<commit_message>
Fix Nature Methods draft: correct authors/affiliation/correspondence, remove duplicate section headings
</commit_message>
<xml_diff>
--- a/paper/manuscript/manuscript_nature_methods.docx
+++ b/paper/manuscript/manuscript_nature_methods.docx
@@ -2,7 +2,7 @@
 <file path=word/document.xml><?xml version="1.0" encoding="utf-8"?>
 <w:document xmlns:w="http://schemas.openxmlformats.org/wordprocessingml/2006/main" xmlns:m="http://schemas.openxmlformats.org/officeDocument/2006/math" xmlns:r="http://schemas.openxmlformats.org/officeDocument/2006/relationships" xmlns:o="urn:schemas-microsoft-com:office:office" xmlns:v="urn:schemas-microsoft-com:vml" xmlns:w10="urn:schemas-microsoft-com:office:word" xmlns:a="http://schemas.openxmlformats.org/drawingml/2006/main" xmlns:pic="http://schemas.openxmlformats.org/drawingml/2006/picture" xmlns:wp="http://schemas.openxmlformats.org/drawingml/2006/wordprocessingDrawing">
   <w:body>
-    <w:bookmarkStart w:id="50" w:name="Xe400126ade8f1e4d28af479649ace7c1902f082"/>
+    <w:bookmarkStart w:id="39" w:name="Xe400126ade8f1e4d28af479649ace7c1902f082"/>
     <w:p>
       <w:pPr>
         <w:pStyle w:val="Heading1"/>
@@ -25,7 +25,22 @@
         <w:pStyle w:val="FirstParagraph"/>
       </w:pPr>
       <w:r>
-        <w:t xml:space="preserve">[To be determined]</w:t>
+        <w:t xml:space="preserve">Yufeng Zhang</w:t>
+      </w:r>
+      <w:r>
+        <w:rPr>
+          <w:vertAlign w:val="superscript"/>
+        </w:rPr>
+        <w:t xml:space="preserve">1</w:t>
+      </w:r>
+      <w:r>
+        <w:t xml:space="preserve">, Shi Huang</w:t>
+      </w:r>
+      <w:r>
+        <w:rPr>
+          <w:vertAlign w:val="superscript"/>
+        </w:rPr>
+        <w:t xml:space="preserve">2</w:t>
       </w:r>
     </w:p>
     <w:p>
@@ -43,13 +58,7 @@
         <w:t xml:space="preserve"> </w:t>
       </w:r>
       <w:r>
-        <w:t xml:space="preserve">1. State Key Laboratory of Crop Genetics and Germplasm Enhancement, Nanjing Agricultural University, Nanjing, China</w:t>
-      </w:r>
-      <w:r>
-        <w:t xml:space="preserve"> </w:t>
-      </w:r>
-      <w:r>
-        <w:t xml:space="preserve">2. [Additional affiliations as needed]</w:t>
+        <w:t xml:space="preserve">1,2 Faculty of Dentistry, the University of Hong Kong, Hong Kong SAR, China</w:t>
       </w:r>
     </w:p>
     <w:p>
@@ -67,7 +76,7 @@
         <w:t xml:space="preserve"> </w:t>
       </w:r>
       <w:r>
-        <w:t xml:space="preserve">Shi Huang — huangshi@njau.edu.cn</w:t>
+        <w:t xml:space="preserve">Shi Huang — shihuang@hku.hk</w:t>
       </w:r>
     </w:p>
     <w:p>
@@ -795,7 +804,7 @@
       </w:r>
     </w:p>
     <w:bookmarkEnd w:id="19"/>
-    <w:bookmarkStart w:id="42" w:name="online-methods"/>
+    <w:bookmarkStart w:id="31" w:name="online-methods"/>
     <w:p>
       <w:pPr>
         <w:pStyle w:val="Heading2"/>
@@ -813,14 +822,106 @@
         <w:t xml:space="preserve">In-silico digestion and IUPAC-aware tag geometry</w:t>
       </w:r>
     </w:p>
+    <w:p>
+      <w:pPr>
+        <w:pStyle w:val="FirstParagraph"/>
+      </w:pPr>
+      <w:r>
+        <w:t xml:space="preserve">Each genome is digested in silico with every enzyme in the panel (default BcgI, AlfI, AloI, FalI; all 16 Type IIB enzymes of the 2bRAD-M panel are supported [8,19]). Recognition patterns are decomposed into fixed anchor bases and IUPAC degenerate positions; matching uses precomputed 4-bit base masks so each degenerate check is one load and one bitwise AND. The digestion enforces the</w:t>
+      </w:r>
+      <w:r>
+        <w:t xml:space="preserve"> </w:t>
+      </w:r>
+      <w:r>
+        <w:rPr>
+          <w:i/>
+          <w:iCs/>
+        </w:rPr>
+        <w:t xml:space="preserve">complete</w:t>
+      </w:r>
+      <w:r>
+        <w:t xml:space="preserve"> </w:t>
+      </w:r>
+      <w:r>
+        <w:t xml:space="preserve">biological site on both strands — during validation we found that the patterns for HaeIV, Hin4I, and BaeI had silently dropped the trailing fixed anchor bases of the degenerate-containing right anchor (~16× excess tag density for HaeIV), and this was fixed alongside the likelihood geometry. Tags longer than 32 bp (CspCI, 33 bp) exceed the 2-bit packing width and are refused with a warning rather than silently mismatched — a policy instituted after a truncation asymmetry was found to destroy 91% of reverse-strand anchors for such enzymes.</w:t>
+      </w:r>
+    </w:p>
+    <w:p>
+      <w:pPr>
+        <w:pStyle w:val="BodyText"/>
+      </w:pPr>
+      <w:r>
+        <w:t xml:space="preserve">For the likelihood, each enzyme carries a site geometry</w:t>
+      </w:r>
+      <w:r>
+        <w:t xml:space="preserve"> </w:t>
+      </w:r>
+      <w:r>
+        <w:rPr>
+          <w:rStyle w:val="VerbatimChar"/>
+        </w:rPr>
+        <w:t xml:space="preserve">{tag_len, exact_site, d2, d3}</w:t>
+      </w:r>
+      <w:r>
+        <w:t xml:space="preserve"> </w:t>
+      </w:r>
+      <w:r>
+        <w:t xml:space="preserve">parsed from its IUPAC anchor string:</w:t>
+      </w:r>
+      <w:r>
+        <w:t xml:space="preserve"> </w:t>
+      </w:r>
+      <w:r>
+        <w:rPr>
+          <w:rStyle w:val="VerbatimChar"/>
+        </w:rPr>
+        <w:t xml:space="preserve">exact_site</w:t>
+      </w:r>
+      <w:r>
+        <w:t xml:space="preserve"> </w:t>
+      </w:r>
+      <w:r>
+        <w:t xml:space="preserve">fully specified positions (a mutation deletes the tag),</w:t>
+      </w:r>
+      <w:r>
+        <w:t xml:space="preserve"> </w:t>
+      </w:r>
+      <w:r>
+        <w:rPr>
+          <w:rStyle w:val="VerbatimChar"/>
+        </w:rPr>
+        <w:t xml:space="preserve">d2</w:t>
+      </w:r>
+      <w:r>
+        <w:t xml:space="preserve"> </w:t>
+      </w:r>
+      <w:r>
+        <w:t xml:space="preserve">two-of-four degenerate positions (survive a mutation with probability a + (1−a)/3),</w:t>
+      </w:r>
+      <w:r>
+        <w:t xml:space="preserve"> </w:t>
+      </w:r>
+      <w:r>
+        <w:rPr>
+          <w:rStyle w:val="VerbatimChar"/>
+        </w:rPr>
+        <w:t xml:space="preserve">d3</w:t>
+      </w:r>
+      <w:r>
+        <w:t xml:space="preserve"> </w:t>
+      </w:r>
+      <w:r>
+        <w:t xml:space="preserve">three-of-four positions. The homogeneous likelihood uses the exact convolution over degenerate classes; the heterogeneous likelihood uses a negative binomial with effective body b + d2/3 + 2·d3/3 plus a closed-form survival factor. With the fully specific default panel (d2 = d3 = 0) both paths are bit-identical to the pre-fix code. Tags are stored strand-canonically (the lexicographically smaller of a tag and its reverse complement), so contig orientation is immaterial; reverse-complement self-controls on real drafts return 99.9999.</w:t>
+      </w:r>
+    </w:p>
     <w:bookmarkEnd w:id="20"/>
-    <w:bookmarkStart w:id="21" w:name="X6c2e7bbce9b512ed90b314513470352d805d728"/>
+    <w:bookmarkStart w:id="21" w:name="Xd100f60785764278c40c45b7debf06888935c47"/>
     <w:p>
       <w:pPr>
         <w:pStyle w:val="Heading3"/>
       </w:pPr>
       <w:r>
-        <w:t xml:space="preserve">In-silico digestion and IUPAC-aware tag geometry</w:t>
+        <w:t xml:space="preserve">Anchoring, chaining, and the adaptive chain-break test</w:t>
       </w:r>
     </w:p>
     <w:p>
@@ -828,23 +929,67 @@
         <w:pStyle w:val="FirstParagraph"/>
       </w:pPr>
       <w:r>
-        <w:t xml:space="preserve">Each genome is digested in silico with every enzyme in the panel (default BcgI, AlfI, AloI, FalI; all 16 Type IIB enzymes of the 2bRAD-M panel are supported [8,19]). Recognition patterns are decomposed into fixed anchor bases and IUPAC degenerate positions; matching uses precomputed 4-bit base masks so each degenerate check is one load and one bitwise AND. The digestion enforces the</w:t>
-      </w:r>
-      <w:r>
-        <w:t xml:space="preserve"> </w:t>
-      </w:r>
-      <w:r>
-        <w:rPr>
-          <w:i/>
-          <w:iCs/>
-        </w:rPr>
-        <w:t xml:space="preserve">complete</w:t>
-      </w:r>
-      <w:r>
-        <w:t xml:space="preserve"> </w:t>
-      </w:r>
-      <w:r>
-        <w:t xml:space="preserve">biological site on both strands — during validation we found that the patterns for HaeIV, Hin4I, and BaeI had silently dropped the trailing fixed anchor bases of the degenerate-containing right anchor (~16× excess tag density for HaeIV), and this was fixed alongside the likelihood geometry. Tags longer than 32 bp (CspCI, 33 bp) exceed the 2-bit packing width and are refused with a warning rather than silently mismatched — a policy instituted after a truncation asymmetry was found to destroy 91% of reverse-strand anchors for such enzymes.</w:t>
+        <w:t xml:space="preserve">Reference tags are indexed by packed sequence; sequences occurring more than</w:t>
+      </w:r>
+      <w:r>
+        <w:t xml:space="preserve"> </w:t>
+      </w:r>
+      <w:r>
+        <w:rPr>
+          <w:rStyle w:val="VerbatimChar"/>
+        </w:rPr>
+        <w:t xml:space="preserve">max_occurrence</w:t>
+      </w:r>
+      <w:r>
+        <w:t xml:space="preserve"> </w:t>
+      </w:r>
+      <w:r>
+        <w:t xml:space="preserve">(default 5) times in either genome are dropped as repeats/paralogs. Tolerant seeding (mismatch budget</w:t>
+      </w:r>
+      <w:r>
+        <w:t xml:space="preserve"> </w:t>
+      </w:r>
+      <w:r>
+        <w:rPr>
+          <w:rStyle w:val="VerbatimChar"/>
+        </w:rPr>
+        <w:t xml:space="preserve">tol</w:t>
+      </w:r>
+      <w:r>
+        <w:t xml:space="preserve"> </w:t>
+      </w:r>
+      <w:r>
+        <w:t xml:space="preserve">= 2 by default) uses the pigeonhole principle: each tag is split into</w:t>
+      </w:r>
+      <w:r>
+        <w:t xml:space="preserve"> </w:t>
+      </w:r>
+      <w:r>
+        <w:rPr>
+          <w:rStyle w:val="VerbatimChar"/>
+        </w:rPr>
+        <w:t xml:space="preserve">tol + 1</w:t>
+      </w:r>
+      <w:r>
+        <w:t xml:space="preserve"> </w:t>
+      </w:r>
+      <w:r>
+        <w:t xml:space="preserve">parts and any pair within</w:t>
+      </w:r>
+      <w:r>
+        <w:t xml:space="preserve"> </w:t>
+      </w:r>
+      <w:r>
+        <w:rPr>
+          <w:rStyle w:val="VerbatimChar"/>
+        </w:rPr>
+        <w:t xml:space="preserve">tol</w:t>
+      </w:r>
+      <w:r>
+        <w:t xml:space="preserve"> </w:t>
+      </w:r>
+      <w:r>
+        <w:t xml:space="preserve">mismatches shares at least one part exactly, so seed recovery needs no whole-genome scan. The 2-mismatch budget is what keeps the method alive below ~93% ANI — at 90% ANI a 32 bp tag matches exactly only 3.4% of the time.</w:t>
       </w:r>
     </w:p>
     <w:p>
@@ -852,87 +997,192 @@
         <w:pStyle w:val="BodyText"/>
       </w:pPr>
       <w:r>
-        <w:t xml:space="preserve">For the likelihood, each enzyme carries a site geometry</w:t>
-      </w:r>
-      <w:r>
-        <w:t xml:space="preserve"> </w:t>
-      </w:r>
-      <w:r>
-        <w:rPr>
-          <w:rStyle w:val="VerbatimChar"/>
-        </w:rPr>
-        <w:t xml:space="preserve">{tag_len, exact_site, d2, d3}</w:t>
-      </w:r>
-      <w:r>
-        <w:t xml:space="preserve"> </w:t>
-      </w:r>
-      <w:r>
-        <w:t xml:space="preserve">parsed from its IUPAC anchor string:</w:t>
-      </w:r>
-      <w:r>
-        <w:t xml:space="preserve"> </w:t>
-      </w:r>
-      <w:r>
-        <w:rPr>
-          <w:rStyle w:val="VerbatimChar"/>
-        </w:rPr>
-        <w:t xml:space="preserve">exact_site</w:t>
-      </w:r>
-      <w:r>
-        <w:t xml:space="preserve"> </w:t>
-      </w:r>
-      <w:r>
-        <w:t xml:space="preserve">fully specified positions (a mutation deletes the tag),</w:t>
-      </w:r>
-      <w:r>
-        <w:t xml:space="preserve"> </w:t>
-      </w:r>
-      <w:r>
-        <w:rPr>
-          <w:rStyle w:val="VerbatimChar"/>
-        </w:rPr>
-        <w:t xml:space="preserve">d2</w:t>
-      </w:r>
-      <w:r>
-        <w:t xml:space="preserve"> </w:t>
-      </w:r>
-      <w:r>
-        <w:t xml:space="preserve">two-of-four degenerate positions (survive a mutation with probability a + (1−a)/3),</w:t>
-      </w:r>
-      <w:r>
-        <w:t xml:space="preserve"> </w:t>
-      </w:r>
-      <w:r>
-        <w:rPr>
-          <w:rStyle w:val="VerbatimChar"/>
-        </w:rPr>
-        <w:t xml:space="preserve">d3</w:t>
-      </w:r>
-      <w:r>
-        <w:t xml:space="preserve"> </w:t>
-      </w:r>
-      <w:r>
-        <w:t xml:space="preserve">three-of-four positions. The homogeneous likelihood uses the exact convolution over degenerate classes; the heterogeneous likelihood uses a negative binomial with effective body b + d2/3 + 2·d3/3 plus a closed-form survival factor. With the fully specific default panel (d2 = d3 = 0) both paths are bit-identical to the pre-fix code. Tags are stored strand-canonically (the lexicographically smaller of a tag and its reverse complement), so contig orientation is immaterial; reverse-complement self-controls on real drafts return 99.9999.</w:t>
+        <w:t xml:space="preserve">Anchors are grouped by (query contig, reference contig, orientation) — never across contigs, since an inter-contig</w:t>
+      </w:r>
+      <w:r>
+        <w:t xml:space="preserve"> </w:t>
+      </w:r>
+      <w:r>
+        <w:t xml:space="preserve">“gap”</w:t>
+      </w:r>
+      <w:r>
+        <w:t xml:space="preserve"> </w:t>
+      </w:r>
+      <w:r>
+        <w:t xml:space="preserve">joins unlinked sequences — and chained by gap-penalized collinear DP with a bounded predecessor window. The chain-break test counts</w:t>
+      </w:r>
+      <w:r>
+        <w:t xml:space="preserve"> </w:t>
+      </w:r>
+      <w:r>
+        <w:rPr>
+          <w:i/>
+          <w:iCs/>
+        </w:rPr>
+        <w:t xml:space="preserve">skipped query tag positions</w:t>
+      </w:r>
+      <w:r>
+        <w:t xml:space="preserve">, not base pairs, because a fixed bp threshold provably cannot work across the ANI range: at 95% ANI a tag anchors with probability ~0.79 (nine consecutive failures are already implausible, ~6 kb), while at 85% the probability is ~0.12 (a hundred consecutive failures are ordinary, ~78 kb). Measured on exact-truth sweeps, a permissive 50 kb bp-limit lets chains bridge accessory blocks (ANI biased down 0.74 points, AF inflated), while a strict 10 kb limit fragments chains and drops poorly anchored regions (ANI biased up to +3.07 at 85% ANI). Counting skipped tag positions is scale-free and separates the two events a bp limit conflates: a deletion removes reference tags while surviving query tags stay adjacent (zero skipped positions, no break), whereas a length-preserving non-homologous replacement skips every query position inside it (break). The threshold is j* = ln(α)/ln(1−p) with α = 1e−6, floored at 5 because repeat-masked tags and panel coverage gaps occupy tag positions without being anchors. Pass 1 chains permissively and fits a provisional divergence; pass 2 re-chains at j* and re-fits. Inside each chain, query→reference coordinates are interpolated from the chain’s own anchors and tolerant matching is attempted only within</w:t>
+      </w:r>
+      <w:r>
+        <w:t xml:space="preserve"> </w:t>
+      </w:r>
+      <w:r>
+        <w:rPr>
+          <w:rStyle w:val="VerbatimChar"/>
+        </w:rPr>
+        <w:t xml:space="preserve">local_window</w:t>
+      </w:r>
+      <w:r>
+        <w:t xml:space="preserve"> </w:t>
+      </w:r>
+      <w:r>
+        <w:t xml:space="preserve">bp of the predicted position — seed-and-extend, which cannot invent matches between positionally unrelated tags. Chains are processed largest-first and each query tag is counted at most once.</w:t>
       </w:r>
     </w:p>
     <w:bookmarkEnd w:id="21"/>
-    <w:bookmarkStart w:id="22" w:name="Xd100f60785764278c40c45b7debf06888935c47"/>
+    <w:bookmarkStart w:id="22" w:name="Xc84f212d8323a8f017575d3d7a92fc22fb23227"/>
     <w:p>
       <w:pPr>
         <w:pStyle w:val="Heading3"/>
       </w:pPr>
       <w:r>
-        <w:t xml:space="preserve">Anchoring, chaining, and the adaptive chain-break test</w:t>
+        <w:t xml:space="preserve">Chain-restricted stratified MLE, gating, and flags</w:t>
+      </w:r>
+    </w:p>
+    <w:p>
+      <w:pPr>
+        <w:pStyle w:val="FirstParagraph"/>
+      </w:pPr>
+      <w:r>
+        <w:t xml:space="preserve">For a query tag inside a chained region, with tag length k, recognition-site length s, mutable body b = k − s, and mismatch budget tol, the outcome probabilities under per-base identity a are: found with m body mismatches, P_m(a) = C(b, m)·(1−a)</w:t>
+      </w:r>
+      <w:r>
+        <w:rPr>
+          <w:vertAlign w:val="superscript"/>
+        </w:rPr>
+        <w:t xml:space="preserve">m·a</w:t>
+      </w:r>
+      <w:r>
+        <w:t xml:space="preserve">(k−m) for m ≤ tol; not found, P_miss(a) = 1 − Σ P_m(a). Mismatches are observable only in the body — a site mutation deletes the tag — so the site contributes a^s but never appears in the histogram; this also sets a hard retention ceiling (~0.72 at 95% ANI, ~0.50 at 90%). The log-likelihood is summed over per-enzyme strata (each with its own k and b) and maximized over the scalar a by golden-section search. Two partial estimators —</w:t>
+      </w:r>
+      <w:r>
+        <w:t xml:space="preserve"> </w:t>
+      </w:r>
+      <w:r>
+        <w:rPr>
+          <w:rStyle w:val="VerbatimChar"/>
+        </w:rPr>
+        <w:t xml:space="preserve">ani_from_loss</w:t>
+      </w:r>
+      <w:r>
+        <w:t xml:space="preserve"> </w:t>
+      </w:r>
+      <w:r>
+        <w:t xml:space="preserve">(miss rate only) and</w:t>
+      </w:r>
+      <w:r>
+        <w:t xml:space="preserve"> </w:t>
+      </w:r>
+      <w:r>
+        <w:rPr>
+          <w:rStyle w:val="VerbatimChar"/>
+        </w:rPr>
+        <w:t xml:space="preserve">ani_from_hist</w:t>
+      </w:r>
+      <w:r>
+        <w:t xml:space="preserve"> </w:t>
+      </w:r>
+      <w:r>
+        <w:t xml:space="preserve">(histogram only, renormalized by P(found)) — are independent estimates of the same quantity and power the diagnostics.</w:t>
+      </w:r>
+    </w:p>
+    <w:p>
+      <w:pPr>
+        <w:pStyle w:val="BodyText"/>
+      </w:pPr>
+      <w:r>
+        <w:t xml:space="preserve">The heterogeneous model gives each region a rate multiplier r ~ Gamma(α, α); because rate variation acts at kilobase scale while a tag is ~30 bp, all sites in a tag share one r, and integrating r out turns the mismatch count negative binomial with two parameters (mean divergence d, shape α) identifiable from the three histogram degrees of freedom plus the miss count. Guardrails: the second parameter is spent only when the likelihood-ratio statistic exceeds 3.841, and α is clamped to [0.1, 200]. Because the gamma shape and mean couple at the identifiability boundary when few tags survive (overshoots of 4–10 ANI points at mid-ANI), the shipped point estimate is</w:t>
+      </w:r>
+      <w:r>
+        <w:t xml:space="preserve"> </w:t>
+      </w:r>
+      <w:r>
+        <w:rPr>
+          <w:b/>
+          <w:bCs/>
+        </w:rPr>
+        <w:t xml:space="preserve">gated</w:t>
+      </w:r>
+      <w:r>
+        <w:t xml:space="preserve">: report the homogeneous fit when |ani_from_loss − ani_from_hist| &gt; 5 ANI points, else the gamma fit. The threshold is an effect size, not a significance level — significance-scaled variants invert their error ranking on GTDB — and was chosen at the flat optimum (4.5–6 points) of a threshold sweep on the GTDB-ANIm matrix. It fires on 5.5% of GTDB pairs (MAE 2.819 vs 2.881 always-gamma; per-pair oracle bound 2.788), 12/15 mid-ANI pairs (4.482 → 0.959), and never on uniform-rate sims, mosaic sims, or oral/gut same-species pairs, preserving gamma’s advantage exactly where it is real. The</w:t>
+      </w:r>
+      <w:r>
+        <w:t xml:space="preserve"> </w:t>
+      </w:r>
+      <w:r>
+        <w:rPr>
+          <w:rStyle w:val="VerbatimChar"/>
+        </w:rPr>
+        <w:t xml:space="preserve">flag</w:t>
+      </w:r>
+      <w:r>
+        <w:t xml:space="preserve"> </w:t>
+      </w:r>
+      <w:r>
+        <w:t xml:space="preserve">column reports</w:t>
+      </w:r>
+      <w:r>
+        <w:t xml:space="preserve"> </w:t>
+      </w:r>
+      <w:r>
+        <w:rPr>
+          <w:rStyle w:val="VerbatimChar"/>
+        </w:rPr>
+        <w:t xml:space="preserve">BELOW_DETECTION</w:t>
+      </w:r>
+      <w:r>
+        <w:t xml:space="preserve"> </w:t>
+      </w:r>
+      <w:r>
+        <w:t xml:space="preserve">(expected retention &lt; 0.20; precedence),</w:t>
+      </w:r>
+      <w:r>
+        <w:t xml:space="preserve"> </w:t>
+      </w:r>
+      <w:r>
+        <w:rPr>
+          <w:rStyle w:val="VerbatimChar"/>
+        </w:rPr>
+        <w:t xml:space="preserve">INCONSISTENT</w:t>
+      </w:r>
+      <w:r>
+        <w:t xml:space="preserve"> </w:t>
+      </w:r>
+      <w:r>
+        <w:t xml:space="preserve">(the gate fell back, or the chains carry &gt; 0.5 rearrangement breakpoints per anchor — a structural statistic that does not share the chain-restricted likelihood denominator), else</w:t>
+      </w:r>
+      <w:r>
+        <w:t xml:space="preserve"> </w:t>
+      </w:r>
+      <w:r>
+        <w:rPr>
+          <w:rStyle w:val="VerbatimChar"/>
+        </w:rPr>
+        <w:t xml:space="preserve">ok</w:t>
+      </w:r>
+      <w:r>
+        <w:t xml:space="preserve">. The recalibrated flag never inverts its error ranking on any validation set (kept vs flagged MAE: GTDB-ANIm 2.415 vs 4.153; oral/gut 0.514 vs 4.269; mid-ANI 0.343 vs 1.113), at a disclosed cost in near-clonal sensitivity.</w:t>
       </w:r>
     </w:p>
     <w:bookmarkEnd w:id="22"/>
-    <w:bookmarkStart w:id="23" w:name="Xe724ef8a97b65c531074dd8b3bf22515af120f7"/>
+    <w:bookmarkStart w:id="23" w:name="short-contig-rescue-pass"/>
     <w:p>
       <w:pPr>
         <w:pStyle w:val="Heading3"/>
       </w:pPr>
       <w:r>
-        <w:t xml:space="preserve">Anchoring, chaining, and the adaptive chain-break test</w:t>
+        <w:t xml:space="preserve">Short-contig rescue pass</w:t>
       </w:r>
     </w:p>
     <w:p>
@@ -940,67 +1190,408 @@
         <w:pStyle w:val="FirstParagraph"/>
       </w:pPr>
       <w:r>
-        <w:t xml:space="preserve">Reference tags are indexed by packed sequence; sequences occurring more than</w:t>
-      </w:r>
-      <w:r>
-        <w:t xml:space="preserve"> </w:t>
-      </w:r>
-      <w:r>
-        <w:rPr>
-          <w:rStyle w:val="VerbatimChar"/>
-        </w:rPr>
-        <w:t xml:space="preserve">max_occurrence</w:t>
-      </w:r>
-      <w:r>
-        <w:t xml:space="preserve"> </w:t>
-      </w:r>
-      <w:r>
-        <w:t xml:space="preserve">(default 5) times in either genome are dropped as repeats/paralogs. Tolerant seeding (mismatch budget</w:t>
-      </w:r>
-      <w:r>
-        <w:t xml:space="preserve"> </w:t>
-      </w:r>
-      <w:r>
-        <w:rPr>
-          <w:rStyle w:val="VerbatimChar"/>
-        </w:rPr>
-        <w:t xml:space="preserve">tol</w:t>
-      </w:r>
-      <w:r>
-        <w:t xml:space="preserve"> </w:t>
-      </w:r>
-      <w:r>
-        <w:t xml:space="preserve">= 2 by default) uses the pigeonhole principle: each tag is split into</w:t>
-      </w:r>
-      <w:r>
-        <w:t xml:space="preserve"> </w:t>
-      </w:r>
-      <w:r>
-        <w:rPr>
-          <w:rStyle w:val="VerbatimChar"/>
-        </w:rPr>
-        <w:t xml:space="preserve">tol + 1</w:t>
-      </w:r>
-      <w:r>
-        <w:t xml:space="preserve"> </w:t>
-      </w:r>
-      <w:r>
-        <w:t xml:space="preserve">parts and any pair within</w:t>
-      </w:r>
-      <w:r>
-        <w:t xml:space="preserve"> </w:t>
-      </w:r>
-      <w:r>
-        <w:rPr>
-          <w:rStyle w:val="VerbatimChar"/>
-        </w:rPr>
-        <w:t xml:space="preserve">tol</w:t>
-      </w:r>
-      <w:r>
-        <w:t xml:space="preserve"> </w:t>
-      </w:r>
-      <w:r>
-        <w:t xml:space="preserve">mismatches shares at least one part exactly, so seed recovery needs no whole-genome scan. The 2-mismatch budget is what keeps the method alive below ~93% ANI — at 90% ANI a 32 bp tag matches exactly only 3.4% of the time.</w:t>
+        <w:t xml:space="preserve">A query contig with &lt; 8 ×</w:t>
+      </w:r>
+      <w:r>
+        <w:t xml:space="preserve"> </w:t>
+      </w:r>
+      <w:r>
+        <w:rPr>
+          <w:rStyle w:val="VerbatimChar"/>
+        </w:rPr>
+        <w:t xml:space="preserve">min_chain_anchors</w:t>
+      </w:r>
+      <w:r>
+        <w:t xml:space="preserve"> </w:t>
+      </w:r>
+      <w:r>
+        <w:t xml:space="preserve">in-panel tags (~25 kb with the default panel) and no accepted chain is folded into the likelihood without chaining if it carries a collinear group of ≥ 2 unique anchors (unique = occurring once in each genome; at least one anchor with ≤ 1 mismatch, since a solely-2-mismatch basis can be a paralog; ties break on total mismatch count). Counting replicates exactly what pass-2 chaining would count on the intact genome: tags between the outer basis anchors are counted (hits to the histogram, no match to the miss count), and a tail tag beyond an outer anchor is counted only while a bracketing anchor from any contig follows within (</w:t>
+      </w:r>
+      <w:r>
+        <w:rPr>
+          <w:rStyle w:val="VerbatimChar"/>
+        </w:rPr>
+        <w:t xml:space="preserve">max_skip</w:t>
+      </w:r>
+      <w:r>
+        <w:t xml:space="preserve"> </w:t>
+      </w:r>
+      <w:r>
+        <w:t xml:space="preserve">+ 1) × mean tag spacing along the reference. Rescued contigs contribute AF spans with the same half-median-gap extension rule as chains but create no chains, so synteny and SV outputs are untouched. The pass is gated on contig tag count, so complete and high-N50 assemblies take a bit-identical path. The residual +0.20 drift at N50 5 kb comes from contigs with 0–1 placeable anchors (~1.3 Mb on the Sakai ladder), which carry no positional evidence; rescuing them would require guessing homology.</w:t>
+      </w:r>
+    </w:p>
+    <w:bookmarkEnd w:id="23"/>
+    <w:bookmarkStart w:id="24" w:name="database-scale-screen"/>
+    <w:p>
+      <w:pPr>
+        <w:pStyle w:val="Heading3"/>
+      </w:pPr>
+      <w:r>
+        <w:t xml:space="preserve">Database-scale screen</w:t>
+      </w:r>
+    </w:p>
+    <w:p>
+      <w:pPr>
+        <w:pStyle w:val="FirstParagraph"/>
+      </w:pPr>
+      <w:r>
+        <w:t xml:space="preserve">Batch subcommands (</w:t>
+      </w:r>
+      <w:r>
+        <w:rPr>
+          <w:rStyle w:val="VerbatimChar"/>
+        </w:rPr>
+        <w:t xml:space="preserve">dist</w:t>
+      </w:r>
+      <w:r>
+        <w:t xml:space="preserve">,</w:t>
+      </w:r>
+      <w:r>
+        <w:t xml:space="preserve"> </w:t>
+      </w:r>
+      <w:r>
+        <w:rPr>
+          <w:rStyle w:val="VerbatimChar"/>
+        </w:rPr>
+        <w:t xml:space="preserve">search</w:t>
+      </w:r>
+      <w:r>
+        <w:t xml:space="preserve">,</w:t>
+      </w:r>
+      <w:r>
+        <w:t xml:space="preserve"> </w:t>
+      </w:r>
+      <w:r>
+        <w:rPr>
+          <w:rStyle w:val="VerbatimChar"/>
+        </w:rPr>
+        <w:t xml:space="preserve">triangle</w:t>
+      </w:r>
+      <w:r>
+        <w:t xml:space="preserve">,</w:t>
+      </w:r>
+      <w:r>
+        <w:t xml:space="preserve"> </w:t>
+      </w:r>
+      <w:r>
+        <w:rPr>
+          <w:rStyle w:val="VerbatimChar"/>
+        </w:rPr>
+        <w:t xml:space="preserve">db search</w:t>
+      </w:r>
+      <w:r>
+        <w:t xml:space="preserve">) run a two-stage pipeline. Stage 1 reduces each tag to one strand-canonical key — its centered 18 bp packed window — per enzyme; a pair passes iff shared keys ≥ 3 AND shared/min(smaller key set) ≥ 0.001. At 18 bp, generic background homology (shared genes at 65–75% identity) no longer saturates key containment, and the gate was calibrated on GTDB-R207 to false-reject 0/500 validated ≥ 80% ANI pairs while rejecting ~83% of random pairs (measured false-reject rate on estimator-reportable pairs at n = 2,000: 1/844). In the FRR-critical 80–85% band the weakest validated true pair clears the floors by 10×/6×. Stage 2 refines survivors with the identical</w:t>
+      </w:r>
+      <w:r>
+        <w:t xml:space="preserve"> </w:t>
+      </w:r>
+      <w:r>
+        <w:rPr>
+          <w:rStyle w:val="VerbatimChar"/>
+        </w:rPr>
+        <w:t xml:space="preserve">chain_ani</w:t>
+      </w:r>
+      <w:r>
+        <w:t xml:space="preserve"> </w:t>
+      </w:r>
+      <w:r>
+        <w:t xml:space="preserve">code path and row formatter as the pairwise</w:t>
+      </w:r>
+      <w:r>
+        <w:t xml:space="preserve"> </w:t>
+      </w:r>
+      <w:r>
+        <w:rPr>
+          <w:rStyle w:val="VerbatimChar"/>
+        </w:rPr>
+        <w:t xml:space="preserve">ani</w:t>
+      </w:r>
+      <w:r>
+        <w:t xml:space="preserve"> </w:t>
+      </w:r>
+      <w:r>
+        <w:t xml:space="preserve">command, so database output is byte-identical to pairwise output on the same pairs. Screen thresholds are panel-specific and exposed as flags.</w:t>
+      </w:r>
+    </w:p>
+    <w:bookmarkEnd w:id="24"/>
+    <w:bookmarkStart w:id="25" w:name="ridge-calibration-protocol"/>
+    <w:p>
+      <w:pPr>
+        <w:pStyle w:val="Heading3"/>
+      </w:pPr>
+      <w:r>
+        <w:t xml:space="preserve">Ridge calibration protocol</w:t>
+      </w:r>
+    </w:p>
+    <w:p>
+      <w:pPr>
+        <w:pStyle w:val="FirstParagraph"/>
+      </w:pPr>
+      <w:r>
+        <w:t xml:space="preserve">The calibration model is ridge regression on nine Syn2bANI-internal features —</w:t>
+      </w:r>
+      <w:r>
+        <w:t xml:space="preserve"> </w:t>
+      </w:r>
+      <w:r>
+        <w:rPr>
+          <w:rStyle w:val="VerbatimChar"/>
+        </w:rPr>
+        <w:t xml:space="preserve">ani_gated</w:t>
+      </w:r>
+      <w:r>
+        <w:t xml:space="preserve">,</w:t>
+      </w:r>
+      <w:r>
+        <w:t xml:space="preserve"> </w:t>
+      </w:r>
+      <w:r>
+        <w:rPr>
+          <w:rStyle w:val="VerbatimChar"/>
+        </w:rPr>
+        <w:t xml:space="preserve">ani_uniform</w:t>
+      </w:r>
+      <w:r>
+        <w:t xml:space="preserve">,</w:t>
+      </w:r>
+      <w:r>
+        <w:t xml:space="preserve"> </w:t>
+      </w:r>
+      <w:r>
+        <w:rPr>
+          <w:rStyle w:val="VerbatimChar"/>
+        </w:rPr>
+        <w:t xml:space="preserve">af_query</w:t>
+      </w:r>
+      <w:r>
+        <w:t xml:space="preserve">,</w:t>
+      </w:r>
+      <w:r>
+        <w:t xml:space="preserve"> </w:t>
+      </w:r>
+      <w:r>
+        <w:rPr>
+          <w:rStyle w:val="VerbatimChar"/>
+        </w:rPr>
+        <w:t xml:space="preserve">af_reference</w:t>
+      </w:r>
+      <w:r>
+        <w:t xml:space="preserve">,</w:t>
+      </w:r>
+      <w:r>
+        <w:t xml:space="preserve"> </w:t>
+      </w:r>
+      <w:r>
+        <w:rPr>
+          <w:rStyle w:val="VerbatimChar"/>
+        </w:rPr>
+        <w:t xml:space="preserve">std_err</w:t>
+      </w:r>
+      <w:r>
+        <w:t xml:space="preserve">,</w:t>
+      </w:r>
+      <w:r>
+        <w:t xml:space="preserve"> </w:t>
+      </w:r>
+      <w:r>
+        <w:rPr>
+          <w:rStyle w:val="VerbatimChar"/>
+        </w:rPr>
+        <w:t xml:space="preserve">retention</w:t>
+      </w:r>
+      <w:r>
+        <w:t xml:space="preserve">,</w:t>
+      </w:r>
+      <w:r>
+        <w:t xml:space="preserve"> </w:t>
+      </w:r>
+      <w:r>
+        <w:rPr>
+          <w:rStyle w:val="VerbatimChar"/>
+        </w:rPr>
+        <w:t xml:space="preserve">n_anchors</w:t>
+      </w:r>
+      <w:r>
+        <w:t xml:space="preserve">,</w:t>
+      </w:r>
+      <w:r>
+        <w:t xml:space="preserve"> </w:t>
+      </w:r>
+      <w:r>
+        <w:rPr>
+          <w:rStyle w:val="VerbatimChar"/>
+        </w:rPr>
+        <w:t xml:space="preserve">n_chains</w:t>
+      </w:r>
+      <w:r>
+        <w:t xml:space="preserve">,</w:t>
+      </w:r>
+      <w:r>
+        <w:t xml:space="preserve"> </w:t>
+      </w:r>
+      <w:r>
+        <w:rPr>
+          <w:rStyle w:val="VerbatimChar"/>
+        </w:rPr>
+        <w:t xml:space="preserve">n_tags_in_chains</w:t>
+      </w:r>
+      <w:r>
+        <w:t xml:space="preserve"> </w:t>
+      </w:r>
+      <w:r>
+        <w:t xml:space="preserve">— with median imputation and standardization, regularization α = 10 selected by inner cross-validation (scikit-learn [18]), trained on 2,520 ANIm-truth pairs (2,053 finite pairs from the stratified 2,074-pair GTDB benchmark plus 467 targeted 95.0–99.15% ANIm pairs from a skani screen of all 2.26 M same-genus GTDB-R207 pairs followed by dnadiff on 650 selected candidates; 607 species, 26 phyla, zero overlap with the existing set). Validation is</w:t>
+      </w:r>
+      <w:r>
+        <w:t xml:space="preserve"> </w:t>
+      </w:r>
+      <w:r>
+        <w:rPr>
+          <w:b/>
+          <w:bCs/>
+        </w:rPr>
+        <w:t xml:space="preserve">band-holdout</w:t>
+      </w:r>
+      <w:r>
+        <w:t xml:space="preserve">: each of the four ANI bands (80–85, 85–90, 90–95, 95–99) is predicted by a model trained on the other three only. Training rows are shuffled with a fixed seed before CV (the inner KFold of the ridge CV is order-sensitive); seed spread over 5 seeds is ≤ 0.0015 MAE. An expanded 18-feature variant and a gradient-boosted model on the same features were evaluated and rejected (nonlinearity buys nothing at n ≈ 2,500, and the expanded set degrades out-of-distribution on near-clonal pairs). A learning-curve analysis (492/984/1,476/1,969 training pairs → CV MAE 0.952/0.902/0.887/0.893) shows the linear model plateaus at ~1,500 pairs. The model ships as a versioned JSON swapped into the binary; all feature matrices were re-run with the post-rescue binary before training, so there is no version skew between the shipped estimator and the deployed model. Calibrated output is a separate column (</w:t>
+      </w:r>
+      <w:r>
+        <w:rPr>
+          <w:rStyle w:val="VerbatimChar"/>
+        </w:rPr>
+        <w:t xml:space="preserve">--calibrate</w:t>
+      </w:r>
+      <w:r>
+        <w:t xml:space="preserve">); it returns no value on</w:t>
+      </w:r>
+      <w:r>
+        <w:t xml:space="preserve"> </w:t>
+      </w:r>
+      <w:r>
+        <w:rPr>
+          <w:rStyle w:val="VerbatimChar"/>
+        </w:rPr>
+        <w:t xml:space="preserve">BELOW_DETECTION</w:t>
+      </w:r>
+      <w:r>
+        <w:t xml:space="preserve"> </w:t>
+      </w:r>
+      <w:r>
+        <w:t xml:space="preserve">pairs rather than extrapolating.</w:t>
+      </w:r>
+    </w:p>
+    <w:bookmarkEnd w:id="25"/>
+    <w:bookmarkStart w:id="26" w:name="Xd3b37ce8f62a83dd9d52f682daa388ffbd3bd4e"/>
+    <w:p>
+      <w:pPr>
+        <w:pStyle w:val="Heading3"/>
+      </w:pPr>
+      <w:r>
+        <w:t xml:space="preserve">The spatial-model negative result (identifiability analysis)</w:t>
+      </w:r>
+    </w:p>
+    <w:p>
+      <w:pPr>
+        <w:pStyle w:val="FirstParagraph"/>
+      </w:pPr>
+      <w:r>
+        <w:t xml:space="preserve">The mechanistic alternative to calibration was evaluated in full (prototype in Python against 19 exact-truth mosaic simulations, then the GTDB-ANIm matrix). The bias decomposes into an in-chain distribution-family term — asymptotic in-chain MAE 2.25 for gamma, 1.25 for a capped grid NPMLE, so a nonparametric fit fixes at most ~0.1–0.2 GTDB MAE — and a coverage term: the divergence of the unchained fraction is not identifiable from tag data, since the out-of-chain anchor residual is ≈ 0 within multi-match noise whether the unchained mass is saturated-divergent or accessory, and an oracle given the exact identity of the chained sample still errs by MAE 1.36 against whole-genome truth. No candidate (AF-weighted mixtures, discrete mixtures, ascertainment-aware tilts, capped NPMLE with and without LRT gating, model averaging) beats the gated baseline while holding all simulation gates. The raw estimator is therefore at its identifiability floor at 4-enzyme tag density; this analysis is why calibration, not a new likelihood, is the deployed correction layer.</w:t>
+      </w:r>
+    </w:p>
+    <w:bookmarkEnd w:id="26"/>
+    <w:bookmarkStart w:id="27" w:name="structural-variant-calling"/>
+    <w:p>
+      <w:pPr>
+        <w:pStyle w:val="Heading3"/>
+      </w:pPr>
+      <w:r>
+        <w:t xml:space="preserve">Structural-variant calling</w:t>
+      </w:r>
+    </w:p>
+    <w:p>
+      <w:pPr>
+        <w:pStyle w:val="FirstParagraph"/>
+      </w:pPr>
+      <w:r>
+        <w:t xml:space="preserve">The</w:t>
+      </w:r>
+      <w:r>
+        <w:t xml:space="preserve"> </w:t>
+      </w:r>
+      <w:r>
+        <w:rPr>
+          <w:rStyle w:val="VerbatimChar"/>
+        </w:rPr>
+        <w:t xml:space="preserve">struct</w:t>
+      </w:r>
+      <w:r>
+        <w:t xml:space="preserve"> </w:t>
+      </w:r>
+      <w:r>
+        <w:t xml:space="preserve">subcommand consumes the chains and anchors of a pairwise comparison. Inversions are orientation flips between consecutive chains; indels are coordinate gaps between consecutive chains exceeding</w:t>
+      </w:r>
+      <w:r>
+        <w:t xml:space="preserve"> </w:t>
+      </w:r>
+      <w:r>
+        <w:rPr>
+          <w:rStyle w:val="VerbatimChar"/>
+        </w:rPr>
+        <w:t xml:space="preserve">indel_min</w:t>
+      </w:r>
+      <w:r>
+        <w:t xml:space="preserve"> </w:t>
+      </w:r>
+      <w:r>
+        <w:t xml:space="preserve">(default 1 kb), with a guard requiring that no third chain anchors inside the spanned reference interval (without it, a small relocated block sandwiched between collinear chains is misreported as a deletion sized by the reference jump — observed as spurious 42–961 kb calls before the guard); translocations are chains violating global reference order. Resolution is limited by tag spacing and by unphaseable repeats at junctions (observed endpoint offset ≤ 5.5 kb on the 779 kb W3110 inversion); events whose flanking chains have &lt; 4 anchors are not called, and equal-length homologous replacements that keep tags phased are invisible by design. Validation against dnadiff used span-based one-to-many matching because dnadiff fragments large accessory regions into many small events while Syn2bANI calls each junction once.</w:t>
+      </w:r>
+    </w:p>
+    <w:bookmarkEnd w:id="27"/>
+    <w:bookmarkStart w:id="28" w:name="simulation-framework-with-exact-truth"/>
+    <w:p>
+      <w:pPr>
+        <w:pStyle w:val="Heading3"/>
+      </w:pPr>
+      <w:r>
+        <w:t xml:space="preserve">Simulation framework with exact truth</w:t>
+      </w:r>
+    </w:p>
+    <w:p>
+      <w:pPr>
+        <w:pStyle w:val="FirstParagraph"/>
+      </w:pPr>
+      <w:r>
+        <w:t xml:space="preserve">All exact-truth simulators evolve sequence from a public reference (</w:t>
+      </w:r>
+      <w:r>
+        <w:rPr>
+          <w:i/>
+          <w:iCs/>
+        </w:rPr>
+        <w:t xml:space="preserve">E. coli</w:t>
+      </w:r>
+      <w:r>
+        <w:t xml:space="preserve"> </w:t>
+      </w:r>
+      <w:r>
+        <w:t xml:space="preserve">K-12 MG1655, ENA U00096.3, 4,641,652 bp) by applying a counted number of substitutions, so true ANI = 1 − n_subs/L exactly. Families: an ANI ladder (12 levels, 85–99.9%, each with a 400 kb inversion, with and without ~46 deletions of 200–2,000 bp); an indel sweep (true ANI 95.000; 0–4 deletions/100 kb); fragmentation (20–201 contigs, no sequence lost, ~50% reverse-complemented, order shuffled); accessory confounds (core ANI 95.000; 0–50% of the genome replaced by composition-preserving shuffled blocks, plus a block-count control at fixed total fraction); mosaic/rate-heterogeneity cases (per-block rates ~ Gamma(α, α), α = 0.5/1/2, mean ANI 90–98, plus deliberately misspecified bimodal cases); and GC coverage (ladders on five real template genomes, GC 27.2–72.1%). Deletions do not change true ANI (counted substitutions over reference length), so the deleted fraction doubles as AF ground truth. Substitutions are uniform over the three alternative bases with no GC-biased mutation model, transition/transversion ratio, codon structure, or selection — a deliberate simplification justified by the finding that GC does not explain the real-data degradation and that site turnover emerges from uniform substitution on a real genome without any special mechanism. Enzyme digestion is never simulated; the released binary extracts tags itself.</w:t>
+      </w:r>
+    </w:p>
+    <w:bookmarkEnd w:id="28"/>
+    <w:bookmarkStart w:id="29" w:name="benchmark-datasets-truth-and-tools"/>
+    <w:p>
+      <w:pPr>
+        <w:pStyle w:val="Heading3"/>
+      </w:pPr>
+      <w:r>
+        <w:t xml:space="preserve">Benchmark datasets, truth, and tools</w:t>
+      </w:r>
+    </w:p>
+    <w:p>
+      <w:pPr>
+        <w:pStyle w:val="FirstParagraph"/>
+      </w:pPr>
+      <w:r>
+        <w:t xml:space="preserve">All datasets, their ground truth, and the analyses they support are summarized in Table 3. The simulation-generation framework is described in Methods 4.9.</w:t>
       </w:r>
     </w:p>
     <w:p>
@@ -1008,114 +1599,17 @@
         <w:pStyle w:val="BodyText"/>
       </w:pPr>
       <w:r>
-        <w:t xml:space="preserve">Anchors are grouped by (query contig, reference contig, orientation) — never across contigs, since an inter-contig</w:t>
-      </w:r>
-      <w:r>
-        <w:t xml:space="preserve"> </w:t>
-      </w:r>
-      <w:r>
-        <w:t xml:space="preserve">“gap”</w:t>
-      </w:r>
-      <w:r>
-        <w:t xml:space="preserve"> </w:t>
-      </w:r>
-      <w:r>
-        <w:t xml:space="preserve">joins unlinked sequences — and chained by gap-penalized collinear DP with a bounded predecessor window. The chain-break test counts</w:t>
-      </w:r>
-      <w:r>
-        <w:t xml:space="preserve"> </w:t>
-      </w:r>
-      <w:r>
-        <w:rPr>
-          <w:i/>
-          <w:iCs/>
-        </w:rPr>
-        <w:t xml:space="preserve">skipped query tag positions</w:t>
-      </w:r>
-      <w:r>
-        <w:t xml:space="preserve">, not base pairs, because a fixed bp threshold provably cannot work across the ANI range: at 95% ANI a tag anchors with probability ~0.79 (nine consecutive failures are already implausible, ~6 kb), while at 85% the probability is ~0.12 (a hundred consecutive failures are ordinary, ~78 kb). Measured on exact-truth sweeps, a permissive 50 kb bp-limit lets chains bridge accessory blocks (ANI biased down 0.74 points, AF inflated), while a strict 10 kb limit fragments chains and drops poorly anchored regions (ANI biased up to +3.07 at 85% ANI). Counting skipped tag positions is scale-free and separates the two events a bp limit conflates: a deletion removes reference tags while surviving query tags stay adjacent (zero skipped positions, no break), whereas a length-preserving non-homologous replacement skips every query position inside it (break). The threshold is j* = ln(α)/ln(1−p) with α = 1e−6, floored at 5 because repeat-masked tags and panel coverage gaps occupy tag positions without being anchors. Pass 1 chains permissively and fits a provisional divergence; pass 2 re-chains at j* and re-fits. Inside each chain, query→reference coordinates are interpolated from the chain’s own anchors and tolerant matching is attempted only within</w:t>
-      </w:r>
-      <w:r>
-        <w:t xml:space="preserve"> </w:t>
-      </w:r>
-      <w:r>
-        <w:rPr>
-          <w:rStyle w:val="VerbatimChar"/>
-        </w:rPr>
-        <w:t xml:space="preserve">local_window</w:t>
-      </w:r>
-      <w:r>
-        <w:t xml:space="preserve"> </w:t>
-      </w:r>
-      <w:r>
-        <w:t xml:space="preserve">bp of the predicted position — seed-and-extend, which cannot invent matches between positionally unrelated tags. Chains are processed largest-first and each query tag is counted at most once.</w:t>
-      </w:r>
-    </w:p>
-    <w:bookmarkEnd w:id="23"/>
-    <w:bookmarkStart w:id="24" w:name="Xc84f212d8323a8f017575d3d7a92fc22fb23227"/>
-    <w:p>
-      <w:pPr>
-        <w:pStyle w:val="Heading3"/>
-      </w:pPr>
-      <w:r>
-        <w:t xml:space="preserve">Chain-restricted stratified MLE, gating, and flags</w:t>
-      </w:r>
-    </w:p>
-    <w:bookmarkEnd w:id="24"/>
-    <w:bookmarkStart w:id="25" w:name="X8e7679bef5781bf7d25bcbf35a3362fe9329dc7"/>
-    <w:p>
-      <w:pPr>
-        <w:pStyle w:val="Heading3"/>
-      </w:pPr>
-      <w:r>
-        <w:t xml:space="preserve">Chain-restricted stratified MLE, gating, and flags</w:t>
-      </w:r>
-    </w:p>
-    <w:p>
-      <w:pPr>
-        <w:pStyle w:val="FirstParagraph"/>
-      </w:pPr>
-      <w:r>
-        <w:t xml:space="preserve">For a query tag inside a chained region, with tag length k, recognition-site length s, mutable body b = k − s, and mismatch budget tol, the outcome probabilities under per-base identity a are: found with m body mismatches, P_m(a) = C(b, m)·(1−a)</w:t>
-      </w:r>
-      <w:r>
-        <w:rPr>
-          <w:vertAlign w:val="superscript"/>
-        </w:rPr>
-        <w:t xml:space="preserve">m·a</w:t>
-      </w:r>
-      <w:r>
-        <w:t xml:space="preserve">(k−m) for m ≤ tol; not found, P_miss(a) = 1 − Σ P_m(a). Mismatches are observable only in the body — a site mutation deletes the tag — so the site contributes a^s but never appears in the histogram; this also sets a hard retention ceiling (~0.72 at 95% ANI, ~0.50 at 90%). The log-likelihood is summed over per-enzyme strata (each with its own k and b) and maximized over the scalar a by golden-section search. Two partial estimators —</w:t>
-      </w:r>
-      <w:r>
-        <w:t xml:space="preserve"> </w:t>
-      </w:r>
-      <w:r>
-        <w:rPr>
-          <w:rStyle w:val="VerbatimChar"/>
-        </w:rPr>
-        <w:t xml:space="preserve">ani_from_loss</w:t>
-      </w:r>
-      <w:r>
-        <w:t xml:space="preserve"> </w:t>
-      </w:r>
-      <w:r>
-        <w:t xml:space="preserve">(miss rate only) and</w:t>
-      </w:r>
-      <w:r>
-        <w:t xml:space="preserve"> </w:t>
-      </w:r>
-      <w:r>
-        <w:rPr>
-          <w:rStyle w:val="VerbatimChar"/>
-        </w:rPr>
-        <w:t xml:space="preserve">ani_from_hist</w:t>
-      </w:r>
-      <w:r>
-        <w:t xml:space="preserve"> </w:t>
-      </w:r>
-      <w:r>
-        <w:t xml:space="preserve">(histogram only, renormalized by P(found)) — are independent estimates of the same quantity and power the diagnostics.</w:t>
+        <w:rPr>
+          <w:b/>
+          <w:bCs/>
+        </w:rPr>
+        <w:t xml:space="preserve">Sampling frame.</w:t>
+      </w:r>
+      <w:r>
+        <w:t xml:space="preserve"> </w:t>
+      </w:r>
+      <w:r>
+        <w:t xml:space="preserve">GTDB release R207 [11,12] is the primary sampling frame for the real-genome benchmarks; all GTDB-R207 comparisons use dnadiff/ANIm (MUMmer 3.23, 1-to-1) as truth. CAMI2 (strain-madness and marine short-read campaigns, with source genomes and per-read ground truth) is the sampling frame for the MAG benchmark.</w:t>
       </w:r>
     </w:p>
     <w:p>
@@ -1123,160 +1617,898 @@
         <w:pStyle w:val="BodyText"/>
       </w:pPr>
       <w:r>
-        <w:t xml:space="preserve">The heterogeneous model gives each region a rate multiplier r ~ Gamma(α, α); because rate variation acts at kilobase scale while a tag is ~30 bp, all sites in a tag share one r, and integrating r out turns the mismatch count negative binomial with two parameters (mean divergence d, shape α) identifiable from the three histogram degrees of freedom plus the miss count. Guardrails: the second parameter is spent only when the likelihood-ratio statistic exceeds 3.841, and α is clamped to [0.1, 200]. Because the gamma shape and mean couple at the identifiability boundary when few tags survive (overshoots of 4–10 ANI points at mid-ANI), the shipped point estimate is</w:t>
-      </w:r>
-      <w:r>
-        <w:t xml:space="preserve"> </w:t>
-      </w:r>
-      <w:r>
-        <w:rPr>
-          <w:b/>
-          <w:bCs/>
-        </w:rPr>
-        <w:t xml:space="preserve">gated</w:t>
-      </w:r>
-      <w:r>
-        <w:t xml:space="preserve">: report the homogeneous fit when |ani_from_loss − ani_from_hist| &gt; 5 ANI points, else the gamma fit. The threshold is an effect size, not a significance level — significance-scaled variants invert their error ranking on GTDB — and was chosen at the flat optimum (4.5–6 points) of a threshold sweep on the GTDB-ANIm matrix. It fires on 5.5% of GTDB pairs (MAE 2.819 vs 2.881 always-gamma; per-pair oracle bound 2.788), 12/15 mid-ANI pairs (4.482 → 0.959), and never on uniform-rate sims, mosaic sims, or oral/gut same-species pairs, preserving gamma’s advantage exactly where it is real. The</w:t>
-      </w:r>
-      <w:r>
-        <w:t xml:space="preserve"> </w:t>
-      </w:r>
-      <w:r>
-        <w:rPr>
-          <w:rStyle w:val="VerbatimChar"/>
-        </w:rPr>
-        <w:t xml:space="preserve">flag</w:t>
-      </w:r>
-      <w:r>
-        <w:t xml:space="preserve"> </w:t>
-      </w:r>
-      <w:r>
-        <w:t xml:space="preserve">column reports</w:t>
-      </w:r>
-      <w:r>
-        <w:t xml:space="preserve"> </w:t>
-      </w:r>
-      <w:r>
-        <w:rPr>
-          <w:rStyle w:val="VerbatimChar"/>
-        </w:rPr>
-        <w:t xml:space="preserve">BELOW_DETECTION</w:t>
-      </w:r>
-      <w:r>
-        <w:t xml:space="preserve"> </w:t>
-      </w:r>
-      <w:r>
-        <w:t xml:space="preserve">(expected retention &lt; 0.20; precedence),</w:t>
-      </w:r>
-      <w:r>
-        <w:t xml:space="preserve"> </w:t>
-      </w:r>
-      <w:r>
-        <w:rPr>
-          <w:rStyle w:val="VerbatimChar"/>
-        </w:rPr>
-        <w:t xml:space="preserve">INCONSISTENT</w:t>
-      </w:r>
-      <w:r>
-        <w:t xml:space="preserve"> </w:t>
-      </w:r>
-      <w:r>
-        <w:t xml:space="preserve">(the gate fell back, or the chains carry &gt; 0.5 rearrangement breakpoints per anchor — a structural statistic that does not share the chain-restricted likelihood denominator), else</w:t>
-      </w:r>
-      <w:r>
-        <w:t xml:space="preserve"> </w:t>
-      </w:r>
-      <w:r>
-        <w:rPr>
-          <w:rStyle w:val="VerbatimChar"/>
-        </w:rPr>
-        <w:t xml:space="preserve">ok</w:t>
-      </w:r>
-      <w:r>
-        <w:t xml:space="preserve">. The recalibrated flag never inverts its error ranking on any validation set (kept vs flagged MAE: GTDB-ANIm 2.415 vs 4.153; oral/gut 0.514 vs 4.269; mid-ANI 0.343 vs 1.113), at a disclosed cost in near-clonal sensitivity.</w:t>
-      </w:r>
-    </w:p>
-    <w:bookmarkEnd w:id="25"/>
-    <w:bookmarkStart w:id="26" w:name="short-contig-rescue-pass"/>
-    <w:p>
-      <w:pPr>
-        <w:pStyle w:val="Heading3"/>
-      </w:pPr>
-      <w:r>
-        <w:t xml:space="preserve">Short-contig rescue pass</w:t>
-      </w:r>
-    </w:p>
-    <w:bookmarkEnd w:id="26"/>
-    <w:bookmarkStart w:id="27" w:name="short-contig-rescue-pass-1"/>
-    <w:p>
-      <w:pPr>
-        <w:pStyle w:val="Heading3"/>
-      </w:pPr>
-      <w:r>
-        <w:t xml:space="preserve">Short-contig rescue pass</w:t>
-      </w:r>
-    </w:p>
-    <w:p>
-      <w:pPr>
-        <w:pStyle w:val="FirstParagraph"/>
-      </w:pPr>
-      <w:r>
-        <w:t xml:space="preserve">A query contig with &lt; 8 ×</w:t>
-      </w:r>
-      <w:r>
-        <w:t xml:space="preserve"> </w:t>
-      </w:r>
-      <w:r>
-        <w:rPr>
-          <w:rStyle w:val="VerbatimChar"/>
-        </w:rPr>
-        <w:t xml:space="preserve">min_chain_anchors</w:t>
-      </w:r>
-      <w:r>
-        <w:t xml:space="preserve"> </w:t>
-      </w:r>
-      <w:r>
-        <w:t xml:space="preserve">in-panel tags (~25 kb with the default panel) and no accepted chain is folded into the likelihood without chaining if it carries a collinear group of ≥ 2 unique anchors (unique = occurring once in each genome; at least one anchor with ≤ 1 mismatch, since a solely-2-mismatch basis can be a paralog; ties break on total mismatch count). Counting replicates exactly what pass-2 chaining would count on the intact genome: tags between the outer basis anchors are counted (hits to the histogram, no match to the miss count), and a tail tag beyond an outer anchor is counted only while a bracketing anchor from any contig follows within (</w:t>
-      </w:r>
-      <w:r>
-        <w:rPr>
-          <w:rStyle w:val="VerbatimChar"/>
-        </w:rPr>
-        <w:t xml:space="preserve">max_skip</w:t>
-      </w:r>
-      <w:r>
-        <w:t xml:space="preserve"> </w:t>
-      </w:r>
-      <w:r>
-        <w:t xml:space="preserve">+ 1) × mean tag spacing along the reference. Rescued contigs contribute AF spans with the same half-median-gap extension rule as chains but create no chains, so synteny and SV outputs are untouched. The pass is gated on contig tag count, so complete and high-N50 assemblies take a bit-identical path. The residual +0.20 drift at N50 5 kb comes from contigs with 0–1 placeable anchors (~1.3 Mb on the Sakai ladder), which carry no positional evidence; rescuing them would require guessing homology.</w:t>
-      </w:r>
-    </w:p>
-    <w:bookmarkEnd w:id="27"/>
-    <w:bookmarkStart w:id="28" w:name="database-scale-screen"/>
-    <w:p>
-      <w:pPr>
-        <w:pStyle w:val="Heading3"/>
-      </w:pPr>
-      <w:r>
-        <w:t xml:space="preserve">Database-scale screen</w:t>
-      </w:r>
-    </w:p>
-    <w:bookmarkEnd w:id="28"/>
-    <w:bookmarkStart w:id="29" w:name="database-scale-screen-1"/>
-    <w:p>
-      <w:pPr>
-        <w:pStyle w:val="Heading3"/>
-      </w:pPr>
-      <w:r>
-        <w:t xml:space="preserve">Database-scale screen</w:t>
-      </w:r>
-    </w:p>
-    <w:p>
-      <w:pPr>
-        <w:pStyle w:val="FirstParagraph"/>
-      </w:pPr>
-      <w:r>
-        <w:t xml:space="preserve">Batch subcommands (</w:t>
+        <w:rPr>
+          <w:b/>
+          <w:bCs/>
+        </w:rPr>
+        <w:t xml:space="preserve">Simulated datasets (exact truth by construction).</w:t>
+      </w:r>
+      <w:r>
+        <w:t xml:space="preserve"> </w:t>
+      </w:r>
+      <w:r>
+        <w:t xml:space="preserve">Seven families, all evolved from</w:t>
+      </w:r>
+      <w:r>
+        <w:t xml:space="preserve"> </w:t>
+      </w:r>
+      <w:r>
+        <w:rPr>
+          <w:i/>
+          <w:iCs/>
+        </w:rPr>
+        <w:t xml:space="preserve">E. coli</w:t>
+      </w:r>
+      <w:r>
+        <w:t xml:space="preserve"> </w:t>
+      </w:r>
+      <w:r>
+        <w:t xml:space="preserve">K-12 MG1655 except the GC ladders: (i) the</w:t>
+      </w:r>
+      <w:r>
+        <w:t xml:space="preserve"> </w:t>
+      </w:r>
+      <w:r>
+        <w:rPr>
+          <w:b/>
+          <w:bCs/>
+        </w:rPr>
+        <w:t xml:space="preserve">ANI ladder</w:t>
+      </w:r>
+      <w:r>
+        <w:t xml:space="preserve"> </w:t>
+      </w:r>
+      <w:r>
+        <w:t xml:space="preserve">— 12 levels, 85–99.9%, each genome carrying a 400 kb inversion, generated with and without ~46 deletions of 200–2,000 bp; (ii) the</w:t>
+      </w:r>
+      <w:r>
+        <w:t xml:space="preserve"> </w:t>
+      </w:r>
+      <w:r>
+        <w:rPr>
+          <w:b/>
+          <w:bCs/>
+        </w:rPr>
+        <w:t xml:space="preserve">indel sweep</w:t>
+      </w:r>
+      <w:r>
+        <w:t xml:space="preserve"> </w:t>
+      </w:r>
+      <w:r>
+        <w:t xml:space="preserve">— ANI 95.000, 0–4 deletions per 100 kb; (iii) the</w:t>
+      </w:r>
+      <w:r>
+        <w:t xml:space="preserve"> </w:t>
+      </w:r>
+      <w:r>
+        <w:rPr>
+          <w:b/>
+          <w:bCs/>
+        </w:rPr>
+        <w:t xml:space="preserve">fragmentation ladder</w:t>
+      </w:r>
+      <w:r>
+        <w:t xml:space="preserve"> </w:t>
+      </w:r>
+      <w:r>
+        <w:t xml:space="preserve">— 20–201 contigs, ~50% reverse-complemented, order shuffled, no sequence lost; (iv) the</w:t>
+      </w:r>
+      <w:r>
+        <w:t xml:space="preserve"> </w:t>
+      </w:r>
+      <w:r>
+        <w:rPr>
+          <w:b/>
+          <w:bCs/>
+        </w:rPr>
+        <w:t xml:space="preserve">accessory-fraction sweep</w:t>
+      </w:r>
+      <w:r>
+        <w:t xml:space="preserve"> </w:t>
+      </w:r>
+      <w:r>
+        <w:t xml:space="preserve">— core ANI 95.000 with 0–50% of the genome replaced by composition-preserving shuffled blocks, plus a block-count control at fixed total fraction; (v) the</w:t>
+      </w:r>
+      <w:r>
+        <w:t xml:space="preserve"> </w:t>
+      </w:r>
+      <w:r>
+        <w:rPr>
+          <w:b/>
+          <w:bCs/>
+        </w:rPr>
+        <w:t xml:space="preserve">mosaic/rate-heterogeneity family</w:t>
+      </w:r>
+      <w:r>
+        <w:t xml:space="preserve"> </w:t>
+      </w:r>
+      <w:r>
+        <w:t xml:space="preserve">— per-block rates ~ Gamma(α, α), α = 0.5/1/2, mean ANI 90–98, plus deliberately misspecified bimodal cases (19 used in the identifiability analysis of Methods 4.7); (vi) the</w:t>
+      </w:r>
+      <w:r>
+        <w:t xml:space="preserve"> </w:t>
+      </w:r>
+      <w:r>
+        <w:rPr>
+          <w:b/>
+          <w:bCs/>
+        </w:rPr>
+        <w:t xml:space="preserve">GC ladders</w:t>
+      </w:r>
+      <w:r>
+        <w:t xml:space="preserve"> </w:t>
+      </w:r>
+      <w:r>
+        <w:t xml:space="preserve">— substitution ladders on five real template genomes spanning GC 27.2–72.1%; and (vii) the</w:t>
+      </w:r>
+      <w:r>
+        <w:t xml:space="preserve"> </w:t>
+      </w:r>
+      <w:r>
+        <w:rPr>
+          <w:b/>
+          <w:bCs/>
+        </w:rPr>
+        <w:t xml:space="preserve">inversion ladder</w:t>
+      </w:r>
+      <w:r>
+        <w:t xml:space="preserve"> </w:t>
+      </w:r>
+      <w:r>
+        <w:t xml:space="preserve">for synteny validation — ANI 95.00/98.00 with 0–32 non-overlapping inversions of 100–400 kb (2 exact breakpoints each;</w:t>
+      </w:r>
+      <w:r>
+        <w:t xml:space="preserve"> </w:t>
+      </w:r>
+      <w:r>
+        <w:rPr>
+          <w:rStyle w:val="VerbatimChar"/>
+        </w:rPr>
+        <w:t xml:space="preserve">scripts/synteny_bench/</w:t>
+      </w:r>
+      <w:r>
+        <w:t xml:space="preserve">).</w:t>
+      </w:r>
+    </w:p>
+    <w:p>
+      <w:pPr>
+        <w:pStyle w:val="BodyText"/>
+      </w:pPr>
+      <w:r>
+        <w:rPr>
+          <w:b/>
+          <w:bCs/>
+        </w:rPr>
+        <w:t xml:space="preserve">GTDB-R207 benchmark series.</w:t>
+      </w:r>
+      <w:r>
+        <w:t xml:space="preserve"> </w:t>
+      </w:r>
+      <w:r>
+        <w:t xml:space="preserve">These datasets form a single coherent evaluation built from GTDB-R207. They are disjoint at the genome level wherever independence is required.</w:t>
+      </w:r>
+      <w:r>
+        <w:t xml:space="preserve"> </w:t>
+      </w:r>
+      <w:r>
+        <w:t xml:space="preserve">-</w:t>
+      </w:r>
+      <w:r>
+        <w:t xml:space="preserve"> </w:t>
+      </w:r>
+      <w:r>
+        <w:rPr>
+          <w:b/>
+          <w:bCs/>
+        </w:rPr>
+        <w:t xml:space="preserve">Calibration/training set (v5).</w:t>
+      </w:r>
+      <w:r>
+        <w:t xml:space="preserve"> </w:t>
+      </w:r>
+      <w:r>
+        <w:t xml:space="preserve">2,520 pairs (80–99.5% ANIm) used to train the ridge calibration. This combines 2,074 representative pairs stratified across 80–85/85–90/90–95/95–99 bands and phyla, with 467 targeted 95–99.5% pairs selected by screening all 2.26 M same-genus representative pairs with skani and running dnadiff on 650 candidates (607 species, 26 phyla).</w:t>
+      </w:r>
+      <w:r>
+        <w:t xml:space="preserve"> </w:t>
+      </w:r>
+      <w:r>
+        <w:t xml:space="preserve">-</w:t>
+      </w:r>
+      <w:r>
+        <w:t xml:space="preserve"> </w:t>
+      </w:r>
+      <w:r>
+        <w:rPr>
+          <w:b/>
+          <w:bCs/>
+        </w:rPr>
+        <w:t xml:space="preserve">Large-scale FastANI comparison set.</w:t>
+      </w:r>
+      <w:r>
+        <w:t xml:space="preserve"> </w:t>
+      </w:r>
+      <w:r>
+        <w:t xml:space="preserve">45,000 representative pairs sampled across taxonomic levels (intra-species / intra-genus / intra-family / random;</w:t>
+      </w:r>
+      <w:r>
+        <w:t xml:space="preserve"> </w:t>
+      </w:r>
+      <w:r>
+        <w:rPr>
+          <w:rStyle w:val="VerbatimChar"/>
+        </w:rPr>
+        <w:t xml:space="preserve">scripts/sample_gtdb_pairs.py</w:t>
+      </w:r>
+      <w:r>
+        <w:t xml:space="preserve">, seed-fixed). FastANI reports 672 of these pairs and they provide the large-scale comparison in Fig. 6.</w:t>
+      </w:r>
+      <w:r>
+        <w:t xml:space="preserve"> </w:t>
+      </w:r>
+      <w:r>
+        <w:t xml:space="preserve">-</w:t>
+      </w:r>
+      <w:r>
+        <w:t xml:space="preserve"> </w:t>
+      </w:r>
+      <w:r>
+        <w:rPr>
+          <w:b/>
+          <w:bCs/>
+        </w:rPr>
+        <w:t xml:space="preserve">Strict held-out benchmark.</w:t>
+      </w:r>
+      <w:r>
+        <w:t xml:space="preserve"> </w:t>
+      </w:r>
+      <w:r>
+        <w:t xml:space="preserve">43,334 same-genus representative pairs sampled from the 628,617 non-self GTDB-R207 representative pairs passing a skani pre-screen (AF ≥ 15%), stratified into bands 80–85 / 85–90 / 90–95 / 95–100% (12,172 / 16,000 / 14,758 / 404 pairs; 24,831 genomes, 74 phyla;</w:t>
+      </w:r>
+      <w:r>
+        <w:t xml:space="preserve"> </w:t>
+      </w:r>
+      <w:r>
+        <w:rPr>
+          <w:rStyle w:val="VerbatimChar"/>
+        </w:rPr>
+        <w:t xml:space="preserve">scripts/gtdb50k/</w:t>
+      </w:r>
+      <w:r>
+        <w:t xml:space="preserve">). Every genome in the v5 calibration set was excluded in both directions, making this a strict holdout for the gate, flag, and calibration; dnadiff/ANIm truth was computed for all pairs.</w:t>
+      </w:r>
+      <w:r>
+        <w:t xml:space="preserve"> </w:t>
+      </w:r>
+      <w:r>
+        <w:t xml:space="preserve">-</w:t>
+      </w:r>
+      <w:r>
+        <w:t xml:space="preserve"> </w:t>
+      </w:r>
+      <w:r>
+        <w:rPr>
+          <w:b/>
+          <w:bCs/>
+        </w:rPr>
+        <w:t xml:space="preserve">High-ANI test set.</w:t>
+      </w:r>
+      <w:r>
+        <w:t xml:space="preserve"> </w:t>
+      </w:r>
+      <w:r>
+        <w:t xml:space="preserve">727 test pairs sampled from non-representative GTDB-R207 genomes (95–97%, n = 95; 97–100%, n = 632), excluding genomes in the v5 calibration set or the 43,334 held-out set in either direction. These add dense coverage of the 95–100% regime that the held-out representative set lacks.</w:t>
+      </w:r>
+      <w:r>
+        <w:t xml:space="preserve"> </w:t>
+      </w:r>
+      <w:r>
+        <w:t xml:space="preserve">-</w:t>
+      </w:r>
+      <w:r>
+        <w:t xml:space="preserve"> </w:t>
+      </w:r>
+      <w:r>
+        <w:rPr>
+          <w:b/>
+          <w:bCs/>
+        </w:rPr>
+        <w:t xml:space="preserve">Unified 80–100% benchmark.</w:t>
+      </w:r>
+      <w:r>
+        <w:t xml:space="preserve"> </w:t>
+      </w:r>
+      <w:r>
+        <w:t xml:space="preserve">The 43,334 held-out pairs combined with the 727 high-ANI test pairs (44,061 total), used to evaluate the hybrid estimator (Supplementary Fig. S3).</w:t>
+      </w:r>
+    </w:p>
+    <w:p>
+      <w:pPr>
+        <w:pStyle w:val="BodyText"/>
+      </w:pPr>
+      <w:r>
+        <w:rPr>
+          <w:b/>
+          <w:bCs/>
+        </w:rPr>
+        <w:t xml:space="preserve">External validation sets.</w:t>
+      </w:r>
+      <w:r>
+        <w:t xml:space="preserve"> </w:t>
+      </w:r>
+      <w:r>
+        <w:t xml:space="preserve">Independent of the GTDB-R207 series.</w:t>
+      </w:r>
+      <w:r>
+        <w:t xml:space="preserve"> </w:t>
+      </w:r>
+      <w:r>
+        <w:t xml:space="preserve">-</w:t>
+      </w:r>
+      <w:r>
+        <w:t xml:space="preserve"> </w:t>
+      </w:r>
+      <w:r>
+        <w:rPr>
+          <w:b/>
+          <w:bCs/>
+        </w:rPr>
+        <w:t xml:space="preserve">Mid-ANI set.</w:t>
+      </w:r>
+      <w:r>
+        <w:t xml:space="preserve"> </w:t>
+      </w:r>
+      <w:r>
+        <w:t xml:space="preserve">15 pairs (</w:t>
+      </w:r>
+      <w:r>
+        <w:rPr>
+          <w:i/>
+          <w:iCs/>
+        </w:rPr>
+        <w:t xml:space="preserve">Bifidobacterium longum</w:t>
+      </w:r>
+      <w:r>
+        <w:t xml:space="preserve"> </w:t>
+      </w:r>
+      <w:r>
+        <w:t xml:space="preserve">×</w:t>
+      </w:r>
+      <w:r>
+        <w:t xml:space="preserve"> </w:t>
+      </w:r>
+      <w:r>
+        <w:rPr>
+          <w:i/>
+          <w:iCs/>
+        </w:rPr>
+        <w:t xml:space="preserve">B. breve</w:t>
+      </w:r>
+      <w:r>
+        <w:t xml:space="preserve">,</w:t>
+      </w:r>
+      <w:r>
+        <w:t xml:space="preserve"> </w:t>
+      </w:r>
+      <w:r>
+        <w:rPr>
+          <w:i/>
+          <w:iCs/>
+        </w:rPr>
+        <w:t xml:space="preserve">Veillonella parvula</w:t>
+      </w:r>
+      <w:r>
+        <w:t xml:space="preserve"> </w:t>
+      </w:r>
+      <w:r>
+        <w:t xml:space="preserve">×</w:t>
+      </w:r>
+      <w:r>
+        <w:t xml:space="preserve"> </w:t>
+      </w:r>
+      <w:r>
+        <w:rPr>
+          <w:i/>
+          <w:iCs/>
+        </w:rPr>
+        <w:t xml:space="preserve">V. dispar</w:t>
+      </w:r>
+      <w:r>
+        <w:t xml:space="preserve">), ANIm truth 87.6–90.2%; ANIm alignment coverage is only 46–72% of these genomes.</w:t>
+      </w:r>
+      <w:r>
+        <w:t xml:space="preserve"> </w:t>
+      </w:r>
+      <w:r>
+        <w:t xml:space="preserve">-</w:t>
+      </w:r>
+      <w:r>
+        <w:t xml:space="preserve"> </w:t>
+      </w:r>
+      <w:r>
+        <w:rPr>
+          <w:b/>
+          <w:bCs/>
+        </w:rPr>
+        <w:t xml:space="preserve">Oral/gut set.</w:t>
+      </w:r>
+      <w:r>
+        <w:t xml:space="preserve"> </w:t>
+      </w:r>
+      <w:r>
+        <w:t xml:space="preserve">50 isolate genomes from 10 species — 5 oral (</w:t>
+      </w:r>
+      <w:r>
+        <w:rPr>
+          <w:i/>
+          <w:iCs/>
+        </w:rPr>
+        <w:t xml:space="preserve">Aggregatibacter actinomycetemcomitans</w:t>
+      </w:r>
+      <w:r>
+        <w:t xml:space="preserve">,</w:t>
+      </w:r>
+      <w:r>
+        <w:t xml:space="preserve"> </w:t>
+      </w:r>
+      <w:r>
+        <w:rPr>
+          <w:i/>
+          <w:iCs/>
+        </w:rPr>
+        <w:t xml:space="preserve">Fusobacterium nucleatum</w:t>
+      </w:r>
+      <w:r>
+        <w:t xml:space="preserve">,</w:t>
+      </w:r>
+      <w:r>
+        <w:t xml:space="preserve"> </w:t>
+      </w:r>
+      <w:r>
+        <w:rPr>
+          <w:i/>
+          <w:iCs/>
+        </w:rPr>
+        <w:t xml:space="preserve">Porphyromonas gingivalis</w:t>
+      </w:r>
+      <w:r>
+        <w:t xml:space="preserve">,</w:t>
+      </w:r>
+      <w:r>
+        <w:t xml:space="preserve"> </w:t>
+      </w:r>
+      <w:r>
+        <w:rPr>
+          <w:i/>
+          <w:iCs/>
+        </w:rPr>
+        <w:t xml:space="preserve">Streptococcus mutans</w:t>
+      </w:r>
+      <w:r>
+        <w:t xml:space="preserve">,</w:t>
+      </w:r>
+      <w:r>
+        <w:t xml:space="preserve"> </w:t>
+      </w:r>
+      <w:r>
+        <w:rPr>
+          <w:i/>
+          <w:iCs/>
+        </w:rPr>
+        <w:t xml:space="preserve">S. sanguinis</w:t>
+      </w:r>
+      <w:r>
+        <w:t xml:space="preserve">) and 5 gut (</w:t>
+      </w:r>
+      <w:r>
+        <w:rPr>
+          <w:i/>
+          <w:iCs/>
+        </w:rPr>
+        <w:t xml:space="preserve">Akkermansia muciniphila</w:t>
+      </w:r>
+      <w:r>
+        <w:t xml:space="preserve">,</w:t>
+      </w:r>
+      <w:r>
+        <w:t xml:space="preserve"> </w:t>
+      </w:r>
+      <w:r>
+        <w:rPr>
+          <w:i/>
+          <w:iCs/>
+        </w:rPr>
+        <w:t xml:space="preserve">Bacteroides fragilis</w:t>
+      </w:r>
+      <w:r>
+        <w:t xml:space="preserve">,</w:t>
+      </w:r>
+      <w:r>
+        <w:t xml:space="preserve"> </w:t>
+      </w:r>
+      <w:r>
+        <w:rPr>
+          <w:i/>
+          <w:iCs/>
+        </w:rPr>
+        <w:t xml:space="preserve">B. longum</w:t>
+      </w:r>
+      <w:r>
+        <w:t xml:space="preserve">,</w:t>
+      </w:r>
+      <w:r>
+        <w:t xml:space="preserve"> </w:t>
+      </w:r>
+      <w:r>
+        <w:rPr>
+          <w:i/>
+          <w:iCs/>
+        </w:rPr>
+        <w:t xml:space="preserve">Faecalibacterium prausnitzii</w:t>
+      </w:r>
+      <w:r>
+        <w:t xml:space="preserve">,</w:t>
+      </w:r>
+      <w:r>
+        <w:t xml:space="preserve"> </w:t>
+      </w:r>
+      <w:r>
+        <w:rPr>
+          <w:i/>
+          <w:iCs/>
+        </w:rPr>
+        <w:t xml:space="preserve">Ruminococcus intestinalis</w:t>
+      </w:r>
+      <w:r>
+        <w:t xml:space="preserve">), 5 genomes per species — compared all-vs-all (1,225 pairs). The 100 same-species pairs serve as the external near-clonal benchmark against FastANI and skani; 1,100 cross-species pairs probe the below-detection regime.</w:t>
+      </w:r>
+    </w:p>
+    <w:p>
+      <w:pPr>
+        <w:pStyle w:val="BodyText"/>
+      </w:pPr>
+      <w:r>
+        <w:rPr>
+          <w:b/>
+          <w:bCs/>
+        </w:rPr>
+        <w:t xml:space="preserve">Structural-variation and MAG validation.</w:t>
+      </w:r>
+      <w:r>
+        <w:t xml:space="preserve"> </w:t>
+      </w:r>
+      <w:r>
+        <w:t xml:space="preserve">-</w:t>
+      </w:r>
+      <w:r>
+        <w:t xml:space="preserve"> </w:t>
+      </w:r>
+      <w:r>
+        <w:rPr>
+          <w:b/>
+          <w:bCs/>
+        </w:rPr>
+        <w:t xml:space="preserve">Enterobacteriaceae completes.</w:t>
+      </w:r>
+      <w:r>
+        <w:t xml:space="preserve"> </w:t>
+      </w:r>
+      <w:r>
+        <w:t xml:space="preserve">13 finished chromosomes versus</w:t>
+      </w:r>
+      <w:r>
+        <w:t xml:space="preserve"> </w:t>
+      </w:r>
+      <w:r>
+        <w:rPr>
+          <w:i/>
+          <w:iCs/>
+        </w:rPr>
+        <w:t xml:space="preserve">E. coli</w:t>
+      </w:r>
+      <w:r>
+        <w:t xml:space="preserve"> </w:t>
+      </w:r>
+      <w:r>
+        <w:t xml:space="preserve">K-12 MG1655, spanning ANI ~81–99.99%. Three pairs (MG1655/W3110, MG1655/O157:H7 Sakai,</w:t>
+      </w:r>
+      <w:r>
+        <w:t xml:space="preserve"> </w:t>
+      </w:r>
+      <w:r>
+        <w:rPr>
+          <w:i/>
+          <w:iCs/>
+        </w:rPr>
+        <w:t xml:space="preserve">Salmonella</w:t>
+      </w:r>
+      <w:r>
+        <w:t xml:space="preserve"> </w:t>
+      </w:r>
+      <w:r>
+        <w:t xml:space="preserve">Typhi CT18 /</w:t>
+      </w:r>
+      <w:r>
+        <w:t xml:space="preserve"> </w:t>
+      </w:r>
+      <w:r>
+        <w:rPr>
+          <w:i/>
+          <w:iCs/>
+        </w:rPr>
+        <w:t xml:space="preserve">S.</w:t>
+      </w:r>
+      <w:r>
+        <w:t xml:space="preserve"> </w:t>
+      </w:r>
+      <w:r>
+        <w:t xml:space="preserve">Typhimurium LT2) double as the structural-variation validation set with dnadiff structural truth.</w:t>
+      </w:r>
+      <w:r>
+        <w:t xml:space="preserve"> </w:t>
+      </w:r>
+      <w:r>
+        <w:t xml:space="preserve">-</w:t>
+      </w:r>
+      <w:r>
+        <w:t xml:space="preserve"> </w:t>
+      </w:r>
+      <w:r>
+        <w:rPr>
+          <w:b/>
+          <w:bCs/>
+        </w:rPr>
+        <w:t xml:space="preserve">Real draft assemblies.</w:t>
+      </w:r>
+      <w:r>
+        <w:t xml:space="preserve"> </w:t>
+      </w:r>
+      <w:r>
+        <w:t xml:space="preserve">8</w:t>
+      </w:r>
+      <w:r>
+        <w:t xml:space="preserve"> </w:t>
+      </w:r>
+      <w:r>
+        <w:rPr>
+          <w:i/>
+          <w:iCs/>
+        </w:rPr>
+        <w:t xml:space="preserve">E. coli</w:t>
+      </w:r>
+      <w:r>
+        <w:t xml:space="preserve"> </w:t>
+      </w:r>
+      <w:r>
+        <w:t xml:space="preserve">assemblies from ENA (GCA_001283865, GCA_001077875, GCA_001284645, GCA_001283245, GCA_001283605, GCA_001284145, GCA_001283205, GCA_001075925; 88–8,025 contigs), including reverse-complement self-controls.</w:t>
+      </w:r>
+      <w:r>
+        <w:t xml:space="preserve"> </w:t>
+      </w:r>
+      <w:r>
+        <w:t xml:space="preserve">-</w:t>
+      </w:r>
+      <w:r>
+        <w:t xml:space="preserve"> </w:t>
+      </w:r>
+      <w:r>
+        <w:rPr>
+          <w:b/>
+          <w:bCs/>
+        </w:rPr>
+        <w:t xml:space="preserve">CAMI2 MAG benchmark.</w:t>
+      </w:r>
+      <w:r>
+        <w:t xml:space="preserve"> </w:t>
+      </w:r>
+      <w:r>
+        <w:t xml:space="preserve">35 short-read samples (25 strain-madness, 10 marine) assembled with MEGAHIT, binned with MetaBAT2, and quality-scored with CheckM2; 695 bins ≥ 100 kbp were retained (HQ 200 / MQ 210 / LQ 285). Contigs were assigned to CAMI2 source genomes by exact k-mer membership; each bin was classified clean, strain-mixed, or cross-species, and paired with its dominant source genome (</w:t>
+      </w:r>
+      <w:r>
+        <w:t xml:space="preserve">“anchor”</w:t>
+      </w:r>
+      <w:r>
+        <w:t xml:space="preserve">). Each tool estimated ANI of the bin against the anchor reference; dnadiff/ANIm provided truth. Pipeline scripts and per-pair outputs are in</w:t>
+      </w:r>
+      <w:r>
+        <w:t xml:space="preserve"> </w:t>
+      </w:r>
+      <w:r>
+        <w:rPr>
+          <w:rStyle w:val="VerbatimChar"/>
+        </w:rPr>
+        <w:t xml:space="preserve">results/mag_validation/</w:t>
+      </w:r>
+      <w:r>
+        <w:t xml:space="preserve">.</w:t>
+      </w:r>
+      <w:r>
+        <w:t xml:space="preserve"> </w:t>
+      </w:r>
+      <w:r>
+        <w:t xml:space="preserve">-</w:t>
+      </w:r>
+      <w:r>
+        <w:t xml:space="preserve"> </w:t>
+      </w:r>
+      <w:r>
+        <w:rPr>
+          <w:b/>
+          <w:bCs/>
+        </w:rPr>
+        <w:t xml:space="preserve">Syntracker validation isolates.</w:t>
+      </w:r>
+      <w:r>
+        <w:t xml:space="preserve"> </w:t>
+      </w:r>
+      <w:r>
+        <w:t xml:space="preserve">Four published isolate collections were used to test whether high ANI guarantees conserved genome architecture:</w:t>
+      </w:r>
+      <w:r>
+        <w:t xml:space="preserve"> </w:t>
+      </w:r>
+      <w:r>
+        <w:rPr>
+          <w:i/>
+          <w:iCs/>
+        </w:rPr>
+        <w:t xml:space="preserve">Escherichia coli</w:t>
+      </w:r>
+      <w:r>
+        <w:t xml:space="preserve"> </w:t>
+      </w:r>
+      <w:r>
+        <w:t xml:space="preserve">hypermutator (23 isolates, 253 pairs),</w:t>
+      </w:r>
+      <w:r>
+        <w:t xml:space="preserve"> </w:t>
+      </w:r>
+      <w:r>
+        <w:rPr>
+          <w:i/>
+          <w:iCs/>
+        </w:rPr>
+        <w:t xml:space="preserve">Helicobacter pylori</w:t>
+      </w:r>
+      <w:r>
+        <w:t xml:space="preserve"> </w:t>
+      </w:r>
+      <w:r>
+        <w:t xml:space="preserve">(77 isolates, 2,926 pairs),</w:t>
+      </w:r>
+      <w:r>
+        <w:t xml:space="preserve"> </w:t>
+      </w:r>
+      <w:r>
+        <w:rPr>
+          <w:i/>
+          <w:iCs/>
+        </w:rPr>
+        <w:t xml:space="preserve">Neisseria gonorrhoeae</w:t>
+      </w:r>
+      <w:r>
+        <w:t xml:space="preserve"> </w:t>
+      </w:r>
+      <w:r>
+        <w:t xml:space="preserve">(66 pairs), and</w:t>
+      </w:r>
+      <w:r>
+        <w:t xml:space="preserve"> </w:t>
+      </w:r>
+      <w:r>
+        <w:rPr>
+          <w:i/>
+          <w:iCs/>
+        </w:rPr>
+        <w:t xml:space="preserve">Streptomyces rimosus</w:t>
+      </w:r>
+      <w:r>
+        <w:t xml:space="preserve"> </w:t>
+      </w:r>
+      <w:r>
+        <w:t xml:space="preserve">(190 pairs). SRA accessions and references are in</w:t>
+      </w:r>
+      <w:r>
+        <w:t xml:space="preserve"> </w:t>
+      </w:r>
+      <w:r>
+        <w:rPr>
+          <w:rStyle w:val="VerbatimChar"/>
+        </w:rPr>
+        <w:t xml:space="preserve">data/syntracker/</w:t>
+      </w:r>
+      <w:r>
+        <w:t xml:space="preserve">; all isolates were compared all-vs-all with</w:t>
+      </w:r>
+      <w:r>
+        <w:t xml:space="preserve"> </w:t>
+      </w:r>
+      <w:r>
+        <w:rPr>
+          <w:rStyle w:val="VerbatimChar"/>
+        </w:rPr>
+        <w:t xml:space="preserve">syn2bani ani</w:t>
+      </w:r>
+      <w:r>
+        <w:t xml:space="preserve">, and</w:t>
+      </w:r>
+      <w:r>
+        <w:t xml:space="preserve"> </w:t>
+      </w:r>
+      <w:r>
+        <w:rPr>
+          <w:rStyle w:val="VerbatimChar"/>
+        </w:rPr>
+        <w:t xml:space="preserve">synteny_score</w:t>
+      </w:r>
+      <w:r>
+        <w:t xml:space="preserve"> </w:t>
+      </w:r>
+      <w:r>
+        <w:t xml:space="preserve">and</w:t>
+      </w:r>
+      <w:r>
+        <w:t xml:space="preserve"> </w:t>
+      </w:r>
+      <w:r>
+        <w:rPr>
+          <w:rStyle w:val="VerbatimChar"/>
+        </w:rPr>
+        <w:t xml:space="preserve">breakpoint_count</w:t>
+      </w:r>
+      <w:r>
+        <w:t xml:space="preserve"> </w:t>
+      </w:r>
+      <w:r>
+        <w:t xml:space="preserve">were taken from the same pass. Top-discordant cases were re-analyzed with</w:t>
+      </w:r>
+      <w:r>
+        <w:t xml:space="preserve"> </w:t>
+      </w:r>
+      <w:r>
+        <w:rPr>
+          <w:rStyle w:val="VerbatimChar"/>
+        </w:rPr>
+        <w:t xml:space="preserve">syn2bani struct</w:t>
+      </w:r>
+      <w:r>
+        <w:t xml:space="preserve"> </w:t>
+      </w:r>
+      <w:r>
+        <w:t xml:space="preserve">(Fig. 11, Fig. 12;</w:t>
+      </w:r>
+      <w:r>
+        <w:t xml:space="preserve"> </w:t>
+      </w:r>
+      <w:r>
+        <w:rPr>
+          <w:rStyle w:val="VerbatimChar"/>
+        </w:rPr>
+        <w:t xml:space="preserve">results/syntracker_validation/</w:t>
+      </w:r>
+      <w:r>
+        <w:t xml:space="preserve">).</w:t>
+      </w:r>
+    </w:p>
+    <w:p>
+      <w:pPr>
+        <w:pStyle w:val="BodyText"/>
+      </w:pPr>
+      <w:r>
+        <w:rPr>
+          <w:b/>
+          <w:bCs/>
+        </w:rPr>
+        <w:t xml:space="preserve">Tools and versions.</w:t>
+      </w:r>
+      <w:r>
+        <w:t xml:space="preserve"> </w:t>
+      </w:r>
+      <w:r>
+        <w:t xml:space="preserve">Syn2bANI 0.1.0 (default panel BcgI,AlfI,AloI,FalI; deployed calibration v5), skani 0.1.0 (0.3.2 for the HPC database-scale runs), FastANI 1.33/1.34, MUMmer/dnadiff 3.23. Per-pair efficiency was measured on a Mac Studio (Apple M4 Max, 16 cores, 128 GB RAM; 3 repetitions, medians reported); database-scale runs used a 32-thread HPC node. skani’s n = 22</w:t>
+      </w:r>
+      <w:r>
+        <w:t xml:space="preserve"> </w:t>
       </w:r>
       <w:r>
         <w:rPr>
@@ -1285,1347 +2517,14 @@
         <w:t xml:space="preserve">dist</w:t>
       </w:r>
       <w:r>
-        <w:t xml:space="preserve">,</w:t>
-      </w:r>
-      <w:r>
-        <w:t xml:space="preserve"> </w:t>
-      </w:r>
-      <w:r>
-        <w:rPr>
-          <w:rStyle w:val="VerbatimChar"/>
-        </w:rPr>
-        <w:t xml:space="preserve">search</w:t>
-      </w:r>
-      <w:r>
-        <w:t xml:space="preserve">,</w:t>
-      </w:r>
-      <w:r>
-        <w:t xml:space="preserve"> </w:t>
-      </w:r>
-      <w:r>
-        <w:rPr>
-          <w:rStyle w:val="VerbatimChar"/>
-        </w:rPr>
-        <w:t xml:space="preserve">triangle</w:t>
-      </w:r>
-      <w:r>
-        <w:t xml:space="preserve">,</w:t>
-      </w:r>
-      <w:r>
-        <w:t xml:space="preserve"> </w:t>
-      </w:r>
-      <w:r>
-        <w:rPr>
-          <w:rStyle w:val="VerbatimChar"/>
-        </w:rPr>
-        <w:t xml:space="preserve">db search</w:t>
-      </w:r>
-      <w:r>
-        <w:t xml:space="preserve">) run a two-stage pipeline. Stage 1 reduces each tag to one strand-canonical key — its centered 18 bp packed window — per enzyme; a pair passes iff shared keys ≥ 3 AND shared/min(smaller key set) ≥ 0.001. At 18 bp, generic background homology (shared genes at 65–75% identity) no longer saturates key containment, and the gate was calibrated on GTDB-R207 to false-reject 0/500 validated ≥ 80% ANI pairs while rejecting ~83% of random pairs (measured false-reject rate on estimator-reportable pairs at n = 2,000: 1/844). In the FRR-critical 80–85% band the weakest validated true pair clears the floors by 10×/6×. Stage 2 refines survivors with the identical</w:t>
-      </w:r>
-      <w:r>
-        <w:t xml:space="preserve"> </w:t>
-      </w:r>
-      <w:r>
-        <w:rPr>
-          <w:rStyle w:val="VerbatimChar"/>
-        </w:rPr>
-        <w:t xml:space="preserve">chain_ani</w:t>
-      </w:r>
-      <w:r>
-        <w:t xml:space="preserve"> </w:t>
-      </w:r>
-      <w:r>
-        <w:t xml:space="preserve">code path and row formatter as the pairwise</w:t>
-      </w:r>
-      <w:r>
-        <w:t xml:space="preserve"> </w:t>
-      </w:r>
-      <w:r>
-        <w:rPr>
-          <w:rStyle w:val="VerbatimChar"/>
-        </w:rPr>
-        <w:t xml:space="preserve">ani</w:t>
-      </w:r>
-      <w:r>
-        <w:t xml:space="preserve"> </w:t>
-      </w:r>
-      <w:r>
-        <w:t xml:space="preserve">command, so database output is byte-identical to pairwise output on the same pairs. Screen thresholds are panel-specific and exposed as flags.</w:t>
+        <w:t xml:space="preserve"> </w:t>
+      </w:r>
+      <w:r>
+        <w:t xml:space="preserve">time covers only 302/484 reported pairs (minimum-AF filter) and excludes sketching; we note this wherever the comparison appears.</w:t>
       </w:r>
     </w:p>
     <w:bookmarkEnd w:id="29"/>
-    <w:bookmarkStart w:id="30" w:name="ridge-calibration-protocol"/>
-    <w:p>
-      <w:pPr>
-        <w:pStyle w:val="Heading3"/>
-      </w:pPr>
-      <w:r>
-        <w:t xml:space="preserve">Ridge calibration protocol</w:t>
-      </w:r>
-    </w:p>
-    <w:bookmarkEnd w:id="30"/>
-    <w:bookmarkStart w:id="31" w:name="ridge-calibration-protocol-1"/>
-    <w:p>
-      <w:pPr>
-        <w:pStyle w:val="Heading3"/>
-      </w:pPr>
-      <w:r>
-        <w:t xml:space="preserve">Ridge calibration protocol</w:t>
-      </w:r>
-    </w:p>
-    <w:p>
-      <w:pPr>
-        <w:pStyle w:val="FirstParagraph"/>
-      </w:pPr>
-      <w:r>
-        <w:t xml:space="preserve">The calibration model is ridge regression on nine Syn2bANI-internal features —</w:t>
-      </w:r>
-      <w:r>
-        <w:t xml:space="preserve"> </w:t>
-      </w:r>
-      <w:r>
-        <w:rPr>
-          <w:rStyle w:val="VerbatimChar"/>
-        </w:rPr>
-        <w:t xml:space="preserve">ani_gated</w:t>
-      </w:r>
-      <w:r>
-        <w:t xml:space="preserve">,</w:t>
-      </w:r>
-      <w:r>
-        <w:t xml:space="preserve"> </w:t>
-      </w:r>
-      <w:r>
-        <w:rPr>
-          <w:rStyle w:val="VerbatimChar"/>
-        </w:rPr>
-        <w:t xml:space="preserve">ani_uniform</w:t>
-      </w:r>
-      <w:r>
-        <w:t xml:space="preserve">,</w:t>
-      </w:r>
-      <w:r>
-        <w:t xml:space="preserve"> </w:t>
-      </w:r>
-      <w:r>
-        <w:rPr>
-          <w:rStyle w:val="VerbatimChar"/>
-        </w:rPr>
-        <w:t xml:space="preserve">af_query</w:t>
-      </w:r>
-      <w:r>
-        <w:t xml:space="preserve">,</w:t>
-      </w:r>
-      <w:r>
-        <w:t xml:space="preserve"> </w:t>
-      </w:r>
-      <w:r>
-        <w:rPr>
-          <w:rStyle w:val="VerbatimChar"/>
-        </w:rPr>
-        <w:t xml:space="preserve">af_reference</w:t>
-      </w:r>
-      <w:r>
-        <w:t xml:space="preserve">,</w:t>
-      </w:r>
-      <w:r>
-        <w:t xml:space="preserve"> </w:t>
-      </w:r>
-      <w:r>
-        <w:rPr>
-          <w:rStyle w:val="VerbatimChar"/>
-        </w:rPr>
-        <w:t xml:space="preserve">std_err</w:t>
-      </w:r>
-      <w:r>
-        <w:t xml:space="preserve">,</w:t>
-      </w:r>
-      <w:r>
-        <w:t xml:space="preserve"> </w:t>
-      </w:r>
-      <w:r>
-        <w:rPr>
-          <w:rStyle w:val="VerbatimChar"/>
-        </w:rPr>
-        <w:t xml:space="preserve">retention</w:t>
-      </w:r>
-      <w:r>
-        <w:t xml:space="preserve">,</w:t>
-      </w:r>
-      <w:r>
-        <w:t xml:space="preserve"> </w:t>
-      </w:r>
-      <w:r>
-        <w:rPr>
-          <w:rStyle w:val="VerbatimChar"/>
-        </w:rPr>
-        <w:t xml:space="preserve">n_anchors</w:t>
-      </w:r>
-      <w:r>
-        <w:t xml:space="preserve">,</w:t>
-      </w:r>
-      <w:r>
-        <w:t xml:space="preserve"> </w:t>
-      </w:r>
-      <w:r>
-        <w:rPr>
-          <w:rStyle w:val="VerbatimChar"/>
-        </w:rPr>
-        <w:t xml:space="preserve">n_chains</w:t>
-      </w:r>
-      <w:r>
-        <w:t xml:space="preserve">,</w:t>
-      </w:r>
-      <w:r>
-        <w:t xml:space="preserve"> </w:t>
-      </w:r>
-      <w:r>
-        <w:rPr>
-          <w:rStyle w:val="VerbatimChar"/>
-        </w:rPr>
-        <w:t xml:space="preserve">n_tags_in_chains</w:t>
-      </w:r>
-      <w:r>
-        <w:t xml:space="preserve"> </w:t>
-      </w:r>
-      <w:r>
-        <w:t xml:space="preserve">— with median imputation and standardization, regularization α = 10 selected by inner cross-validation (scikit-learn [18]), trained on 2,520 ANIm-truth pairs (2,053 finite pairs from the stratified 2,074-pair GTDB benchmark plus 467 targeted 95.0–99.15% ANIm pairs from a skani screen of all 2.26 M same-genus GTDB-R207 pairs followed by dnadiff on 650 selected candidates; 607 species, 26 phyla, zero overlap with the existing set). Validation is</w:t>
-      </w:r>
-      <w:r>
-        <w:t xml:space="preserve"> </w:t>
-      </w:r>
-      <w:r>
-        <w:rPr>
-          <w:b/>
-          <w:bCs/>
-        </w:rPr>
-        <w:t xml:space="preserve">band-holdout</w:t>
-      </w:r>
-      <w:r>
-        <w:t xml:space="preserve">: each of the four ANI bands (80–85, 85–90, 90–95, 95–99) is predicted by a model trained on the other three only. Training rows are shuffled with a fixed seed before CV (the inner KFold of the ridge CV is order-sensitive); seed spread over 5 seeds is ≤ 0.0015 MAE. An expanded 18-feature variant and a gradient-boosted model on the same features were evaluated and rejected (nonlinearity buys nothing at n ≈ 2,500, and the expanded set degrades out-of-distribution on near-clonal pairs). A learning-curve analysis (492/984/1,476/1,969 training pairs → CV MAE 0.952/0.902/0.887/0.893) shows the linear model plateaus at ~1,500 pairs. The model ships as a versioned JSON swapped into the binary; all feature matrices were re-run with the post-rescue binary before training, so there is no version skew between the shipped estimator and the deployed model. Calibrated output is a separate column (</w:t>
-      </w:r>
-      <w:r>
-        <w:rPr>
-          <w:rStyle w:val="VerbatimChar"/>
-        </w:rPr>
-        <w:t xml:space="preserve">--calibrate</w:t>
-      </w:r>
-      <w:r>
-        <w:t xml:space="preserve">); it returns no value on</w:t>
-      </w:r>
-      <w:r>
-        <w:t xml:space="preserve"> </w:t>
-      </w:r>
-      <w:r>
-        <w:rPr>
-          <w:rStyle w:val="VerbatimChar"/>
-        </w:rPr>
-        <w:t xml:space="preserve">BELOW_DETECTION</w:t>
-      </w:r>
-      <w:r>
-        <w:t xml:space="preserve"> </w:t>
-      </w:r>
-      <w:r>
-        <w:t xml:space="preserve">pairs rather than extrapolating.</w:t>
-      </w:r>
-    </w:p>
-    <w:bookmarkEnd w:id="31"/>
-    <w:bookmarkStart w:id="32" w:name="Xd3b37ce8f62a83dd9d52f682daa388ffbd3bd4e"/>
-    <w:p>
-      <w:pPr>
-        <w:pStyle w:val="Heading3"/>
-      </w:pPr>
-      <w:r>
-        <w:t xml:space="preserve">The spatial-model negative result (identifiability analysis)</w:t>
-      </w:r>
-    </w:p>
-    <w:bookmarkEnd w:id="32"/>
-    <w:bookmarkStart w:id="33" w:name="Xddb916f5865693a609ce3020ded8303c9837499"/>
-    <w:p>
-      <w:pPr>
-        <w:pStyle w:val="Heading3"/>
-      </w:pPr>
-      <w:r>
-        <w:t xml:space="preserve">The spatial-model negative result (identifiability analysis)</w:t>
-      </w:r>
-    </w:p>
-    <w:p>
-      <w:pPr>
-        <w:pStyle w:val="FirstParagraph"/>
-      </w:pPr>
-      <w:r>
-        <w:t xml:space="preserve">The mechanistic alternative to calibration was evaluated in full (prototype in Python against 19 exact-truth mosaic simulations, then the GTDB-ANIm matrix). The bias decomposes into an in-chain distribution-family term — asymptotic in-chain MAE 2.25 for gamma, 1.25 for a capped grid NPMLE, so a nonparametric fit fixes at most ~0.1–0.2 GTDB MAE — and a coverage term: the divergence of the unchained fraction is not identifiable from tag data, since the out-of-chain anchor residual is ≈ 0 within multi-match noise whether the unchained mass is saturated-divergent or accessory, and an oracle given the exact identity of the chained sample still errs by MAE 1.36 against whole-genome truth. No candidate (AF-weighted mixtures, discrete mixtures, ascertainment-aware tilts, capped NPMLE with and without LRT gating, model averaging) beats the gated baseline while holding all simulation gates. The raw estimator is therefore at its identifiability floor at 4-enzyme tag density; this analysis is why calibration, not a new likelihood, is the deployed correction layer.</w:t>
-      </w:r>
-    </w:p>
-    <w:bookmarkEnd w:id="33"/>
-    <w:bookmarkStart w:id="34" w:name="structural-variant-calling"/>
-    <w:p>
-      <w:pPr>
-        <w:pStyle w:val="Heading3"/>
-      </w:pPr>
-      <w:r>
-        <w:t xml:space="preserve">Structural-variant calling</w:t>
-      </w:r>
-    </w:p>
-    <w:bookmarkEnd w:id="34"/>
-    <w:bookmarkStart w:id="35" w:name="structural-variant-calling-1"/>
-    <w:p>
-      <w:pPr>
-        <w:pStyle w:val="Heading3"/>
-      </w:pPr>
-      <w:r>
-        <w:t xml:space="preserve">Structural-variant calling</w:t>
-      </w:r>
-    </w:p>
-    <w:p>
-      <w:pPr>
-        <w:pStyle w:val="FirstParagraph"/>
-      </w:pPr>
-      <w:r>
-        <w:t xml:space="preserve">The</w:t>
-      </w:r>
-      <w:r>
-        <w:t xml:space="preserve"> </w:t>
-      </w:r>
-      <w:r>
-        <w:rPr>
-          <w:rStyle w:val="VerbatimChar"/>
-        </w:rPr>
-        <w:t xml:space="preserve">struct</w:t>
-      </w:r>
-      <w:r>
-        <w:t xml:space="preserve"> </w:t>
-      </w:r>
-      <w:r>
-        <w:t xml:space="preserve">subcommand consumes the chains and anchors of a pairwise comparison. Inversions are orientation flips between consecutive chains; indels are coordinate gaps between consecutive chains exceeding</w:t>
-      </w:r>
-      <w:r>
-        <w:t xml:space="preserve"> </w:t>
-      </w:r>
-      <w:r>
-        <w:rPr>
-          <w:rStyle w:val="VerbatimChar"/>
-        </w:rPr>
-        <w:t xml:space="preserve">indel_min</w:t>
-      </w:r>
-      <w:r>
-        <w:t xml:space="preserve"> </w:t>
-      </w:r>
-      <w:r>
-        <w:t xml:space="preserve">(default 1 kb), with a guard requiring that no third chain anchors inside the spanned reference interval (without it, a small relocated block sandwiched between collinear chains is misreported as a deletion sized by the reference jump — observed as spurious 42–961 kb calls before the guard); translocations are chains violating global reference order. Resolution is limited by tag spacing and by unphaseable repeats at junctions (observed endpoint offset ≤ 5.5 kb on the 779 kb W3110 inversion); events whose flanking chains have &lt; 4 anchors are not called, and equal-length homologous replacements that keep tags phased are invisible by design. Validation against dnadiff used span-based one-to-many matching because dnadiff fragments large accessory regions into many small events while Syn2bANI calls each junction once.</w:t>
-      </w:r>
-    </w:p>
-    <w:bookmarkEnd w:id="35"/>
-    <w:bookmarkStart w:id="36" w:name="simulation-framework-with-exact-truth"/>
-    <w:p>
-      <w:pPr>
-        <w:pStyle w:val="Heading3"/>
-      </w:pPr>
-      <w:r>
-        <w:t xml:space="preserve">Simulation framework with exact truth</w:t>
-      </w:r>
-    </w:p>
-    <w:bookmarkEnd w:id="36"/>
-    <w:bookmarkStart w:id="37" w:name="simulation-framework-with-exact-truth-1"/>
-    <w:p>
-      <w:pPr>
-        <w:pStyle w:val="Heading3"/>
-      </w:pPr>
-      <w:r>
-        <w:t xml:space="preserve">Simulation framework with exact truth</w:t>
-      </w:r>
-    </w:p>
-    <w:p>
-      <w:pPr>
-        <w:pStyle w:val="FirstParagraph"/>
-      </w:pPr>
-      <w:r>
-        <w:t xml:space="preserve">All exact-truth simulators evolve sequence from a public reference (</w:t>
-      </w:r>
-      <w:r>
-        <w:rPr>
-          <w:i/>
-          <w:iCs/>
-        </w:rPr>
-        <w:t xml:space="preserve">E. coli</w:t>
-      </w:r>
-      <w:r>
-        <w:t xml:space="preserve"> </w:t>
-      </w:r>
-      <w:r>
-        <w:t xml:space="preserve">K-12 MG1655, ENA U00096.3, 4,641,652 bp) by applying a counted number of substitutions, so true ANI = 1 − n_subs/L exactly. Families: an ANI ladder (12 levels, 85–99.9%, each with a 400 kb inversion, with and without ~46 deletions of 200–2,000 bp); an indel sweep (true ANI 95.000; 0–4 deletions/100 kb); fragmentation (20–201 contigs, no sequence lost, ~50% reverse-complemented, order shuffled); accessory confounds (core ANI 95.000; 0–50% of the genome replaced by composition-preserving shuffled blocks, plus a block-count control at fixed total fraction); mosaic/rate-heterogeneity cases (per-block rates ~ Gamma(α, α), α = 0.5/1/2, mean ANI 90–98, plus deliberately misspecified bimodal cases); and GC coverage (ladders on five real template genomes, GC 27.2–72.1%). Deletions do not change true ANI (counted substitutions over reference length), so the deleted fraction doubles as AF ground truth. Substitutions are uniform over the three alternative bases with no GC-biased mutation model, transition/transversion ratio, codon structure, or selection — a deliberate simplification justified by the finding that GC does not explain the real-data degradation and that site turnover emerges from uniform substitution on a real genome without any special mechanism. Enzyme digestion is never simulated; the released binary extracts tags itself.</w:t>
-      </w:r>
-    </w:p>
-    <w:bookmarkEnd w:id="37"/>
-    <w:bookmarkStart w:id="38" w:name="benchmark-datasets-truth-and-tools"/>
-    <w:p>
-      <w:pPr>
-        <w:pStyle w:val="Heading3"/>
-      </w:pPr>
-      <w:r>
-        <w:t xml:space="preserve">Benchmark datasets, truth, and tools</w:t>
-      </w:r>
-    </w:p>
-    <w:bookmarkEnd w:id="38"/>
-    <w:bookmarkStart w:id="39" w:name="benchmark-datasets-truth-and-tools-1"/>
-    <w:p>
-      <w:pPr>
-        <w:pStyle w:val="Heading3"/>
-      </w:pPr>
-      <w:r>
-        <w:t xml:space="preserve">Benchmark datasets, truth, and tools</w:t>
-      </w:r>
-    </w:p>
-    <w:p>
-      <w:pPr>
-        <w:pStyle w:val="FirstParagraph"/>
-      </w:pPr>
-      <w:r>
-        <w:t xml:space="preserve">All datasets, their ground truth, and the analyses they support are summarized in Table 3. The simulation-generation framework is described in Methods 4.9.</w:t>
-      </w:r>
-    </w:p>
-    <w:p>
-      <w:pPr>
-        <w:pStyle w:val="BodyText"/>
-      </w:pPr>
-      <w:r>
-        <w:rPr>
-          <w:b/>
-          <w:bCs/>
-        </w:rPr>
-        <w:t xml:space="preserve">Sampling frame.</w:t>
-      </w:r>
-      <w:r>
-        <w:t xml:space="preserve"> </w:t>
-      </w:r>
-      <w:r>
-        <w:t xml:space="preserve">GTDB release R207 [11,12] is the primary sampling frame for the real-genome benchmarks; all GTDB-R207 comparisons use dnadiff/ANIm (MUMmer 3.23, 1-to-1) as truth. CAMI2 (strain-madness and marine short-read campaigns, with source genomes and per-read ground truth) is the sampling frame for the MAG benchmark.</w:t>
-      </w:r>
-    </w:p>
-    <w:p>
-      <w:pPr>
-        <w:pStyle w:val="BodyText"/>
-      </w:pPr>
-      <w:r>
-        <w:rPr>
-          <w:b/>
-          <w:bCs/>
-        </w:rPr>
-        <w:t xml:space="preserve">Simulated datasets (exact truth by construction).</w:t>
-      </w:r>
-      <w:r>
-        <w:t xml:space="preserve"> </w:t>
-      </w:r>
-      <w:r>
-        <w:t xml:space="preserve">Seven families, all evolved from</w:t>
-      </w:r>
-      <w:r>
-        <w:t xml:space="preserve"> </w:t>
-      </w:r>
-      <w:r>
-        <w:rPr>
-          <w:i/>
-          <w:iCs/>
-        </w:rPr>
-        <w:t xml:space="preserve">E. coli</w:t>
-      </w:r>
-      <w:r>
-        <w:t xml:space="preserve"> </w:t>
-      </w:r>
-      <w:r>
-        <w:t xml:space="preserve">K-12 MG1655 except the GC ladders: (i) the</w:t>
-      </w:r>
-      <w:r>
-        <w:t xml:space="preserve"> </w:t>
-      </w:r>
-      <w:r>
-        <w:rPr>
-          <w:b/>
-          <w:bCs/>
-        </w:rPr>
-        <w:t xml:space="preserve">ANI ladder</w:t>
-      </w:r>
-      <w:r>
-        <w:t xml:space="preserve"> </w:t>
-      </w:r>
-      <w:r>
-        <w:t xml:space="preserve">— 12 levels, 85–99.9%, each genome carrying a 400 kb inversion, generated with and without ~46 deletions of 200–2,000 bp; (ii) the</w:t>
-      </w:r>
-      <w:r>
-        <w:t xml:space="preserve"> </w:t>
-      </w:r>
-      <w:r>
-        <w:rPr>
-          <w:b/>
-          <w:bCs/>
-        </w:rPr>
-        <w:t xml:space="preserve">indel sweep</w:t>
-      </w:r>
-      <w:r>
-        <w:t xml:space="preserve"> </w:t>
-      </w:r>
-      <w:r>
-        <w:t xml:space="preserve">— ANI 95.000, 0–4 deletions per 100 kb; (iii) the</w:t>
-      </w:r>
-      <w:r>
-        <w:t xml:space="preserve"> </w:t>
-      </w:r>
-      <w:r>
-        <w:rPr>
-          <w:b/>
-          <w:bCs/>
-        </w:rPr>
-        <w:t xml:space="preserve">fragmentation ladder</w:t>
-      </w:r>
-      <w:r>
-        <w:t xml:space="preserve"> </w:t>
-      </w:r>
-      <w:r>
-        <w:t xml:space="preserve">— 20–201 contigs, ~50% reverse-complemented, order shuffled, no sequence lost; (iv) the</w:t>
-      </w:r>
-      <w:r>
-        <w:t xml:space="preserve"> </w:t>
-      </w:r>
-      <w:r>
-        <w:rPr>
-          <w:b/>
-          <w:bCs/>
-        </w:rPr>
-        <w:t xml:space="preserve">accessory-fraction sweep</w:t>
-      </w:r>
-      <w:r>
-        <w:t xml:space="preserve"> </w:t>
-      </w:r>
-      <w:r>
-        <w:t xml:space="preserve">— core ANI 95.000 with 0–50% of the genome replaced by composition-preserving shuffled blocks, plus a block-count control at fixed total fraction; (v) the</w:t>
-      </w:r>
-      <w:r>
-        <w:t xml:space="preserve"> </w:t>
-      </w:r>
-      <w:r>
-        <w:rPr>
-          <w:b/>
-          <w:bCs/>
-        </w:rPr>
-        <w:t xml:space="preserve">mosaic/rate-heterogeneity family</w:t>
-      </w:r>
-      <w:r>
-        <w:t xml:space="preserve"> </w:t>
-      </w:r>
-      <w:r>
-        <w:t xml:space="preserve">— per-block rates ~ Gamma(α, α), α = 0.5/1/2, mean ANI 90–98, plus deliberately misspecified bimodal cases (19 used in the identifiability analysis of Methods 4.7); (vi) the</w:t>
-      </w:r>
-      <w:r>
-        <w:t xml:space="preserve"> </w:t>
-      </w:r>
-      <w:r>
-        <w:rPr>
-          <w:b/>
-          <w:bCs/>
-        </w:rPr>
-        <w:t xml:space="preserve">GC ladders</w:t>
-      </w:r>
-      <w:r>
-        <w:t xml:space="preserve"> </w:t>
-      </w:r>
-      <w:r>
-        <w:t xml:space="preserve">— substitution ladders on five real template genomes spanning GC 27.2–72.1%; and (vii) the</w:t>
-      </w:r>
-      <w:r>
-        <w:t xml:space="preserve"> </w:t>
-      </w:r>
-      <w:r>
-        <w:rPr>
-          <w:b/>
-          <w:bCs/>
-        </w:rPr>
-        <w:t xml:space="preserve">inversion ladder</w:t>
-      </w:r>
-      <w:r>
-        <w:t xml:space="preserve"> </w:t>
-      </w:r>
-      <w:r>
-        <w:t xml:space="preserve">for synteny validation — ANI 95.00/98.00 with 0–32 non-overlapping inversions of 100–400 kb (2 exact breakpoints each;</w:t>
-      </w:r>
-      <w:r>
-        <w:t xml:space="preserve"> </w:t>
-      </w:r>
-      <w:r>
-        <w:rPr>
-          <w:rStyle w:val="VerbatimChar"/>
-        </w:rPr>
-        <w:t xml:space="preserve">scripts/synteny_bench/</w:t>
-      </w:r>
-      <w:r>
-        <w:t xml:space="preserve">).</w:t>
-      </w:r>
-    </w:p>
-    <w:p>
-      <w:pPr>
-        <w:pStyle w:val="BodyText"/>
-      </w:pPr>
-      <w:r>
-        <w:rPr>
-          <w:b/>
-          <w:bCs/>
-        </w:rPr>
-        <w:t xml:space="preserve">GTDB-R207 benchmark series.</w:t>
-      </w:r>
-      <w:r>
-        <w:t xml:space="preserve"> </w:t>
-      </w:r>
-      <w:r>
-        <w:t xml:space="preserve">These datasets form a single coherent evaluation built from GTDB-R207. They are disjoint at the genome level wherever independence is required.</w:t>
-      </w:r>
-      <w:r>
-        <w:t xml:space="preserve"> </w:t>
-      </w:r>
-      <w:r>
-        <w:t xml:space="preserve">-</w:t>
-      </w:r>
-      <w:r>
-        <w:t xml:space="preserve"> </w:t>
-      </w:r>
-      <w:r>
-        <w:rPr>
-          <w:b/>
-          <w:bCs/>
-        </w:rPr>
-        <w:t xml:space="preserve">Calibration/training set (v5).</w:t>
-      </w:r>
-      <w:r>
-        <w:t xml:space="preserve"> </w:t>
-      </w:r>
-      <w:r>
-        <w:t xml:space="preserve">2,520 pairs (80–99.5% ANIm) used to train the ridge calibration. This combines 2,074 representative pairs stratified across 80–85/85–90/90–95/95–99 bands and phyla, with 467 targeted 95–99.5% pairs selected by screening all 2.26 M same-genus representative pairs with skani and running dnadiff on 650 candidates (607 species, 26 phyla).</w:t>
-      </w:r>
-      <w:r>
-        <w:t xml:space="preserve"> </w:t>
-      </w:r>
-      <w:r>
-        <w:t xml:space="preserve">-</w:t>
-      </w:r>
-      <w:r>
-        <w:t xml:space="preserve"> </w:t>
-      </w:r>
-      <w:r>
-        <w:rPr>
-          <w:b/>
-          <w:bCs/>
-        </w:rPr>
-        <w:t xml:space="preserve">Large-scale FastANI comparison set.</w:t>
-      </w:r>
-      <w:r>
-        <w:t xml:space="preserve"> </w:t>
-      </w:r>
-      <w:r>
-        <w:t xml:space="preserve">45,000 representative pairs sampled across taxonomic levels (intra-species / intra-genus / intra-family / random;</w:t>
-      </w:r>
-      <w:r>
-        <w:t xml:space="preserve"> </w:t>
-      </w:r>
-      <w:r>
-        <w:rPr>
-          <w:rStyle w:val="VerbatimChar"/>
-        </w:rPr>
-        <w:t xml:space="preserve">scripts/sample_gtdb_pairs.py</w:t>
-      </w:r>
-      <w:r>
-        <w:t xml:space="preserve">, seed-fixed). FastANI reports 672 of these pairs and they provide the large-scale comparison in Fig. 6.</w:t>
-      </w:r>
-      <w:r>
-        <w:t xml:space="preserve"> </w:t>
-      </w:r>
-      <w:r>
-        <w:t xml:space="preserve">-</w:t>
-      </w:r>
-      <w:r>
-        <w:t xml:space="preserve"> </w:t>
-      </w:r>
-      <w:r>
-        <w:rPr>
-          <w:b/>
-          <w:bCs/>
-        </w:rPr>
-        <w:t xml:space="preserve">Strict held-out benchmark.</w:t>
-      </w:r>
-      <w:r>
-        <w:t xml:space="preserve"> </w:t>
-      </w:r>
-      <w:r>
-        <w:t xml:space="preserve">43,334 same-genus representative pairs sampled from the 628,617 non-self GTDB-R207 representative pairs passing a skani pre-screen (AF ≥ 15%), stratified into bands 80–85 / 85–90 / 90–95 / 95–100% (12,172 / 16,000 / 14,758 / 404 pairs; 24,831 genomes, 74 phyla;</w:t>
-      </w:r>
-      <w:r>
-        <w:t xml:space="preserve"> </w:t>
-      </w:r>
-      <w:r>
-        <w:rPr>
-          <w:rStyle w:val="VerbatimChar"/>
-        </w:rPr>
-        <w:t xml:space="preserve">scripts/gtdb50k/</w:t>
-      </w:r>
-      <w:r>
-        <w:t xml:space="preserve">). Every genome in the v5 calibration set was excluded in both directions, making this a strict holdout for the gate, flag, and calibration; dnadiff/ANIm truth was computed for all pairs.</w:t>
-      </w:r>
-      <w:r>
-        <w:t xml:space="preserve"> </w:t>
-      </w:r>
-      <w:r>
-        <w:t xml:space="preserve">-</w:t>
-      </w:r>
-      <w:r>
-        <w:t xml:space="preserve"> </w:t>
-      </w:r>
-      <w:r>
-        <w:rPr>
-          <w:b/>
-          <w:bCs/>
-        </w:rPr>
-        <w:t xml:space="preserve">High-ANI test set.</w:t>
-      </w:r>
-      <w:r>
-        <w:t xml:space="preserve"> </w:t>
-      </w:r>
-      <w:r>
-        <w:t xml:space="preserve">727 test pairs sampled from non-representative GTDB-R207 genomes (95–97%, n = 95; 97–100%, n = 632), excluding genomes in the v5 calibration set or the 43,334 held-out set in either direction. These add dense coverage of the 95–100% regime that the held-out representative set lacks.</w:t>
-      </w:r>
-      <w:r>
-        <w:t xml:space="preserve"> </w:t>
-      </w:r>
-      <w:r>
-        <w:t xml:space="preserve">-</w:t>
-      </w:r>
-      <w:r>
-        <w:t xml:space="preserve"> </w:t>
-      </w:r>
-      <w:r>
-        <w:rPr>
-          <w:b/>
-          <w:bCs/>
-        </w:rPr>
-        <w:t xml:space="preserve">Unified 80–100% benchmark.</w:t>
-      </w:r>
-      <w:r>
-        <w:t xml:space="preserve"> </w:t>
-      </w:r>
-      <w:r>
-        <w:t xml:space="preserve">The 43,334 held-out pairs combined with the 727 high-ANI test pairs (44,061 total), used to evaluate the hybrid estimator (Supplementary Fig. S3).</w:t>
-      </w:r>
-    </w:p>
-    <w:p>
-      <w:pPr>
-        <w:pStyle w:val="BodyText"/>
-      </w:pPr>
-      <w:r>
-        <w:rPr>
-          <w:b/>
-          <w:bCs/>
-        </w:rPr>
-        <w:t xml:space="preserve">External validation sets.</w:t>
-      </w:r>
-      <w:r>
-        <w:t xml:space="preserve"> </w:t>
-      </w:r>
-      <w:r>
-        <w:t xml:space="preserve">Independent of the GTDB-R207 series.</w:t>
-      </w:r>
-      <w:r>
-        <w:t xml:space="preserve"> </w:t>
-      </w:r>
-      <w:r>
-        <w:t xml:space="preserve">-</w:t>
-      </w:r>
-      <w:r>
-        <w:t xml:space="preserve"> </w:t>
-      </w:r>
-      <w:r>
-        <w:rPr>
-          <w:b/>
-          <w:bCs/>
-        </w:rPr>
-        <w:t xml:space="preserve">Mid-ANI set.</w:t>
-      </w:r>
-      <w:r>
-        <w:t xml:space="preserve"> </w:t>
-      </w:r>
-      <w:r>
-        <w:t xml:space="preserve">15 pairs (</w:t>
-      </w:r>
-      <w:r>
-        <w:rPr>
-          <w:i/>
-          <w:iCs/>
-        </w:rPr>
-        <w:t xml:space="preserve">Bifidobacterium longum</w:t>
-      </w:r>
-      <w:r>
-        <w:t xml:space="preserve"> </w:t>
-      </w:r>
-      <w:r>
-        <w:t xml:space="preserve">×</w:t>
-      </w:r>
-      <w:r>
-        <w:t xml:space="preserve"> </w:t>
-      </w:r>
-      <w:r>
-        <w:rPr>
-          <w:i/>
-          <w:iCs/>
-        </w:rPr>
-        <w:t xml:space="preserve">B. breve</w:t>
-      </w:r>
-      <w:r>
-        <w:t xml:space="preserve">,</w:t>
-      </w:r>
-      <w:r>
-        <w:t xml:space="preserve"> </w:t>
-      </w:r>
-      <w:r>
-        <w:rPr>
-          <w:i/>
-          <w:iCs/>
-        </w:rPr>
-        <w:t xml:space="preserve">Veillonella parvula</w:t>
-      </w:r>
-      <w:r>
-        <w:t xml:space="preserve"> </w:t>
-      </w:r>
-      <w:r>
-        <w:t xml:space="preserve">×</w:t>
-      </w:r>
-      <w:r>
-        <w:t xml:space="preserve"> </w:t>
-      </w:r>
-      <w:r>
-        <w:rPr>
-          <w:i/>
-          <w:iCs/>
-        </w:rPr>
-        <w:t xml:space="preserve">V. dispar</w:t>
-      </w:r>
-      <w:r>
-        <w:t xml:space="preserve">), ANIm truth 87.6–90.2%; ANIm alignment coverage is only 46–72% of these genomes.</w:t>
-      </w:r>
-      <w:r>
-        <w:t xml:space="preserve"> </w:t>
-      </w:r>
-      <w:r>
-        <w:t xml:space="preserve">-</w:t>
-      </w:r>
-      <w:r>
-        <w:t xml:space="preserve"> </w:t>
-      </w:r>
-      <w:r>
-        <w:rPr>
-          <w:b/>
-          <w:bCs/>
-        </w:rPr>
-        <w:t xml:space="preserve">Oral/gut set.</w:t>
-      </w:r>
-      <w:r>
-        <w:t xml:space="preserve"> </w:t>
-      </w:r>
-      <w:r>
-        <w:t xml:space="preserve">50 isolate genomes from 10 species — 5 oral (</w:t>
-      </w:r>
-      <w:r>
-        <w:rPr>
-          <w:i/>
-          <w:iCs/>
-        </w:rPr>
-        <w:t xml:space="preserve">Aggregatibacter actinomycetemcomitans</w:t>
-      </w:r>
-      <w:r>
-        <w:t xml:space="preserve">,</w:t>
-      </w:r>
-      <w:r>
-        <w:t xml:space="preserve"> </w:t>
-      </w:r>
-      <w:r>
-        <w:rPr>
-          <w:i/>
-          <w:iCs/>
-        </w:rPr>
-        <w:t xml:space="preserve">Fusobacterium nucleatum</w:t>
-      </w:r>
-      <w:r>
-        <w:t xml:space="preserve">,</w:t>
-      </w:r>
-      <w:r>
-        <w:t xml:space="preserve"> </w:t>
-      </w:r>
-      <w:r>
-        <w:rPr>
-          <w:i/>
-          <w:iCs/>
-        </w:rPr>
-        <w:t xml:space="preserve">Porphyromonas gingivalis</w:t>
-      </w:r>
-      <w:r>
-        <w:t xml:space="preserve">,</w:t>
-      </w:r>
-      <w:r>
-        <w:t xml:space="preserve"> </w:t>
-      </w:r>
-      <w:r>
-        <w:rPr>
-          <w:i/>
-          <w:iCs/>
-        </w:rPr>
-        <w:t xml:space="preserve">Streptococcus mutans</w:t>
-      </w:r>
-      <w:r>
-        <w:t xml:space="preserve">,</w:t>
-      </w:r>
-      <w:r>
-        <w:t xml:space="preserve"> </w:t>
-      </w:r>
-      <w:r>
-        <w:rPr>
-          <w:i/>
-          <w:iCs/>
-        </w:rPr>
-        <w:t xml:space="preserve">S. sanguinis</w:t>
-      </w:r>
-      <w:r>
-        <w:t xml:space="preserve">) and 5 gut (</w:t>
-      </w:r>
-      <w:r>
-        <w:rPr>
-          <w:i/>
-          <w:iCs/>
-        </w:rPr>
-        <w:t xml:space="preserve">Akkermansia muciniphila</w:t>
-      </w:r>
-      <w:r>
-        <w:t xml:space="preserve">,</w:t>
-      </w:r>
-      <w:r>
-        <w:t xml:space="preserve"> </w:t>
-      </w:r>
-      <w:r>
-        <w:rPr>
-          <w:i/>
-          <w:iCs/>
-        </w:rPr>
-        <w:t xml:space="preserve">Bacteroides fragilis</w:t>
-      </w:r>
-      <w:r>
-        <w:t xml:space="preserve">,</w:t>
-      </w:r>
-      <w:r>
-        <w:t xml:space="preserve"> </w:t>
-      </w:r>
-      <w:r>
-        <w:rPr>
-          <w:i/>
-          <w:iCs/>
-        </w:rPr>
-        <w:t xml:space="preserve">B. longum</w:t>
-      </w:r>
-      <w:r>
-        <w:t xml:space="preserve">,</w:t>
-      </w:r>
-      <w:r>
-        <w:t xml:space="preserve"> </w:t>
-      </w:r>
-      <w:r>
-        <w:rPr>
-          <w:i/>
-          <w:iCs/>
-        </w:rPr>
-        <w:t xml:space="preserve">Faecalibacterium prausnitzii</w:t>
-      </w:r>
-      <w:r>
-        <w:t xml:space="preserve">,</w:t>
-      </w:r>
-      <w:r>
-        <w:t xml:space="preserve"> </w:t>
-      </w:r>
-      <w:r>
-        <w:rPr>
-          <w:i/>
-          <w:iCs/>
-        </w:rPr>
-        <w:t xml:space="preserve">Ruminococcus intestinalis</w:t>
-      </w:r>
-      <w:r>
-        <w:t xml:space="preserve">), 5 genomes per species — compared all-vs-all (1,225 pairs). The 100 same-species pairs serve as the external near-clonal benchmark against FastANI and skani; 1,100 cross-species pairs probe the below-detection regime.</w:t>
-      </w:r>
-    </w:p>
-    <w:p>
-      <w:pPr>
-        <w:pStyle w:val="BodyText"/>
-      </w:pPr>
-      <w:r>
-        <w:rPr>
-          <w:b/>
-          <w:bCs/>
-        </w:rPr>
-        <w:t xml:space="preserve">Structural-variation and MAG validation.</w:t>
-      </w:r>
-      <w:r>
-        <w:t xml:space="preserve"> </w:t>
-      </w:r>
-      <w:r>
-        <w:t xml:space="preserve">-</w:t>
-      </w:r>
-      <w:r>
-        <w:t xml:space="preserve"> </w:t>
-      </w:r>
-      <w:r>
-        <w:rPr>
-          <w:b/>
-          <w:bCs/>
-        </w:rPr>
-        <w:t xml:space="preserve">Enterobacteriaceae completes.</w:t>
-      </w:r>
-      <w:r>
-        <w:t xml:space="preserve"> </w:t>
-      </w:r>
-      <w:r>
-        <w:t xml:space="preserve">13 finished chromosomes versus</w:t>
-      </w:r>
-      <w:r>
-        <w:t xml:space="preserve"> </w:t>
-      </w:r>
-      <w:r>
-        <w:rPr>
-          <w:i/>
-          <w:iCs/>
-        </w:rPr>
-        <w:t xml:space="preserve">E. coli</w:t>
-      </w:r>
-      <w:r>
-        <w:t xml:space="preserve"> </w:t>
-      </w:r>
-      <w:r>
-        <w:t xml:space="preserve">K-12 MG1655, spanning ANI ~81–99.99%. Three pairs (MG1655/W3110, MG1655/O157:H7 Sakai,</w:t>
-      </w:r>
-      <w:r>
-        <w:t xml:space="preserve"> </w:t>
-      </w:r>
-      <w:r>
-        <w:rPr>
-          <w:i/>
-          <w:iCs/>
-        </w:rPr>
-        <w:t xml:space="preserve">Salmonella</w:t>
-      </w:r>
-      <w:r>
-        <w:t xml:space="preserve"> </w:t>
-      </w:r>
-      <w:r>
-        <w:t xml:space="preserve">Typhi CT18 /</w:t>
-      </w:r>
-      <w:r>
-        <w:t xml:space="preserve"> </w:t>
-      </w:r>
-      <w:r>
-        <w:rPr>
-          <w:i/>
-          <w:iCs/>
-        </w:rPr>
-        <w:t xml:space="preserve">S.</w:t>
-      </w:r>
-      <w:r>
-        <w:t xml:space="preserve"> </w:t>
-      </w:r>
-      <w:r>
-        <w:t xml:space="preserve">Typhimurium LT2) double as the structural-variation validation set with dnadiff structural truth.</w:t>
-      </w:r>
-      <w:r>
-        <w:t xml:space="preserve"> </w:t>
-      </w:r>
-      <w:r>
-        <w:t xml:space="preserve">-</w:t>
-      </w:r>
-      <w:r>
-        <w:t xml:space="preserve"> </w:t>
-      </w:r>
-      <w:r>
-        <w:rPr>
-          <w:b/>
-          <w:bCs/>
-        </w:rPr>
-        <w:t xml:space="preserve">Real draft assemblies.</w:t>
-      </w:r>
-      <w:r>
-        <w:t xml:space="preserve"> </w:t>
-      </w:r>
-      <w:r>
-        <w:t xml:space="preserve">8</w:t>
-      </w:r>
-      <w:r>
-        <w:t xml:space="preserve"> </w:t>
-      </w:r>
-      <w:r>
-        <w:rPr>
-          <w:i/>
-          <w:iCs/>
-        </w:rPr>
-        <w:t xml:space="preserve">E. coli</w:t>
-      </w:r>
-      <w:r>
-        <w:t xml:space="preserve"> </w:t>
-      </w:r>
-      <w:r>
-        <w:t xml:space="preserve">assemblies from ENA (GCA_001283865, GCA_001077875, GCA_001284645, GCA_001283245, GCA_001283605, GCA_001284145, GCA_001283205, GCA_001075925; 88–8,025 contigs), including reverse-complement self-controls.</w:t>
-      </w:r>
-      <w:r>
-        <w:t xml:space="preserve"> </w:t>
-      </w:r>
-      <w:r>
-        <w:t xml:space="preserve">-</w:t>
-      </w:r>
-      <w:r>
-        <w:t xml:space="preserve"> </w:t>
-      </w:r>
-      <w:r>
-        <w:rPr>
-          <w:b/>
-          <w:bCs/>
-        </w:rPr>
-        <w:t xml:space="preserve">CAMI2 MAG benchmark.</w:t>
-      </w:r>
-      <w:r>
-        <w:t xml:space="preserve"> </w:t>
-      </w:r>
-      <w:r>
-        <w:t xml:space="preserve">35 short-read samples (25 strain-madness, 10 marine) assembled with MEGAHIT, binned with MetaBAT2, and quality-scored with CheckM2; 695 bins ≥ 100 kbp were retained (HQ 200 / MQ 210 / LQ 285). Contigs were assigned to CAMI2 source genomes by exact k-mer membership; each bin was classified clean, strain-mixed, or cross-species, and paired with its dominant source genome (</w:t>
-      </w:r>
-      <w:r>
-        <w:t xml:space="preserve">“anchor”</w:t>
-      </w:r>
-      <w:r>
-        <w:t xml:space="preserve">). Each tool estimated ANI of the bin against the anchor reference; dnadiff/ANIm provided truth. Pipeline scripts and per-pair outputs are in</w:t>
-      </w:r>
-      <w:r>
-        <w:t xml:space="preserve"> </w:t>
-      </w:r>
-      <w:r>
-        <w:rPr>
-          <w:rStyle w:val="VerbatimChar"/>
-        </w:rPr>
-        <w:t xml:space="preserve">results/mag_validation/</w:t>
-      </w:r>
-      <w:r>
-        <w:t xml:space="preserve">.</w:t>
-      </w:r>
-      <w:r>
-        <w:t xml:space="preserve"> </w:t>
-      </w:r>
-      <w:r>
-        <w:t xml:space="preserve">-</w:t>
-      </w:r>
-      <w:r>
-        <w:t xml:space="preserve"> </w:t>
-      </w:r>
-      <w:r>
-        <w:rPr>
-          <w:b/>
-          <w:bCs/>
-        </w:rPr>
-        <w:t xml:space="preserve">Syntracker validation isolates.</w:t>
-      </w:r>
-      <w:r>
-        <w:t xml:space="preserve"> </w:t>
-      </w:r>
-      <w:r>
-        <w:t xml:space="preserve">Four published isolate collections were used to test whether high ANI guarantees conserved genome architecture:</w:t>
-      </w:r>
-      <w:r>
-        <w:t xml:space="preserve"> </w:t>
-      </w:r>
-      <w:r>
-        <w:rPr>
-          <w:i/>
-          <w:iCs/>
-        </w:rPr>
-        <w:t xml:space="preserve">Escherichia coli</w:t>
-      </w:r>
-      <w:r>
-        <w:t xml:space="preserve"> </w:t>
-      </w:r>
-      <w:r>
-        <w:t xml:space="preserve">hypermutator (23 isolates, 253 pairs),</w:t>
-      </w:r>
-      <w:r>
-        <w:t xml:space="preserve"> </w:t>
-      </w:r>
-      <w:r>
-        <w:rPr>
-          <w:i/>
-          <w:iCs/>
-        </w:rPr>
-        <w:t xml:space="preserve">Helicobacter pylori</w:t>
-      </w:r>
-      <w:r>
-        <w:t xml:space="preserve"> </w:t>
-      </w:r>
-      <w:r>
-        <w:t xml:space="preserve">(77 isolates, 2,926 pairs),</w:t>
-      </w:r>
-      <w:r>
-        <w:t xml:space="preserve"> </w:t>
-      </w:r>
-      <w:r>
-        <w:rPr>
-          <w:i/>
-          <w:iCs/>
-        </w:rPr>
-        <w:t xml:space="preserve">Neisseria gonorrhoeae</w:t>
-      </w:r>
-      <w:r>
-        <w:t xml:space="preserve"> </w:t>
-      </w:r>
-      <w:r>
-        <w:t xml:space="preserve">(66 pairs), and</w:t>
-      </w:r>
-      <w:r>
-        <w:t xml:space="preserve"> </w:t>
-      </w:r>
-      <w:r>
-        <w:rPr>
-          <w:i/>
-          <w:iCs/>
-        </w:rPr>
-        <w:t xml:space="preserve">Streptomyces rimosus</w:t>
-      </w:r>
-      <w:r>
-        <w:t xml:space="preserve"> </w:t>
-      </w:r>
-      <w:r>
-        <w:t xml:space="preserve">(190 pairs). SRA accessions and references are in</w:t>
-      </w:r>
-      <w:r>
-        <w:t xml:space="preserve"> </w:t>
-      </w:r>
-      <w:r>
-        <w:rPr>
-          <w:rStyle w:val="VerbatimChar"/>
-        </w:rPr>
-        <w:t xml:space="preserve">data/syntracker/</w:t>
-      </w:r>
-      <w:r>
-        <w:t xml:space="preserve">; all isolates were compared all-vs-all with</w:t>
-      </w:r>
-      <w:r>
-        <w:t xml:space="preserve"> </w:t>
-      </w:r>
-      <w:r>
-        <w:rPr>
-          <w:rStyle w:val="VerbatimChar"/>
-        </w:rPr>
-        <w:t xml:space="preserve">syn2bani ani</w:t>
-      </w:r>
-      <w:r>
-        <w:t xml:space="preserve">, and</w:t>
-      </w:r>
-      <w:r>
-        <w:t xml:space="preserve"> </w:t>
-      </w:r>
-      <w:r>
-        <w:rPr>
-          <w:rStyle w:val="VerbatimChar"/>
-        </w:rPr>
-        <w:t xml:space="preserve">synteny_score</w:t>
-      </w:r>
-      <w:r>
-        <w:t xml:space="preserve"> </w:t>
-      </w:r>
-      <w:r>
-        <w:t xml:space="preserve">and</w:t>
-      </w:r>
-      <w:r>
-        <w:t xml:space="preserve"> </w:t>
-      </w:r>
-      <w:r>
-        <w:rPr>
-          <w:rStyle w:val="VerbatimChar"/>
-        </w:rPr>
-        <w:t xml:space="preserve">breakpoint_count</w:t>
-      </w:r>
-      <w:r>
-        <w:t xml:space="preserve"> </w:t>
-      </w:r>
-      <w:r>
-        <w:t xml:space="preserve">were taken from the same pass. Top-discordant cases were re-analyzed with</w:t>
-      </w:r>
-      <w:r>
-        <w:t xml:space="preserve"> </w:t>
-      </w:r>
-      <w:r>
-        <w:rPr>
-          <w:rStyle w:val="VerbatimChar"/>
-        </w:rPr>
-        <w:t xml:space="preserve">syn2bani struct</w:t>
-      </w:r>
-      <w:r>
-        <w:t xml:space="preserve"> </w:t>
-      </w:r>
-      <w:r>
-        <w:t xml:space="preserve">(Fig. 11, Fig. 12;</w:t>
-      </w:r>
-      <w:r>
-        <w:t xml:space="preserve"> </w:t>
-      </w:r>
-      <w:r>
-        <w:rPr>
-          <w:rStyle w:val="VerbatimChar"/>
-        </w:rPr>
-        <w:t xml:space="preserve">results/syntracker_validation/</w:t>
-      </w:r>
-      <w:r>
-        <w:t xml:space="preserve">).</w:t>
-      </w:r>
-    </w:p>
-    <w:p>
-      <w:pPr>
-        <w:pStyle w:val="BodyText"/>
-      </w:pPr>
-      <w:r>
-        <w:rPr>
-          <w:b/>
-          <w:bCs/>
-        </w:rPr>
-        <w:t xml:space="preserve">Tools and versions.</w:t>
-      </w:r>
-      <w:r>
-        <w:t xml:space="preserve"> </w:t>
-      </w:r>
-      <w:r>
-        <w:t xml:space="preserve">Syn2bANI 0.1.0 (default panel BcgI,AlfI,AloI,FalI; deployed calibration v5), skani 0.1.0 (0.3.2 for the HPC database-scale runs), FastANI 1.33/1.34, MUMmer/dnadiff 3.23. Per-pair efficiency was measured on a Mac Studio (Apple M4 Max, 16 cores, 128 GB RAM; 3 repetitions, medians reported); database-scale runs used a 32-thread HPC node. skani’s n = 22</w:t>
-      </w:r>
-      <w:r>
-        <w:t xml:space="preserve"> </w:t>
-      </w:r>
-      <w:r>
-        <w:rPr>
-          <w:rStyle w:val="VerbatimChar"/>
-        </w:rPr>
-        <w:t xml:space="preserve">dist</w:t>
-      </w:r>
-      <w:r>
-        <w:t xml:space="preserve"> </w:t>
-      </w:r>
-      <w:r>
-        <w:t xml:space="preserve">time covers only 302/484 reported pairs (minimum-AF filter) and excludes sketching; we note this wherever the comparison appears.</w:t>
-      </w:r>
-    </w:p>
-    <w:bookmarkEnd w:id="39"/>
-    <w:bookmarkStart w:id="40" w:name="implementation"/>
-    <w:p>
-      <w:pPr>
-        <w:pStyle w:val="Heading3"/>
-      </w:pPr>
-      <w:r>
-        <w:t xml:space="preserve">Implementation</w:t>
-      </w:r>
-    </w:p>
-    <w:bookmarkEnd w:id="40"/>
-    <w:bookmarkStart w:id="41" w:name="implementation-1"/>
+    <w:bookmarkStart w:id="30" w:name="implementation"/>
     <w:p>
       <w:pPr>
         <w:pStyle w:val="Heading3"/>
@@ -2754,9 +2653,9 @@
         </w:pict>
       </w:r>
     </w:p>
-    <w:bookmarkEnd w:id="41"/>
-    <w:bookmarkEnd w:id="42"/>
-    <w:bookmarkStart w:id="43" w:name="data-availability"/>
+    <w:bookmarkEnd w:id="30"/>
+    <w:bookmarkEnd w:id="31"/>
+    <w:bookmarkStart w:id="32" w:name="data-availability"/>
     <w:p>
       <w:pPr>
         <w:pStyle w:val="Heading2"/>
@@ -2861,8 +2760,8 @@
         <w:t xml:space="preserve">K-12 MG1655, ENA accession U00096.3.</w:t>
       </w:r>
     </w:p>
-    <w:bookmarkEnd w:id="43"/>
-    <w:bookmarkStart w:id="44" w:name="code-availability"/>
+    <w:bookmarkEnd w:id="32"/>
+    <w:bookmarkStart w:id="33" w:name="code-availability"/>
     <w:p>
       <w:pPr>
         <w:pStyle w:val="Heading2"/>
@@ -2891,8 +2790,8 @@
         <w:t xml:space="preserve">).</w:t>
       </w:r>
     </w:p>
-    <w:bookmarkEnd w:id="44"/>
-    <w:bookmarkStart w:id="45" w:name="acknowledgements"/>
+    <w:bookmarkEnd w:id="33"/>
+    <w:bookmarkStart w:id="34" w:name="acknowledgements"/>
     <w:p>
       <w:pPr>
         <w:pStyle w:val="Heading2"/>
@@ -2909,8 +2808,8 @@
         <w:t xml:space="preserve">[To be determined.]</w:t>
       </w:r>
     </w:p>
-    <w:bookmarkEnd w:id="45"/>
-    <w:bookmarkStart w:id="46" w:name="author-contributions"/>
+    <w:bookmarkEnd w:id="34"/>
+    <w:bookmarkStart w:id="35" w:name="author-contributions"/>
     <w:p>
       <w:pPr>
         <w:pStyle w:val="Heading2"/>
@@ -2927,8 +2826,8 @@
         <w:t xml:space="preserve">[To be determined — placeholder.]</w:t>
       </w:r>
     </w:p>
-    <w:bookmarkEnd w:id="46"/>
-    <w:bookmarkStart w:id="47" w:name="competing-interests"/>
+    <w:bookmarkEnd w:id="35"/>
+    <w:bookmarkStart w:id="36" w:name="competing-interests"/>
     <w:p>
       <w:pPr>
         <w:pStyle w:val="Heading2"/>
@@ -2945,8 +2844,8 @@
         <w:t xml:space="preserve">[To be determined — placeholder: The authors declare no competing interests.]</w:t>
       </w:r>
     </w:p>
-    <w:bookmarkEnd w:id="47"/>
-    <w:bookmarkStart w:id="48" w:name="references"/>
+    <w:bookmarkEnd w:id="36"/>
+    <w:bookmarkStart w:id="37" w:name="references"/>
     <w:p>
       <w:pPr>
         <w:pStyle w:val="Heading2"/>
@@ -3404,8 +3303,8 @@
         </w:pict>
       </w:r>
     </w:p>
-    <w:bookmarkEnd w:id="48"/>
-    <w:bookmarkStart w:id="49" w:name="figure-legends"/>
+    <w:bookmarkEnd w:id="37"/>
+    <w:bookmarkStart w:id="38" w:name="figure-legends"/>
     <w:p>
       <w:pPr>
         <w:pStyle w:val="Heading2"/>
@@ -3758,8 +3657,8 @@
         <w:t xml:space="preserve">.</w:t>
       </w:r>
     </w:p>
-    <w:bookmarkEnd w:id="49"/>
-    <w:bookmarkEnd w:id="50"/>
+    <w:bookmarkEnd w:id="38"/>
+    <w:bookmarkEnd w:id="39"/>
     <w:sectPr>
       <w:footnotePr>
         <w:numRestart w:val="eachSect"/>

</xml_diff>

<commit_message>
Phase 3: mid-ANI ANIm re-validation and hybrid boundary sweep; update Nature Methods draft
</commit_message>
<xml_diff>
--- a/paper/manuscript/manuscript_nature_methods.docx
+++ b/paper/manuscript/manuscript_nature_methods.docx
@@ -2,7 +2,7 @@
 <file path=word/document.xml><?xml version="1.0" encoding="utf-8"?>
 <w:document xmlns:w="http://schemas.openxmlformats.org/wordprocessingml/2006/main" xmlns:m="http://schemas.openxmlformats.org/officeDocument/2006/math" xmlns:r="http://schemas.openxmlformats.org/officeDocument/2006/relationships" xmlns:o="urn:schemas-microsoft-com:office:office" xmlns:v="urn:schemas-microsoft-com:vml" xmlns:w10="urn:schemas-microsoft-com:office:word" xmlns:a="http://schemas.openxmlformats.org/drawingml/2006/main" xmlns:pic="http://schemas.openxmlformats.org/drawingml/2006/picture" xmlns:wp="http://schemas.openxmlformats.org/drawingml/2006/wordprocessingDrawing">
   <w:body>
-    <w:bookmarkStart w:id="39" w:name="Xe400126ade8f1e4d28af479649ace7c1902f082"/>
+    <w:bookmarkStart w:id="40" w:name="Xe400126ade8f1e4d28af479649ace7c1902f082"/>
     <w:p>
       <w:pPr>
         <w:pStyle w:val="Heading1"/>
@@ -229,7 +229,7 @@
       </w:r>
     </w:p>
     <w:bookmarkEnd w:id="11"/>
-    <w:bookmarkStart w:id="18" w:name="results"/>
+    <w:bookmarkStart w:id="19" w:name="results"/>
     <w:p>
       <w:pPr>
         <w:pStyle w:val="Heading2"/>
@@ -543,16 +543,105 @@
         <w:t xml:space="preserve">0.615</w:t>
       </w:r>
       <w:r>
-        <w:t xml:space="preserve">), recovering the strong raw performance in the 97–100% regime (MAE 0.23) without degrading 95–97% (Fig. 4; Supplementary Fig. S3).</w:t>
+        <w:t xml:space="preserve">), recovering the strong raw performance in the 97–100% regime (MAE 0.23) without degrading 95–97% (Fig. 4; Supplementary Fig. S3). A threshold sweep shows the boundary is not critical: 97% gives MAE 0.619, 98% gives 0.615, and 99% gives 0.614.</w:t>
       </w:r>
     </w:p>
     <w:bookmarkEnd w:id="14"/>
-    <w:bookmarkStart w:id="15" w:name="accuracy-on-metagenome-assembled-genomes"/>
+    <w:bookmarkStart w:id="15" w:name="mid-ani-validation-against-anim"/>
     <w:p>
       <w:pPr>
         <w:pStyle w:val="Heading3"/>
       </w:pPr>
       <w:r>
+        <w:t xml:space="preserve">Mid-ANI validation against ANIm</w:t>
+      </w:r>
+    </w:p>
+    <w:p>
+      <w:pPr>
+        <w:pStyle w:val="FirstParagraph"/>
+      </w:pPr>
+      <w:r>
+        <w:t xml:space="preserve">Fifteen oral/gut cross-species pairs (</w:t>
+      </w:r>
+      <w:r>
+        <w:rPr>
+          <w:i/>
+          <w:iCs/>
+        </w:rPr>
+        <w:t xml:space="preserve">Bifidobacterium longum</w:t>
+      </w:r>
+      <w:r>
+        <w:t xml:space="preserve"> </w:t>
+      </w:r>
+      <w:r>
+        <w:t xml:space="preserve">×</w:t>
+      </w:r>
+      <w:r>
+        <w:t xml:space="preserve"> </w:t>
+      </w:r>
+      <w:r>
+        <w:rPr>
+          <w:i/>
+          <w:iCs/>
+        </w:rPr>
+        <w:t xml:space="preserve">B. breve</w:t>
+      </w:r>
+      <w:r>
+        <w:t xml:space="preserve">,</w:t>
+      </w:r>
+      <w:r>
+        <w:t xml:space="preserve"> </w:t>
+      </w:r>
+      <w:r>
+        <w:rPr>
+          <w:i/>
+          <w:iCs/>
+        </w:rPr>
+        <w:t xml:space="preserve">Veillonella parvula</w:t>
+      </w:r>
+      <w:r>
+        <w:t xml:space="preserve"> </w:t>
+      </w:r>
+      <w:r>
+        <w:t xml:space="preserve">×</w:t>
+      </w:r>
+      <w:r>
+        <w:t xml:space="preserve"> </w:t>
+      </w:r>
+      <w:r>
+        <w:rPr>
+          <w:i/>
+          <w:iCs/>
+        </w:rPr>
+        <w:t xml:space="preserve">V. dispar</w:t>
+      </w:r>
+      <w:r>
+        <w:t xml:space="preserve">) with ANIm truth at 87.6–90.2% test the hardest end of the detectable range. Here the calibrated output is harmful (MAE 4.48 against ANIm), but the gate correctly falls back to the homogeneous fit on all 15 pairs, giving MAE</w:t>
+      </w:r>
+      <w:r>
+        <w:t xml:space="preserve"> </w:t>
+      </w:r>
+      <w:r>
+        <w:rPr>
+          <w:b/>
+          <w:bCs/>
+        </w:rPr>
+        <w:t xml:space="preserve">1.42</w:t>
+      </w:r>
+      <w:r>
+        <w:t xml:space="preserve"> </w:t>
+      </w:r>
+      <w:r>
+        <w:t xml:space="preserve">— comparable to skani (1.40) and better than FastANI (1.86). This set validates the diagnostic, not the point estimate: the consistency flag is the safeguard when too few tags survive for the gamma model.</w:t>
+      </w:r>
+    </w:p>
+    <w:bookmarkEnd w:id="15"/>
+    <w:bookmarkStart w:id="16" w:name="accuracy-on-metagenome-assembled-genomes"/>
+    <w:p>
+      <w:pPr>
+        <w:pStyle w:val="Heading3"/>
+      </w:pPr>
+      <w:r>
         <w:t xml:space="preserve">Accuracy on metagenome-assembled genomes</w:t>
       </w:r>
     </w:p>
@@ -580,8 +669,8 @@
         <w:t xml:space="preserve">against dnadiff ANIm, versus 0.092 for skani and 0.203 for FastANI (Fig. 5). By CheckM2 tier, MAE is 0.041 on high-quality bins (n = 200; 100% within 0.5 points), 0.105 on medium-quality, and 0.291 on low-quality; |error| tracks contig N50 at Spearman ρ = −0.68. Applying the GTDB-trained v5 calibration to these MAGs degrades accuracy sharply (MAE 1.26), because the calibration learned real-genome associations absent in draft inputs; the raw gated estimate is therefore recommended for MAGs.</w:t>
       </w:r>
     </w:p>
-    <w:bookmarkEnd w:id="15"/>
-    <w:bookmarkStart w:id="16" w:name="Xc2259e7cc3fe8ebc3efe3d816355fd94caff3b1"/>
+    <w:bookmarkEnd w:id="16"/>
+    <w:bookmarkStart w:id="17" w:name="Xc2259e7cc3fe8ebc3efe3d816355fd94caff3b1"/>
     <w:p>
       <w:pPr>
         <w:pStyle w:val="Heading3"/>
@@ -701,8 +790,8 @@
         <w:t xml:space="preserve">The same pattern appears at database scale. Among 336 GTDB-R207 representative pairs with ANI ≥ 99.0% and aligned fraction ≥ 0.9 in both directions, 7.4% have a synteny score &lt; 0.99 and 2.4% fall below 0.98 — i.e. pairs an ANI-only search would return as near-clonal yet which are structurally divergent.</w:t>
       </w:r>
     </w:p>
-    <w:bookmarkEnd w:id="16"/>
-    <w:bookmarkStart w:id="17" w:name="computational-efficiency"/>
+    <w:bookmarkEnd w:id="17"/>
+    <w:bookmarkStart w:id="18" w:name="computational-efficiency"/>
     <w:p>
       <w:pPr>
         <w:pStyle w:val="Heading3"/>
@@ -769,9 +858,9 @@
         </w:pict>
       </w:r>
     </w:p>
-    <w:bookmarkEnd w:id="17"/>
     <w:bookmarkEnd w:id="18"/>
-    <w:bookmarkStart w:id="19" w:name="discussion"/>
+    <w:bookmarkEnd w:id="19"/>
+    <w:bookmarkStart w:id="20" w:name="discussion"/>
     <w:p>
       <w:pPr>
         <w:pStyle w:val="Heading2"/>
@@ -785,7 +874,7 @@
         <w:pStyle w:val="FirstParagraph"/>
       </w:pPr>
       <w:r>
-        <w:t xml:space="preserve">Syn2bANI demonstrates that fixed restriction-site anchors can support accurate, interpretable ANI estimation while additionally yielding synteny and structural information in the same computational pass. The chain-restricted likelihood cleanly separates divergence from shared content, and the calibration layer corrects the rate-heterogeneity bias that simulations alone fail to predict. Two boundaries are worth stating. First, skani remains faster for very large all-vs-all screens and is more accurate in the near-clonal 97–100% regime; the hybrid rule lets Syn2bANI recover the best raw estimate there. Second, the v5 calibration is trained on complete genomes and should not be silently applied to MAGs — the raw gated estimate is preferred for draft inputs, and the consistency flag marks pairs at the identifiability boundary.</w:t>
+        <w:t xml:space="preserve">Syn2bANI demonstrates that fixed restriction-site anchors can support accurate, interpretable ANI estimation while additionally yielding synteny and structural information in the same computational pass. The chain-restricted likelihood cleanly separates divergence from shared content, and the calibration layer corrects the rate-heterogeneity bias that simulations alone fail to predict. Three boundaries are worth stating. First, skani remains faster for very large all-vs-all screens and is more accurate in the near-clonal 97–100% regime; the hybrid rule lets Syn2bANI recover the best raw estimate there. Second, the v5 calibration is trained on complete genomes and should not be silently applied to MAGs or mid-ANI pairs — the raw gated estimate is preferred for draft inputs, and the consistency flag marks pairs at the identifiability boundary. Third, the structural outputs are not an afterthought: they are a direct consequence of using coordinate-carrying anchors, and they provide a second axis of comparison that is orthogonal to divergence.</w:t>
       </w:r>
     </w:p>
     <w:p>
@@ -803,8 +892,8 @@
         </w:pict>
       </w:r>
     </w:p>
-    <w:bookmarkEnd w:id="19"/>
-    <w:bookmarkStart w:id="31" w:name="online-methods"/>
+    <w:bookmarkEnd w:id="20"/>
+    <w:bookmarkStart w:id="32" w:name="online-methods"/>
     <w:p>
       <w:pPr>
         <w:pStyle w:val="Heading2"/>
@@ -813,7 +902,7 @@
         <w:t xml:space="preserve">Online Methods</w:t>
       </w:r>
     </w:p>
-    <w:bookmarkStart w:id="20" w:name="X585a6a8b67378bd6645996598d95979c15b1236"/>
+    <w:bookmarkStart w:id="21" w:name="X585a6a8b67378bd6645996598d95979c15b1236"/>
     <w:p>
       <w:pPr>
         <w:pStyle w:val="Heading3"/>
@@ -914,8 +1003,8 @@
         <w:t xml:space="preserve">three-of-four positions. The homogeneous likelihood uses the exact convolution over degenerate classes; the heterogeneous likelihood uses a negative binomial with effective body b + d2/3 + 2·d3/3 plus a closed-form survival factor. With the fully specific default panel (d2 = d3 = 0) both paths are bit-identical to the pre-fix code. Tags are stored strand-canonically (the lexicographically smaller of a tag and its reverse complement), so contig orientation is immaterial; reverse-complement self-controls on real drafts return 99.9999.</w:t>
       </w:r>
     </w:p>
-    <w:bookmarkEnd w:id="20"/>
-    <w:bookmarkStart w:id="21" w:name="Xd100f60785764278c40c45b7debf06888935c47"/>
+    <w:bookmarkEnd w:id="21"/>
+    <w:bookmarkStart w:id="22" w:name="Xd100f60785764278c40c45b7debf06888935c47"/>
     <w:p>
       <w:pPr>
         <w:pStyle w:val="Heading3"/>
@@ -1040,8 +1129,8 @@
         <w:t xml:space="preserve">bp of the predicted position — seed-and-extend, which cannot invent matches between positionally unrelated tags. Chains are processed largest-first and each query tag is counted at most once.</w:t>
       </w:r>
     </w:p>
-    <w:bookmarkEnd w:id="21"/>
-    <w:bookmarkStart w:id="22" w:name="Xc84f212d8323a8f017575d3d7a92fc22fb23227"/>
+    <w:bookmarkEnd w:id="22"/>
+    <w:bookmarkStart w:id="23" w:name="Xc84f212d8323a8f017575d3d7a92fc22fb23227"/>
     <w:p>
       <w:pPr>
         <w:pStyle w:val="Heading3"/>
@@ -1175,8 +1264,8 @@
         <w:t xml:space="preserve">. The recalibrated flag never inverts its error ranking on any validation set (kept vs flagged MAE: GTDB-ANIm 2.415 vs 4.153; oral/gut 0.514 vs 4.269; mid-ANI 0.343 vs 1.113), at a disclosed cost in near-clonal sensitivity.</w:t>
       </w:r>
     </w:p>
-    <w:bookmarkEnd w:id="22"/>
-    <w:bookmarkStart w:id="23" w:name="short-contig-rescue-pass"/>
+    <w:bookmarkEnd w:id="23"/>
+    <w:bookmarkStart w:id="24" w:name="short-contig-rescue-pass"/>
     <w:p>
       <w:pPr>
         <w:pStyle w:val="Heading3"/>
@@ -1220,8 +1309,8 @@
         <w:t xml:space="preserve">+ 1) × mean tag spacing along the reference. Rescued contigs contribute AF spans with the same half-median-gap extension rule as chains but create no chains, so synteny and SV outputs are untouched. The pass is gated on contig tag count, so complete and high-N50 assemblies take a bit-identical path. The residual +0.20 drift at N50 5 kb comes from contigs with 0–1 placeable anchors (~1.3 Mb on the Sakai ladder), which carry no positional evidence; rescuing them would require guessing homology.</w:t>
       </w:r>
     </w:p>
-    <w:bookmarkEnd w:id="23"/>
-    <w:bookmarkStart w:id="24" w:name="database-scale-screen"/>
+    <w:bookmarkEnd w:id="24"/>
+    <w:bookmarkStart w:id="25" w:name="database-scale-screen"/>
     <w:p>
       <w:pPr>
         <w:pStyle w:val="Heading3"/>
@@ -1313,8 +1402,8 @@
         <w:t xml:space="preserve">command, so database output is byte-identical to pairwise output on the same pairs. Screen thresholds are panel-specific and exposed as flags.</w:t>
       </w:r>
     </w:p>
-    <w:bookmarkEnd w:id="24"/>
-    <w:bookmarkStart w:id="25" w:name="ridge-calibration-protocol"/>
+    <w:bookmarkEnd w:id="25"/>
+    <w:bookmarkStart w:id="26" w:name="ridge-calibration-protocol"/>
     <w:p>
       <w:pPr>
         <w:pStyle w:val="Heading3"/>
@@ -1479,8 +1568,8 @@
         <w:t xml:space="preserve">pairs rather than extrapolating.</w:t>
       </w:r>
     </w:p>
-    <w:bookmarkEnd w:id="25"/>
-    <w:bookmarkStart w:id="26" w:name="Xd3b37ce8f62a83dd9d52f682daa388ffbd3bd4e"/>
+    <w:bookmarkEnd w:id="26"/>
+    <w:bookmarkStart w:id="27" w:name="Xd3b37ce8f62a83dd9d52f682daa388ffbd3bd4e"/>
     <w:p>
       <w:pPr>
         <w:pStyle w:val="Heading3"/>
@@ -1497,8 +1586,8 @@
         <w:t xml:space="preserve">The mechanistic alternative to calibration was evaluated in full (prototype in Python against 19 exact-truth mosaic simulations, then the GTDB-ANIm matrix). The bias decomposes into an in-chain distribution-family term — asymptotic in-chain MAE 2.25 for gamma, 1.25 for a capped grid NPMLE, so a nonparametric fit fixes at most ~0.1–0.2 GTDB MAE — and a coverage term: the divergence of the unchained fraction is not identifiable from tag data, since the out-of-chain anchor residual is ≈ 0 within multi-match noise whether the unchained mass is saturated-divergent or accessory, and an oracle given the exact identity of the chained sample still errs by MAE 1.36 against whole-genome truth. No candidate (AF-weighted mixtures, discrete mixtures, ascertainment-aware tilts, capped NPMLE with and without LRT gating, model averaging) beats the gated baseline while holding all simulation gates. The raw estimator is therefore at its identifiability floor at 4-enzyme tag density; this analysis is why calibration, not a new likelihood, is the deployed correction layer.</w:t>
       </w:r>
     </w:p>
-    <w:bookmarkEnd w:id="26"/>
-    <w:bookmarkStart w:id="27" w:name="structural-variant-calling"/>
+    <w:bookmarkEnd w:id="27"/>
+    <w:bookmarkStart w:id="28" w:name="structural-variant-calling"/>
     <w:p>
       <w:pPr>
         <w:pStyle w:val="Heading3"/>
@@ -1545,8 +1634,8 @@
         <w:t xml:space="preserve">(default 1 kb), with a guard requiring that no third chain anchors inside the spanned reference interval (without it, a small relocated block sandwiched between collinear chains is misreported as a deletion sized by the reference jump — observed as spurious 42–961 kb calls before the guard); translocations are chains violating global reference order. Resolution is limited by tag spacing and by unphaseable repeats at junctions (observed endpoint offset ≤ 5.5 kb on the 779 kb W3110 inversion); events whose flanking chains have &lt; 4 anchors are not called, and equal-length homologous replacements that keep tags phased are invisible by design. Validation against dnadiff used span-based one-to-many matching because dnadiff fragments large accessory regions into many small events while Syn2bANI calls each junction once.</w:t>
       </w:r>
     </w:p>
-    <w:bookmarkEnd w:id="27"/>
-    <w:bookmarkStart w:id="28" w:name="simulation-framework-with-exact-truth"/>
+    <w:bookmarkEnd w:id="28"/>
+    <w:bookmarkStart w:id="29" w:name="simulation-framework-with-exact-truth"/>
     <w:p>
       <w:pPr>
         <w:pStyle w:val="Heading3"/>
@@ -1576,8 +1665,8 @@
         <w:t xml:space="preserve">K-12 MG1655, ENA U00096.3, 4,641,652 bp) by applying a counted number of substitutions, so true ANI = 1 − n_subs/L exactly. Families: an ANI ladder (12 levels, 85–99.9%, each with a 400 kb inversion, with and without ~46 deletions of 200–2,000 bp); an indel sweep (true ANI 95.000; 0–4 deletions/100 kb); fragmentation (20–201 contigs, no sequence lost, ~50% reverse-complemented, order shuffled); accessory confounds (core ANI 95.000; 0–50% of the genome replaced by composition-preserving shuffled blocks, plus a block-count control at fixed total fraction); mosaic/rate-heterogeneity cases (per-block rates ~ Gamma(α, α), α = 0.5/1/2, mean ANI 90–98, plus deliberately misspecified bimodal cases); and GC coverage (ladders on five real template genomes, GC 27.2–72.1%). Deletions do not change true ANI (counted substitutions over reference length), so the deleted fraction doubles as AF ground truth. Substitutions are uniform over the three alternative bases with no GC-biased mutation model, transition/transversion ratio, codon structure, or selection — a deliberate simplification justified by the finding that GC does not explain the real-data degradation and that site turnover emerges from uniform substitution on a real genome without any special mechanism. Enzyme digestion is never simulated; the released binary extracts tags itself.</w:t>
       </w:r>
     </w:p>
-    <w:bookmarkEnd w:id="28"/>
-    <w:bookmarkStart w:id="29" w:name="benchmark-datasets-truth-and-tools"/>
+    <w:bookmarkEnd w:id="29"/>
+    <w:bookmarkStart w:id="30" w:name="benchmark-datasets-truth-and-tools"/>
     <w:p>
       <w:pPr>
         <w:pStyle w:val="Heading3"/>
@@ -2523,8 +2612,8 @@
         <w:t xml:space="preserve">time covers only 302/484 reported pairs (minimum-AF filter) and excludes sketching; we note this wherever the comparison appears.</w:t>
       </w:r>
     </w:p>
-    <w:bookmarkEnd w:id="29"/>
-    <w:bookmarkStart w:id="30" w:name="implementation"/>
+    <w:bookmarkEnd w:id="30"/>
+    <w:bookmarkStart w:id="31" w:name="implementation"/>
     <w:p>
       <w:pPr>
         <w:pStyle w:val="Heading3"/>
@@ -2653,9 +2742,9 @@
         </w:pict>
       </w:r>
     </w:p>
-    <w:bookmarkEnd w:id="30"/>
     <w:bookmarkEnd w:id="31"/>
-    <w:bookmarkStart w:id="32" w:name="data-availability"/>
+    <w:bookmarkEnd w:id="32"/>
+    <w:bookmarkStart w:id="33" w:name="data-availability"/>
     <w:p>
       <w:pPr>
         <w:pStyle w:val="Heading2"/>
@@ -2760,8 +2849,8 @@
         <w:t xml:space="preserve">K-12 MG1655, ENA accession U00096.3.</w:t>
       </w:r>
     </w:p>
-    <w:bookmarkEnd w:id="32"/>
-    <w:bookmarkStart w:id="33" w:name="code-availability"/>
+    <w:bookmarkEnd w:id="33"/>
+    <w:bookmarkStart w:id="34" w:name="code-availability"/>
     <w:p>
       <w:pPr>
         <w:pStyle w:val="Heading2"/>
@@ -2790,8 +2879,8 @@
         <w:t xml:space="preserve">).</w:t>
       </w:r>
     </w:p>
-    <w:bookmarkEnd w:id="33"/>
-    <w:bookmarkStart w:id="34" w:name="acknowledgements"/>
+    <w:bookmarkEnd w:id="34"/>
+    <w:bookmarkStart w:id="35" w:name="acknowledgements"/>
     <w:p>
       <w:pPr>
         <w:pStyle w:val="Heading2"/>
@@ -2808,8 +2897,8 @@
         <w:t xml:space="preserve">[To be determined.]</w:t>
       </w:r>
     </w:p>
-    <w:bookmarkEnd w:id="34"/>
-    <w:bookmarkStart w:id="35" w:name="author-contributions"/>
+    <w:bookmarkEnd w:id="35"/>
+    <w:bookmarkStart w:id="36" w:name="author-contributions"/>
     <w:p>
       <w:pPr>
         <w:pStyle w:val="Heading2"/>
@@ -2826,8 +2915,8 @@
         <w:t xml:space="preserve">[To be determined — placeholder.]</w:t>
       </w:r>
     </w:p>
-    <w:bookmarkEnd w:id="35"/>
-    <w:bookmarkStart w:id="36" w:name="competing-interests"/>
+    <w:bookmarkEnd w:id="36"/>
+    <w:bookmarkStart w:id="37" w:name="competing-interests"/>
     <w:p>
       <w:pPr>
         <w:pStyle w:val="Heading2"/>
@@ -2844,8 +2933,8 @@
         <w:t xml:space="preserve">[To be determined — placeholder: The authors declare no competing interests.]</w:t>
       </w:r>
     </w:p>
-    <w:bookmarkEnd w:id="36"/>
-    <w:bookmarkStart w:id="37" w:name="references"/>
+    <w:bookmarkEnd w:id="37"/>
+    <w:bookmarkStart w:id="38" w:name="references"/>
     <w:p>
       <w:pPr>
         <w:pStyle w:val="Heading2"/>
@@ -3303,8 +3392,8 @@
         </w:pict>
       </w:r>
     </w:p>
-    <w:bookmarkEnd w:id="37"/>
-    <w:bookmarkStart w:id="38" w:name="figure-legends"/>
+    <w:bookmarkEnd w:id="38"/>
+    <w:bookmarkStart w:id="39" w:name="figure-legends"/>
     <w:p>
       <w:pPr>
         <w:pStyle w:val="Heading2"/>
@@ -3657,8 +3746,8 @@
         <w:t xml:space="preserve">.</w:t>
       </w:r>
     </w:p>
-    <w:bookmarkEnd w:id="38"/>
     <w:bookmarkEnd w:id="39"/>
+    <w:bookmarkEnd w:id="40"/>
     <w:sectPr>
       <w:footnotePr>
         <w:numRestart w:val="eachSect"/>

</xml_diff>

<commit_message>
Revise Nature Methods draft per simulated review: fix abstract claims, add calibration decision rule, clarify 2bRAD-M distinction, fix internal inconsistencies, expand references to 40, add Tables 1 and 3
</commit_message>
<xml_diff>
--- a/paper/manuscript/manuscript_nature_methods.docx
+++ b/paper/manuscript/manuscript_nature_methods.docx
@@ -2,7 +2,7 @@
 <file path=word/document.xml><?xml version="1.0" encoding="utf-8"?>
 <w:document xmlns:w="http://schemas.openxmlformats.org/wordprocessingml/2006/main" xmlns:m="http://schemas.openxmlformats.org/officeDocument/2006/math" xmlns:r="http://schemas.openxmlformats.org/officeDocument/2006/relationships" xmlns:o="urn:schemas-microsoft-com:office:office" xmlns:v="urn:schemas-microsoft-com:vml" xmlns:w10="urn:schemas-microsoft-com:office:word" xmlns:a="http://schemas.openxmlformats.org/drawingml/2006/main" xmlns:pic="http://schemas.openxmlformats.org/drawingml/2006/picture" xmlns:wp="http://schemas.openxmlformats.org/drawingml/2006/wordprocessingDrawing">
   <w:body>
-    <w:bookmarkStart w:id="40" w:name="Xe400126ade8f1e4d28af479649ace7c1902f082"/>
+    <w:bookmarkStart w:id="43" w:name="Xe400126ade8f1e4d28af479649ace7c1902f082"/>
     <w:p>
       <w:pPr>
         <w:pStyle w:val="Heading1"/>
@@ -101,7 +101,7 @@
         <w:pStyle w:val="FirstParagraph"/>
       </w:pPr>
       <w:r>
-        <w:t xml:space="preserve">Average Nucleotide Identity (ANI) is the standard metric for prokaryotic species delineation, yet alignment-free tools reduce a genome comparison to a single divergence scalar and discard synteny and structural information. We introduce Syn2bANI, which uses in-silico Type IIB restriction enzyme tags as fixed positional anchors, chains shared anchors collinearly, and estimates ANI by maximum likelihood from tags inside trusted chains. A per-pair effect-size gate chooses between uniform and gamma rate models, and a ridge calibration trained on alignment-based truth corrects real-genome rate heterogeneity. In one pass the same anchors yield aligned fraction, a synteny score, and structural-variant calls. On simulations with exact truth Syn2bANI attains MAE 0.073% versus 0.377% (skani) and 0.742% (FastANI), and remains robust to indels, GC variation, accessory content, and fragmentation. On 43,334 held-out GTDB-R207 pairs it achieves MAE 0.619% against ANIm, compared with 0.957% for skani and 0.977% for FastANI. Syn2bANI is implemented in Rust and available at https://github.com/HuangShiLab/Syn2bANI.</w:t>
+        <w:t xml:space="preserve">Average Nucleotide Identity (ANI) is the standard metric for prokaryotic species delineation, yet alignment-free tools reduce a genome comparison to a single divergence scalar and discard synteny and structural information. We introduce Syn2bANI, which uses in-silico Type IIB restriction enzyme tags as fixed positional anchors, chains shared anchors collinearly, and estimates ANI by maximum likelihood from tags inside trusted chains. A per-pair effect-size gate chooses between uniform and gamma rate models; a ridge calibration trained on alignment-based truth corrects real-genome rate heterogeneity where it matters most. In one pass the same anchors yield aligned fraction, a synteny score, and structural-variant calls. On simulations with exact truth Syn2bANI attains MAE 0.073% versus 0.377% (skani) and 0.742% (FastANI), and remains robust to indels, GC variation, accessory content, and fragmentation. On 43,334 held-out GTDB-R207 pairs the calibrated estimator achieves MAE 0.619% against ANIm, compared with 0.957% for skani and 0.977% for FastANI; a hybrid rule restores skani-level accuracy in the near-clonal 97–100% regime. Syn2bANI is implemented in Rust and available at https://github.com/HuangShiLab/Syn2bANI.</w:t>
       </w:r>
     </w:p>
     <w:p>
@@ -149,7 +149,7 @@
         <w:pStyle w:val="BodyText"/>
       </w:pPr>
       <w:r>
-        <w:t xml:space="preserve">Three tool families dominate. Alignment-based methods (ANIm/ANIb) are the direct realization of the definition but too slow for database-scale all-vs-all screens4,5. FastANI popularized an alignment-free approximation from 20-mer seed matches and fragment-level chaining2; skani replaced seeding with sparse k-mer sketches and a regressed chain statistic, gaining orders of magnitude in speed6. Both k-mer tools reduce the comparison to essentially one number: ANI plus an aligned-fraction estimate. Neither reports</w:t>
+        <w:t xml:space="preserve">Three tool families dominate. Alignment-based methods (ANIm/ANIb) are the direct realization of the definition but too slow for database-scale all-vs-all screens4,5,17,18. FastANI popularized an alignment-free approximation from 20-mer seed matches and fragment-level chaining2; skani replaced seeding with sparse k-mer sketches and a regressed chain statistic, gaining orders of magnitude in speed6. Related sketching approaches such as Mash13, Dashing14, and BinDash15 trade accuracy for speed by estimating distances from k-mer containment. Both k-mer tools reduce the comparison to essentially one number: ANI plus an aligned-fraction estimate. Neither reports</w:t>
       </w:r>
       <w:r>
         <w:t xml:space="preserve"> </w:t>
@@ -173,7 +173,7 @@
         <w:pStyle w:val="BodyText"/>
       </w:pPr>
       <w:r>
-        <w:t xml:space="preserve">Type IIB restriction enzymes offer a different anchoring substrate. They cleave at fixed offsets from a short recognition sequence, producing short (~32 bp) tags whose genomic positions are fully determined by the motif. The 2bRAD reduced-representation sequencing family exploits this property7, and 2bRAD-M has shown species- and strain-level resolution in real microbiome data8. Computationally, these tags are sparse (one per ~0.5–1.5 kb), long enough that a match is almost certainly homologous, and — crucially — the</w:t>
+        <w:t xml:space="preserve">Type IIB restriction enzymes offer a different anchoring substrate. They cleave at fixed offsets from a short recognition sequence, producing short (~32 bp) tags whose genomic positions are fully determined by the motif. The 2bRAD reduced-representation sequencing family exploits this property7, and 2bRAD-M has shown species- and strain-level resolution in real microbiome data8. Syn2bANI differs from 2bRAD-M in purpose and machinery: 2bRAD-M profiles community composition from sequencing reads using tag presence/absence, whereas Syn2bANI compares two complete or draft genome sequences and estimates divergence by maximum likelihood from tag mismatch and miss statistics inside chained collinear blocks. Computationally, these tags are sparse (one per ~0.5–1.5 kb), long enough that a match is almost certainly homologous, and — crucially — the</w:t>
       </w:r>
       <w:r>
         <w:t xml:space="preserve"> </w:t>
@@ -218,7 +218,7 @@
         <w:pStyle w:val="BodyText"/>
       </w:pPr>
       <w:r>
-        <w:t xml:space="preserve">We validate Syn2bANI in two regimes. Simulations with exact truth establish that the raw estimator is essentially unbiased and quantify robustness to indels, fragmentation, accessory content, and GC. Real genome pairs against ANIm truth reveal regional rate heterogeneity that biases the raw estimator upward by about two ANI points at divergent bands; a transparent ridge calibration on internal features removes this bias. The result is a tool that matches or exceeds skani and FastANI on held-out GTDB-R207 pairs while additionally providing synteny and SV outputs that k-mer tools cannot.</w:t>
+        <w:t xml:space="preserve">We validate Syn2bANI in two regimes. Simulations with exact truth establish that the raw estimator is essentially unbiased and quantify robustness to indels, fragmentation, accessory content, and GC. Real genome pairs against ANIm truth reveal regional rate heterogeneity that biases the raw estimator upward by about two ANI points at divergent bands; a transparent ridge calibration on internal features removes this bias. On held-out GTDB-R207 pairs the calibrated estimator is more accurate than skani and FastANI at 80–95% ANI, while a hybrid rule restores skani-level accuracy at 97–100% ANI. The same pass additionally provides synteny and SV outputs that k-mer tools do not report.</w:t>
       </w:r>
     </w:p>
     <w:p>
@@ -229,7 +229,7 @@
       </w:r>
     </w:p>
     <w:bookmarkEnd w:id="11"/>
-    <w:bookmarkStart w:id="19" w:name="results"/>
+    <w:bookmarkStart w:id="20" w:name="results"/>
     <w:p>
       <w:pPr>
         <w:pStyle w:val="Heading2"/>
@@ -666,16 +666,61 @@
         <w:t xml:space="preserve"> </w:t>
       </w:r>
       <w:r>
-        <w:t xml:space="preserve">against dnadiff ANIm, versus 0.092 for skani and 0.203 for FastANI (Fig. 5). By CheckM2 tier, MAE is 0.041 on high-quality bins (n = 200; 100% within 0.5 points), 0.105 on medium-quality, and 0.291 on low-quality; |error| tracks contig N50 at Spearman ρ = −0.68. Applying the GTDB-trained v5 calibration to these MAGs degrades accuracy sharply (MAE 1.26), because the calibration learned real-genome associations absent in draft inputs; the raw gated estimate is therefore recommended for MAGs.</w:t>
+        <w:t xml:space="preserve">against dnadiff ANIm, versus 0.092 for skani and 0.203 for FastANI (Fig. 5). By CheckM2 quality tier24,25, MAE is 0.041 on high-quality bins (n = 200; 100% within 0.5 points), 0.105 on medium-quality, and 0.291 on low-quality; |error| tracks contig N50 at Spearman ρ = −0.68. Applying the GTDB-trained v5 calibration to these MAGs degrades accuracy sharply (MAE 1.26), because the calibration learned real-genome associations absent in draft inputs; the raw gated estimate is therefore recommended for MAGs.</w:t>
       </w:r>
     </w:p>
     <w:bookmarkEnd w:id="16"/>
-    <w:bookmarkStart w:id="17" w:name="Xc2259e7cc3fe8ebc3efe3d816355fd94caff3b1"/>
+    <w:bookmarkStart w:id="17" w:name="X5be024dde2592d6a6a663fd30b3a116f84242f9"/>
     <w:p>
       <w:pPr>
         <w:pStyle w:val="Heading3"/>
       </w:pPr>
       <w:r>
+        <w:t xml:space="preserve">Calibration regime-specificity and output selection</w:t>
+      </w:r>
+    </w:p>
+    <w:p>
+      <w:pPr>
+        <w:pStyle w:val="FirstParagraph"/>
+      </w:pPr>
+      <w:r>
+        <w:t xml:space="preserve">The v5 calibration is trained on complete GTDB-R207 genomes and improves accuracy only in that regime. For fragmented MAGs and mid-ANI pairs, the calibrated column can be substantially worse than the raw gated estimate (MAGs: MAE 1.26 vs 0.163; mid-ANI: 4.48 vs 1.42). We therefore recommend a simple decision rule: use the calibrated column for complete-genome database comparisons and species-level screening; use the raw gated estimate for draft genomes, MAGs, and any pair flagged</w:t>
+      </w:r>
+      <w:r>
+        <w:t xml:space="preserve"> </w:t>
+      </w:r>
+      <w:r>
+        <w:rPr>
+          <w:rStyle w:val="VerbatimChar"/>
+        </w:rPr>
+        <w:t xml:space="preserve">INCONSISTENT</w:t>
+      </w:r>
+      <w:r>
+        <w:t xml:space="preserve"> </w:t>
+      </w:r>
+      <w:r>
+        <w:t xml:space="preserve">or</w:t>
+      </w:r>
+      <w:r>
+        <w:t xml:space="preserve"> </w:t>
+      </w:r>
+      <w:r>
+        <w:rPr>
+          <w:rStyle w:val="VerbatimChar"/>
+        </w:rPr>
+        <w:t xml:space="preserve">BELOW_DETECTION</w:t>
+      </w:r>
+      <w:r>
+        <w:t xml:space="preserve">; and use the hybrid rule (raw ≥98%, calibrated &lt;98%) when a single column must be chosen for mixed inputs.</w:t>
+      </w:r>
+    </w:p>
+    <w:bookmarkEnd w:id="17"/>
+    <w:bookmarkStart w:id="18" w:name="Xc2259e7cc3fe8ebc3efe3d816355fd94caff3b1"/>
+    <w:p>
+      <w:pPr>
+        <w:pStyle w:val="Heading3"/>
+      </w:pPr>
+      <w:r>
         <w:t xml:space="preserve">High-ANI pairs hide extensive rearrangements</w:t>
       </w:r>
     </w:p>
@@ -684,7 +729,7 @@
         <w:pStyle w:val="FirstParagraph"/>
       </w:pPr>
       <w:r>
-        <w:t xml:space="preserve">ANI is a scalar average and therefore blind to genome architecture. We quantified this on four published isolate collections. In a longitudinal</w:t>
+        <w:t xml:space="preserve">ANI is a scalar average and therefore blind to genome architecture. We quantified this on four published isolate collections from a recent synteny-based strain-tracking study10. In a longitudinal</w:t>
       </w:r>
       <w:r>
         <w:t xml:space="preserve"> </w:t>
@@ -790,8 +835,8 @@
         <w:t xml:space="preserve">The same pattern appears at database scale. Among 336 GTDB-R207 representative pairs with ANI ≥ 99.0% and aligned fraction ≥ 0.9 in both directions, 7.4% have a synteny score &lt; 0.99 and 2.4% fall below 0.98 — i.e. pairs an ANI-only search would return as near-clonal yet which are structurally divergent.</w:t>
       </w:r>
     </w:p>
-    <w:bookmarkEnd w:id="17"/>
-    <w:bookmarkStart w:id="18" w:name="computational-efficiency"/>
+    <w:bookmarkEnd w:id="18"/>
+    <w:bookmarkStart w:id="19" w:name="computational-efficiency"/>
     <w:p>
       <w:pPr>
         <w:pStyle w:val="Heading3"/>
@@ -848,7 +893,7 @@
         <w:t xml:space="preserve"> </w:t>
       </w:r>
       <w:r>
-        <w:t xml:space="preserve">against the same database takes ~4 min for 1,000 queries. skani remains faster at scale, a trade-off we state openly.</w:t>
+        <w:t xml:space="preserve">against the same database takes ~4 min for 1,000 queries. skani remains faster at scale, a trade-off that is stated openly.</w:t>
       </w:r>
     </w:p>
     <w:p>
@@ -858,9 +903,9 @@
         </w:pict>
       </w:r>
     </w:p>
-    <w:bookmarkEnd w:id="18"/>
     <w:bookmarkEnd w:id="19"/>
-    <w:bookmarkStart w:id="20" w:name="discussion"/>
+    <w:bookmarkEnd w:id="20"/>
+    <w:bookmarkStart w:id="21" w:name="discussion"/>
     <w:p>
       <w:pPr>
         <w:pStyle w:val="Heading2"/>
@@ -874,15 +919,7 @@
         <w:pStyle w:val="FirstParagraph"/>
       </w:pPr>
       <w:r>
-        <w:t xml:space="preserve">Syn2bANI demonstrates that fixed restriction-site anchors can support accurate, interpretable ANI estimation while additionally yielding synteny and structural information in the same computational pass. The chain-restricted likelihood cleanly separates divergence from shared content, and the calibration layer corrects the rate-heterogeneity bias that simulations alone fail to predict. Three boundaries are worth stating. First, skani remains faster for very large all-vs-all screens and is more accurate in the near-clonal 97–100% regime; the hybrid rule lets Syn2bANI recover the best raw estimate there. Second, the v5 calibration is trained on complete genomes and should not be silently applied to MAGs or mid-ANI pairs — the raw gated estimate is preferred for draft inputs, and the consistency flag marks pairs at the identifiability boundary. Third, the structural outputs are not an afterthought: they are a direct consequence of using coordinate-carrying anchors, and they provide a second axis of comparison that is orthogonal to divergence.</w:t>
-      </w:r>
-    </w:p>
-    <w:p>
-      <w:pPr>
-        <w:pStyle w:val="BodyText"/>
-      </w:pPr>
-      <w:r>
-        <w:t xml:space="preserve">The structural outputs are not an afterthought: they are a direct consequence of using coordinate-carrying anchors. In an era of strain-resolved metagenomics, ANI alone is insufficient to decide whether two genomes are truly equivalent. The synteny score and SV calls provide a second axis of comparison that is orthogonal to divergence and biologically interpretable.</w:t>
+        <w:t xml:space="preserve">Syn2bANI demonstrates that fixed restriction-site anchors can support accurate, interpretable ANI estimation while additionally yielding synteny and structural information in the same computational pass. The chain-restricted likelihood cleanly separates divergence from shared content, and the calibration layer corrects the rate-heterogeneity bias that simulations alone fail to predict. Three boundaries are worth stating. First, skani remains faster for very large all-vs-all screens and is more accurate in the near-clonal 97–100% regime; the hybrid rule lets Syn2bANI recover the best raw estimate there. Second, the v5 calibration is trained on complete genomes and should not be silently applied to MAGs or mid-ANI pairs — the raw gated estimate is preferred for draft inputs, and the consistency flag marks pairs at the identifiability boundary. Third, the structural outputs are a direct consequence of using coordinate-carrying anchors: in an era of strain-resolved metagenomics, ANI alone is insufficient to decide whether two genomes are truly equivalent, and the synteny score and SV calls provide a second, biologically interpretable axis of comparison. Unlike dedicated structural tools such as minigraph-Cactus19, SyRI20, or Mauve21, Syn2bANI does not aim to reconstruct full genome graphs or base-level alignments; instead it reports breakpoint counts, inversion/translocation calls, and a synteny score directly from the anchor chains used for ANI estimation, at no additional modeling cost.</w:t>
       </w:r>
     </w:p>
     <w:p>
@@ -892,8 +929,8 @@
         </w:pict>
       </w:r>
     </w:p>
-    <w:bookmarkEnd w:id="20"/>
-    <w:bookmarkStart w:id="32" w:name="online-methods"/>
+    <w:bookmarkEnd w:id="21"/>
+    <w:bookmarkStart w:id="33" w:name="online-methods"/>
     <w:p>
       <w:pPr>
         <w:pStyle w:val="Heading2"/>
@@ -902,7 +939,7 @@
         <w:t xml:space="preserve">Online Methods</w:t>
       </w:r>
     </w:p>
-    <w:bookmarkStart w:id="21" w:name="X585a6a8b67378bd6645996598d95979c15b1236"/>
+    <w:bookmarkStart w:id="22" w:name="X585a6a8b67378bd6645996598d95979c15b1236"/>
     <w:p>
       <w:pPr>
         <w:pStyle w:val="Heading3"/>
@@ -916,7 +953,7 @@
         <w:pStyle w:val="FirstParagraph"/>
       </w:pPr>
       <w:r>
-        <w:t xml:space="preserve">Each genome is digested in silico with every enzyme in the panel (default BcgI, AlfI, AloI, FalI; all 16 Type IIB enzymes of the 2bRAD-M panel are supported [8,19]). Recognition patterns are decomposed into fixed anchor bases and IUPAC degenerate positions; matching uses precomputed 4-bit base masks so each degenerate check is one load and one bitwise AND. The digestion enforces the</w:t>
+        <w:t xml:space="preserve">Each genome is digested in silico with every enzyme in the panel (default BcgI, AlfI, AloI, FalI; all 16 Type IIB enzymes of the 2bRAD-M panel are supported8,30). Recognition patterns are decomposed into fixed anchor bases and IUPAC degenerate positions; matching uses precomputed 4-bit base masks so each degenerate check is one load and one bitwise AND. The digestion enforces the</w:t>
       </w:r>
       <w:r>
         <w:t xml:space="preserve"> </w:t>
@@ -932,7 +969,7 @@
         <w:t xml:space="preserve"> </w:t>
       </w:r>
       <w:r>
-        <w:t xml:space="preserve">biological site on both strands — during validation we found that the patterns for HaeIV, Hin4I, and BaeI had silently dropped the trailing fixed anchor bases of the degenerate-containing right anchor (~16× excess tag density for HaeIV), and this was fixed alongside the likelihood geometry. Tags longer than 32 bp (CspCI, 33 bp) exceed the 2-bit packing width and are refused with a warning rather than silently mismatched — a policy instituted after a truncation asymmetry was found to destroy 91% of reverse-strand anchors for such enzymes.</w:t>
+        <w:t xml:space="preserve">biological site on both strands — during validation it was observed that the patterns for HaeIV, Hin4I, and BaeI had silently dropped the trailing fixed anchor bases of the degenerate-containing right anchor (~16× excess tag density for HaeIV), and this was fixed alongside the likelihood geometry. Tags longer than 32 bp (CspCI, 33 bp) exceed the 2-bit packing width and are refused with a warning rather than silently mismatched — a policy instituted after a truncation asymmetry was found to destroy 91% of reverse-strand anchors for such enzymes.</w:t>
       </w:r>
     </w:p>
     <w:p>
@@ -1003,8 +1040,8 @@
         <w:t xml:space="preserve">three-of-four positions. The homogeneous likelihood uses the exact convolution over degenerate classes; the heterogeneous likelihood uses a negative binomial with effective body b + d2/3 + 2·d3/3 plus a closed-form survival factor. With the fully specific default panel (d2 = d3 = 0) both paths are bit-identical to the pre-fix code. Tags are stored strand-canonically (the lexicographically smaller of a tag and its reverse complement), so contig orientation is immaterial; reverse-complement self-controls on real drafts return 99.9999.</w:t>
       </w:r>
     </w:p>
-    <w:bookmarkEnd w:id="21"/>
-    <w:bookmarkStart w:id="22" w:name="Xd100f60785764278c40c45b7debf06888935c47"/>
+    <w:bookmarkEnd w:id="22"/>
+    <w:bookmarkStart w:id="23" w:name="Xd100f60785764278c40c45b7debf06888935c47"/>
     <w:p>
       <w:pPr>
         <w:pStyle w:val="Heading3"/>
@@ -1129,8 +1166,8 @@
         <w:t xml:space="preserve">bp of the predicted position — seed-and-extend, which cannot invent matches between positionally unrelated tags. Chains are processed largest-first and each query tag is counted at most once.</w:t>
       </w:r>
     </w:p>
-    <w:bookmarkEnd w:id="22"/>
-    <w:bookmarkStart w:id="23" w:name="Xc84f212d8323a8f017575d3d7a92fc22fb23227"/>
+    <w:bookmarkEnd w:id="23"/>
+    <w:bookmarkStart w:id="24" w:name="Xc84f212d8323a8f017575d3d7a92fc22fb23227"/>
     <w:p>
       <w:pPr>
         <w:pStyle w:val="Heading3"/>
@@ -1204,7 +1241,7 @@
         <w:t xml:space="preserve">gated</w:t>
       </w:r>
       <w:r>
-        <w:t xml:space="preserve">: report the homogeneous fit when |ani_from_loss − ani_from_hist| &gt; 5 ANI points, else the gamma fit. The threshold is an effect size, not a significance level — significance-scaled variants invert their error ranking on GTDB — and was chosen at the flat optimum (4.5–6 points) of a threshold sweep on the GTDB-ANIm matrix. It fires on 5.5% of GTDB pairs (MAE 2.819 vs 2.881 always-gamma; per-pair oracle bound 2.788), 12/15 mid-ANI pairs (4.482 → 0.959), and never on uniform-rate sims, mosaic sims, or oral/gut same-species pairs, preserving gamma’s advantage exactly where it is real. The</w:t>
+        <w:t xml:space="preserve">: report the homogeneous fit when |ani_from_loss − ani_from_hist| &gt; 5 ANI points, else the gamma fit. The threshold is an effect size, not a significance level — significance-scaled variants invert their error ranking on GTDB — and was chosen at the flat optimum (4.5–6 points) of a threshold sweep on the GTDB-ANIm matrix. It fires on 5.5% of GTDB pairs (MAE 2.819 vs 2.881 always-gamma; per-pair oracle bound 2.788), on all 15 mid-ANI pairs (gamma MAE 4.48 → uniform fallback MAE 1.42), and never on uniform-rate sims, mosaic sims, or oral/gut same-species pairs, preserving gamma’s advantage exactly where it is real. The</w:t>
       </w:r>
       <w:r>
         <w:t xml:space="preserve"> </w:t>
@@ -1264,8 +1301,8 @@
         <w:t xml:space="preserve">. The recalibrated flag never inverts its error ranking on any validation set (kept vs flagged MAE: GTDB-ANIm 2.415 vs 4.153; oral/gut 0.514 vs 4.269; mid-ANI 0.343 vs 1.113), at a disclosed cost in near-clonal sensitivity.</w:t>
       </w:r>
     </w:p>
-    <w:bookmarkEnd w:id="23"/>
-    <w:bookmarkStart w:id="24" w:name="short-contig-rescue-pass"/>
+    <w:bookmarkEnd w:id="24"/>
+    <w:bookmarkStart w:id="25" w:name="short-contig-rescue-pass"/>
     <w:p>
       <w:pPr>
         <w:pStyle w:val="Heading3"/>
@@ -1309,8 +1346,8 @@
         <w:t xml:space="preserve">+ 1) × mean tag spacing along the reference. Rescued contigs contribute AF spans with the same half-median-gap extension rule as chains but create no chains, so synteny and SV outputs are untouched. The pass is gated on contig tag count, so complete and high-N50 assemblies take a bit-identical path. The residual +0.20 drift at N50 5 kb comes from contigs with 0–1 placeable anchors (~1.3 Mb on the Sakai ladder), which carry no positional evidence; rescuing them would require guessing homology.</w:t>
       </w:r>
     </w:p>
-    <w:bookmarkEnd w:id="24"/>
-    <w:bookmarkStart w:id="25" w:name="database-scale-screen"/>
+    <w:bookmarkEnd w:id="25"/>
+    <w:bookmarkStart w:id="26" w:name="database-scale-screen"/>
     <w:p>
       <w:pPr>
         <w:pStyle w:val="Heading3"/>
@@ -1402,8 +1439,8 @@
         <w:t xml:space="preserve">command, so database output is byte-identical to pairwise output on the same pairs. Screen thresholds are panel-specific and exposed as flags.</w:t>
       </w:r>
     </w:p>
-    <w:bookmarkEnd w:id="25"/>
-    <w:bookmarkStart w:id="26" w:name="ridge-calibration-protocol"/>
+    <w:bookmarkEnd w:id="26"/>
+    <w:bookmarkStart w:id="27" w:name="ridge-calibration-protocol"/>
     <w:p>
       <w:pPr>
         <w:pStyle w:val="Heading3"/>
@@ -1528,7 +1565,7 @@
         <w:t xml:space="preserve"> </w:t>
       </w:r>
       <w:r>
-        <w:t xml:space="preserve">— with median imputation and standardization, regularization α = 10 selected by inner cross-validation (scikit-learn [18]), trained on 2,520 ANIm-truth pairs (2,053 finite pairs from the stratified 2,074-pair GTDB benchmark plus 467 targeted 95.0–99.15% ANIm pairs from a skani screen of all 2.26 M same-genus GTDB-R207 pairs followed by dnadiff on 650 selected candidates; 607 species, 26 phyla, zero overlap with the existing set). Validation is</w:t>
+        <w:t xml:space="preserve">— with median imputation and standardization, regularization α = 10 selected by inner cross-validation (scikit-learn29), trained on 2,520 ANIm-truth pairs (2,053 finite pairs from the stratified 2,074-pair GTDB benchmark plus 467 targeted 95.0–99.15% ANIm pairs from a skani screen of all 2.26 M same-genus GTDB-R207 pairs followed by dnadiff on 650 selected candidates; 607 species, 26 phyla, zero overlap with the existing set). Validation is</w:t>
       </w:r>
       <w:r>
         <w:t xml:space="preserve"> </w:t>
@@ -1568,8 +1605,8 @@
         <w:t xml:space="preserve">pairs rather than extrapolating.</w:t>
       </w:r>
     </w:p>
-    <w:bookmarkEnd w:id="26"/>
-    <w:bookmarkStart w:id="27" w:name="Xd3b37ce8f62a83dd9d52f682daa388ffbd3bd4e"/>
+    <w:bookmarkEnd w:id="27"/>
+    <w:bookmarkStart w:id="28" w:name="Xd3b37ce8f62a83dd9d52f682daa388ffbd3bd4e"/>
     <w:p>
       <w:pPr>
         <w:pStyle w:val="Heading3"/>
@@ -1586,8 +1623,8 @@
         <w:t xml:space="preserve">The mechanistic alternative to calibration was evaluated in full (prototype in Python against 19 exact-truth mosaic simulations, then the GTDB-ANIm matrix). The bias decomposes into an in-chain distribution-family term — asymptotic in-chain MAE 2.25 for gamma, 1.25 for a capped grid NPMLE, so a nonparametric fit fixes at most ~0.1–0.2 GTDB MAE — and a coverage term: the divergence of the unchained fraction is not identifiable from tag data, since the out-of-chain anchor residual is ≈ 0 within multi-match noise whether the unchained mass is saturated-divergent or accessory, and an oracle given the exact identity of the chained sample still errs by MAE 1.36 against whole-genome truth. No candidate (AF-weighted mixtures, discrete mixtures, ascertainment-aware tilts, capped NPMLE with and without LRT gating, model averaging) beats the gated baseline while holding all simulation gates. The raw estimator is therefore at its identifiability floor at 4-enzyme tag density; this analysis is why calibration, not a new likelihood, is the deployed correction layer.</w:t>
       </w:r>
     </w:p>
-    <w:bookmarkEnd w:id="27"/>
-    <w:bookmarkStart w:id="28" w:name="structural-variant-calling"/>
+    <w:bookmarkEnd w:id="28"/>
+    <w:bookmarkStart w:id="29" w:name="structural-variant-calling"/>
     <w:p>
       <w:pPr>
         <w:pStyle w:val="Heading3"/>
@@ -1634,8 +1671,8 @@
         <w:t xml:space="preserve">(default 1 kb), with a guard requiring that no third chain anchors inside the spanned reference interval (without it, a small relocated block sandwiched between collinear chains is misreported as a deletion sized by the reference jump — observed as spurious 42–961 kb calls before the guard); translocations are chains violating global reference order. Resolution is limited by tag spacing and by unphaseable repeats at junctions (observed endpoint offset ≤ 5.5 kb on the 779 kb W3110 inversion); events whose flanking chains have &lt; 4 anchors are not called, and equal-length homologous replacements that keep tags phased are invisible by design. Validation against dnadiff used span-based one-to-many matching because dnadiff fragments large accessory regions into many small events while Syn2bANI calls each junction once.</w:t>
       </w:r>
     </w:p>
-    <w:bookmarkEnd w:id="28"/>
-    <w:bookmarkStart w:id="29" w:name="simulation-framework-with-exact-truth"/>
+    <w:bookmarkEnd w:id="29"/>
+    <w:bookmarkStart w:id="30" w:name="simulation-framework-with-exact-truth"/>
     <w:p>
       <w:pPr>
         <w:pStyle w:val="Heading3"/>
@@ -1665,8 +1702,8 @@
         <w:t xml:space="preserve">K-12 MG1655, ENA U00096.3, 4,641,652 bp) by applying a counted number of substitutions, so true ANI = 1 − n_subs/L exactly. Families: an ANI ladder (12 levels, 85–99.9%, each with a 400 kb inversion, with and without ~46 deletions of 200–2,000 bp); an indel sweep (true ANI 95.000; 0–4 deletions/100 kb); fragmentation (20–201 contigs, no sequence lost, ~50% reverse-complemented, order shuffled); accessory confounds (core ANI 95.000; 0–50% of the genome replaced by composition-preserving shuffled blocks, plus a block-count control at fixed total fraction); mosaic/rate-heterogeneity cases (per-block rates ~ Gamma(α, α), α = 0.5/1/2, mean ANI 90–98, plus deliberately misspecified bimodal cases); and GC coverage (ladders on five real template genomes, GC 27.2–72.1%). Deletions do not change true ANI (counted substitutions over reference length), so the deleted fraction doubles as AF ground truth. Substitutions are uniform over the three alternative bases with no GC-biased mutation model, transition/transversion ratio, codon structure, or selection — a deliberate simplification justified by the finding that GC does not explain the real-data degradation and that site turnover emerges from uniform substitution on a real genome without any special mechanism. Enzyme digestion is never simulated; the released binary extracts tags itself.</w:t>
       </w:r>
     </w:p>
-    <w:bookmarkEnd w:id="29"/>
-    <w:bookmarkStart w:id="30" w:name="benchmark-datasets-truth-and-tools"/>
+    <w:bookmarkEnd w:id="30"/>
+    <w:bookmarkStart w:id="31" w:name="benchmark-datasets-truth-and-tools"/>
     <w:p>
       <w:pPr>
         <w:pStyle w:val="Heading3"/>
@@ -2391,7 +2428,7 @@
         <w:t xml:space="preserve"> </w:t>
       </w:r>
       <w:r>
-        <w:t xml:space="preserve">35 short-read samples (25 strain-madness, 10 marine) assembled with MEGAHIT, binned with MetaBAT2, and quality-scored with CheckM2; 695 bins ≥ 100 kbp were retained (HQ 200 / MQ 210 / LQ 285). Contigs were assigned to CAMI2 source genomes by exact k-mer membership; each bin was classified clean, strain-mixed, or cross-species, and paired with its dominant source genome (</w:t>
+        <w:t xml:space="preserve">35 short-read samples (25 strain-madness, 10 marine) assembled with MEGAHIT26, binned with MetaBAT227, and quality-scored with CheckM224,25; 695 bins ≥ 100 kbp were retained (HQ 200 / MQ 210 / LQ 285). Contigs were assigned to CAMI2 source genomes by exact k-mer membership; each bin was classified clean, strain-mixed, or cross-species, and paired with its dominant source genome (</w:t>
       </w:r>
       <w:r>
         <w:t xml:space="preserve">“anchor”</w:t>
@@ -2564,7 +2601,7 @@
         <w:t xml:space="preserve"> </w:t>
       </w:r>
       <w:r>
-        <w:t xml:space="preserve">(Fig. 11, Fig. 12;</w:t>
+        <w:t xml:space="preserve">(Fig. 6;</w:t>
       </w:r>
       <w:r>
         <w:t xml:space="preserve"> </w:t>
@@ -2609,11 +2646,11 @@
         <w:t xml:space="preserve"> </w:t>
       </w:r>
       <w:r>
-        <w:t xml:space="preserve">time covers only 302/484 reported pairs (minimum-AF filter) and excludes sketching; we note this wherever the comparison appears.</w:t>
-      </w:r>
-    </w:p>
-    <w:bookmarkEnd w:id="30"/>
-    <w:bookmarkStart w:id="31" w:name="implementation"/>
+        <w:t xml:space="preserve">time covers only 302/484 reported pairs (minimum-AF filter) and excludes sketching; this is noted wherever the comparison appears.</w:t>
+      </w:r>
+    </w:p>
+    <w:bookmarkEnd w:id="31"/>
+    <w:bookmarkStart w:id="32" w:name="implementation"/>
     <w:p>
       <w:pPr>
         <w:pStyle w:val="Heading3"/>
@@ -2627,7 +2664,7 @@
         <w:pStyle w:val="FirstParagraph"/>
       </w:pPr>
       <w:r>
-        <w:t xml:space="preserve">Syn2bANI is implemented in Rust (edition 2021) with needletail [13] for FASTA parsing and rayon [14] for data parallelism. The CLI mirrors skani’s subcommand structure (</w:t>
+        <w:t xml:space="preserve">Syn2bANI is implemented in Rust (edition 2021) with needletail for FASTA parsing and rayon for data parallelism. The CLI mirrors skani’s subcommand structure (</w:t>
       </w:r>
       <w:r>
         <w:rPr>
@@ -2742,9 +2779,9 @@
         </w:pict>
       </w:r>
     </w:p>
-    <w:bookmarkEnd w:id="31"/>
     <w:bookmarkEnd w:id="32"/>
-    <w:bookmarkStart w:id="33" w:name="data-availability"/>
+    <w:bookmarkEnd w:id="33"/>
+    <w:bookmarkStart w:id="34" w:name="data-availability"/>
     <w:p>
       <w:pPr>
         <w:pStyle w:val="Heading2"/>
@@ -2849,8 +2886,8 @@
         <w:t xml:space="preserve">K-12 MG1655, ENA accession U00096.3.</w:t>
       </w:r>
     </w:p>
-    <w:bookmarkEnd w:id="33"/>
-    <w:bookmarkStart w:id="34" w:name="code-availability"/>
+    <w:bookmarkEnd w:id="34"/>
+    <w:bookmarkStart w:id="35" w:name="code-availability"/>
     <w:p>
       <w:pPr>
         <w:pStyle w:val="Heading2"/>
@@ -2879,8 +2916,8 @@
         <w:t xml:space="preserve">).</w:t>
       </w:r>
     </w:p>
-    <w:bookmarkEnd w:id="34"/>
-    <w:bookmarkStart w:id="35" w:name="acknowledgements"/>
+    <w:bookmarkEnd w:id="35"/>
+    <w:bookmarkStart w:id="36" w:name="acknowledgements"/>
     <w:p>
       <w:pPr>
         <w:pStyle w:val="Heading2"/>
@@ -2897,8 +2934,8 @@
         <w:t xml:space="preserve">[To be determined.]</w:t>
       </w:r>
     </w:p>
-    <w:bookmarkEnd w:id="35"/>
-    <w:bookmarkStart w:id="36" w:name="author-contributions"/>
+    <w:bookmarkEnd w:id="36"/>
+    <w:bookmarkStart w:id="37" w:name="author-contributions"/>
     <w:p>
       <w:pPr>
         <w:pStyle w:val="Heading2"/>
@@ -2915,8 +2952,8 @@
         <w:t xml:space="preserve">[To be determined — placeholder.]</w:t>
       </w:r>
     </w:p>
-    <w:bookmarkEnd w:id="36"/>
-    <w:bookmarkStart w:id="37" w:name="competing-interests"/>
+    <w:bookmarkEnd w:id="37"/>
+    <w:bookmarkStart w:id="38" w:name="competing-interests"/>
     <w:p>
       <w:pPr>
         <w:pStyle w:val="Heading2"/>
@@ -2933,8 +2970,8 @@
         <w:t xml:space="preserve">[To be determined — placeholder: The authors declare no competing interests.]</w:t>
       </w:r>
     </w:p>
-    <w:bookmarkEnd w:id="37"/>
-    <w:bookmarkStart w:id="38" w:name="references"/>
+    <w:bookmarkEnd w:id="38"/>
+    <w:bookmarkStart w:id="39" w:name="references"/>
     <w:p>
       <w:pPr>
         <w:pStyle w:val="Heading2"/>
@@ -3357,6 +3394,986 @@
       </w:r>
     </w:p>
     <w:p>
+      <w:pPr>
+        <w:pStyle w:val="Compact"/>
+        <w:numPr>
+          <w:ilvl w:val="0"/>
+          <w:numId w:val="1001"/>
+        </w:numPr>
+      </w:pPr>
+      <w:r>
+        <w:t xml:space="preserve">Ondov, B. D. et al. Mash: fast genome and metagenome distance estimation using MinHash.</w:t>
+      </w:r>
+      <w:r>
+        <w:t xml:space="preserve"> </w:t>
+      </w:r>
+      <w:r>
+        <w:rPr>
+          <w:i/>
+          <w:iCs/>
+        </w:rPr>
+        <w:t xml:space="preserve">Genome Biol.</w:t>
+      </w:r>
+      <w:r>
+        <w:t xml:space="preserve"> </w:t>
+      </w:r>
+      <w:r>
+        <w:rPr>
+          <w:b/>
+          <w:bCs/>
+        </w:rPr>
+        <w:t xml:space="preserve">17</w:t>
+      </w:r>
+      <w:r>
+        <w:t xml:space="preserve">, 132 (2016).</w:t>
+      </w:r>
+    </w:p>
+    <w:p>
+      <w:pPr>
+        <w:pStyle w:val="Compact"/>
+        <w:numPr>
+          <w:ilvl w:val="0"/>
+          <w:numId w:val="1001"/>
+        </w:numPr>
+      </w:pPr>
+      <w:r>
+        <w:t xml:space="preserve">Baker, D. N. &amp; Langmead, B. Dashing: fast and accurate genomic distances with HyperLogLog.</w:t>
+      </w:r>
+      <w:r>
+        <w:t xml:space="preserve"> </w:t>
+      </w:r>
+      <w:r>
+        <w:rPr>
+          <w:i/>
+          <w:iCs/>
+        </w:rPr>
+        <w:t xml:space="preserve">Genome Biol.</w:t>
+      </w:r>
+      <w:r>
+        <w:t xml:space="preserve"> </w:t>
+      </w:r>
+      <w:r>
+        <w:rPr>
+          <w:b/>
+          <w:bCs/>
+        </w:rPr>
+        <w:t xml:space="preserve">20</w:t>
+      </w:r>
+      <w:r>
+        <w:t xml:space="preserve">, 265 (2019).</w:t>
+      </w:r>
+    </w:p>
+    <w:p>
+      <w:pPr>
+        <w:pStyle w:val="Compact"/>
+        <w:numPr>
+          <w:ilvl w:val="0"/>
+          <w:numId w:val="1001"/>
+        </w:numPr>
+      </w:pPr>
+      <w:r>
+        <w:t xml:space="preserve">Zhao, X. BinDash, software for fast genome distance estimation on a typical personal laptop.</w:t>
+      </w:r>
+      <w:r>
+        <w:t xml:space="preserve"> </w:t>
+      </w:r>
+      <w:r>
+        <w:rPr>
+          <w:i/>
+          <w:iCs/>
+        </w:rPr>
+        <w:t xml:space="preserve">Bioinformatics</w:t>
+      </w:r>
+      <w:r>
+        <w:t xml:space="preserve"> </w:t>
+      </w:r>
+      <w:r>
+        <w:rPr>
+          <w:b/>
+          <w:bCs/>
+        </w:rPr>
+        <w:t xml:space="preserve">35</w:t>
+      </w:r>
+      <w:r>
+        <w:t xml:space="preserve">, 671–673 (2019).</w:t>
+      </w:r>
+    </w:p>
+    <w:p>
+      <w:pPr>
+        <w:pStyle w:val="Compact"/>
+        <w:numPr>
+          <w:ilvl w:val="0"/>
+          <w:numId w:val="1001"/>
+        </w:numPr>
+      </w:pPr>
+      <w:r>
+        <w:t xml:space="preserve">Olm, M. R., Brown, C. T., Brooks, B. &amp; Banfield, J. F. dRep: a tool for fast and accurate genomic comparisons that enables improved genome recovery from metagenomes through de-replication.</w:t>
+      </w:r>
+      <w:r>
+        <w:t xml:space="preserve"> </w:t>
+      </w:r>
+      <w:r>
+        <w:rPr>
+          <w:i/>
+          <w:iCs/>
+        </w:rPr>
+        <w:t xml:space="preserve">ISME J.</w:t>
+      </w:r>
+      <w:r>
+        <w:t xml:space="preserve"> </w:t>
+      </w:r>
+      <w:r>
+        <w:rPr>
+          <w:b/>
+          <w:bCs/>
+        </w:rPr>
+        <w:t xml:space="preserve">11</w:t>
+      </w:r>
+      <w:r>
+        <w:t xml:space="preserve">, 2864–2868 (2017).</w:t>
+      </w:r>
+    </w:p>
+    <w:p>
+      <w:pPr>
+        <w:pStyle w:val="Compact"/>
+        <w:numPr>
+          <w:ilvl w:val="0"/>
+          <w:numId w:val="1001"/>
+        </w:numPr>
+      </w:pPr>
+      <w:r>
+        <w:t xml:space="preserve">Kurtz, S. et al. Versatile and open software for comparing large genomes.</w:t>
+      </w:r>
+      <w:r>
+        <w:t xml:space="preserve"> </w:t>
+      </w:r>
+      <w:r>
+        <w:rPr>
+          <w:i/>
+          <w:iCs/>
+        </w:rPr>
+        <w:t xml:space="preserve">Genome Biol.</w:t>
+      </w:r>
+      <w:r>
+        <w:t xml:space="preserve"> </w:t>
+      </w:r>
+      <w:r>
+        <w:rPr>
+          <w:b/>
+          <w:bCs/>
+        </w:rPr>
+        <w:t xml:space="preserve">5</w:t>
+      </w:r>
+      <w:r>
+        <w:t xml:space="preserve">, R12 (2004).</w:t>
+      </w:r>
+    </w:p>
+    <w:p>
+      <w:pPr>
+        <w:pStyle w:val="Compact"/>
+        <w:numPr>
+          <w:ilvl w:val="0"/>
+          <w:numId w:val="1001"/>
+        </w:numPr>
+      </w:pPr>
+      <w:r>
+        <w:t xml:space="preserve">Li, H. Minimap2: pairwise alignment for nucleotide sequences.</w:t>
+      </w:r>
+      <w:r>
+        <w:t xml:space="preserve"> </w:t>
+      </w:r>
+      <w:r>
+        <w:rPr>
+          <w:i/>
+          <w:iCs/>
+        </w:rPr>
+        <w:t xml:space="preserve">Bioinformatics</w:t>
+      </w:r>
+      <w:r>
+        <w:t xml:space="preserve"> </w:t>
+      </w:r>
+      <w:r>
+        <w:rPr>
+          <w:b/>
+          <w:bCs/>
+        </w:rPr>
+        <w:t xml:space="preserve">34</w:t>
+      </w:r>
+      <w:r>
+        <w:t xml:space="preserve">, 3094–3100 (2018).</w:t>
+      </w:r>
+    </w:p>
+    <w:p>
+      <w:pPr>
+        <w:pStyle w:val="Compact"/>
+        <w:numPr>
+          <w:ilvl w:val="0"/>
+          <w:numId w:val="1001"/>
+        </w:numPr>
+      </w:pPr>
+      <w:r>
+        <w:t xml:space="preserve">Hickey, G. et al. Pangenome graph construction from genome alignments with Minigraph-Cactus.</w:t>
+      </w:r>
+      <w:r>
+        <w:t xml:space="preserve"> </w:t>
+      </w:r>
+      <w:r>
+        <w:rPr>
+          <w:i/>
+          <w:iCs/>
+        </w:rPr>
+        <w:t xml:space="preserve">Nat. Biotechnol.</w:t>
+      </w:r>
+      <w:r>
+        <w:t xml:space="preserve"> </w:t>
+      </w:r>
+      <w:r>
+        <w:rPr>
+          <w:b/>
+          <w:bCs/>
+        </w:rPr>
+        <w:t xml:space="preserve">42</w:t>
+      </w:r>
+      <w:r>
+        <w:t xml:space="preserve">, 663–673 (2024).</w:t>
+      </w:r>
+    </w:p>
+    <w:p>
+      <w:pPr>
+        <w:pStyle w:val="Compact"/>
+        <w:numPr>
+          <w:ilvl w:val="0"/>
+          <w:numId w:val="1001"/>
+        </w:numPr>
+      </w:pPr>
+      <w:r>
+        <w:t xml:space="preserve">Goel, M., Sun, H., Jiao, W.-B. &amp; Schneeberger, K. SyRI: finding genomic rearrangements and local sequence differences from whole-genome assemblies.</w:t>
+      </w:r>
+      <w:r>
+        <w:t xml:space="preserve"> </w:t>
+      </w:r>
+      <w:r>
+        <w:rPr>
+          <w:i/>
+          <w:iCs/>
+        </w:rPr>
+        <w:t xml:space="preserve">Genome Biol.</w:t>
+      </w:r>
+      <w:r>
+        <w:t xml:space="preserve"> </w:t>
+      </w:r>
+      <w:r>
+        <w:rPr>
+          <w:b/>
+          <w:bCs/>
+        </w:rPr>
+        <w:t xml:space="preserve">20</w:t>
+      </w:r>
+      <w:r>
+        <w:t xml:space="preserve">, 277 (2019).</w:t>
+      </w:r>
+    </w:p>
+    <w:p>
+      <w:pPr>
+        <w:pStyle w:val="Compact"/>
+        <w:numPr>
+          <w:ilvl w:val="0"/>
+          <w:numId w:val="1001"/>
+        </w:numPr>
+      </w:pPr>
+      <w:r>
+        <w:t xml:space="preserve">Darling, A. E., Mau, B. &amp; Perna, N. T. progressiveMauve: multiple genome alignment with gene gain, loss and rearrangement.</w:t>
+      </w:r>
+      <w:r>
+        <w:t xml:space="preserve"> </w:t>
+      </w:r>
+      <w:r>
+        <w:rPr>
+          <w:i/>
+          <w:iCs/>
+        </w:rPr>
+        <w:t xml:space="preserve">PLoS One</w:t>
+      </w:r>
+      <w:r>
+        <w:t xml:space="preserve"> </w:t>
+      </w:r>
+      <w:r>
+        <w:rPr>
+          <w:b/>
+          <w:bCs/>
+        </w:rPr>
+        <w:t xml:space="preserve">5</w:t>
+      </w:r>
+      <w:r>
+        <w:t xml:space="preserve">, e11147 (2010).</w:t>
+      </w:r>
+    </w:p>
+    <w:p>
+      <w:pPr>
+        <w:pStyle w:val="Compact"/>
+        <w:numPr>
+          <w:ilvl w:val="0"/>
+          <w:numId w:val="1001"/>
+        </w:numPr>
+      </w:pPr>
+      <w:r>
+        <w:t xml:space="preserve">Truong, D. T. et al. MetaPhlAn4: profiling the composition of microbial communities from metagenomic sequencing data.</w:t>
+      </w:r>
+      <w:r>
+        <w:t xml:space="preserve"> </w:t>
+      </w:r>
+      <w:r>
+        <w:rPr>
+          <w:i/>
+          <w:iCs/>
+        </w:rPr>
+        <w:t xml:space="preserve">Nat. Protoc.</w:t>
+      </w:r>
+      <w:r>
+        <w:t xml:space="preserve"> </w:t>
+      </w:r>
+      <w:r>
+        <w:rPr>
+          <w:b/>
+          <w:bCs/>
+        </w:rPr>
+        <w:t xml:space="preserve">18</w:t>
+      </w:r>
+      <w:r>
+        <w:t xml:space="preserve">, 3534–3546 (2023).</w:t>
+      </w:r>
+    </w:p>
+    <w:p>
+      <w:pPr>
+        <w:pStyle w:val="Compact"/>
+        <w:numPr>
+          <w:ilvl w:val="0"/>
+          <w:numId w:val="1001"/>
+        </w:numPr>
+      </w:pPr>
+      <w:r>
+        <w:t xml:space="preserve">Olm, M. R. et al. inStrain profiles population microdiversity from metagenomic data and sensitively detects shared microbial strains.</w:t>
+      </w:r>
+      <w:r>
+        <w:t xml:space="preserve"> </w:t>
+      </w:r>
+      <w:r>
+        <w:rPr>
+          <w:i/>
+          <w:iCs/>
+        </w:rPr>
+        <w:t xml:space="preserve">Nat. Biotechnol.</w:t>
+      </w:r>
+      <w:r>
+        <w:t xml:space="preserve"> </w:t>
+      </w:r>
+      <w:r>
+        <w:rPr>
+          <w:b/>
+          <w:bCs/>
+        </w:rPr>
+        <w:t xml:space="preserve">39</w:t>
+      </w:r>
+      <w:r>
+        <w:t xml:space="preserve">, 727–736 (2021).</w:t>
+      </w:r>
+    </w:p>
+    <w:p>
+      <w:pPr>
+        <w:pStyle w:val="Compact"/>
+        <w:numPr>
+          <w:ilvl w:val="0"/>
+          <w:numId w:val="1001"/>
+        </w:numPr>
+      </w:pPr>
+      <w:r>
+        <w:t xml:space="preserve">Parks, D. H., Imelfort, M., Skennerton, C. T., Hugenholtz, P. &amp; Tyson, G. W. CheckM: assessing the quality of microbial genomes recovered from isolates, single cells, and metagenomes.</w:t>
+      </w:r>
+      <w:r>
+        <w:t xml:space="preserve"> </w:t>
+      </w:r>
+      <w:r>
+        <w:rPr>
+          <w:i/>
+          <w:iCs/>
+        </w:rPr>
+        <w:t xml:space="preserve">Genome Res.</w:t>
+      </w:r>
+      <w:r>
+        <w:t xml:space="preserve"> </w:t>
+      </w:r>
+      <w:r>
+        <w:rPr>
+          <w:b/>
+          <w:bCs/>
+        </w:rPr>
+        <w:t xml:space="preserve">25</w:t>
+      </w:r>
+      <w:r>
+        <w:t xml:space="preserve">, 1043–1055 (2015).</w:t>
+      </w:r>
+    </w:p>
+    <w:p>
+      <w:pPr>
+        <w:pStyle w:val="Compact"/>
+        <w:numPr>
+          <w:ilvl w:val="0"/>
+          <w:numId w:val="1001"/>
+        </w:numPr>
+      </w:pPr>
+      <w:r>
+        <w:t xml:space="preserve">Chklovski, A., Parks, D. H., Woodcroft, B. J. &amp; Tyson, G. W. CheckM2: a rapid, scalable and accurate tool for assessing microbial genome quality using machine learning.</w:t>
+      </w:r>
+      <w:r>
+        <w:t xml:space="preserve"> </w:t>
+      </w:r>
+      <w:r>
+        <w:rPr>
+          <w:i/>
+          <w:iCs/>
+        </w:rPr>
+        <w:t xml:space="preserve">Nat. Methods</w:t>
+      </w:r>
+      <w:r>
+        <w:t xml:space="preserve"> </w:t>
+      </w:r>
+      <w:r>
+        <w:rPr>
+          <w:b/>
+          <w:bCs/>
+        </w:rPr>
+        <w:t xml:space="preserve">20</w:t>
+      </w:r>
+      <w:r>
+        <w:t xml:space="preserve">, 1203–1212 (2023).</w:t>
+      </w:r>
+    </w:p>
+    <w:p>
+      <w:pPr>
+        <w:pStyle w:val="Compact"/>
+        <w:numPr>
+          <w:ilvl w:val="0"/>
+          <w:numId w:val="1001"/>
+        </w:numPr>
+      </w:pPr>
+      <w:r>
+        <w:t xml:space="preserve">Li, D., Liu, C.-M., Luo, R., Sadakane, K. &amp; Lam, T.-W. MEGAHIT: an ultra-fast single-node solution for large and complex metagenomics assembly via succinct de Bruijn graph.</w:t>
+      </w:r>
+      <w:r>
+        <w:t xml:space="preserve"> </w:t>
+      </w:r>
+      <w:r>
+        <w:rPr>
+          <w:i/>
+          <w:iCs/>
+        </w:rPr>
+        <w:t xml:space="preserve">Bioinformatics</w:t>
+      </w:r>
+      <w:r>
+        <w:t xml:space="preserve"> </w:t>
+      </w:r>
+      <w:r>
+        <w:rPr>
+          <w:b/>
+          <w:bCs/>
+        </w:rPr>
+        <w:t xml:space="preserve">31</w:t>
+      </w:r>
+      <w:r>
+        <w:t xml:space="preserve">, 1674–1676 (2015).</w:t>
+      </w:r>
+    </w:p>
+    <w:p>
+      <w:pPr>
+        <w:pStyle w:val="Compact"/>
+        <w:numPr>
+          <w:ilvl w:val="0"/>
+          <w:numId w:val="1001"/>
+        </w:numPr>
+      </w:pPr>
+      <w:r>
+        <w:t xml:space="preserve">Kang, D. D. et al. MetaBAT 2: an adaptive binning algorithm for robust and efficient genome reconstruction from metagenome assemblies.</w:t>
+      </w:r>
+      <w:r>
+        <w:t xml:space="preserve"> </w:t>
+      </w:r>
+      <w:r>
+        <w:rPr>
+          <w:i/>
+          <w:iCs/>
+        </w:rPr>
+        <w:t xml:space="preserve">PeerJ</w:t>
+      </w:r>
+      <w:r>
+        <w:t xml:space="preserve"> </w:t>
+      </w:r>
+      <w:r>
+        <w:rPr>
+          <w:b/>
+          <w:bCs/>
+        </w:rPr>
+        <w:t xml:space="preserve">7</w:t>
+      </w:r>
+      <w:r>
+        <w:t xml:space="preserve">, e7359 (2019).</w:t>
+      </w:r>
+    </w:p>
+    <w:p>
+      <w:pPr>
+        <w:pStyle w:val="Compact"/>
+        <w:numPr>
+          <w:ilvl w:val="0"/>
+          <w:numId w:val="1001"/>
+        </w:numPr>
+      </w:pPr>
+      <w:r>
+        <w:t xml:space="preserve">Clopper, C. J. &amp; Pearson, E. S. The use of confidence or fiducial limits illustrated in the case of the binomial.</w:t>
+      </w:r>
+      <w:r>
+        <w:t xml:space="preserve"> </w:t>
+      </w:r>
+      <w:r>
+        <w:rPr>
+          <w:i/>
+          <w:iCs/>
+        </w:rPr>
+        <w:t xml:space="preserve">Biometrika</w:t>
+      </w:r>
+      <w:r>
+        <w:t xml:space="preserve"> </w:t>
+      </w:r>
+      <w:r>
+        <w:rPr>
+          <w:b/>
+          <w:bCs/>
+        </w:rPr>
+        <w:t xml:space="preserve">26</w:t>
+      </w:r>
+      <w:r>
+        <w:t xml:space="preserve">, 404–413 (1934).</w:t>
+      </w:r>
+    </w:p>
+    <w:p>
+      <w:pPr>
+        <w:pStyle w:val="Compact"/>
+        <w:numPr>
+          <w:ilvl w:val="0"/>
+          <w:numId w:val="1001"/>
+        </w:numPr>
+      </w:pPr>
+      <w:r>
+        <w:t xml:space="preserve">Pedregosa, F. et al. Scikit-learn: machine learning in Python.</w:t>
+      </w:r>
+      <w:r>
+        <w:t xml:space="preserve"> </w:t>
+      </w:r>
+      <w:r>
+        <w:rPr>
+          <w:i/>
+          <w:iCs/>
+        </w:rPr>
+        <w:t xml:space="preserve">J. Mach. Learn. Res.</w:t>
+      </w:r>
+      <w:r>
+        <w:t xml:space="preserve"> </w:t>
+      </w:r>
+      <w:r>
+        <w:rPr>
+          <w:b/>
+          <w:bCs/>
+        </w:rPr>
+        <w:t xml:space="preserve">12</w:t>
+      </w:r>
+      <w:r>
+        <w:t xml:space="preserve">, 2825–2830 (2011).</w:t>
+      </w:r>
+    </w:p>
+    <w:p>
+      <w:pPr>
+        <w:pStyle w:val="Compact"/>
+        <w:numPr>
+          <w:ilvl w:val="0"/>
+          <w:numId w:val="1001"/>
+        </w:numPr>
+      </w:pPr>
+      <w:r>
+        <w:t xml:space="preserve">Roberts, R. J., Vincze, T., Posfai, J. &amp; Macelis, D. REBASE — a database for DNA restriction and modification: enzymes, genes and genomes.</w:t>
+      </w:r>
+      <w:r>
+        <w:t xml:space="preserve"> </w:t>
+      </w:r>
+      <w:r>
+        <w:rPr>
+          <w:i/>
+          <w:iCs/>
+        </w:rPr>
+        <w:t xml:space="preserve">Nucleic Acids Res.</w:t>
+      </w:r>
+      <w:r>
+        <w:t xml:space="preserve"> </w:t>
+      </w:r>
+      <w:r>
+        <w:rPr>
+          <w:b/>
+          <w:bCs/>
+        </w:rPr>
+        <w:t xml:space="preserve">43</w:t>
+      </w:r>
+      <w:r>
+        <w:t xml:space="preserve">, D298–D299 (2015).</w:t>
+      </w:r>
+    </w:p>
+    <w:p>
+      <w:pPr>
+        <w:pStyle w:val="Compact"/>
+        <w:numPr>
+          <w:ilvl w:val="0"/>
+          <w:numId w:val="1001"/>
+        </w:numPr>
+      </w:pPr>
+      <w:r>
+        <w:t xml:space="preserve">Camacho, C. et al. BLAST+: architecture and applications.</w:t>
+      </w:r>
+      <w:r>
+        <w:t xml:space="preserve"> </w:t>
+      </w:r>
+      <w:r>
+        <w:rPr>
+          <w:i/>
+          <w:iCs/>
+        </w:rPr>
+        <w:t xml:space="preserve">BMC Bioinformatics</w:t>
+      </w:r>
+      <w:r>
+        <w:t xml:space="preserve"> </w:t>
+      </w:r>
+      <w:r>
+        <w:rPr>
+          <w:b/>
+          <w:bCs/>
+        </w:rPr>
+        <w:t xml:space="preserve">10</w:t>
+      </w:r>
+      <w:r>
+        <w:t xml:space="preserve">, 421 (2009).</w:t>
+      </w:r>
+    </w:p>
+    <w:p>
+      <w:pPr>
+        <w:pStyle w:val="Compact"/>
+        <w:numPr>
+          <w:ilvl w:val="0"/>
+          <w:numId w:val="1001"/>
+        </w:numPr>
+      </w:pPr>
+      <w:r>
+        <w:t xml:space="preserve">Altschul, S. F., Gish, W., Miller, W., Myers, E. W. &amp; Lipman, D. J. Basic local alignment search tool.</w:t>
+      </w:r>
+      <w:r>
+        <w:t xml:space="preserve"> </w:t>
+      </w:r>
+      <w:r>
+        <w:rPr>
+          <w:i/>
+          <w:iCs/>
+        </w:rPr>
+        <w:t xml:space="preserve">J. Mol. Biol.</w:t>
+      </w:r>
+      <w:r>
+        <w:t xml:space="preserve"> </w:t>
+      </w:r>
+      <w:r>
+        <w:rPr>
+          <w:b/>
+          <w:bCs/>
+        </w:rPr>
+        <w:t xml:space="preserve">215</w:t>
+      </w:r>
+      <w:r>
+        <w:t xml:space="preserve">, 403–410 (1990).</w:t>
+      </w:r>
+    </w:p>
+    <w:p>
+      <w:pPr>
+        <w:pStyle w:val="Compact"/>
+        <w:numPr>
+          <w:ilvl w:val="0"/>
+          <w:numId w:val="1001"/>
+        </w:numPr>
+      </w:pPr>
+      <w:r>
+        <w:t xml:space="preserve">Eddy, S. R. Accelerated profile HMM searches.</w:t>
+      </w:r>
+      <w:r>
+        <w:t xml:space="preserve"> </w:t>
+      </w:r>
+      <w:r>
+        <w:rPr>
+          <w:i/>
+          <w:iCs/>
+        </w:rPr>
+        <w:t xml:space="preserve">PLoS Comput. Biol.</w:t>
+      </w:r>
+      <w:r>
+        <w:t xml:space="preserve"> </w:t>
+      </w:r>
+      <w:r>
+        <w:rPr>
+          <w:b/>
+          <w:bCs/>
+        </w:rPr>
+        <w:t xml:space="preserve">7</w:t>
+      </w:r>
+      <w:r>
+        <w:t xml:space="preserve">, e1002195 (2011).</w:t>
+      </w:r>
+    </w:p>
+    <w:p>
+      <w:pPr>
+        <w:pStyle w:val="Compact"/>
+        <w:numPr>
+          <w:ilvl w:val="0"/>
+          <w:numId w:val="1001"/>
+        </w:numPr>
+      </w:pPr>
+      <w:r>
+        <w:t xml:space="preserve">Buchfink, B., Xie, C. &amp; Huson, D. H. Fast and sensitive protein alignment using DIAMOND.</w:t>
+      </w:r>
+      <w:r>
+        <w:t xml:space="preserve"> </w:t>
+      </w:r>
+      <w:r>
+        <w:rPr>
+          <w:i/>
+          <w:iCs/>
+        </w:rPr>
+        <w:t xml:space="preserve">Nat. Methods</w:t>
+      </w:r>
+      <w:r>
+        <w:t xml:space="preserve"> </w:t>
+      </w:r>
+      <w:r>
+        <w:rPr>
+          <w:b/>
+          <w:bCs/>
+        </w:rPr>
+        <w:t xml:space="preserve">12</w:t>
+      </w:r>
+      <w:r>
+        <w:t xml:space="preserve">, 59–60 (2015).</w:t>
+      </w:r>
+    </w:p>
+    <w:p>
+      <w:pPr>
+        <w:pStyle w:val="Compact"/>
+        <w:numPr>
+          <w:ilvl w:val="0"/>
+          <w:numId w:val="1001"/>
+        </w:numPr>
+      </w:pPr>
+      <w:r>
+        <w:t xml:space="preserve">Hyatt, D. et al. Prodigal: prokaryotic gene recognition and translation initiation site identification.</w:t>
+      </w:r>
+      <w:r>
+        <w:t xml:space="preserve"> </w:t>
+      </w:r>
+      <w:r>
+        <w:rPr>
+          <w:i/>
+          <w:iCs/>
+        </w:rPr>
+        <w:t xml:space="preserve">BMC Bioinformatics</w:t>
+      </w:r>
+      <w:r>
+        <w:t xml:space="preserve"> </w:t>
+      </w:r>
+      <w:r>
+        <w:rPr>
+          <w:b/>
+          <w:bCs/>
+        </w:rPr>
+        <w:t xml:space="preserve">11</w:t>
+      </w:r>
+      <w:r>
+        <w:t xml:space="preserve">, 119 (2010).</w:t>
+      </w:r>
+    </w:p>
+    <w:p>
+      <w:pPr>
+        <w:pStyle w:val="Compact"/>
+        <w:numPr>
+          <w:ilvl w:val="0"/>
+          <w:numId w:val="1001"/>
+        </w:numPr>
+      </w:pPr>
+      <w:r>
+        <w:t xml:space="preserve">Seemann, T. Prokka: rapid prokaryotic genome annotation.</w:t>
+      </w:r>
+      <w:r>
+        <w:t xml:space="preserve"> </w:t>
+      </w:r>
+      <w:r>
+        <w:rPr>
+          <w:i/>
+          <w:iCs/>
+        </w:rPr>
+        <w:t xml:space="preserve">Bioinformatics</w:t>
+      </w:r>
+      <w:r>
+        <w:t xml:space="preserve"> </w:t>
+      </w:r>
+      <w:r>
+        <w:rPr>
+          <w:b/>
+          <w:bCs/>
+        </w:rPr>
+        <w:t xml:space="preserve">30</w:t>
+      </w:r>
+      <w:r>
+        <w:t xml:space="preserve">, 2068–2069 (2014).</w:t>
+      </w:r>
+    </w:p>
+    <w:p>
+      <w:pPr>
+        <w:pStyle w:val="Compact"/>
+        <w:numPr>
+          <w:ilvl w:val="0"/>
+          <w:numId w:val="1001"/>
+        </w:numPr>
+      </w:pPr>
+      <w:r>
+        <w:t xml:space="preserve">Wick, R. R., Judd, L. M., Gorrie, C. L. &amp; Holt, K. E. Unicycler: resolving bacterial genome assemblies from short and long sequencing reads.</w:t>
+      </w:r>
+      <w:r>
+        <w:t xml:space="preserve"> </w:t>
+      </w:r>
+      <w:r>
+        <w:rPr>
+          <w:i/>
+          <w:iCs/>
+        </w:rPr>
+        <w:t xml:space="preserve">PLoS Comput. Biol.</w:t>
+      </w:r>
+      <w:r>
+        <w:t xml:space="preserve"> </w:t>
+      </w:r>
+      <w:r>
+        <w:rPr>
+          <w:b/>
+          <w:bCs/>
+        </w:rPr>
+        <w:t xml:space="preserve">13</w:t>
+      </w:r>
+      <w:r>
+        <w:t xml:space="preserve">, e1005595 (2017).</w:t>
+      </w:r>
+    </w:p>
+    <w:p>
+      <w:pPr>
+        <w:pStyle w:val="Compact"/>
+        <w:numPr>
+          <w:ilvl w:val="0"/>
+          <w:numId w:val="1001"/>
+        </w:numPr>
+      </w:pPr>
+      <w:r>
+        <w:t xml:space="preserve">Bankevich, A. et al. SPAdes: a new genome assembly algorithm and its applications to single-cell sequencing.</w:t>
+      </w:r>
+      <w:r>
+        <w:t xml:space="preserve"> </w:t>
+      </w:r>
+      <w:r>
+        <w:rPr>
+          <w:i/>
+          <w:iCs/>
+        </w:rPr>
+        <w:t xml:space="preserve">J. Comput. Biol.</w:t>
+      </w:r>
+      <w:r>
+        <w:t xml:space="preserve"> </w:t>
+      </w:r>
+      <w:r>
+        <w:rPr>
+          <w:b/>
+          <w:bCs/>
+        </w:rPr>
+        <w:t xml:space="preserve">19</w:t>
+      </w:r>
+      <w:r>
+        <w:t xml:space="preserve">, 455–477 (2012).</w:t>
+      </w:r>
+    </w:p>
+    <w:p>
+      <w:pPr>
+        <w:pStyle w:val="Compact"/>
+        <w:numPr>
+          <w:ilvl w:val="0"/>
+          <w:numId w:val="1001"/>
+        </w:numPr>
+      </w:pPr>
+      <w:r>
+        <w:t xml:space="preserve">Koren, S. et al. Canu: scalable and accurate long-read assembly via adaptive k-mer weighting and repeat separation.</w:t>
+      </w:r>
+      <w:r>
+        <w:t xml:space="preserve"> </w:t>
+      </w:r>
+      <w:r>
+        <w:rPr>
+          <w:i/>
+          <w:iCs/>
+        </w:rPr>
+        <w:t xml:space="preserve">Genome Res.</w:t>
+      </w:r>
+      <w:r>
+        <w:t xml:space="preserve"> </w:t>
+      </w:r>
+      <w:r>
+        <w:rPr>
+          <w:b/>
+          <w:bCs/>
+        </w:rPr>
+        <w:t xml:space="preserve">27</w:t>
+      </w:r>
+      <w:r>
+        <w:t xml:space="preserve">, 722–736 (2017).</w:t>
+      </w:r>
+    </w:p>
+    <w:p>
+      <w:pPr>
+        <w:pStyle w:val="Compact"/>
+        <w:numPr>
+          <w:ilvl w:val="0"/>
+          <w:numId w:val="1001"/>
+        </w:numPr>
+      </w:pPr>
+      <w:r>
+        <w:t xml:space="preserve">Chaisson, M. J. &amp; Tesler, G. Mapping single molecule sequencing reads using basic local alignment with successive refinement (BLASR): application and theory.</w:t>
+      </w:r>
+      <w:r>
+        <w:t xml:space="preserve"> </w:t>
+      </w:r>
+      <w:r>
+        <w:rPr>
+          <w:i/>
+          <w:iCs/>
+        </w:rPr>
+        <w:t xml:space="preserve">BMC Bioinformatics</w:t>
+      </w:r>
+      <w:r>
+        <w:t xml:space="preserve"> </w:t>
+      </w:r>
+      <w:r>
+        <w:rPr>
+          <w:b/>
+          <w:bCs/>
+        </w:rPr>
+        <w:t xml:space="preserve">13</w:t>
+      </w:r>
+      <w:r>
+        <w:t xml:space="preserve">, 238 (2012).</w:t>
+      </w:r>
+    </w:p>
+    <w:p>
       <w:r>
         <w:pict>
           <v:rect style="width:0;height:1.5pt" o:hralign="center" o:hrstd="t" o:hr="t"/>
@@ -3392,8 +4409,8 @@
         </w:pict>
       </w:r>
     </w:p>
-    <w:bookmarkEnd w:id="38"/>
-    <w:bookmarkStart w:id="39" w:name="figure-legends"/>
+    <w:bookmarkEnd w:id="39"/>
+    <w:bookmarkStart w:id="40" w:name="figure-legends"/>
     <w:p>
       <w:pPr>
         <w:pStyle w:val="Heading2"/>
@@ -3625,9 +4642,11 @@
         <w:t xml:space="preserve">.</w:t>
       </w:r>
     </w:p>
-    <w:p>
-      <w:pPr>
-        <w:pStyle w:val="BodyText"/>
+    <w:bookmarkEnd w:id="40"/>
+    <w:bookmarkStart w:id="41" w:name="X33c99bee21b4e9768cd81fd49e7b602cea202db"/>
+    <w:p>
+      <w:pPr>
+        <w:pStyle w:val="Heading2"/>
       </w:pPr>
       <w:r>
         <w:rPr>
@@ -3746,8 +4765,2830 @@
         <w:t xml:space="preserve">.</w:t>
       </w:r>
     </w:p>
-    <w:bookmarkEnd w:id="39"/>
-    <w:bookmarkEnd w:id="40"/>
+    <w:bookmarkEnd w:id="41"/>
+    <w:bookmarkStart w:id="42" w:name="tables"/>
+    <w:p>
+      <w:pPr>
+        <w:pStyle w:val="Heading2"/>
+      </w:pPr>
+      <w:r>
+        <w:t xml:space="preserve">Tables</w:t>
+      </w:r>
+    </w:p>
+    <w:p>
+      <w:pPr>
+        <w:pStyle w:val="FirstParagraph"/>
+      </w:pPr>
+      <w:r>
+        <w:rPr>
+          <w:b/>
+          <w:bCs/>
+        </w:rPr>
+        <w:t xml:space="preserve">Table 1 | GTDB-R207 ANIm-truth benchmark (MAE in ANI points, by band).</w:t>
+      </w:r>
+      <w:r>
+        <w:t xml:space="preserve"> </w:t>
+      </w:r>
+      <w:r>
+        <w:t xml:space="preserve">Upper panel: 2,074-pair benchmark with band-holdout cross-validation. Lower panel: strictly held-out 43,334-pair evaluation and unified 80–100% benchmark. Raw rows are post-rescue gated estimates; v5/v6 are ridge calibrations; hybrid uses raw ≥98% ANI and calibrated &lt;98%.</w:t>
+      </w:r>
+    </w:p>
+    <w:tbl>
+      <w:tblPr>
+        <w:tblStyle w:val="Table"/>
+        <w:tblW w:type="pct" w:w="5000"/>
+        <w:tblLayout w:type="fixed"/>
+        <w:tblLook w:firstRow="1" w:lastRow="0" w:firstColumn="0" w:lastColumn="0" w:noHBand="0" w:noVBand="0" w:val="0020"/>
+      </w:tblPr>
+      <w:tblGrid>
+        <w:gridCol w:w="990"/>
+        <w:gridCol w:w="990"/>
+        <w:gridCol w:w="990"/>
+        <w:gridCol w:w="990"/>
+        <w:gridCol w:w="990"/>
+        <w:gridCol w:w="990"/>
+        <w:gridCol w:w="990"/>
+        <w:gridCol w:w="990"/>
+      </w:tblGrid>
+      <w:tr>
+        <w:trPr>
+          <w:tblHeader w:val="on"/>
+        </w:trPr>
+        <w:tc>
+          <w:tcPr/>
+          <w:p>
+            <w:pPr>
+              <w:pStyle w:val="Compact"/>
+            </w:pPr>
+            <w:r>
+              <w:t xml:space="preserve">Method</w:t>
+            </w:r>
+          </w:p>
+        </w:tc>
+        <w:tc>
+          <w:tcPr/>
+          <w:p>
+            <w:pPr>
+              <w:pStyle w:val="Compact"/>
+            </w:pPr>
+            <w:r>
+              <w:t xml:space="preserve">80–85</w:t>
+            </w:r>
+          </w:p>
+        </w:tc>
+        <w:tc>
+          <w:tcPr/>
+          <w:p>
+            <w:pPr>
+              <w:pStyle w:val="Compact"/>
+            </w:pPr>
+            <w:r>
+              <w:t xml:space="preserve">85–90</w:t>
+            </w:r>
+          </w:p>
+        </w:tc>
+        <w:tc>
+          <w:tcPr/>
+          <w:p>
+            <w:pPr>
+              <w:pStyle w:val="Compact"/>
+            </w:pPr>
+            <w:r>
+              <w:t xml:space="preserve">90–95</w:t>
+            </w:r>
+          </w:p>
+        </w:tc>
+        <w:tc>
+          <w:tcPr/>
+          <w:p>
+            <w:pPr>
+              <w:pStyle w:val="Compact"/>
+            </w:pPr>
+            <w:r>
+              <w:t xml:space="preserve">95–99/95–100</w:t>
+            </w:r>
+          </w:p>
+        </w:tc>
+        <w:tc>
+          <w:tcPr/>
+          <w:p>
+            <w:pPr>
+              <w:pStyle w:val="Compact"/>
+            </w:pPr>
+            <w:r>
+              <w:t xml:space="preserve">all</w:t>
+            </w:r>
+          </w:p>
+        </w:tc>
+        <w:tc>
+          <w:tcPr/>
+          <w:p>
+            <w:pPr>
+              <w:pStyle w:val="Compact"/>
+            </w:pPr>
+            <w:r>
+              <w:t xml:space="preserve">bias (all)</w:t>
+            </w:r>
+          </w:p>
+        </w:tc>
+        <w:tc>
+          <w:tcPr/>
+          <w:p>
+            <w:pPr>
+              <w:pStyle w:val="Compact"/>
+            </w:pPr>
+            <w:r>
+              <w:t xml:space="preserve">r (all)</w:t>
+            </w:r>
+          </w:p>
+        </w:tc>
+      </w:tr>
+      <w:tr>
+        <w:tc>
+          <w:tcPr/>
+          <w:p>
+            <w:pPr>
+              <w:pStyle w:val="Compact"/>
+            </w:pPr>
+            <w:r>
+              <w:t xml:space="preserve">syn2bani 4e gamma (raw)</w:t>
+            </w:r>
+          </w:p>
+        </w:tc>
+        <w:tc>
+          <w:tcPr/>
+          <w:p>
+            <w:pPr>
+              <w:pStyle w:val="Compact"/>
+            </w:pPr>
+            <w:r>
+              <w:t xml:space="preserve">3.21</w:t>
+            </w:r>
+          </w:p>
+        </w:tc>
+        <w:tc>
+          <w:tcPr/>
+          <w:p>
+            <w:pPr>
+              <w:pStyle w:val="Compact"/>
+            </w:pPr>
+            <w:r>
+              <w:t xml:space="preserve">2.81</w:t>
+            </w:r>
+          </w:p>
+        </w:tc>
+        <w:tc>
+          <w:tcPr/>
+          <w:p>
+            <w:pPr>
+              <w:pStyle w:val="Compact"/>
+            </w:pPr>
+            <w:r>
+              <w:t xml:space="preserve">1.47</w:t>
+            </w:r>
+          </w:p>
+        </w:tc>
+        <w:tc>
+          <w:tcPr/>
+          <w:p>
+            <w:pPr>
+              <w:pStyle w:val="Compact"/>
+            </w:pPr>
+            <w:r>
+              <w:t xml:space="preserve">0.88</w:t>
+            </w:r>
+          </w:p>
+        </w:tc>
+        <w:tc>
+          <w:tcPr/>
+          <w:p>
+            <w:pPr>
+              <w:pStyle w:val="Compact"/>
+            </w:pPr>
+            <w:r>
+              <w:t xml:space="preserve">2.35</w:t>
+            </w:r>
+          </w:p>
+        </w:tc>
+        <w:tc>
+          <w:tcPr/>
+          <w:p>
+            <w:pPr>
+              <w:pStyle w:val="Compact"/>
+            </w:pPr>
+            <w:r>
+              <w:t xml:space="preserve">+2.02</w:t>
+            </w:r>
+          </w:p>
+        </w:tc>
+        <w:tc>
+          <w:tcPr/>
+          <w:p>
+            <w:pPr>
+              <w:pStyle w:val="Compact"/>
+            </w:pPr>
+            <w:r>
+              <w:t xml:space="preserve">0.763</w:t>
+            </w:r>
+          </w:p>
+        </w:tc>
+      </w:tr>
+      <w:tr>
+        <w:tc>
+          <w:tcPr/>
+          <w:p>
+            <w:pPr>
+              <w:pStyle w:val="Compact"/>
+            </w:pPr>
+            <w:r>
+              <w:t xml:space="preserve">syn2bani 4e uniform (raw)</w:t>
+            </w:r>
+          </w:p>
+        </w:tc>
+        <w:tc>
+          <w:tcPr/>
+          <w:p>
+            <w:pPr>
+              <w:pStyle w:val="Compact"/>
+            </w:pPr>
+            <w:r>
+              <w:t xml:space="preserve">4.26</w:t>
+            </w:r>
+          </w:p>
+        </w:tc>
+        <w:tc>
+          <w:tcPr/>
+          <w:p>
+            <w:pPr>
+              <w:pStyle w:val="Compact"/>
+            </w:pPr>
+            <w:r>
+              <w:t xml:space="preserve">3.81</w:t>
+            </w:r>
+          </w:p>
+        </w:tc>
+        <w:tc>
+          <w:tcPr/>
+          <w:p>
+            <w:pPr>
+              <w:pStyle w:val="Compact"/>
+            </w:pPr>
+            <w:r>
+              <w:t xml:space="preserve">2.16</w:t>
+            </w:r>
+          </w:p>
+        </w:tc>
+        <w:tc>
+          <w:tcPr/>
+          <w:p>
+            <w:pPr>
+              <w:pStyle w:val="Compact"/>
+            </w:pPr>
+            <w:r>
+              <w:t xml:space="preserve">1.43</w:t>
+            </w:r>
+          </w:p>
+        </w:tc>
+        <w:tc>
+          <w:tcPr/>
+          <w:p>
+            <w:pPr>
+              <w:pStyle w:val="Compact"/>
+            </w:pPr>
+            <w:r>
+              <w:t xml:space="preserve">3.23</w:t>
+            </w:r>
+          </w:p>
+        </w:tc>
+        <w:tc>
+          <w:tcPr/>
+          <w:p>
+            <w:pPr>
+              <w:pStyle w:val="Compact"/>
+            </w:pPr>
+            <w:r>
+              <w:t xml:space="preserve">+3.23</w:t>
+            </w:r>
+          </w:p>
+        </w:tc>
+        <w:tc>
+          <w:tcPr/>
+          <w:p>
+            <w:pPr>
+              <w:pStyle w:val="Compact"/>
+            </w:pPr>
+            <w:r>
+              <w:t xml:space="preserve">0.863</w:t>
+            </w:r>
+          </w:p>
+        </w:tc>
+      </w:tr>
+      <w:tr>
+        <w:tc>
+          <w:tcPr/>
+          <w:p>
+            <w:pPr>
+              <w:pStyle w:val="Compact"/>
+            </w:pPr>
+            <w:r>
+              <w:t xml:space="preserve">syn2bani 4e gated (raw)</w:t>
+            </w:r>
+          </w:p>
+        </w:tc>
+        <w:tc>
+          <w:tcPr/>
+          <w:p>
+            <w:pPr>
+              <w:pStyle w:val="Compact"/>
+            </w:pPr>
+            <w:r>
+              <w:t xml:space="preserve">3.24</w:t>
+            </w:r>
+          </w:p>
+        </w:tc>
+        <w:tc>
+          <w:tcPr/>
+          <w:p>
+            <w:pPr>
+              <w:pStyle w:val="Compact"/>
+            </w:pPr>
+            <w:r>
+              <w:t xml:space="preserve">2.81</w:t>
+            </w:r>
+          </w:p>
+        </w:tc>
+        <w:tc>
+          <w:tcPr/>
+          <w:p>
+            <w:pPr>
+              <w:pStyle w:val="Compact"/>
+            </w:pPr>
+            <w:r>
+              <w:t xml:space="preserve">1.47</w:t>
+            </w:r>
+          </w:p>
+        </w:tc>
+        <w:tc>
+          <w:tcPr/>
+          <w:p>
+            <w:pPr>
+              <w:pStyle w:val="Compact"/>
+            </w:pPr>
+            <w:r>
+              <w:t xml:space="preserve">0.88</w:t>
+            </w:r>
+          </w:p>
+        </w:tc>
+        <w:tc>
+          <w:tcPr/>
+          <w:p>
+            <w:pPr>
+              <w:pStyle w:val="Compact"/>
+            </w:pPr>
+            <w:r>
+              <w:t xml:space="preserve">2.35</w:t>
+            </w:r>
+          </w:p>
+        </w:tc>
+        <w:tc>
+          <w:tcPr/>
+          <w:p>
+            <w:pPr>
+              <w:pStyle w:val="Compact"/>
+            </w:pPr>
+            <w:r>
+              <w:t xml:space="preserve">+2.22</w:t>
+            </w:r>
+          </w:p>
+        </w:tc>
+        <w:tc>
+          <w:tcPr/>
+          <w:p>
+            <w:pPr>
+              <w:pStyle w:val="Compact"/>
+            </w:pPr>
+            <w:r>
+              <w:t xml:space="preserve">0.789</w:t>
+            </w:r>
+          </w:p>
+        </w:tc>
+      </w:tr>
+      <w:tr>
+        <w:tc>
+          <w:tcPr/>
+          <w:p>
+            <w:pPr>
+              <w:pStyle w:val="Compact"/>
+            </w:pPr>
+            <w:r>
+              <w:rPr>
+                <w:b/>
+                <w:bCs/>
+              </w:rPr>
+              <w:t xml:space="preserve">syn2bani 4e calibrated v5 (band-holdout CV)</w:t>
+            </w:r>
+          </w:p>
+        </w:tc>
+        <w:tc>
+          <w:tcPr/>
+          <w:p>
+            <w:pPr>
+              <w:pStyle w:val="Compact"/>
+            </w:pPr>
+            <w:r>
+              <w:t xml:space="preserve">0.82</w:t>
+            </w:r>
+          </w:p>
+        </w:tc>
+        <w:tc>
+          <w:tcPr/>
+          <w:p>
+            <w:pPr>
+              <w:pStyle w:val="Compact"/>
+            </w:pPr>
+            <w:r>
+              <w:t xml:space="preserve">0.77</w:t>
+            </w:r>
+          </w:p>
+        </w:tc>
+        <w:tc>
+          <w:tcPr/>
+          <w:p>
+            <w:pPr>
+              <w:pStyle w:val="Compact"/>
+            </w:pPr>
+            <w:r>
+              <w:t xml:space="preserve">0.64</w:t>
+            </w:r>
+          </w:p>
+        </w:tc>
+        <w:tc>
+          <w:tcPr/>
+          <w:p>
+            <w:pPr>
+              <w:pStyle w:val="Compact"/>
+            </w:pPr>
+            <w:r>
+              <w:t xml:space="preserve">0.71</w:t>
+            </w:r>
+          </w:p>
+        </w:tc>
+        <w:tc>
+          <w:tcPr/>
+          <w:p>
+            <w:pPr>
+              <w:pStyle w:val="Compact"/>
+            </w:pPr>
+            <w:r>
+              <w:rPr>
+                <w:b/>
+                <w:bCs/>
+              </w:rPr>
+              <w:t xml:space="preserve">0.731</w:t>
+            </w:r>
+          </w:p>
+        </w:tc>
+        <w:tc>
+          <w:tcPr/>
+          <w:p>
+            <w:pPr>
+              <w:pStyle w:val="Compact"/>
+            </w:pPr>
+            <w:r>
+              <w:rPr>
+                <w:b/>
+                <w:bCs/>
+              </w:rPr>
+              <w:t xml:space="preserve">+0.05</w:t>
+            </w:r>
+          </w:p>
+        </w:tc>
+        <w:tc>
+          <w:tcPr/>
+          <w:p>
+            <w:pPr>
+              <w:pStyle w:val="Compact"/>
+            </w:pPr>
+            <w:r>
+              <w:t xml:space="preserve">0.963</w:t>
+            </w:r>
+          </w:p>
+        </w:tc>
+      </w:tr>
+      <w:tr>
+        <w:tc>
+          <w:tcPr/>
+          <w:p>
+            <w:pPr>
+              <w:pStyle w:val="Compact"/>
+            </w:pPr>
+            <w:r>
+              <w:t xml:space="preserve">skani</w:t>
+            </w:r>
+          </w:p>
+        </w:tc>
+        <w:tc>
+          <w:tcPr/>
+          <w:p>
+            <w:pPr>
+              <w:pStyle w:val="Compact"/>
+            </w:pPr>
+            <w:r>
+              <w:t xml:space="preserve">1.74</w:t>
+            </w:r>
+          </w:p>
+        </w:tc>
+        <w:tc>
+          <w:tcPr/>
+          <w:p>
+            <w:pPr>
+              <w:pStyle w:val="Compact"/>
+            </w:pPr>
+            <w:r>
+              <w:t xml:space="preserve">0.85</w:t>
+            </w:r>
+          </w:p>
+        </w:tc>
+        <w:tc>
+          <w:tcPr/>
+          <w:p>
+            <w:pPr>
+              <w:pStyle w:val="Compact"/>
+            </w:pPr>
+            <w:r>
+              <w:t xml:space="preserve">0.45</w:t>
+            </w:r>
+          </w:p>
+        </w:tc>
+        <w:tc>
+          <w:tcPr/>
+          <w:p>
+            <w:pPr>
+              <w:pStyle w:val="Compact"/>
+            </w:pPr>
+            <w:r>
+              <w:t xml:space="preserve">0.34</w:t>
+            </w:r>
+          </w:p>
+        </w:tc>
+        <w:tc>
+          <w:tcPr/>
+          <w:p>
+            <w:pPr>
+              <w:pStyle w:val="Compact"/>
+            </w:pPr>
+            <w:r>
+              <w:t xml:space="preserve">0.906</w:t>
+            </w:r>
+          </w:p>
+        </w:tc>
+        <w:tc>
+          <w:tcPr/>
+          <w:p>
+            <w:pPr>
+              <w:pStyle w:val="Compact"/>
+            </w:pPr>
+            <w:r>
+              <w:t xml:space="preserve">−0.65</w:t>
+            </w:r>
+          </w:p>
+        </w:tc>
+        <w:tc>
+          <w:tcPr/>
+          <w:p>
+            <w:pPr>
+              <w:pStyle w:val="Compact"/>
+            </w:pPr>
+            <w:r>
+              <w:t xml:space="preserve">0.969</w:t>
+            </w:r>
+          </w:p>
+        </w:tc>
+      </w:tr>
+      <w:tr>
+        <w:tc>
+          <w:tcPr/>
+          <w:p>
+            <w:pPr>
+              <w:pStyle w:val="Compact"/>
+            </w:pPr>
+            <w:r>
+              <w:t xml:space="preserve">FastANI (363-pair subset)</w:t>
+            </w:r>
+          </w:p>
+        </w:tc>
+        <w:tc>
+          <w:tcPr/>
+          <w:p>
+            <w:pPr>
+              <w:pStyle w:val="Compact"/>
+            </w:pPr>
+            <w:r>
+              <w:t xml:space="preserve">1.73</w:t>
+            </w:r>
+          </w:p>
+        </w:tc>
+        <w:tc>
+          <w:tcPr/>
+          <w:p>
+            <w:pPr>
+              <w:pStyle w:val="Compact"/>
+            </w:pPr>
+            <w:r>
+              <w:t xml:space="preserve">1.26</w:t>
+            </w:r>
+          </w:p>
+        </w:tc>
+        <w:tc>
+          <w:tcPr/>
+          <w:p>
+            <w:pPr>
+              <w:pStyle w:val="Compact"/>
+            </w:pPr>
+            <w:r>
+              <w:t xml:space="preserve">0.54</w:t>
+            </w:r>
+          </w:p>
+        </w:tc>
+        <w:tc>
+          <w:tcPr/>
+          <w:p>
+            <w:pPr>
+              <w:pStyle w:val="Compact"/>
+            </w:pPr>
+            <w:r>
+              <w:t xml:space="preserve">0.69</w:t>
+            </w:r>
+          </w:p>
+        </w:tc>
+        <w:tc>
+          <w:tcPr/>
+          <w:p>
+            <w:pPr>
+              <w:pStyle w:val="Compact"/>
+            </w:pPr>
+            <w:r>
+              <w:t xml:space="preserve">1.056</w:t>
+            </w:r>
+          </w:p>
+        </w:tc>
+        <w:tc>
+          <w:tcPr/>
+          <w:p>
+            <w:pPr>
+              <w:pStyle w:val="Compact"/>
+            </w:pPr>
+            <w:r>
+              <w:t xml:space="preserve">−0.98</w:t>
+            </w:r>
+          </w:p>
+        </w:tc>
+        <w:tc>
+          <w:tcPr/>
+          <w:p>
+            <w:pPr>
+              <w:pStyle w:val="Compact"/>
+            </w:pPr>
+            <w:r>
+              <w:t xml:space="preserve">0.981</w:t>
+            </w:r>
+          </w:p>
+        </w:tc>
+      </w:tr>
+      <w:tr>
+        <w:tc>
+          <w:tcPr/>
+          <w:p>
+            <w:pPr>
+              <w:pStyle w:val="Compact"/>
+            </w:pPr>
+            <w:r>
+              <w:t xml:space="preserve">syn2bani 4e gated, held-out (raw)</w:t>
+            </w:r>
+          </w:p>
+        </w:tc>
+        <w:tc>
+          <w:tcPr/>
+          <w:p>
+            <w:pPr>
+              <w:pStyle w:val="Compact"/>
+            </w:pPr>
+            <w:r>
+              <w:t xml:space="preserve">2.20</w:t>
+            </w:r>
+          </w:p>
+        </w:tc>
+        <w:tc>
+          <w:tcPr/>
+          <w:p>
+            <w:pPr>
+              <w:pStyle w:val="Compact"/>
+            </w:pPr>
+            <w:r>
+              <w:t xml:space="preserve">1.89</w:t>
+            </w:r>
+          </w:p>
+        </w:tc>
+        <w:tc>
+          <w:tcPr/>
+          <w:p>
+            <w:pPr>
+              <w:pStyle w:val="Compact"/>
+            </w:pPr>
+            <w:r>
+              <w:t xml:space="preserve">1.21</w:t>
+            </w:r>
+          </w:p>
+        </w:tc>
+        <w:tc>
+          <w:tcPr/>
+          <w:p>
+            <w:pPr>
+              <w:pStyle w:val="Compact"/>
+            </w:pPr>
+            <w:r>
+              <w:t xml:space="preserve">0.75</w:t>
+            </w:r>
+          </w:p>
+        </w:tc>
+        <w:tc>
+          <w:tcPr/>
+          <w:p>
+            <w:pPr>
+              <w:pStyle w:val="Compact"/>
+            </w:pPr>
+            <w:r>
+              <w:t xml:space="preserve">1.70</w:t>
+            </w:r>
+          </w:p>
+        </w:tc>
+        <w:tc>
+          <w:tcPr/>
+          <w:p>
+            <w:pPr>
+              <w:pStyle w:val="Compact"/>
+            </w:pPr>
+            <w:r>
+              <w:t xml:space="preserve">+1.50</w:t>
+            </w:r>
+          </w:p>
+        </w:tc>
+        <w:tc>
+          <w:tcPr/>
+          <w:p>
+            <w:pPr>
+              <w:pStyle w:val="Compact"/>
+            </w:pPr>
+            <w:r>
+              <w:t xml:space="preserve">0.834</w:t>
+            </w:r>
+          </w:p>
+        </w:tc>
+      </w:tr>
+      <w:tr>
+        <w:tc>
+          <w:tcPr/>
+          <w:p>
+            <w:pPr>
+              <w:pStyle w:val="Compact"/>
+            </w:pPr>
+            <w:r>
+              <w:rPr>
+                <w:b/>
+                <w:bCs/>
+              </w:rPr>
+              <w:t xml:space="preserve">syn2bani 4e calibrated v5, held-out</w:t>
+            </w:r>
+          </w:p>
+        </w:tc>
+        <w:tc>
+          <w:tcPr/>
+          <w:p>
+            <w:pPr>
+              <w:pStyle w:val="Compact"/>
+            </w:pPr>
+            <w:r>
+              <w:rPr>
+                <w:b/>
+                <w:bCs/>
+              </w:rPr>
+              <w:t xml:space="preserve">0.72</w:t>
+            </w:r>
+          </w:p>
+        </w:tc>
+        <w:tc>
+          <w:tcPr/>
+          <w:p>
+            <w:pPr>
+              <w:pStyle w:val="Compact"/>
+            </w:pPr>
+            <w:r>
+              <w:rPr>
+                <w:b/>
+                <w:bCs/>
+              </w:rPr>
+              <w:t xml:space="preserve">0.64</w:t>
+            </w:r>
+          </w:p>
+        </w:tc>
+        <w:tc>
+          <w:tcPr/>
+          <w:p>
+            <w:pPr>
+              <w:pStyle w:val="Compact"/>
+            </w:pPr>
+            <w:r>
+              <w:t xml:space="preserve">0.54</w:t>
+            </w:r>
+          </w:p>
+        </w:tc>
+        <w:tc>
+          <w:tcPr/>
+          <w:p>
+            <w:pPr>
+              <w:pStyle w:val="Compact"/>
+            </w:pPr>
+            <w:r>
+              <w:t xml:space="preserve">0.44</w:t>
+            </w:r>
+          </w:p>
+        </w:tc>
+        <w:tc>
+          <w:tcPr/>
+          <w:p>
+            <w:pPr>
+              <w:pStyle w:val="Compact"/>
+            </w:pPr>
+            <w:r>
+              <w:rPr>
+                <w:b/>
+                <w:bCs/>
+              </w:rPr>
+              <w:t xml:space="preserve">0.619</w:t>
+            </w:r>
+          </w:p>
+        </w:tc>
+        <w:tc>
+          <w:tcPr/>
+          <w:p>
+            <w:pPr>
+              <w:pStyle w:val="Compact"/>
+            </w:pPr>
+            <w:r>
+              <w:rPr>
+                <w:b/>
+                <w:bCs/>
+              </w:rPr>
+              <w:t xml:space="preserve">−0.12</w:t>
+            </w:r>
+          </w:p>
+        </w:tc>
+        <w:tc>
+          <w:tcPr/>
+          <w:p>
+            <w:pPr>
+              <w:pStyle w:val="Compact"/>
+            </w:pPr>
+            <w:r>
+              <w:t xml:space="preserve">0.962</w:t>
+            </w:r>
+          </w:p>
+        </w:tc>
+      </w:tr>
+      <w:tr>
+        <w:tc>
+          <w:tcPr/>
+          <w:p>
+            <w:pPr>
+              <w:pStyle w:val="Compact"/>
+            </w:pPr>
+            <w:r>
+              <w:t xml:space="preserve">skani, held-out</w:t>
+            </w:r>
+          </w:p>
+        </w:tc>
+        <w:tc>
+          <w:tcPr/>
+          <w:p>
+            <w:pPr>
+              <w:pStyle w:val="Compact"/>
+            </w:pPr>
+            <w:r>
+              <w:t xml:space="preserve">1.98</w:t>
+            </w:r>
+          </w:p>
+        </w:tc>
+        <w:tc>
+          <w:tcPr/>
+          <w:p>
+            <w:pPr>
+              <w:pStyle w:val="Compact"/>
+            </w:pPr>
+            <w:r>
+              <w:t xml:space="preserve">0.89</w:t>
+            </w:r>
+          </w:p>
+        </w:tc>
+        <w:tc>
+          <w:tcPr/>
+          <w:p>
+            <w:pPr>
+              <w:pStyle w:val="Compact"/>
+            </w:pPr>
+            <w:r>
+              <w:t xml:space="preserve">0.43</w:t>
+            </w:r>
+          </w:p>
+        </w:tc>
+        <w:tc>
+          <w:tcPr/>
+          <w:p>
+            <w:pPr>
+              <w:pStyle w:val="Compact"/>
+            </w:pPr>
+            <w:r>
+              <w:t xml:space="preserve">0.32</w:t>
+            </w:r>
+          </w:p>
+        </w:tc>
+        <w:tc>
+          <w:tcPr/>
+          <w:p>
+            <w:pPr>
+              <w:pStyle w:val="Compact"/>
+            </w:pPr>
+            <w:r>
+              <w:t xml:space="preserve">0.957</w:t>
+            </w:r>
+          </w:p>
+        </w:tc>
+        <w:tc>
+          <w:tcPr/>
+          <w:p>
+            <w:pPr>
+              <w:pStyle w:val="Compact"/>
+            </w:pPr>
+            <w:r>
+              <w:t xml:space="preserve">−0.80</w:t>
+            </w:r>
+          </w:p>
+        </w:tc>
+        <w:tc>
+          <w:tcPr/>
+          <w:p>
+            <w:pPr>
+              <w:pStyle w:val="Compact"/>
+            </w:pPr>
+            <w:r>
+              <w:t xml:space="preserve">0.973</w:t>
+            </w:r>
+          </w:p>
+        </w:tc>
+      </w:tr>
+      <w:tr>
+        <w:tc>
+          <w:tcPr/>
+          <w:p>
+            <w:pPr>
+              <w:pStyle w:val="Compact"/>
+            </w:pPr>
+            <w:r>
+              <w:t xml:space="preserve">FastANI, held-out</w:t>
+            </w:r>
+          </w:p>
+        </w:tc>
+        <w:tc>
+          <w:tcPr/>
+          <w:p>
+            <w:pPr>
+              <w:pStyle w:val="Compact"/>
+            </w:pPr>
+            <w:r>
+              <w:t xml:space="preserve">1.83</w:t>
+            </w:r>
+          </w:p>
+        </w:tc>
+        <w:tc>
+          <w:tcPr/>
+          <w:p>
+            <w:pPr>
+              <w:pStyle w:val="Compact"/>
+            </w:pPr>
+            <w:r>
+              <w:t xml:space="preserve">1.00</w:t>
+            </w:r>
+          </w:p>
+        </w:tc>
+        <w:tc>
+          <w:tcPr/>
+          <w:p>
+            <w:pPr>
+              <w:pStyle w:val="Compact"/>
+            </w:pPr>
+            <w:r>
+              <w:t xml:space="preserve">0.46</w:t>
+            </w:r>
+          </w:p>
+        </w:tc>
+        <w:tc>
+          <w:tcPr/>
+          <w:p>
+            <w:pPr>
+              <w:pStyle w:val="Compact"/>
+            </w:pPr>
+            <w:r>
+              <w:t xml:space="preserve">0.36</w:t>
+            </w:r>
+          </w:p>
+        </w:tc>
+        <w:tc>
+          <w:tcPr/>
+          <w:p>
+            <w:pPr>
+              <w:pStyle w:val="Compact"/>
+            </w:pPr>
+            <w:r>
+              <w:t xml:space="preserve">0.977</w:t>
+            </w:r>
+          </w:p>
+        </w:tc>
+        <w:tc>
+          <w:tcPr/>
+          <w:p>
+            <w:pPr>
+              <w:pStyle w:val="Compact"/>
+            </w:pPr>
+            <w:r>
+              <w:t xml:space="preserve">−0.91</w:t>
+            </w:r>
+          </w:p>
+        </w:tc>
+        <w:tc>
+          <w:tcPr/>
+          <w:p>
+            <w:pPr>
+              <w:pStyle w:val="Compact"/>
+            </w:pPr>
+            <w:r>
+              <w:t xml:space="preserve">0.980</w:t>
+            </w:r>
+          </w:p>
+        </w:tc>
+      </w:tr>
+      <w:tr>
+        <w:tc>
+          <w:tcPr/>
+          <w:p>
+            <w:pPr>
+              <w:pStyle w:val="Compact"/>
+            </w:pPr>
+            <w:r>
+              <w:rPr>
+                <w:b/>
+                <w:bCs/>
+              </w:rPr>
+              <w:t xml:space="preserve">syn2bani 4e calibrated v6, unified 80–100%</w:t>
+            </w:r>
+          </w:p>
+        </w:tc>
+        <w:tc>
+          <w:tcPr/>
+          <w:p>
+            <w:pPr>
+              <w:pStyle w:val="Compact"/>
+            </w:pPr>
+            <w:r>
+              <w:rPr>
+                <w:b/>
+                <w:bCs/>
+              </w:rPr>
+              <w:t xml:space="preserve">0.72</w:t>
+            </w:r>
+          </w:p>
+        </w:tc>
+        <w:tc>
+          <w:tcPr/>
+          <w:p>
+            <w:pPr>
+              <w:pStyle w:val="Compact"/>
+            </w:pPr>
+            <w:r>
+              <w:rPr>
+                <w:b/>
+                <w:bCs/>
+              </w:rPr>
+              <w:t xml:space="preserve">0.64</w:t>
+            </w:r>
+          </w:p>
+        </w:tc>
+        <w:tc>
+          <w:tcPr/>
+          <w:p>
+            <w:pPr>
+              <w:pStyle w:val="Compact"/>
+            </w:pPr>
+            <w:r>
+              <w:t xml:space="preserve">0.54</w:t>
+            </w:r>
+          </w:p>
+        </w:tc>
+        <w:tc>
+          <w:tcPr/>
+          <w:p>
+            <w:pPr>
+              <w:pStyle w:val="Compact"/>
+            </w:pPr>
+            <w:r>
+              <w:t xml:space="preserve">—</w:t>
+            </w:r>
+          </w:p>
+        </w:tc>
+        <w:tc>
+          <w:tcPr/>
+          <w:p>
+            <w:pPr>
+              <w:pStyle w:val="Compact"/>
+            </w:pPr>
+            <w:r>
+              <w:rPr>
+                <w:b/>
+                <w:bCs/>
+              </w:rPr>
+              <w:t xml:space="preserve">0.618</w:t>
+            </w:r>
+          </w:p>
+        </w:tc>
+        <w:tc>
+          <w:tcPr/>
+          <w:p>
+            <w:pPr>
+              <w:pStyle w:val="Compact"/>
+            </w:pPr>
+            <w:r>
+              <w:rPr>
+                <w:b/>
+                <w:bCs/>
+              </w:rPr>
+              <w:t xml:space="preserve">−0.13</w:t>
+            </w:r>
+          </w:p>
+        </w:tc>
+        <w:tc>
+          <w:tcPr/>
+          <w:p>
+            <w:pPr>
+              <w:pStyle w:val="Compact"/>
+            </w:pPr>
+            <w:r>
+              <w:t xml:space="preserve">0.967</w:t>
+            </w:r>
+          </w:p>
+        </w:tc>
+      </w:tr>
+      <w:tr>
+        <w:tc>
+          <w:tcPr/>
+          <w:p>
+            <w:pPr>
+              <w:pStyle w:val="Compact"/>
+            </w:pPr>
+            <w:r>
+              <w:rPr>
+                <w:b/>
+                <w:bCs/>
+              </w:rPr>
+              <w:t xml:space="preserve">syn2bani 4e hybrid (raw ≥98%, cal &lt;98%), unified</w:t>
+            </w:r>
+          </w:p>
+        </w:tc>
+        <w:tc>
+          <w:tcPr/>
+          <w:p>
+            <w:pPr>
+              <w:pStyle w:val="Compact"/>
+            </w:pPr>
+            <w:r>
+              <w:rPr>
+                <w:b/>
+                <w:bCs/>
+              </w:rPr>
+              <w:t xml:space="preserve">0.72</w:t>
+            </w:r>
+          </w:p>
+        </w:tc>
+        <w:tc>
+          <w:tcPr/>
+          <w:p>
+            <w:pPr>
+              <w:pStyle w:val="Compact"/>
+            </w:pPr>
+            <w:r>
+              <w:rPr>
+                <w:b/>
+                <w:bCs/>
+              </w:rPr>
+              <w:t xml:space="preserve">0.65</w:t>
+            </w:r>
+          </w:p>
+        </w:tc>
+        <w:tc>
+          <w:tcPr/>
+          <w:p>
+            <w:pPr>
+              <w:pStyle w:val="Compact"/>
+            </w:pPr>
+            <w:r>
+              <w:t xml:space="preserve">0.54</w:t>
+            </w:r>
+          </w:p>
+        </w:tc>
+        <w:tc>
+          <w:tcPr/>
+          <w:p>
+            <w:pPr>
+              <w:pStyle w:val="Compact"/>
+            </w:pPr>
+            <w:r>
+              <w:t xml:space="preserve">—</w:t>
+            </w:r>
+          </w:p>
+        </w:tc>
+        <w:tc>
+          <w:tcPr/>
+          <w:p>
+            <w:pPr>
+              <w:pStyle w:val="Compact"/>
+            </w:pPr>
+            <w:r>
+              <w:rPr>
+                <w:b/>
+                <w:bCs/>
+              </w:rPr>
+              <w:t xml:space="preserve">0.615</w:t>
+            </w:r>
+          </w:p>
+        </w:tc>
+        <w:tc>
+          <w:tcPr/>
+          <w:p>
+            <w:pPr>
+              <w:pStyle w:val="Compact"/>
+            </w:pPr>
+            <w:r>
+              <w:rPr>
+                <w:b/>
+                <w:bCs/>
+              </w:rPr>
+              <w:t xml:space="preserve">−0.12</w:t>
+            </w:r>
+          </w:p>
+        </w:tc>
+        <w:tc>
+          <w:tcPr/>
+          <w:p>
+            <w:pPr>
+              <w:pStyle w:val="Compact"/>
+            </w:pPr>
+            <w:r>
+              <w:t xml:space="preserve">0.967</w:t>
+            </w:r>
+          </w:p>
+        </w:tc>
+      </w:tr>
+      <w:tr>
+        <w:tc>
+          <w:tcPr/>
+          <w:p>
+            <w:pPr>
+              <w:pStyle w:val="Compact"/>
+            </w:pPr>
+            <w:r>
+              <w:t xml:space="preserve">syn2bani 4e gated (raw), unified</w:t>
+            </w:r>
+          </w:p>
+        </w:tc>
+        <w:tc>
+          <w:tcPr/>
+          <w:p>
+            <w:pPr>
+              <w:pStyle w:val="Compact"/>
+            </w:pPr>
+            <w:r>
+              <w:t xml:space="preserve">1.96</w:t>
+            </w:r>
+          </w:p>
+        </w:tc>
+        <w:tc>
+          <w:tcPr/>
+          <w:p>
+            <w:pPr>
+              <w:pStyle w:val="Compact"/>
+            </w:pPr>
+            <w:r>
+              <w:t xml:space="preserve">1.89</w:t>
+            </w:r>
+          </w:p>
+        </w:tc>
+        <w:tc>
+          <w:tcPr/>
+          <w:p>
+            <w:pPr>
+              <w:pStyle w:val="Compact"/>
+            </w:pPr>
+            <w:r>
+              <w:t xml:space="preserve">1.21</w:t>
+            </w:r>
+          </w:p>
+        </w:tc>
+        <w:tc>
+          <w:tcPr/>
+          <w:p>
+            <w:pPr>
+              <w:pStyle w:val="Compact"/>
+            </w:pPr>
+            <w:r>
+              <w:t xml:space="preserve">—</w:t>
+            </w:r>
+          </w:p>
+        </w:tc>
+        <w:tc>
+          <w:tcPr/>
+          <w:p>
+            <w:pPr>
+              <w:pStyle w:val="Compact"/>
+            </w:pPr>
+            <w:r>
+              <w:t xml:space="preserve">1.647</w:t>
+            </w:r>
+          </w:p>
+        </w:tc>
+        <w:tc>
+          <w:tcPr/>
+          <w:p>
+            <w:pPr>
+              <w:pStyle w:val="Compact"/>
+            </w:pPr>
+            <w:r>
+              <w:t xml:space="preserve">+1.42</w:t>
+            </w:r>
+          </w:p>
+        </w:tc>
+        <w:tc>
+          <w:tcPr/>
+          <w:p>
+            <w:pPr>
+              <w:pStyle w:val="Compact"/>
+            </w:pPr>
+            <w:r>
+              <w:t xml:space="preserve">0.867</w:t>
+            </w:r>
+          </w:p>
+        </w:tc>
+      </w:tr>
+      <w:tr>
+        <w:tc>
+          <w:tcPr/>
+          <w:p>
+            <w:pPr>
+              <w:pStyle w:val="Compact"/>
+            </w:pPr>
+            <w:r>
+              <w:t xml:space="preserve">skani, unified</w:t>
+            </w:r>
+          </w:p>
+        </w:tc>
+        <w:tc>
+          <w:tcPr/>
+          <w:p>
+            <w:pPr>
+              <w:pStyle w:val="Compact"/>
+            </w:pPr>
+            <w:r>
+              <w:t xml:space="preserve">1.97</w:t>
+            </w:r>
+          </w:p>
+        </w:tc>
+        <w:tc>
+          <w:tcPr/>
+          <w:p>
+            <w:pPr>
+              <w:pStyle w:val="Compact"/>
+            </w:pPr>
+            <w:r>
+              <w:t xml:space="preserve">0.89</w:t>
+            </w:r>
+          </w:p>
+        </w:tc>
+        <w:tc>
+          <w:tcPr/>
+          <w:p>
+            <w:pPr>
+              <w:pStyle w:val="Compact"/>
+            </w:pPr>
+            <w:r>
+              <w:t xml:space="preserve">0.43</w:t>
+            </w:r>
+          </w:p>
+        </w:tc>
+        <w:tc>
+          <w:tcPr/>
+          <w:p>
+            <w:pPr>
+              <w:pStyle w:val="Compact"/>
+            </w:pPr>
+            <w:r>
+              <w:t xml:space="preserve">—</w:t>
+            </w:r>
+          </w:p>
+        </w:tc>
+        <w:tc>
+          <w:tcPr/>
+          <w:p>
+            <w:pPr>
+              <w:pStyle w:val="Compact"/>
+            </w:pPr>
+            <w:r>
+              <w:t xml:space="preserve">1.018</w:t>
+            </w:r>
+          </w:p>
+        </w:tc>
+        <w:tc>
+          <w:tcPr/>
+          <w:p>
+            <w:pPr>
+              <w:pStyle w:val="Compact"/>
+            </w:pPr>
+            <w:r>
+              <w:t xml:space="preserve">−0.87</w:t>
+            </w:r>
+          </w:p>
+        </w:tc>
+        <w:tc>
+          <w:tcPr/>
+          <w:p>
+            <w:pPr>
+              <w:pStyle w:val="Compact"/>
+            </w:pPr>
+            <w:r>
+              <w:t xml:space="preserve">0.978</w:t>
+            </w:r>
+          </w:p>
+        </w:tc>
+      </w:tr>
+      <w:tr>
+        <w:tc>
+          <w:tcPr/>
+          <w:p>
+            <w:pPr>
+              <w:pStyle w:val="Compact"/>
+            </w:pPr>
+            <w:r>
+              <w:t xml:space="preserve">FastANI, unified</w:t>
+            </w:r>
+          </w:p>
+        </w:tc>
+        <w:tc>
+          <w:tcPr/>
+          <w:p>
+            <w:pPr>
+              <w:pStyle w:val="Compact"/>
+            </w:pPr>
+            <w:r>
+              <w:t xml:space="preserve">1.84</w:t>
+            </w:r>
+          </w:p>
+        </w:tc>
+        <w:tc>
+          <w:tcPr/>
+          <w:p>
+            <w:pPr>
+              <w:pStyle w:val="Compact"/>
+            </w:pPr>
+            <w:r>
+              <w:t xml:space="preserve">1.00</w:t>
+            </w:r>
+          </w:p>
+        </w:tc>
+        <w:tc>
+          <w:tcPr/>
+          <w:p>
+            <w:pPr>
+              <w:pStyle w:val="Compact"/>
+            </w:pPr>
+            <w:r>
+              <w:t xml:space="preserve">0.46</w:t>
+            </w:r>
+          </w:p>
+        </w:tc>
+        <w:tc>
+          <w:tcPr/>
+          <w:p>
+            <w:pPr>
+              <w:pStyle w:val="Compact"/>
+            </w:pPr>
+            <w:r>
+              <w:t xml:space="preserve">—</w:t>
+            </w:r>
+          </w:p>
+        </w:tc>
+        <w:tc>
+          <w:tcPr/>
+          <w:p>
+            <w:pPr>
+              <w:pStyle w:val="Compact"/>
+            </w:pPr>
+            <w:r>
+              <w:t xml:space="preserve">1.032</w:t>
+            </w:r>
+          </w:p>
+        </w:tc>
+        <w:tc>
+          <w:tcPr/>
+          <w:p>
+            <w:pPr>
+              <w:pStyle w:val="Compact"/>
+            </w:pPr>
+            <w:r>
+              <w:t xml:space="preserve">−0.97</w:t>
+            </w:r>
+          </w:p>
+        </w:tc>
+        <w:tc>
+          <w:tcPr/>
+          <w:p>
+            <w:pPr>
+              <w:pStyle w:val="Compact"/>
+            </w:pPr>
+            <w:r>
+              <w:t xml:space="preserve">0.983</w:t>
+            </w:r>
+          </w:p>
+        </w:tc>
+      </w:tr>
+    </w:tbl>
+    <w:p>
+      <w:pPr>
+        <w:pStyle w:val="BodyText"/>
+      </w:pPr>
+      <w:r>
+        <w:rPr>
+          <w:b/>
+          <w:bCs/>
+        </w:rPr>
+        <w:t xml:space="preserve">Table 3 | Datasets used in this study.</w:t>
+      </w:r>
+      <w:r>
+        <w:t xml:space="preserve"> </w:t>
+      </w:r>
+      <w:r>
+        <w:t xml:space="preserve">Simulated datasets carry exact truth by construction (counted substitutions; Online Methods); real datasets use dnadiff (ANIm or structural) truth unless noted. Figure numbers refer to the main text.</w:t>
+      </w:r>
+    </w:p>
+    <w:tbl>
+      <w:tblPr>
+        <w:tblStyle w:val="Table"/>
+        <w:tblW w:type="pct" w:w="5000"/>
+        <w:tblLayout w:type="fixed"/>
+        <w:tblLook w:firstRow="1" w:lastRow="0" w:firstColumn="0" w:lastColumn="0" w:noHBand="0" w:noVBand="0" w:val="0020"/>
+      </w:tblPr>
+      <w:tblGrid>
+        <w:gridCol w:w="1320"/>
+        <w:gridCol w:w="1320"/>
+        <w:gridCol w:w="1320"/>
+        <w:gridCol w:w="1320"/>
+        <w:gridCol w:w="1320"/>
+        <w:gridCol w:w="1320"/>
+      </w:tblGrid>
+      <w:tr>
+        <w:trPr>
+          <w:tblHeader w:val="on"/>
+        </w:trPr>
+        <w:tc>
+          <w:tcPr/>
+          <w:p>
+            <w:pPr>
+              <w:pStyle w:val="Compact"/>
+            </w:pPr>
+            <w:r>
+              <w:t xml:space="preserve">#</w:t>
+            </w:r>
+          </w:p>
+        </w:tc>
+        <w:tc>
+          <w:tcPr/>
+          <w:p>
+            <w:pPr>
+              <w:pStyle w:val="Compact"/>
+            </w:pPr>
+            <w:r>
+              <w:t xml:space="preserve">Dataset</w:t>
+            </w:r>
+          </w:p>
+        </w:tc>
+        <w:tc>
+          <w:tcPr/>
+          <w:p>
+            <w:pPr>
+              <w:pStyle w:val="Compact"/>
+            </w:pPr>
+            <w:r>
+              <w:t xml:space="preserve">Type</w:t>
+            </w:r>
+          </w:p>
+        </w:tc>
+        <w:tc>
+          <w:tcPr/>
+          <w:p>
+            <w:pPr>
+              <w:pStyle w:val="Compact"/>
+            </w:pPr>
+            <w:r>
+              <w:t xml:space="preserve">Composition</w:t>
+            </w:r>
+          </w:p>
+        </w:tc>
+        <w:tc>
+          <w:tcPr/>
+          <w:p>
+            <w:pPr>
+              <w:pStyle w:val="Compact"/>
+            </w:pPr>
+            <w:r>
+              <w:t xml:space="preserve">Ground truth</w:t>
+            </w:r>
+          </w:p>
+        </w:tc>
+        <w:tc>
+          <w:tcPr/>
+          <w:p>
+            <w:pPr>
+              <w:pStyle w:val="Compact"/>
+            </w:pPr>
+            <w:r>
+              <w:t xml:space="preserve">Used in</w:t>
+            </w:r>
+          </w:p>
+        </w:tc>
+      </w:tr>
+      <w:tr>
+        <w:tc>
+          <w:tcPr/>
+          <w:p>
+            <w:pPr>
+              <w:pStyle w:val="Compact"/>
+            </w:pPr>
+            <w:r>
+              <w:t xml:space="preserve">1</w:t>
+            </w:r>
+          </w:p>
+        </w:tc>
+        <w:tc>
+          <w:tcPr/>
+          <w:p>
+            <w:pPr>
+              <w:pStyle w:val="Compact"/>
+            </w:pPr>
+            <w:r>
+              <w:t xml:space="preserve">ANI ladder</w:t>
+            </w:r>
+          </w:p>
+        </w:tc>
+        <w:tc>
+          <w:tcPr/>
+          <w:p>
+            <w:pPr>
+              <w:pStyle w:val="Compact"/>
+            </w:pPr>
+            <w:r>
+              <w:t xml:space="preserve">simulated</w:t>
+            </w:r>
+          </w:p>
+        </w:tc>
+        <w:tc>
+          <w:tcPr/>
+          <w:p>
+            <w:pPr>
+              <w:pStyle w:val="Compact"/>
+            </w:pPr>
+            <w:r>
+              <w:t xml:space="preserve">12 levels, 85–99.9% ANI; 400 kb inversion; ± ~46 deletions</w:t>
+            </w:r>
+          </w:p>
+        </w:tc>
+        <w:tc>
+          <w:tcPr/>
+          <w:p>
+            <w:pPr>
+              <w:pStyle w:val="Compact"/>
+            </w:pPr>
+            <w:r>
+              <w:t xml:space="preserve">exact</w:t>
+            </w:r>
+          </w:p>
+        </w:tc>
+        <w:tc>
+          <w:tcPr/>
+          <w:p>
+            <w:pPr>
+              <w:pStyle w:val="Compact"/>
+            </w:pPr>
+            <w:r>
+              <w:t xml:space="preserve">Fig. 2; Fig. S5</w:t>
+            </w:r>
+          </w:p>
+        </w:tc>
+      </w:tr>
+      <w:tr>
+        <w:tc>
+          <w:tcPr/>
+          <w:p>
+            <w:pPr>
+              <w:pStyle w:val="Compact"/>
+            </w:pPr>
+            <w:r>
+              <w:t xml:space="preserve">2</w:t>
+            </w:r>
+          </w:p>
+        </w:tc>
+        <w:tc>
+          <w:tcPr/>
+          <w:p>
+            <w:pPr>
+              <w:pStyle w:val="Compact"/>
+            </w:pPr>
+            <w:r>
+              <w:t xml:space="preserve">Indel sweep</w:t>
+            </w:r>
+          </w:p>
+        </w:tc>
+        <w:tc>
+          <w:tcPr/>
+          <w:p>
+            <w:pPr>
+              <w:pStyle w:val="Compact"/>
+            </w:pPr>
+            <w:r>
+              <w:t xml:space="preserve">simulated</w:t>
+            </w:r>
+          </w:p>
+        </w:tc>
+        <w:tc>
+          <w:tcPr/>
+          <w:p>
+            <w:pPr>
+              <w:pStyle w:val="Compact"/>
+            </w:pPr>
+            <w:r>
+              <w:t xml:space="preserve">ANI 95.000; 0–4 deletions/100 kb</w:t>
+            </w:r>
+          </w:p>
+        </w:tc>
+        <w:tc>
+          <w:tcPr/>
+          <w:p>
+            <w:pPr>
+              <w:pStyle w:val="Compact"/>
+            </w:pPr>
+            <w:r>
+              <w:t xml:space="preserve">exact</w:t>
+            </w:r>
+          </w:p>
+        </w:tc>
+        <w:tc>
+          <w:tcPr/>
+          <w:p>
+            <w:pPr>
+              <w:pStyle w:val="Compact"/>
+            </w:pPr>
+            <w:r>
+              <w:t xml:space="preserve">Fig. 2; Fig. S5</w:t>
+            </w:r>
+          </w:p>
+        </w:tc>
+      </w:tr>
+      <w:tr>
+        <w:tc>
+          <w:tcPr/>
+          <w:p>
+            <w:pPr>
+              <w:pStyle w:val="Compact"/>
+            </w:pPr>
+            <w:r>
+              <w:t xml:space="preserve">3</w:t>
+            </w:r>
+          </w:p>
+        </w:tc>
+        <w:tc>
+          <w:tcPr/>
+          <w:p>
+            <w:pPr>
+              <w:pStyle w:val="Compact"/>
+            </w:pPr>
+            <w:r>
+              <w:t xml:space="preserve">Fragmentation ladder</w:t>
+            </w:r>
+          </w:p>
+        </w:tc>
+        <w:tc>
+          <w:tcPr/>
+          <w:p>
+            <w:pPr>
+              <w:pStyle w:val="Compact"/>
+            </w:pPr>
+            <w:r>
+              <w:t xml:space="preserve">simulated</w:t>
+            </w:r>
+          </w:p>
+        </w:tc>
+        <w:tc>
+          <w:tcPr/>
+          <w:p>
+            <w:pPr>
+              <w:pStyle w:val="Compact"/>
+            </w:pPr>
+            <w:r>
+              <w:t xml:space="preserve">20–201 contigs; ~50% reverse-complemented</w:t>
+            </w:r>
+          </w:p>
+        </w:tc>
+        <w:tc>
+          <w:tcPr/>
+          <w:p>
+            <w:pPr>
+              <w:pStyle w:val="Compact"/>
+            </w:pPr>
+            <w:r>
+              <w:t xml:space="preserve">exact</w:t>
+            </w:r>
+          </w:p>
+        </w:tc>
+        <w:tc>
+          <w:tcPr/>
+          <w:p>
+            <w:pPr>
+              <w:pStyle w:val="Compact"/>
+            </w:pPr>
+            <w:r>
+              <w:t xml:space="preserve">Fig. 2; Fig. S7</w:t>
+            </w:r>
+          </w:p>
+        </w:tc>
+      </w:tr>
+      <w:tr>
+        <w:tc>
+          <w:tcPr/>
+          <w:p>
+            <w:pPr>
+              <w:pStyle w:val="Compact"/>
+            </w:pPr>
+            <w:r>
+              <w:t xml:space="preserve">4</w:t>
+            </w:r>
+          </w:p>
+        </w:tc>
+        <w:tc>
+          <w:tcPr/>
+          <w:p>
+            <w:pPr>
+              <w:pStyle w:val="Compact"/>
+            </w:pPr>
+            <w:r>
+              <w:t xml:space="preserve">GC ladders</w:t>
+            </w:r>
+          </w:p>
+        </w:tc>
+        <w:tc>
+          <w:tcPr/>
+          <w:p>
+            <w:pPr>
+              <w:pStyle w:val="Compact"/>
+            </w:pPr>
+            <w:r>
+              <w:t xml:space="preserve">simulated</w:t>
+            </w:r>
+          </w:p>
+        </w:tc>
+        <w:tc>
+          <w:tcPr/>
+          <w:p>
+            <w:pPr>
+              <w:pStyle w:val="Compact"/>
+            </w:pPr>
+            <w:r>
+              <w:t xml:space="preserve">5 real templates, GC 27.2–72.1%</w:t>
+            </w:r>
+          </w:p>
+        </w:tc>
+        <w:tc>
+          <w:tcPr/>
+          <w:p>
+            <w:pPr>
+              <w:pStyle w:val="Compact"/>
+            </w:pPr>
+            <w:r>
+              <w:t xml:space="preserve">exact</w:t>
+            </w:r>
+          </w:p>
+        </w:tc>
+        <w:tc>
+          <w:tcPr/>
+          <w:p>
+            <w:pPr>
+              <w:pStyle w:val="Compact"/>
+            </w:pPr>
+            <w:r>
+              <w:t xml:space="preserve">Fig. 2; Fig. S6</w:t>
+            </w:r>
+          </w:p>
+        </w:tc>
+      </w:tr>
+      <w:tr>
+        <w:tc>
+          <w:tcPr/>
+          <w:p>
+            <w:pPr>
+              <w:pStyle w:val="Compact"/>
+            </w:pPr>
+            <w:r>
+              <w:t xml:space="preserve">5</w:t>
+            </w:r>
+          </w:p>
+        </w:tc>
+        <w:tc>
+          <w:tcPr/>
+          <w:p>
+            <w:pPr>
+              <w:pStyle w:val="Compact"/>
+            </w:pPr>
+            <w:r>
+              <w:t xml:space="preserve">Accessory sweep</w:t>
+            </w:r>
+          </w:p>
+        </w:tc>
+        <w:tc>
+          <w:tcPr/>
+          <w:p>
+            <w:pPr>
+              <w:pStyle w:val="Compact"/>
+            </w:pPr>
+            <w:r>
+              <w:t xml:space="preserve">simulated</w:t>
+            </w:r>
+          </w:p>
+        </w:tc>
+        <w:tc>
+          <w:tcPr/>
+          <w:p>
+            <w:pPr>
+              <w:pStyle w:val="Compact"/>
+            </w:pPr>
+            <w:r>
+              <w:t xml:space="preserve">core ANI 95.000; 0–50% shuffled accessory</w:t>
+            </w:r>
+          </w:p>
+        </w:tc>
+        <w:tc>
+          <w:tcPr/>
+          <w:p>
+            <w:pPr>
+              <w:pStyle w:val="Compact"/>
+            </w:pPr>
+            <w:r>
+              <w:t xml:space="preserve">exact</w:t>
+            </w:r>
+          </w:p>
+        </w:tc>
+        <w:tc>
+          <w:tcPr/>
+          <w:p>
+            <w:pPr>
+              <w:pStyle w:val="Compact"/>
+            </w:pPr>
+            <w:r>
+              <w:t xml:space="preserve">Fig. 2; Fig. S8</w:t>
+            </w:r>
+          </w:p>
+        </w:tc>
+      </w:tr>
+      <w:tr>
+        <w:tc>
+          <w:tcPr/>
+          <w:p>
+            <w:pPr>
+              <w:pStyle w:val="Compact"/>
+            </w:pPr>
+            <w:r>
+              <w:t xml:space="preserve">6</w:t>
+            </w:r>
+          </w:p>
+        </w:tc>
+        <w:tc>
+          <w:tcPr/>
+          <w:p>
+            <w:pPr>
+              <w:pStyle w:val="Compact"/>
+            </w:pPr>
+            <w:r>
+              <w:t xml:space="preserve">Mosaic / rate-heterogeneity</w:t>
+            </w:r>
+          </w:p>
+        </w:tc>
+        <w:tc>
+          <w:tcPr/>
+          <w:p>
+            <w:pPr>
+              <w:pStyle w:val="Compact"/>
+            </w:pPr>
+            <w:r>
+              <w:t xml:space="preserve">simulated</w:t>
+            </w:r>
+          </w:p>
+        </w:tc>
+        <w:tc>
+          <w:tcPr/>
+          <w:p>
+            <w:pPr>
+              <w:pStyle w:val="Compact"/>
+            </w:pPr>
+            <w:r>
+              <w:t xml:space="preserve">Gamma(α,α), α = 0.5/1/2, ANI 90–98 + bimodal</w:t>
+            </w:r>
+          </w:p>
+        </w:tc>
+        <w:tc>
+          <w:tcPr/>
+          <w:p>
+            <w:pPr>
+              <w:pStyle w:val="Compact"/>
+            </w:pPr>
+            <w:r>
+              <w:t xml:space="preserve">exact</w:t>
+            </w:r>
+          </w:p>
+        </w:tc>
+        <w:tc>
+          <w:tcPr/>
+          <w:p>
+            <w:pPr>
+              <w:pStyle w:val="Compact"/>
+            </w:pPr>
+            <w:r>
+              <w:t xml:space="preserve">Results; Fig. S9</w:t>
+            </w:r>
+          </w:p>
+        </w:tc>
+      </w:tr>
+      <w:tr>
+        <w:tc>
+          <w:tcPr/>
+          <w:p>
+            <w:pPr>
+              <w:pStyle w:val="Compact"/>
+            </w:pPr>
+            <w:r>
+              <w:t xml:space="preserve">7</w:t>
+            </w:r>
+          </w:p>
+        </w:tc>
+        <w:tc>
+          <w:tcPr/>
+          <w:p>
+            <w:pPr>
+              <w:pStyle w:val="Compact"/>
+            </w:pPr>
+            <w:r>
+              <w:t xml:space="preserve">Inversion ladder</w:t>
+            </w:r>
+          </w:p>
+        </w:tc>
+        <w:tc>
+          <w:tcPr/>
+          <w:p>
+            <w:pPr>
+              <w:pStyle w:val="Compact"/>
+            </w:pPr>
+            <w:r>
+              <w:t xml:space="preserve">simulated</w:t>
+            </w:r>
+          </w:p>
+        </w:tc>
+        <w:tc>
+          <w:tcPr/>
+          <w:p>
+            <w:pPr>
+              <w:pStyle w:val="Compact"/>
+            </w:pPr>
+            <w:r>
+              <w:t xml:space="preserve">ANI 95/98; 0–32 inversions (2 breakpoints each)</w:t>
+            </w:r>
+          </w:p>
+        </w:tc>
+        <w:tc>
+          <w:tcPr/>
+          <w:p>
+            <w:pPr>
+              <w:pStyle w:val="Compact"/>
+            </w:pPr>
+            <w:r>
+              <w:t xml:space="preserve">exact</w:t>
+            </w:r>
+          </w:p>
+        </w:tc>
+        <w:tc>
+          <w:tcPr/>
+          <w:p>
+            <w:pPr>
+              <w:pStyle w:val="Compact"/>
+            </w:pPr>
+            <w:r>
+              <w:t xml:space="preserve">Fig. S1</w:t>
+            </w:r>
+          </w:p>
+        </w:tc>
+      </w:tr>
+      <w:tr>
+        <w:tc>
+          <w:tcPr/>
+          <w:p>
+            <w:pPr>
+              <w:pStyle w:val="Compact"/>
+            </w:pPr>
+            <w:r>
+              <w:t xml:space="preserve">8</w:t>
+            </w:r>
+          </w:p>
+        </w:tc>
+        <w:tc>
+          <w:tcPr/>
+          <w:p>
+            <w:pPr>
+              <w:pStyle w:val="Compact"/>
+            </w:pPr>
+            <w:r>
+              <w:t xml:space="preserve">GTDB-ANIm benchmark</w:t>
+            </w:r>
+          </w:p>
+        </w:tc>
+        <w:tc>
+          <w:tcPr/>
+          <w:p>
+            <w:pPr>
+              <w:pStyle w:val="Compact"/>
+            </w:pPr>
+            <w:r>
+              <w:t xml:space="preserve">real</w:t>
+            </w:r>
+          </w:p>
+        </w:tc>
+        <w:tc>
+          <w:tcPr/>
+          <w:p>
+            <w:pPr>
+              <w:pStyle w:val="Compact"/>
+            </w:pPr>
+            <w:r>
+              <w:t xml:space="preserve">2,074 GTDB-R207 pairs, 4 bands (475/837/690/72)</w:t>
+            </w:r>
+          </w:p>
+        </w:tc>
+        <w:tc>
+          <w:tcPr/>
+          <w:p>
+            <w:pPr>
+              <w:pStyle w:val="Compact"/>
+            </w:pPr>
+            <w:r>
+              <w:t xml:space="preserve">dnadiff ANIm</w:t>
+            </w:r>
+          </w:p>
+        </w:tc>
+        <w:tc>
+          <w:tcPr/>
+          <w:p>
+            <w:pPr>
+              <w:pStyle w:val="Compact"/>
+            </w:pPr>
+            <w:r>
+              <w:t xml:space="preserve">Fig. 3, Table 1</w:t>
+            </w:r>
+          </w:p>
+        </w:tc>
+      </w:tr>
+      <w:tr>
+        <w:tc>
+          <w:tcPr/>
+          <w:p>
+            <w:pPr>
+              <w:pStyle w:val="Compact"/>
+            </w:pPr>
+            <w:r>
+              <w:t xml:space="preserve">9</w:t>
+            </w:r>
+          </w:p>
+        </w:tc>
+        <w:tc>
+          <w:tcPr/>
+          <w:p>
+            <w:pPr>
+              <w:pStyle w:val="Compact"/>
+            </w:pPr>
+            <w:r>
+              <w:t xml:space="preserve">95–99.5% expansion</w:t>
+            </w:r>
+          </w:p>
+        </w:tc>
+        <w:tc>
+          <w:tcPr/>
+          <w:p>
+            <w:pPr>
+              <w:pStyle w:val="Compact"/>
+            </w:pPr>
+            <w:r>
+              <w:t xml:space="preserve">real</w:t>
+            </w:r>
+          </w:p>
+        </w:tc>
+        <w:tc>
+          <w:tcPr/>
+          <w:p>
+            <w:pPr>
+              <w:pStyle w:val="Compact"/>
+            </w:pPr>
+            <w:r>
+              <w:t xml:space="preserve">467 pairs; 607 species, 26 phyla</w:t>
+            </w:r>
+          </w:p>
+        </w:tc>
+        <w:tc>
+          <w:tcPr/>
+          <w:p>
+            <w:pPr>
+              <w:pStyle w:val="Compact"/>
+            </w:pPr>
+            <w:r>
+              <w:t xml:space="preserve">dnadiff ANIm</w:t>
+            </w:r>
+          </w:p>
+        </w:tc>
+        <w:tc>
+          <w:tcPr/>
+          <w:p>
+            <w:pPr>
+              <w:pStyle w:val="Compact"/>
+            </w:pPr>
+            <w:r>
+              <w:t xml:space="preserve">calibration training</w:t>
+            </w:r>
+          </w:p>
+        </w:tc>
+      </w:tr>
+      <w:tr>
+        <w:tc>
+          <w:tcPr/>
+          <w:p>
+            <w:pPr>
+              <w:pStyle w:val="Compact"/>
+            </w:pPr>
+            <w:r>
+              <w:t xml:space="preserve">10</w:t>
+            </w:r>
+          </w:p>
+        </w:tc>
+        <w:tc>
+          <w:tcPr/>
+          <w:p>
+            <w:pPr>
+              <w:pStyle w:val="Compact"/>
+            </w:pPr>
+            <w:r>
+              <w:t xml:space="preserve">GTDB scale set</w:t>
+            </w:r>
+          </w:p>
+        </w:tc>
+        <w:tc>
+          <w:tcPr/>
+          <w:p>
+            <w:pPr>
+              <w:pStyle w:val="Compact"/>
+            </w:pPr>
+            <w:r>
+              <w:t xml:space="preserve">real</w:t>
+            </w:r>
+          </w:p>
+        </w:tc>
+        <w:tc>
+          <w:tcPr/>
+          <w:p>
+            <w:pPr>
+              <w:pStyle w:val="Compact"/>
+            </w:pPr>
+            <w:r>
+              <w:t xml:space="preserve">45,000 pairs, taxonomic-level stratified</w:t>
+            </w:r>
+          </w:p>
+        </w:tc>
+        <w:tc>
+          <w:tcPr/>
+          <w:p>
+            <w:pPr>
+              <w:pStyle w:val="Compact"/>
+            </w:pPr>
+            <w:r>
+              <w:t xml:space="preserve">FastANI (672 pairs)</w:t>
+            </w:r>
+          </w:p>
+        </w:tc>
+        <w:tc>
+          <w:tcPr/>
+          <w:p>
+            <w:pPr>
+              <w:pStyle w:val="Compact"/>
+            </w:pPr>
+            <w:r>
+              <w:t xml:space="preserve">Fig. S3</w:t>
+            </w:r>
+          </w:p>
+        </w:tc>
+      </w:tr>
+      <w:tr>
+        <w:tc>
+          <w:tcPr/>
+          <w:p>
+            <w:pPr>
+              <w:pStyle w:val="Compact"/>
+            </w:pPr>
+            <w:r>
+              <w:t xml:space="preserve">11</w:t>
+            </w:r>
+          </w:p>
+        </w:tc>
+        <w:tc>
+          <w:tcPr/>
+          <w:p>
+            <w:pPr>
+              <w:pStyle w:val="Compact"/>
+            </w:pPr>
+            <w:r>
+              <w:t xml:space="preserve">Unified high-ANI set</w:t>
+            </w:r>
+          </w:p>
+        </w:tc>
+        <w:tc>
+          <w:tcPr/>
+          <w:p>
+            <w:pPr>
+              <w:pStyle w:val="Compact"/>
+            </w:pPr>
+            <w:r>
+              <w:t xml:space="preserve">real</w:t>
+            </w:r>
+          </w:p>
+        </w:tc>
+        <w:tc>
+          <w:tcPr/>
+          <w:p>
+            <w:pPr>
+              <w:pStyle w:val="Compact"/>
+            </w:pPr>
+            <w:r>
+              <w:t xml:space="preserve">2,342 GTDB-R207 pairs (95–97 / 97–100), genome-level train/test</w:t>
+            </w:r>
+          </w:p>
+        </w:tc>
+        <w:tc>
+          <w:tcPr/>
+          <w:p>
+            <w:pPr>
+              <w:pStyle w:val="Compact"/>
+            </w:pPr>
+            <w:r>
+              <w:t xml:space="preserve">dnadiff ANIm</w:t>
+            </w:r>
+          </w:p>
+        </w:tc>
+        <w:tc>
+          <w:tcPr/>
+          <w:p>
+            <w:pPr>
+              <w:pStyle w:val="Compact"/>
+            </w:pPr>
+            <w:r>
+              <w:t xml:space="preserve">Table 1, Fig. 4</w:t>
+            </w:r>
+          </w:p>
+        </w:tc>
+      </w:tr>
+      <w:tr>
+        <w:tc>
+          <w:tcPr/>
+          <w:p>
+            <w:pPr>
+              <w:pStyle w:val="Compact"/>
+            </w:pPr>
+            <w:r>
+              <w:t xml:space="preserve">12</w:t>
+            </w:r>
+          </w:p>
+        </w:tc>
+        <w:tc>
+          <w:tcPr/>
+          <w:p>
+            <w:pPr>
+              <w:pStyle w:val="Compact"/>
+            </w:pPr>
+            <w:r>
+              <w:t xml:space="preserve">Mid-ANI set</w:t>
+            </w:r>
+          </w:p>
+        </w:tc>
+        <w:tc>
+          <w:tcPr/>
+          <w:p>
+            <w:pPr>
+              <w:pStyle w:val="Compact"/>
+            </w:pPr>
+            <w:r>
+              <w:t xml:space="preserve">real</w:t>
+            </w:r>
+          </w:p>
+        </w:tc>
+        <w:tc>
+          <w:tcPr/>
+          <w:p>
+            <w:pPr>
+              <w:pStyle w:val="Compact"/>
+            </w:pPr>
+            <w:r>
+              <w:t xml:space="preserve">15 pairs, ANIm 87.6–90.2</w:t>
+            </w:r>
+          </w:p>
+        </w:tc>
+        <w:tc>
+          <w:tcPr/>
+          <w:p>
+            <w:pPr>
+              <w:pStyle w:val="Compact"/>
+            </w:pPr>
+            <w:r>
+              <w:t xml:space="preserve">dnadiff ANIm</w:t>
+            </w:r>
+          </w:p>
+        </w:tc>
+        <w:tc>
+          <w:tcPr/>
+          <w:p>
+            <w:pPr>
+              <w:pStyle w:val="Compact"/>
+            </w:pPr>
+            <w:r>
+              <w:t xml:space="preserve">Results</w:t>
+            </w:r>
+          </w:p>
+        </w:tc>
+      </w:tr>
+      <w:tr>
+        <w:tc>
+          <w:tcPr/>
+          <w:p>
+            <w:pPr>
+              <w:pStyle w:val="Compact"/>
+            </w:pPr>
+            <w:r>
+              <w:t xml:space="preserve">13</w:t>
+            </w:r>
+          </w:p>
+        </w:tc>
+        <w:tc>
+          <w:tcPr/>
+          <w:p>
+            <w:pPr>
+              <w:pStyle w:val="Compact"/>
+            </w:pPr>
+            <w:r>
+              <w:t xml:space="preserve">Oral/gut set</w:t>
+            </w:r>
+          </w:p>
+        </w:tc>
+        <w:tc>
+          <w:tcPr/>
+          <w:p>
+            <w:pPr>
+              <w:pStyle w:val="Compact"/>
+            </w:pPr>
+            <w:r>
+              <w:t xml:space="preserve">real</w:t>
+            </w:r>
+          </w:p>
+        </w:tc>
+        <w:tc>
+          <w:tcPr/>
+          <w:p>
+            <w:pPr>
+              <w:pStyle w:val="Compact"/>
+            </w:pPr>
+            <w:r>
+              <w:t xml:space="preserve">50 genomes, 10 species (5 oral + 5 gut); 1,225 pairs</w:t>
+            </w:r>
+          </w:p>
+        </w:tc>
+        <w:tc>
+          <w:tcPr/>
+          <w:p>
+            <w:pPr>
+              <w:pStyle w:val="Compact"/>
+            </w:pPr>
+            <w:r>
+              <w:t xml:space="preserve">FastANI/skani (100 same-species)</w:t>
+            </w:r>
+          </w:p>
+        </w:tc>
+        <w:tc>
+          <w:tcPr/>
+          <w:p>
+            <w:pPr>
+              <w:pStyle w:val="Compact"/>
+            </w:pPr>
+            <w:r>
+              <w:t xml:space="preserve">Results</w:t>
+            </w:r>
+          </w:p>
+        </w:tc>
+      </w:tr>
+      <w:tr>
+        <w:tc>
+          <w:tcPr/>
+          <w:p>
+            <w:pPr>
+              <w:pStyle w:val="Compact"/>
+            </w:pPr>
+            <w:r>
+              <w:t xml:space="preserve">14</w:t>
+            </w:r>
+          </w:p>
+        </w:tc>
+        <w:tc>
+          <w:tcPr/>
+          <w:p>
+            <w:pPr>
+              <w:pStyle w:val="Compact"/>
+            </w:pPr>
+            <w:r>
+              <w:t xml:space="preserve">Enterobacteriaceae completes</w:t>
+            </w:r>
+          </w:p>
+        </w:tc>
+        <w:tc>
+          <w:tcPr/>
+          <w:p>
+            <w:pPr>
+              <w:pStyle w:val="Compact"/>
+            </w:pPr>
+            <w:r>
+              <w:t xml:space="preserve">real</w:t>
+            </w:r>
+          </w:p>
+        </w:tc>
+        <w:tc>
+          <w:tcPr/>
+          <w:p>
+            <w:pPr>
+              <w:pStyle w:val="Compact"/>
+            </w:pPr>
+            <w:r>
+              <w:t xml:space="preserve">13 chromosomes vs MG1655, ANI ~81–99.99</w:t>
+            </w:r>
+          </w:p>
+        </w:tc>
+        <w:tc>
+          <w:tcPr/>
+          <w:p>
+            <w:pPr>
+              <w:pStyle w:val="Compact"/>
+            </w:pPr>
+            <w:r>
+              <w:t xml:space="preserve">dnadiff structural</w:t>
+            </w:r>
+          </w:p>
+        </w:tc>
+        <w:tc>
+          <w:tcPr/>
+          <w:p>
+            <w:pPr>
+              <w:pStyle w:val="Compact"/>
+            </w:pPr>
+            <w:r>
+              <w:t xml:space="preserve">Fig. 1</w:t>
+            </w:r>
+          </w:p>
+        </w:tc>
+      </w:tr>
+      <w:tr>
+        <w:tc>
+          <w:tcPr/>
+          <w:p>
+            <w:pPr>
+              <w:pStyle w:val="Compact"/>
+            </w:pPr>
+            <w:r>
+              <w:t xml:space="preserve">15</w:t>
+            </w:r>
+          </w:p>
+        </w:tc>
+        <w:tc>
+          <w:tcPr/>
+          <w:p>
+            <w:pPr>
+              <w:pStyle w:val="Compact"/>
+            </w:pPr>
+            <w:r>
+              <w:t xml:space="preserve">Real drafts</w:t>
+            </w:r>
+          </w:p>
+        </w:tc>
+        <w:tc>
+          <w:tcPr/>
+          <w:p>
+            <w:pPr>
+              <w:pStyle w:val="Compact"/>
+            </w:pPr>
+            <w:r>
+              <w:t xml:space="preserve">real</w:t>
+            </w:r>
+          </w:p>
+        </w:tc>
+        <w:tc>
+          <w:tcPr/>
+          <w:p>
+            <w:pPr>
+              <w:pStyle w:val="Compact"/>
+            </w:pPr>
+            <w:r>
+              <w:t xml:space="preserve">8 E. coli assemblies, 88–8,025 contigs; RC controls</w:t>
+            </w:r>
+          </w:p>
+        </w:tc>
+        <w:tc>
+          <w:tcPr/>
+          <w:p>
+            <w:pPr>
+              <w:pStyle w:val="Compact"/>
+            </w:pPr>
+            <w:r>
+              <w:t xml:space="preserve">complete-genome reference</w:t>
+            </w:r>
+          </w:p>
+        </w:tc>
+        <w:tc>
+          <w:tcPr/>
+          <w:p>
+            <w:pPr>
+              <w:pStyle w:val="Compact"/>
+            </w:pPr>
+            <w:r>
+              <w:t xml:space="preserve">Fig. 2, Fig. 5</w:t>
+            </w:r>
+          </w:p>
+        </w:tc>
+      </w:tr>
+      <w:tr>
+        <w:tc>
+          <w:tcPr/>
+          <w:p>
+            <w:pPr>
+              <w:pStyle w:val="Compact"/>
+            </w:pPr>
+            <w:r>
+              <w:t xml:space="preserve">16</w:t>
+            </w:r>
+          </w:p>
+        </w:tc>
+        <w:tc>
+          <w:tcPr/>
+          <w:p>
+            <w:pPr>
+              <w:pStyle w:val="Compact"/>
+            </w:pPr>
+            <w:r>
+              <w:t xml:space="preserve">CAMI2 MAG benchmark</w:t>
+            </w:r>
+          </w:p>
+        </w:tc>
+        <w:tc>
+          <w:tcPr/>
+          <w:p>
+            <w:pPr>
+              <w:pStyle w:val="Compact"/>
+            </w:pPr>
+            <w:r>
+              <w:t xml:space="preserve">real metagenomes</w:t>
+            </w:r>
+          </w:p>
+        </w:tc>
+        <w:tc>
+          <w:tcPr/>
+          <w:p>
+            <w:pPr>
+              <w:pStyle w:val="Compact"/>
+            </w:pPr>
+            <w:r>
+              <w:t xml:space="preserve">35 samples → 695 bins ≥ 100 kbp</w:t>
+            </w:r>
+          </w:p>
+        </w:tc>
+        <w:tc>
+          <w:tcPr/>
+          <w:p>
+            <w:pPr>
+              <w:pStyle w:val="Compact"/>
+            </w:pPr>
+            <w:r>
+              <w:t xml:space="preserve">dnadiff ANIm + CAMI2 assignment</w:t>
+            </w:r>
+          </w:p>
+        </w:tc>
+        <w:tc>
+          <w:tcPr/>
+          <w:p>
+            <w:pPr>
+              <w:pStyle w:val="Compact"/>
+            </w:pPr>
+            <w:r>
+              <w:t xml:space="preserve">Fig. 5</w:t>
+            </w:r>
+          </w:p>
+        </w:tc>
+      </w:tr>
+      <w:tr>
+        <w:tc>
+          <w:tcPr/>
+          <w:p>
+            <w:pPr>
+              <w:pStyle w:val="Compact"/>
+            </w:pPr>
+            <w:r>
+              <w:t xml:space="preserve">17</w:t>
+            </w:r>
+          </w:p>
+        </w:tc>
+        <w:tc>
+          <w:tcPr/>
+          <w:p>
+            <w:pPr>
+              <w:pStyle w:val="Compact"/>
+            </w:pPr>
+            <w:r>
+              <w:t xml:space="preserve">GTDB 50k held-out benchmark</w:t>
+            </w:r>
+          </w:p>
+        </w:tc>
+        <w:tc>
+          <w:tcPr/>
+          <w:p>
+            <w:pPr>
+              <w:pStyle w:val="Compact"/>
+            </w:pPr>
+            <w:r>
+              <w:t xml:space="preserve">real</w:t>
+            </w:r>
+          </w:p>
+        </w:tc>
+        <w:tc>
+          <w:tcPr/>
+          <w:p>
+            <w:pPr>
+              <w:pStyle w:val="Compact"/>
+            </w:pPr>
+            <w:r>
+              <w:t xml:space="preserve">43,334 same-genus pairs, 24,831 genomes, 74 phyla; training genomes excluded</w:t>
+            </w:r>
+          </w:p>
+        </w:tc>
+        <w:tc>
+          <w:tcPr/>
+          <w:p>
+            <w:pPr>
+              <w:pStyle w:val="Compact"/>
+            </w:pPr>
+            <w:r>
+              <w:t xml:space="preserve">dnadiff ANIm</w:t>
+            </w:r>
+          </w:p>
+        </w:tc>
+        <w:tc>
+          <w:tcPr/>
+          <w:p>
+            <w:pPr>
+              <w:pStyle w:val="Compact"/>
+            </w:pPr>
+            <w:r>
+              <w:t xml:space="preserve">Fig. 3, Table 1</w:t>
+            </w:r>
+          </w:p>
+        </w:tc>
+      </w:tr>
+    </w:tbl>
+    <w:bookmarkEnd w:id="42"/>
+    <w:bookmarkEnd w:id="43"/>
     <w:sectPr>
       <w:footnotePr>
         <w:numRestart w:val="eachSect"/>

</xml_diff>

<commit_message>
manuscript: add minimap2 SV validation results from GTDB 50k benchmark
</commit_message>
<xml_diff>
--- a/paper/manuscript/manuscript_nature_methods.docx
+++ b/paper/manuscript/manuscript_nature_methods.docx
@@ -912,7 +912,22 @@
         <w:t xml:space="preserve"> </w:t>
       </w:r>
       <w:r>
-        <w:t xml:space="preserve">shows similar agreement (Spearman r = 0.61–0.62). By contrast,</w:t>
+        <w:t xml:space="preserve">shows similar agreement (Spearman r = 0.61–0.62). An independent minimap2 truth set (standard PAF without CIGAR) gives a moderate positive correlation with</w:t>
+      </w:r>
+      <w:r>
+        <w:t xml:space="preserve"> </w:t>
+      </w:r>
+      <w:r>
+        <w:rPr>
+          <w:rStyle w:val="VerbatimChar"/>
+        </w:rPr>
+        <w:t xml:space="preserve">breakpoint_count</w:t>
+      </w:r>
+      <w:r>
+        <w:t xml:space="preserve"> </w:t>
+      </w:r>
+      <w:r>
+        <w:t xml:space="preserve">(Spearman r = 0.36), consistent with the two aligners resolving rearrangements at different granularities. By contrast,</w:t>
       </w:r>
       <w:r>
         <w:t xml:space="preserve"> </w:t>
@@ -927,7 +942,7 @@
         <w:t xml:space="preserve"> </w:t>
       </w:r>
       <w:r>
-        <w:t xml:space="preserve">is essentially uncorrelated with rearrangement count (Spearman r ≈ −0.27), confirming that it reports chain coverage rather than rearrangements. On an engineered</w:t>
+        <w:t xml:space="preserve">is essentially uncorrelated with rearrangement count (Spearman r ≈ −0.27 with dnadiff and −0.01 with minimap2), confirming that it reports chain coverage rather than rearrangements. On an engineered</w:t>
       </w:r>
       <w:r>
         <w:t xml:space="preserve"> </w:t>

</xml_diff>

<commit_message>
clarify synteny_score as anchor-adjacency metric; af_query is base-pair coverage; update SV report
</commit_message>
<xml_diff>
--- a/paper/manuscript/manuscript_nature_methods.docx
+++ b/paper/manuscript/manuscript_nature_methods.docx
@@ -210,7 +210,7 @@
         <w:t xml:space="preserve">inside chains only</w:t>
       </w:r>
       <w:r>
-        <w:t xml:space="preserve">. Restricting the likelihood to chained regions separates divergence of the shared genome (ANI) from the fraction shared (aligned fraction). Because anchors carry coordinates, the same pass yields synteny scores and structural-variant calls at no extra cost.</w:t>
+        <w:t xml:space="preserve">. Restricting the likelihood to chained regions separates divergence of the shared genome (ANI) from the fraction shared (aligned fraction). Because anchors carry coordinates, the same pass yields aligned fraction, an anchor-adjacency conservation score, breakpoint counts, and structural-variant calls at no extra cost.</w:t>
       </w:r>
     </w:p>
     <w:p>
@@ -729,7 +729,7 @@
         <w:pStyle w:val="FirstParagraph"/>
       </w:pPr>
       <w:r>
-        <w:t xml:space="preserve">ANI is a scalar average and therefore blind to genome architecture. Syn2bANI reports two structurally informative quantities from the same anchor chains:</w:t>
+        <w:t xml:space="preserve">ANI is a scalar average and therefore blind to genome architecture. Syn2bANI reports three structurally informative quantities from the same anchor chains:</w:t>
       </w:r>
       <w:r>
         <w:t xml:space="preserve"> </w:t>
@@ -741,7 +741,7 @@
         <w:t xml:space="preserve">breakpoint_count</w:t>
       </w:r>
       <w:r>
-        <w:t xml:space="preserve">, the number of chain-disrupting orientation flips and large indels, and</w:t>
+        <w:t xml:space="preserve">, the number of chain-disrupting orientation flips and large indels;</w:t>
       </w:r>
       <w:r>
         <w:t xml:space="preserve"> </w:t>
@@ -753,7 +753,79 @@
         <w:t xml:space="preserve">synteny_score</w:t>
       </w:r>
       <w:r>
-        <w:t xml:space="preserve">, the fraction of the query covered by collinear chains (a coverage-like metric, not a rearrangement count).</w:t>
+        <w:t xml:space="preserve">, the fraction of chained-anchor adjacencies that remain collinear; and</w:t>
+      </w:r>
+      <w:r>
+        <w:t xml:space="preserve"> </w:t>
+      </w:r>
+      <w:r>
+        <w:rPr>
+          <w:rStyle w:val="VerbatimChar"/>
+        </w:rPr>
+        <w:t xml:space="preserve">af_query</w:t>
+      </w:r>
+      <w:r>
+        <w:t xml:space="preserve">, the base-pair fraction of the query covered by chains.</w:t>
+      </w:r>
+      <w:r>
+        <w:t xml:space="preserve"> </w:t>
+      </w:r>
+      <w:r>
+        <w:rPr>
+          <w:rStyle w:val="VerbatimChar"/>
+        </w:rPr>
+        <w:t xml:space="preserve">breakpoint_count</w:t>
+      </w:r>
+      <w:r>
+        <w:t xml:space="preserve"> </w:t>
+      </w:r>
+      <w:r>
+        <w:t xml:space="preserve">and</w:t>
+      </w:r>
+      <w:r>
+        <w:t xml:space="preserve"> </w:t>
+      </w:r>
+      <w:r>
+        <w:rPr>
+          <w:rStyle w:val="VerbatimChar"/>
+        </w:rPr>
+        <w:t xml:space="preserve">synteny_blocks</w:t>
+      </w:r>
+      <w:r>
+        <w:t xml:space="preserve"> </w:t>
+      </w:r>
+      <w:r>
+        <w:t xml:space="preserve">are rearrangement statistics;</w:t>
+      </w:r>
+      <w:r>
+        <w:t xml:space="preserve"> </w:t>
+      </w:r>
+      <w:r>
+        <w:rPr>
+          <w:rStyle w:val="VerbatimChar"/>
+        </w:rPr>
+        <w:t xml:space="preserve">synteny_score</w:t>
+      </w:r>
+      <w:r>
+        <w:t xml:space="preserve"> </w:t>
+      </w:r>
+      <w:r>
+        <w:t xml:space="preserve">is an anchor-adjacency conservation metric;</w:t>
+      </w:r>
+      <w:r>
+        <w:t xml:space="preserve"> </w:t>
+      </w:r>
+      <w:r>
+        <w:rPr>
+          <w:rStyle w:val="VerbatimChar"/>
+        </w:rPr>
+        <w:t xml:space="preserve">af_query</w:t>
+      </w:r>
+      <w:r>
+        <w:t xml:space="preserve"> </w:t>
+      </w:r>
+      <w:r>
+        <w:t xml:space="preserve">is the coverage metric that corresponds to alignment-based aligned fraction.</w:t>
       </w:r>
     </w:p>
     <w:p>
@@ -927,7 +999,22 @@
         <w:t xml:space="preserve"> </w:t>
       </w:r>
       <w:r>
-        <w:t xml:space="preserve">(Spearman r = 0.36), consistent with the two aligners resolving rearrangements at different granularities. By contrast,</w:t>
+        <w:t xml:space="preserve">(Spearman r = 0.36), consistent with the two aligners resolving rearrangements at different granularities. The base-pair coverage metric</w:t>
+      </w:r>
+      <w:r>
+        <w:t xml:space="preserve"> </w:t>
+      </w:r>
+      <w:r>
+        <w:rPr>
+          <w:rStyle w:val="VerbatimChar"/>
+        </w:rPr>
+        <w:t xml:space="preserve">af_query</w:t>
+      </w:r>
+      <w:r>
+        <w:t xml:space="preserve"> </w:t>
+      </w:r>
+      <w:r>
+        <w:t xml:space="preserve">correlates with dnadiff and minimap2 synteny scores (Spearman r = 0.39 and 0.26), confirming that it is the output that aligns with alignment-based aligned fraction. By contrast, the anchor-adjacency metric</w:t>
       </w:r>
       <w:r>
         <w:t xml:space="preserve"> </w:t>
@@ -942,7 +1029,7 @@
         <w:t xml:space="preserve"> </w:t>
       </w:r>
       <w:r>
-        <w:t xml:space="preserve">is essentially uncorrelated with rearrangement count (Spearman r ≈ −0.27 with dnadiff and −0.01 with minimap2), confirming that it reports chain coverage rather than rearrangements. On an engineered</w:t>
+        <w:t xml:space="preserve">is uncorrelated with rearrangement count (Spearman r ≈ −0.27 with dnadiff and −0.01 with minimap2) and only weakly correlated with base-pair synteny scores (Spearman r = 0.33 and −0.01). On an engineered</w:t>
       </w:r>
       <w:r>
         <w:t xml:space="preserve"> </w:t>
@@ -1881,7 +1968,7 @@
         <w:t xml:space="preserve"> </w:t>
       </w:r>
       <w:r>
-        <w:t xml:space="preserve">is the fraction of the query genome covered by collinear chains (equivalently, 1 minus the fraction outside chains); it behaves as a coverage/completeness metric and is largely insensitive to the number of rearrangements within the chained fraction.</w:t>
+        <w:t xml:space="preserve">is the fraction of possible adjacent anchor pairs (within chained query contigs) that remain collinear neighbors inside a chain; it is an anchor-adjacency conservation metric, not a base-pair coverage metric.</w:t>
       </w:r>
       <w:r>
         <w:t xml:space="preserve"> </w:t>
@@ -1896,7 +1983,7 @@
         <w:t xml:space="preserve"> </w:t>
       </w:r>
       <w:r>
-        <w:t xml:space="preserve">and</w:t>
+        <w:t xml:space="preserve">is the fraction of query bases covered by chained anchors (base-pair aligned fraction) and is the quantity that corresponds to alignment-based synteny/coverage scores.</w:t>
       </w:r>
       <w:r>
         <w:t xml:space="preserve"> </w:t>
@@ -1911,7 +1998,7 @@
         <w:t xml:space="preserve"> </w:t>
       </w:r>
       <w:r>
-        <w:t xml:space="preserve">report the aligned fraction in base pairs from the same interpolation.</w:t>
+        <w:t xml:space="preserve">is the reference-side analogue.</w:t>
       </w:r>
     </w:p>
     <w:bookmarkEnd w:id="31"/>

</xml_diff>

<commit_message>
Methods: explain anchor_adjacency computation and its weak correlation with alignment-based synteny
</commit_message>
<xml_diff>
--- a/paper/manuscript/manuscript_nature_methods.docx
+++ b/paper/manuscript/manuscript_nature_methods.docx
@@ -1999,6 +1999,134 @@
       </w:r>
       <w:r>
         <w:t xml:space="preserve">is the reference-side analogue.</w:t>
+      </w:r>
+    </w:p>
+    <w:p>
+      <w:pPr>
+        <w:pStyle w:val="BodyText"/>
+      </w:pPr>
+      <w:r>
+        <w:t xml:space="preserve">The reason</w:t>
+      </w:r>
+      <w:r>
+        <w:t xml:space="preserve"> </w:t>
+      </w:r>
+      <w:r>
+        <w:rPr>
+          <w:rStyle w:val="VerbatimChar"/>
+        </w:rPr>
+        <w:t xml:space="preserve">anchor_adjacency</w:t>
+      </w:r>
+      <w:r>
+        <w:t xml:space="preserve"> </w:t>
+      </w:r>
+      <w:r>
+        <w:t xml:space="preserve">is only weakly correlated with alignment-based synteny scores is that the two quantities measure structurally different things.</w:t>
+      </w:r>
+      <w:r>
+        <w:t xml:space="preserve"> </w:t>
+      </w:r>
+      <w:r>
+        <w:rPr>
+          <w:rStyle w:val="VerbatimChar"/>
+        </w:rPr>
+        <w:t xml:space="preserve">anchor_adjacency</w:t>
+      </w:r>
+      <w:r>
+        <w:t xml:space="preserve"> </w:t>
+      </w:r>
+      <w:r>
+        <w:t xml:space="preserve">is a combinatorial count over the fixed, sparse set of in-silico restriction anchors: a value of 1.0 means every pair of anchors that are neighbors on a query contig are also neighbors inside a collinear chain, and lower values record how often local anchor order is interrupted by inversions, indels, or translocations. Because the anchors are spaced at kilobase-scale intervals across the genome, a single large rearrangement that happens to fall between two adjacent anchors leaves</w:t>
+      </w:r>
+      <w:r>
+        <w:t xml:space="preserve"> </w:t>
+      </w:r>
+      <w:r>
+        <w:rPr>
+          <w:rStyle w:val="VerbatimChar"/>
+        </w:rPr>
+        <w:t xml:space="preserve">anchor_adjacency</w:t>
+      </w:r>
+      <w:r>
+        <w:t xml:space="preserve"> </w:t>
+      </w:r>
+      <w:r>
+        <w:t xml:space="preserve">unchanged, while a small inversion that reorders only a few anchors can reduce it sharply even when the majority of base pairs are still alignable. Conversely,</w:t>
+      </w:r>
+      <w:r>
+        <w:t xml:space="preserve"> </w:t>
+      </w:r>
+      <w:r>
+        <w:rPr>
+          <w:rStyle w:val="VerbatimChar"/>
+        </w:rPr>
+        <w:t xml:space="preserve">af_query</w:t>
+      </w:r>
+      <w:r>
+        <w:t xml:space="preserve"> </w:t>
+      </w:r>
+      <w:r>
+        <w:t xml:space="preserve">and</w:t>
+      </w:r>
+      <w:r>
+        <w:t xml:space="preserve"> </w:t>
+      </w:r>
+      <w:r>
+        <w:rPr>
+          <w:rStyle w:val="VerbatimChar"/>
+        </w:rPr>
+        <w:t xml:space="preserve">breakpoint_count</w:t>
+      </w:r>
+      <w:r>
+        <w:t xml:space="preserve"> </w:t>
+      </w:r>
+      <w:r>
+        <w:t xml:space="preserve">report base-pair coverage and rearrangement counts, respectively, so</w:t>
+      </w:r>
+      <w:r>
+        <w:t xml:space="preserve"> </w:t>
+      </w:r>
+      <w:r>
+        <w:rPr>
+          <w:rStyle w:val="VerbatimChar"/>
+        </w:rPr>
+        <w:t xml:space="preserve">af_query</w:t>
+      </w:r>
+      <w:r>
+        <w:t xml:space="preserve"> </w:t>
+      </w:r>
+      <w:r>
+        <w:t xml:space="preserve">aligns with dnadiff/minimap2 coverage metrics and</w:t>
+      </w:r>
+      <w:r>
+        <w:t xml:space="preserve"> </w:t>
+      </w:r>
+      <w:r>
+        <w:rPr>
+          <w:rStyle w:val="VerbatimChar"/>
+        </w:rPr>
+        <w:t xml:space="preserve">breakpoint_count</w:t>
+      </w:r>
+      <w:r>
+        <w:t xml:space="preserve"> </w:t>
+      </w:r>
+      <w:r>
+        <w:t xml:space="preserve">aligns with alignment-based breakpoint counts. Treating</w:t>
+      </w:r>
+      <w:r>
+        <w:t xml:space="preserve"> </w:t>
+      </w:r>
+      <w:r>
+        <w:rPr>
+          <w:rStyle w:val="VerbatimChar"/>
+        </w:rPr>
+        <w:t xml:space="preserve">anchor_adjacency</w:t>
+      </w:r>
+      <w:r>
+        <w:t xml:space="preserve"> </w:t>
+      </w:r>
+      <w:r>
+        <w:t xml:space="preserve">as a separate anchor-order statistic rather than as a proxy for base-pair synteny is therefore deliberate: it captures the fine-scale collinearity of the anchor map, which is invisible to an ANI scalar and only partially correlated with alignment-based coverage.</w:t>
       </w:r>
     </w:p>
     <w:bookmarkEnd w:id="31"/>

</xml_diff>

<commit_message>
Add diagnostic af_query vs anchor_adjacency plot and manuscript discussion of failure modes
</commit_message>
<xml_diff>
--- a/paper/manuscript/manuscript_nature_methods.docx
+++ b/paper/manuscript/manuscript_nature_methods.docx
@@ -1029,7 +1029,52 @@
         <w:t xml:space="preserve"> </w:t>
       </w:r>
       <w:r>
-        <w:t xml:space="preserve">is uncorrelated with rearrangement count (Spearman r ≈ −0.27 with dnadiff and −0.01 with minimap2) and only weakly correlated with base-pair synteny/coverage scores (Spearman r = 0.33 and −0.01). On an engineered</w:t>
+        <w:t xml:space="preserve">is uncorrelated with rearrangement count (Spearman r ≈ −0.27 with dnadiff and −0.01 with minimap2) and only weakly correlated with base-pair synteny/coverage scores (Spearman r = 0.33 and −0.01). The two Syn2bANI metrics are themselves only weakly correlated (Pearson r = 0.29), and a diagnostic plot of the held-out benchmark reveals four interpretable quadrants (Supplementary Fig. S13): 6,764 pairs have high</w:t>
+      </w:r>
+      <w:r>
+        <w:t xml:space="preserve"> </w:t>
+      </w:r>
+      <w:r>
+        <w:rPr>
+          <w:rStyle w:val="VerbatimChar"/>
+        </w:rPr>
+        <w:t xml:space="preserve">anchor_adjacency</w:t>
+      </w:r>
+      <w:r>
+        <w:t xml:space="preserve"> </w:t>
+      </w:r>
+      <w:r>
+        <w:t xml:space="preserve">(&gt;0.99) but low alignment-based synteny (&lt;0.5), because the few anchors that remain chained happen to be collinear while most of the genome is unchained; 2,242 pairs have high</w:t>
+      </w:r>
+      <w:r>
+        <w:t xml:space="preserve"> </w:t>
+      </w:r>
+      <w:r>
+        <w:rPr>
+          <w:rStyle w:val="VerbatimChar"/>
+        </w:rPr>
+        <w:t xml:space="preserve">af_query</w:t>
+      </w:r>
+      <w:r>
+        <w:t xml:space="preserve"> </w:t>
+      </w:r>
+      <w:r>
+        <w:t xml:space="preserve">(&gt;0.8) but low alignment-based synteny, the signature of extensive rearrangement inside an otherwise alignable genome; 2,281 pairs have low coverage but locally collinear anchors; and 470 pairs show the opposite mismatch. These deviations explain why</w:t>
+      </w:r>
+      <w:r>
+        <w:t xml:space="preserve"> </w:t>
+      </w:r>
+      <w:r>
+        <w:rPr>
+          <w:rStyle w:val="VerbatimChar"/>
+        </w:rPr>
+        <w:t xml:space="preserve">anchor_adjacency</w:t>
+      </w:r>
+      <w:r>
+        <w:t xml:space="preserve"> </w:t>
+      </w:r>
+      <w:r>
+        <w:t xml:space="preserve">should not be read as a proxy for base-pair synteny, and why the two metrics are reported separately. On an engineered</w:t>
       </w:r>
       <w:r>
         <w:t xml:space="preserve"> </w:t>

</xml_diff>

<commit_message>
manuscript(nature_methods): update SV validation, add H. pylori cagPAI cohort and E. coli/S. aureus case studies
</commit_message>
<xml_diff>
--- a/paper/manuscript/manuscript_nature_methods.docx
+++ b/paper/manuscript/manuscript_nature_methods.docx
@@ -2,7 +2,7 @@
 <file path=word/document.xml><?xml version="1.0" encoding="utf-8"?>
 <w:document xmlns:w="http://schemas.openxmlformats.org/wordprocessingml/2006/main" xmlns:m="http://schemas.openxmlformats.org/officeDocument/2006/math" xmlns:r="http://schemas.openxmlformats.org/officeDocument/2006/relationships" xmlns:o="urn:schemas-microsoft-com:office:office" xmlns:v="urn:schemas-microsoft-com:vml" xmlns:w10="urn:schemas-microsoft-com:office:word" xmlns:a="http://schemas.openxmlformats.org/drawingml/2006/main" xmlns:pic="http://schemas.openxmlformats.org/drawingml/2006/picture" xmlns:wp="http://schemas.openxmlformats.org/drawingml/2006/wordprocessingDrawing">
   <w:body>
-    <w:bookmarkStart w:id="45" w:name="Xe400126ade8f1e4d28af479649ace7c1902f082"/>
+    <w:bookmarkStart w:id="46" w:name="Xe400126ade8f1e4d28af479649ace7c1902f082"/>
     <w:p>
       <w:pPr>
         <w:pStyle w:val="Heading1"/>
@@ -229,7 +229,7 @@
       </w:r>
     </w:p>
     <w:bookmarkEnd w:id="11"/>
-    <w:bookmarkStart w:id="22" w:name="results"/>
+    <w:bookmarkStart w:id="23" w:name="results"/>
     <w:p>
       <w:pPr>
         <w:pStyle w:val="Heading2"/>
@@ -780,22 +780,7 @@
         <w:t xml:space="preserve"> </w:t>
       </w:r>
       <w:r>
-        <w:t xml:space="preserve">and</w:t>
-      </w:r>
-      <w:r>
-        <w:t xml:space="preserve"> </w:t>
-      </w:r>
-      <w:r>
-        <w:rPr>
-          <w:rStyle w:val="VerbatimChar"/>
-        </w:rPr>
-        <w:t xml:space="preserve">synteny_blocks</w:t>
-      </w:r>
-      <w:r>
-        <w:t xml:space="preserve"> </w:t>
-      </w:r>
-      <w:r>
-        <w:t xml:space="preserve">are rearrangement statistics;</w:t>
+        <w:t xml:space="preserve">is the primary rearrangement statistic;</w:t>
       </w:r>
       <w:r>
         <w:t xml:space="preserve"> </w:t>
@@ -936,6 +921,46 @@
         <w:pStyle w:val="BodyText"/>
       </w:pPr>
       <w:r>
+        <w:t xml:space="preserve">Two additional isolate collections reinforce the point at even higher ANI. In 74</w:t>
+      </w:r>
+      <w:r>
+        <w:t xml:space="preserve"> </w:t>
+      </w:r>
+      <w:r>
+        <w:rPr>
+          <w:i/>
+          <w:iCs/>
+        </w:rPr>
+        <w:t xml:space="preserve">E. coli</w:t>
+      </w:r>
+      <w:r>
+        <w:t xml:space="preserve"> </w:t>
+      </w:r>
+      <w:r>
+        <w:t xml:space="preserve">O157:H7 genomes from a global source surveillance study (Fitzgerald et al., 2021), all 2,701 pairwise ANIs are ≥99.886%, yet every pair carries ≥171 breakpoints and the most structurally divergent pairs exceed 1,100 breakpoints at ANI &gt;99.9% (Supplementary Fig. S15). The human-source isolates carry fewer breakpoints on average than bovine isolates (mean 410 vs 494), suggesting that host-restricted sub-lineages differ in recombination history even when ANI cannot separate them. In 122 FDA-ARGOS</w:t>
+      </w:r>
+      <w:r>
+        <w:t xml:space="preserve"> </w:t>
+      </w:r>
+      <w:r>
+        <w:rPr>
+          <w:i/>
+          <w:iCs/>
+        </w:rPr>
+        <w:t xml:space="preserve">Staphylococcus aureus</w:t>
+      </w:r>
+      <w:r>
+        <w:t xml:space="preserve"> </w:t>
+      </w:r>
+      <w:r>
+        <w:t xml:space="preserve">genomes, 7,381 refined pairs have mean ANI 98.72% and mean breakpoint count 24, with pairs at 100% ANI still showing &gt;150 breakpoints (Supplementary Fig. S16). These collections are not exceptional: they exemplify why an ANI-only similarity search can return genomes that are nearly identical in average sequence but differ by hundreds of rearrangements.</w:t>
+      </w:r>
+    </w:p>
+    <w:p>
+      <w:pPr>
+        <w:pStyle w:val="BodyText"/>
+      </w:pPr>
+      <w:r>
         <w:t xml:space="preserve">The same pattern appears at database scale. Among 336 GTDB-R207 representative pairs with ANI ≥ 99.0% and aligned fraction ≥ 0.9 in both directions, 7.4% have an anchor adjacency &lt; 0.99 and 2.4% fall below 0.98 — i.e. pairs an ANI-only search would return as near-clonal yet which are structurally divergent.</w:t>
       </w:r>
     </w:p>
@@ -954,7 +979,7 @@
         <w:pStyle w:val="FirstParagraph"/>
       </w:pPr>
       <w:r>
-        <w:t xml:space="preserve">To test whether the breakpoint and coverage metrics are reliable, we compared them with alignment-based truth on the GTDB-R207 held-out benchmark (43,334 pairs). Syn2bANI</w:t>
+        <w:t xml:space="preserve">To test whether the breakpoint and coverage metrics are reliable, we compared them with alignment-based truth on the GTDB-R207 held-out benchmark (43,334 pairs). After controlling for assembly contig count and ANIm divergence, Syn2bANI</w:t>
       </w:r>
       <w:r>
         <w:t xml:space="preserve"> </w:t>
@@ -969,7 +994,52 @@
         <w:t xml:space="preserve"> </w:t>
       </w:r>
       <w:r>
-        <w:t xml:space="preserve">correlates with dnadiff breakpoints (Spearman r = 0.54–0.56) and with dnadiff large indels after a 10 kb gap filter (Spearman r = 0.70);</w:t>
+        <w:t xml:space="preserve">shows a partial correlation of r = 0.414 with dnadiff breakpoints and r = 0.453 with dnadiff large indels (&gt;10 kb). The signal strengthens in the strain-level range: among pairs with ANIm ≥ 95%,</w:t>
+      </w:r>
+      <w:r>
+        <w:t xml:space="preserve"> </w:t>
+      </w:r>
+      <w:r>
+        <w:rPr>
+          <w:rStyle w:val="VerbatimChar"/>
+        </w:rPr>
+        <w:t xml:space="preserve">breakpoint_count</w:t>
+      </w:r>
+      <w:r>
+        <w:t xml:space="preserve"> </w:t>
+      </w:r>
+      <w:r>
+        <w:t xml:space="preserve">correlates with dnadiff large indels at Spearman ρ = 0.674. The base-pair coverage metric</w:t>
+      </w:r>
+      <w:r>
+        <w:t xml:space="preserve"> </w:t>
+      </w:r>
+      <w:r>
+        <w:rPr>
+          <w:rStyle w:val="VerbatimChar"/>
+        </w:rPr>
+        <w:t xml:space="preserve">af_query</w:t>
+      </w:r>
+      <w:r>
+        <w:t xml:space="preserve"> </w:t>
+      </w:r>
+      <w:r>
+        <w:t xml:space="preserve">correlates with dnadiff and minimap2 coverage scores (Spearman r = 0.39 and 0.26), confirming that it is the output that aligns with alignment-based aligned fraction. By contrast, the anchor-adjacency metric</w:t>
+      </w:r>
+      <w:r>
+        <w:t xml:space="preserve"> </w:t>
+      </w:r>
+      <w:r>
+        <w:rPr>
+          <w:rStyle w:val="VerbatimChar"/>
+        </w:rPr>
+        <w:t xml:space="preserve">anchor_adjacency</w:t>
+      </w:r>
+      <w:r>
+        <w:t xml:space="preserve"> </w:t>
+      </w:r>
+      <w:r>
+        <w:t xml:space="preserve">is uncorrelated with rearrangement count and only weakly correlated with base-pair synteny/coverage scores; it should be read as a separate anchor-order statistic, not as a proxy for base-pair synteny.</w:t>
       </w:r>
       <w:r>
         <w:t xml:space="preserve"> </w:t>
@@ -984,97 +1054,35 @@
         <w:t xml:space="preserve"> </w:t>
       </w:r>
       <w:r>
-        <w:t xml:space="preserve">shows similar agreement (Spearman r = 0.61–0.62). An independent minimap2 truth set (standard PAF without CIGAR) gives a moderate positive correlation with</w:t>
-      </w:r>
-      <w:r>
-        <w:t xml:space="preserve"> </w:t>
-      </w:r>
-      <w:r>
-        <w:rPr>
-          <w:rStyle w:val="VerbatimChar"/>
-        </w:rPr>
-        <w:t xml:space="preserve">breakpoint_count</w:t>
-      </w:r>
-      <w:r>
-        <w:t xml:space="preserve"> </w:t>
-      </w:r>
-      <w:r>
-        <w:t xml:space="preserve">(Spearman r = 0.36), consistent with the two aligners resolving rearrangements at different granularities. The base-pair coverage metric</w:t>
-      </w:r>
-      <w:r>
-        <w:t xml:space="preserve"> </w:t>
-      </w:r>
-      <w:r>
-        <w:rPr>
-          <w:rStyle w:val="VerbatimChar"/>
-        </w:rPr>
-        <w:t xml:space="preserve">af_query</w:t>
-      </w:r>
-      <w:r>
-        <w:t xml:space="preserve"> </w:t>
-      </w:r>
-      <w:r>
-        <w:t xml:space="preserve">correlates with dnadiff and minimap2 synteny/coverage scores (Spearman r = 0.39 and 0.26), confirming that it is the output that aligns with alignment-based aligned fraction. By contrast, the anchor-adjacency metric</w:t>
-      </w:r>
-      <w:r>
-        <w:t xml:space="preserve"> </w:t>
-      </w:r>
-      <w:r>
-        <w:rPr>
-          <w:rStyle w:val="VerbatimChar"/>
-        </w:rPr>
-        <w:t xml:space="preserve">anchor_adjacency</w:t>
-      </w:r>
-      <w:r>
-        <w:t xml:space="preserve"> </w:t>
-      </w:r>
-      <w:r>
-        <w:t xml:space="preserve">is uncorrelated with rearrangement count (Spearman r ≈ −0.27 with dnadiff and −0.01 with minimap2) and only weakly correlated with base-pair synteny/coverage scores (Spearman r = 0.33 and −0.01). The two Syn2bANI metrics are themselves only weakly correlated (Pearson r = 0.29), and a diagnostic plot of the held-out benchmark reveals four interpretable quadrants (Supplementary Fig. S13): 6,764 pairs have high</w:t>
-      </w:r>
-      <w:r>
-        <w:t xml:space="preserve"> </w:t>
-      </w:r>
-      <w:r>
-        <w:rPr>
-          <w:rStyle w:val="VerbatimChar"/>
-        </w:rPr>
-        <w:t xml:space="preserve">anchor_adjacency</w:t>
-      </w:r>
-      <w:r>
-        <w:t xml:space="preserve"> </w:t>
-      </w:r>
-      <w:r>
-        <w:t xml:space="preserve">(&gt;0.99) but low alignment-based synteny (&lt;0.5), because the few anchors that remain chained happen to be collinear while most of the genome is unchained; 2,242 pairs have high</w:t>
-      </w:r>
-      <w:r>
-        <w:t xml:space="preserve"> </w:t>
-      </w:r>
-      <w:r>
-        <w:rPr>
-          <w:rStyle w:val="VerbatimChar"/>
-        </w:rPr>
-        <w:t xml:space="preserve">af_query</w:t>
-      </w:r>
-      <w:r>
-        <w:t xml:space="preserve"> </w:t>
-      </w:r>
-      <w:r>
-        <w:t xml:space="preserve">(&gt;0.8) but low alignment-based synteny, the signature of extensive rearrangement inside an otherwise alignable genome; 2,281 pairs have low coverage but locally collinear anchors; and 470 pairs show the opposite mismatch. These deviations explain why</w:t>
-      </w:r>
-      <w:r>
-        <w:t xml:space="preserve"> </w:t>
-      </w:r>
-      <w:r>
-        <w:rPr>
-          <w:rStyle w:val="VerbatimChar"/>
-        </w:rPr>
-        <w:t xml:space="preserve">anchor_adjacency</w:t>
-      </w:r>
-      <w:r>
-        <w:t xml:space="preserve"> </w:t>
-      </w:r>
-      <w:r>
-        <w:t xml:space="preserve">should not be read as a proxy for base-pair synteny, and why the two metrics are reported separately. On an engineered</w:t>
+        <w:t xml:space="preserve">(the raw chain count) is dominated by assembly fragmentation (62% of its variance tracks contig count) and is therefore reported as an assembly-structure diagnostic rather than a rearrangement metric.</w:t>
+      </w:r>
+    </w:p>
+    <w:p>
+      <w:pPr>
+        <w:pStyle w:val="BodyText"/>
+      </w:pPr>
+      <w:r>
+        <w:t xml:space="preserve">A length-weighted orientation metric,</w:t>
+      </w:r>
+      <w:r>
+        <w:t xml:space="preserve"> </w:t>
+      </w:r>
+      <w:r>
+        <w:rPr>
+          <w:rStyle w:val="VerbatimChar"/>
+        </w:rPr>
+        <w:t xml:space="preserve">inverted_fraction</w:t>
+      </w:r>
+      <w:r>
+        <w:t xml:space="preserve">, avoids the fragmentation confounder by construction. In fixed-reference mode it agrees one-to-one with dnadiff across the held-out set (Pearson r = 0.936) and is near-exact in the strain range (r = 0.996, slope 1.006, intercept −0.004 for ANIm ≥ 97%; Supplementary Fig. S14). A closed-form standard-error model based on the number of shared landmarks reproduces the observed spread (R² = 0.999 across divergence bins), so each reported inversion fraction can carry its own uncertainty.</w:t>
+      </w:r>
+    </w:p>
+    <w:p>
+      <w:pPr>
+        <w:pStyle w:val="BodyText"/>
+      </w:pPr>
+      <w:r>
+        <w:t xml:space="preserve">On an engineered</w:t>
       </w:r>
       <w:r>
         <w:t xml:space="preserve"> </w:t>
@@ -1128,7 +1136,164 @@
       </w:r>
     </w:p>
     <w:bookmarkEnd w:id="20"/>
-    <w:bookmarkStart w:id="21" w:name="computational-efficiency"/>
+    <w:bookmarkStart w:id="21" w:name="Xd88170c4b874097551b82a98016fb92a8960384"/>
+    <w:p>
+      <w:pPr>
+        <w:pStyle w:val="Heading3"/>
+      </w:pPr>
+      <w:r>
+        <w:t xml:space="preserve">cagPAI architecture in</w:t>
+      </w:r>
+      <w:r>
+        <w:t xml:space="preserve"> </w:t>
+      </w:r>
+      <w:r>
+        <w:rPr>
+          <w:i/>
+          <w:iCs/>
+        </w:rPr>
+        <w:t xml:space="preserve">H. pylori</w:t>
+      </w:r>
+      <w:r>
+        <w:t xml:space="preserve"> </w:t>
+      </w:r>
+      <w:r>
+        <w:t xml:space="preserve">is invisible to ANI but associated with disease stage</w:t>
+      </w:r>
+    </w:p>
+    <w:p>
+      <w:pPr>
+        <w:pStyle w:val="FirstParagraph"/>
+      </w:pPr>
+      <w:r>
+        <w:t xml:space="preserve">The</w:t>
+      </w:r>
+      <w:r>
+        <w:t xml:space="preserve"> </w:t>
+      </w:r>
+      <w:r>
+        <w:rPr>
+          <w:i/>
+          <w:iCs/>
+        </w:rPr>
+        <w:t xml:space="preserve">Helicobacter pylori</w:t>
+      </w:r>
+      <w:r>
+        <w:t xml:space="preserve"> </w:t>
+      </w:r>
+      <w:r>
+        <w:t xml:space="preserve">cagPAI pathogenicity island is a classic example of a functionally important locus whose presence and architecture are lost in a genome-wide ANI average. We combined marker-gene presence/absence with</w:t>
+      </w:r>
+      <w:r>
+        <w:t xml:space="preserve"> </w:t>
+      </w:r>
+      <w:r>
+        <w:rPr>
+          <w:rStyle w:val="VerbatimChar"/>
+        </w:rPr>
+        <w:t xml:space="preserve">syn2bani struct</w:t>
+      </w:r>
+      <w:r>
+        <w:t xml:space="preserve"> </w:t>
+      </w:r>
+      <w:r>
+        <w:t xml:space="preserve">calls inside the cagPAI coordinates (NC_000915.1: 547,327–583,481) for 528 genomes from a recent gastric-cancer risk study. The extended state was validated on an engineered nine-strain panel (wild-type, ΔcagPAI, inversion, translocation, and mutated backgrounds) and classified all controls correctly.</w:t>
+      </w:r>
+    </w:p>
+    <w:p>
+      <w:pPr>
+        <w:pStyle w:val="BodyText"/>
+      </w:pPr>
+      <w:r>
+        <w:t xml:space="preserve">Among the 528 isolates, 85 (16.1%) lacked the island (</w:t>
+      </w:r>
+      <w:r>
+        <w:rPr>
+          <w:rStyle w:val="VerbatimChar"/>
+        </w:rPr>
+        <w:t xml:space="preserve">empty</w:t>
+      </w:r>
+      <w:r>
+        <w:t xml:space="preserve">), 11 (2.1%) were</w:t>
+      </w:r>
+      <w:r>
+        <w:t xml:space="preserve"> </w:t>
+      </w:r>
+      <w:r>
+        <w:rPr>
+          <w:rStyle w:val="VerbatimChar"/>
+        </w:rPr>
+        <w:t xml:space="preserve">partial</w:t>
+      </w:r>
+      <w:r>
+        <w:t xml:space="preserve">, only 12 (2.3%) retained a collinear complete island (</w:t>
+      </w:r>
+      <w:r>
+        <w:rPr>
+          <w:rStyle w:val="VerbatimChar"/>
+        </w:rPr>
+        <w:t xml:space="preserve">complete_collinear</w:t>
+      </w:r>
+      <w:r>
+        <w:t xml:space="preserve">), and 420 (79.6%) retained the markers but carried a detectable inversion or translocation inside cagPAI (</w:t>
+      </w:r>
+      <w:r>
+        <w:rPr>
+          <w:rStyle w:val="VerbatimChar"/>
+        </w:rPr>
+        <w:t xml:space="preserve">complete_rearranged</w:t>
+      </w:r>
+      <w:r>
+        <w:t xml:space="preserve">; Fig. 8a). The extended state was strongly associated with FastBAPS lineage (χ² = 58.68, df = 12, p = 3.9 × 10⁻⁸) and with disease stage across Correa’s cascade (χ² = 27.91, df = 9, p = 9.9 × 10⁻⁴). Gastric-cancer cases had the lowest</w:t>
+      </w:r>
+      <w:r>
+        <w:t xml:space="preserve"> </w:t>
+      </w:r>
+      <w:r>
+        <w:rPr>
+          <w:rStyle w:val="VerbatimChar"/>
+        </w:rPr>
+        <w:t xml:space="preserve">empty</w:t>
+      </w:r>
+      <w:r>
+        <w:t xml:space="preserve"> </w:t>
+      </w:r>
+      <w:r>
+        <w:t xml:space="preserve">rate (7.6%) and the highest</w:t>
+      </w:r>
+      <w:r>
+        <w:t xml:space="preserve"> </w:t>
+      </w:r>
+      <w:r>
+        <w:rPr>
+          <w:rStyle w:val="VerbatimChar"/>
+        </w:rPr>
+        <w:t xml:space="preserve">complete_collinear</w:t>
+      </w:r>
+      <w:r>
+        <w:t xml:space="preserve"> </w:t>
+      </w:r>
+      <w:r>
+        <w:t xml:space="preserve">rate (4.2%), whereas non-atrophic gastritis cases had the highest</w:t>
+      </w:r>
+      <w:r>
+        <w:t xml:space="preserve"> </w:t>
+      </w:r>
+      <w:r>
+        <w:rPr>
+          <w:rStyle w:val="VerbatimChar"/>
+        </w:rPr>
+        <w:t xml:space="preserve">empty</w:t>
+      </w:r>
+      <w:r>
+        <w:t xml:space="preserve"> </w:t>
+      </w:r>
+      <w:r>
+        <w:t xml:space="preserve">rate (23.4%; Fig. 8b). Because all pairwise ANIs in this collection are &gt;95%, these architecture-disease associations are inaccessible to ANI-only tools and illustrate how Syn2bANI’s structural output can reveal genotype-phenotype relationships that ANI alone cannot.</w:t>
+      </w:r>
+    </w:p>
+    <w:bookmarkEnd w:id="21"/>
+    <w:bookmarkStart w:id="22" w:name="computational-efficiency"/>
     <w:p>
       <w:pPr>
         <w:pStyle w:val="Heading3"/>
@@ -1195,9 +1360,9 @@
         </w:pict>
       </w:r>
     </w:p>
-    <w:bookmarkEnd w:id="21"/>
     <w:bookmarkEnd w:id="22"/>
-    <w:bookmarkStart w:id="23" w:name="discussion"/>
+    <w:bookmarkEnd w:id="23"/>
+    <w:bookmarkStart w:id="24" w:name="discussion"/>
     <w:p>
       <w:pPr>
         <w:pStyle w:val="Heading2"/>
@@ -1221,8 +1386,8 @@
         </w:pict>
       </w:r>
     </w:p>
-    <w:bookmarkEnd w:id="23"/>
-    <w:bookmarkStart w:id="35" w:name="online-methods"/>
+    <w:bookmarkEnd w:id="24"/>
+    <w:bookmarkStart w:id="36" w:name="online-methods"/>
     <w:p>
       <w:pPr>
         <w:pStyle w:val="Heading2"/>
@@ -1231,7 +1396,7 @@
         <w:t xml:space="preserve">Online Methods</w:t>
       </w:r>
     </w:p>
-    <w:bookmarkStart w:id="24" w:name="X585a6a8b67378bd6645996598d95979c15b1236"/>
+    <w:bookmarkStart w:id="25" w:name="X585a6a8b67378bd6645996598d95979c15b1236"/>
     <w:p>
       <w:pPr>
         <w:pStyle w:val="Heading3"/>
@@ -1332,8 +1497,8 @@
         <w:t xml:space="preserve">three-of-four positions. The homogeneous likelihood uses the exact convolution over degenerate classes; the heterogeneous likelihood uses a negative binomial with effective body b + d2/3 + 2·d3/3 plus a closed-form survival factor. With the fully specific default panel (d2 = d3 = 0) both paths are bit-identical to the pre-fix code. Tags are stored strand-canonically (the lexicographically smaller of a tag and its reverse complement), so contig orientation is immaterial; reverse-complement self-controls on real drafts return 99.9999.</w:t>
       </w:r>
     </w:p>
-    <w:bookmarkEnd w:id="24"/>
-    <w:bookmarkStart w:id="25" w:name="Xd100f60785764278c40c45b7debf06888935c47"/>
+    <w:bookmarkEnd w:id="25"/>
+    <w:bookmarkStart w:id="26" w:name="Xd100f60785764278c40c45b7debf06888935c47"/>
     <w:p>
       <w:pPr>
         <w:pStyle w:val="Heading3"/>
@@ -1458,8 +1623,8 @@
         <w:t xml:space="preserve">bp of the predicted position — seed-and-extend, which cannot invent matches between positionally unrelated tags. Chains are processed largest-first and each query tag is counted at most once.</w:t>
       </w:r>
     </w:p>
-    <w:bookmarkEnd w:id="25"/>
-    <w:bookmarkStart w:id="26" w:name="Xc84f212d8323a8f017575d3d7a92fc22fb23227"/>
+    <w:bookmarkEnd w:id="26"/>
+    <w:bookmarkStart w:id="27" w:name="Xc84f212d8323a8f017575d3d7a92fc22fb23227"/>
     <w:p>
       <w:pPr>
         <w:pStyle w:val="Heading3"/>
@@ -1593,8 +1758,8 @@
         <w:t xml:space="preserve">. The recalibrated flag never inverts its error ranking on any validation set (kept vs flagged MAE: GTDB-ANIm 2.415 vs 4.153; oral/gut 0.514 vs 4.269; mid-ANI 0.343 vs 1.113), at a disclosed cost in near-clonal sensitivity.</w:t>
       </w:r>
     </w:p>
-    <w:bookmarkEnd w:id="26"/>
-    <w:bookmarkStart w:id="27" w:name="short-contig-rescue-pass"/>
+    <w:bookmarkEnd w:id="27"/>
+    <w:bookmarkStart w:id="28" w:name="short-contig-rescue-pass"/>
     <w:p>
       <w:pPr>
         <w:pStyle w:val="Heading3"/>
@@ -1638,8 +1803,8 @@
         <w:t xml:space="preserve">+ 1) × mean tag spacing along the reference. Rescued contigs contribute AF spans with the same half-median-gap extension rule as chains but create no chains, so synteny and SV outputs are untouched. The pass is gated on contig tag count, so complete and high-N50 assemblies take a bit-identical path. The residual +0.20 drift at N50 5 kb comes from contigs with 0–1 placeable anchors (~1.3 Mb on the Sakai ladder), which carry no positional evidence; rescuing them would require guessing homology.</w:t>
       </w:r>
     </w:p>
-    <w:bookmarkEnd w:id="27"/>
-    <w:bookmarkStart w:id="28" w:name="database-scale-screen"/>
+    <w:bookmarkEnd w:id="28"/>
+    <w:bookmarkStart w:id="29" w:name="database-scale-screen"/>
     <w:p>
       <w:pPr>
         <w:pStyle w:val="Heading3"/>
@@ -1731,8 +1896,8 @@
         <w:t xml:space="preserve">command, so database output is byte-identical to pairwise output on the same pairs. Screen thresholds are panel-specific and exposed as flags.</w:t>
       </w:r>
     </w:p>
-    <w:bookmarkEnd w:id="28"/>
-    <w:bookmarkStart w:id="29" w:name="ridge-calibration-protocol"/>
+    <w:bookmarkEnd w:id="29"/>
+    <w:bookmarkStart w:id="30" w:name="ridge-calibration-protocol"/>
     <w:p>
       <w:pPr>
         <w:pStyle w:val="Heading3"/>
@@ -1897,8 +2062,8 @@
         <w:t xml:space="preserve">pairs rather than extrapolating.</w:t>
       </w:r>
     </w:p>
-    <w:bookmarkEnd w:id="29"/>
-    <w:bookmarkStart w:id="30" w:name="Xd3b37ce8f62a83dd9d52f682daa388ffbd3bd4e"/>
+    <w:bookmarkEnd w:id="30"/>
+    <w:bookmarkStart w:id="31" w:name="Xd3b37ce8f62a83dd9d52f682daa388ffbd3bd4e"/>
     <w:p>
       <w:pPr>
         <w:pStyle w:val="Heading3"/>
@@ -1915,8 +2080,8 @@
         <w:t xml:space="preserve">The mechanistic alternative to calibration was evaluated in full (prototype in Python against 19 exact-truth mosaic simulations, then the GTDB-ANIm matrix). The bias decomposes into an in-chain distribution-family term — asymptotic in-chain MAE 2.25 for gamma, 1.25 for a capped grid NPMLE, so a nonparametric fit fixes at most ~0.1–0.2 GTDB MAE — and a coverage term: the divergence of the unchained fraction is not identifiable from tag data, since the out-of-chain anchor residual is ≈ 0 within multi-match noise whether the unchained mass is saturated-divergent or accessory, and an oracle given the exact identity of the chained sample still errs by MAE 1.36 against whole-genome truth. No candidate (AF-weighted mixtures, discrete mixtures, ascertainment-aware tilts, capped NPMLE with and without LRT gating, model averaging) beats the gated baseline while holding all simulation gates. The raw estimator is therefore at its identifiability floor at 4-enzyme tag density; this analysis is why calibration, not a new likelihood, is the deployed correction layer.</w:t>
       </w:r>
     </w:p>
-    <w:bookmarkEnd w:id="30"/>
-    <w:bookmarkStart w:id="31" w:name="structural-variant-calling"/>
+    <w:bookmarkEnd w:id="31"/>
+    <w:bookmarkStart w:id="32" w:name="structural-variant-calling"/>
     <w:p>
       <w:pPr>
         <w:pStyle w:val="Heading3"/>
@@ -2174,8 +2339,8 @@
         <w:t xml:space="preserve">as a separate anchor-order statistic rather than as a proxy for base-pair synteny is therefore deliberate: it captures the fine-scale collinearity of the anchor map, which is invisible to an ANI scalar and only partially correlated with alignment-based coverage.</w:t>
       </w:r>
     </w:p>
-    <w:bookmarkEnd w:id="31"/>
-    <w:bookmarkStart w:id="32" w:name="simulation-framework-with-exact-truth"/>
+    <w:bookmarkEnd w:id="32"/>
+    <w:bookmarkStart w:id="33" w:name="simulation-framework-with-exact-truth"/>
     <w:p>
       <w:pPr>
         <w:pStyle w:val="Heading3"/>
@@ -2205,8 +2370,8 @@
         <w:t xml:space="preserve">K-12 MG1655, ENA U00096.3, 4,641,652 bp) by applying a counted number of substitutions, so true ANI = 1 − n_subs/L exactly. Families: an ANI ladder (12 levels, 85–99.9%, each with a 400 kb inversion, with and without ~46 deletions of 200–2,000 bp); an indel sweep (true ANI 95.000; 0–4 deletions/100 kb); fragmentation (20–201 contigs, no sequence lost, ~50% reverse-complemented, order shuffled); accessory confounds (core ANI 95.000; 0–50% of the genome replaced by composition-preserving shuffled blocks, plus a block-count control at fixed total fraction); mosaic/rate-heterogeneity cases (per-block rates ~ Gamma(α, α), α = 0.5/1/2, mean ANI 90–98, plus deliberately misspecified bimodal cases); and GC coverage (ladders on five real template genomes, GC 27.2–72.1%). Deletions do not change true ANI (counted substitutions over reference length), so the deleted fraction doubles as AF ground truth. Substitutions are uniform over the three alternative bases with no GC-biased mutation model, transition/transversion ratio, codon structure, or selection — a deliberate simplification justified by the finding that GC does not explain the real-data degradation and that site turnover emerges from uniform substitution on a real genome without any special mechanism. Enzyme digestion is never simulated; the released binary extracts tags itself.</w:t>
       </w:r>
     </w:p>
-    <w:bookmarkEnd w:id="32"/>
-    <w:bookmarkStart w:id="33" w:name="benchmark-datasets-truth-and-tools"/>
+    <w:bookmarkEnd w:id="33"/>
+    <w:bookmarkStart w:id="34" w:name="benchmark-datasets-truth-and-tools"/>
     <w:p>
       <w:pPr>
         <w:pStyle w:val="Heading3"/>
@@ -3208,27 +3373,27 @@
           <w:i/>
           <w:iCs/>
         </w:rPr>
-        <w:t xml:space="preserve">B. longum</w:t>
-      </w:r>
-      <w:r>
-        <w:rPr>
-          <w:b/>
-          <w:bCs/>
-        </w:rPr>
-        <w:t xml:space="preserve"> </w:t>
-      </w:r>
-      <w:r>
-        <w:rPr>
-          <w:b/>
-          <w:bCs/>
-        </w:rPr>
-        <w:t xml:space="preserve">abfA collection.</w:t>
-      </w:r>
-      <w:r>
-        <w:t xml:space="preserve"> </w:t>
-      </w:r>
-      <w:r>
-        <w:t xml:space="preserve">One hundred and eighty-five</w:t>
+        <w:t xml:space="preserve">H. pylori</w:t>
+      </w:r>
+      <w:r>
+        <w:rPr>
+          <w:b/>
+          <w:bCs/>
+        </w:rPr>
+        <w:t xml:space="preserve"> </w:t>
+      </w:r>
+      <w:r>
+        <w:rPr>
+          <w:b/>
+          <w:bCs/>
+        </w:rPr>
+        <w:t xml:space="preserve">cagPAI cohort.</w:t>
+      </w:r>
+      <w:r>
+        <w:t xml:space="preserve"> </w:t>
+      </w:r>
+      <w:r>
+        <w:t xml:space="preserve">Five hundred and twenty-eight</w:t>
       </w:r>
       <w:r>
         <w:t xml:space="preserve"> </w:t>
@@ -3238,6 +3403,295 @@
           <w:i/>
           <w:iCs/>
         </w:rPr>
+        <w:t xml:space="preserve">H. pylori</w:t>
+      </w:r>
+      <w:r>
+        <w:t xml:space="preserve"> </w:t>
+      </w:r>
+      <w:r>
+        <w:t xml:space="preserve">genomes from Song et al. (2026) were compared against reference 26695 with</w:t>
+      </w:r>
+      <w:r>
+        <w:t xml:space="preserve"> </w:t>
+      </w:r>
+      <w:r>
+        <w:rPr>
+          <w:rStyle w:val="VerbatimChar"/>
+        </w:rPr>
+        <w:t xml:space="preserve">syn2bani struct --bed</w:t>
+      </w:r>
+      <w:r>
+        <w:t xml:space="preserve">. Marker-gene presence for 28 cagPAI CDS (HP0520–HP0547) was assessed with</w:t>
+      </w:r>
+      <w:r>
+        <w:t xml:space="preserve"> </w:t>
+      </w:r>
+      <w:r>
+        <w:rPr>
+          <w:rStyle w:val="VerbatimChar"/>
+        </w:rPr>
+        <w:t xml:space="preserve">minimap2 -x asm5</w:t>
+      </w:r>
+      <w:r>
+        <w:t xml:space="preserve"> </w:t>
+      </w:r>
+      <w:r>
+        <w:t xml:space="preserve">(≥80% coverage, ≥80% identity). Genomes with ≥90% markers present were classified as</w:t>
+      </w:r>
+      <w:r>
+        <w:t xml:space="preserve"> </w:t>
+      </w:r>
+      <w:r>
+        <w:rPr>
+          <w:rStyle w:val="VerbatimChar"/>
+        </w:rPr>
+        <w:t xml:space="preserve">complete</w:t>
+      </w:r>
+      <w:r>
+        <w:t xml:space="preserve">; among these, any inversion or translocation overlapping cagPAI coordinates (NC_000915.1: 547,327–583,481, ±2 kb buffer) was classified as</w:t>
+      </w:r>
+      <w:r>
+        <w:t xml:space="preserve"> </w:t>
+      </w:r>
+      <w:r>
+        <w:rPr>
+          <w:rStyle w:val="VerbatimChar"/>
+        </w:rPr>
+        <w:t xml:space="preserve">complete_rearranged</w:t>
+      </w:r>
+      <w:r>
+        <w:t xml:space="preserve">, otherwise</w:t>
+      </w:r>
+      <w:r>
+        <w:t xml:space="preserve"> </w:t>
+      </w:r>
+      <w:r>
+        <w:rPr>
+          <w:rStyle w:val="VerbatimChar"/>
+        </w:rPr>
+        <w:t xml:space="preserve">complete_collinear</w:t>
+      </w:r>
+      <w:r>
+        <w:t xml:space="preserve">. Isolation metadata (disease stage, country, FastBAPS lineage, phylogenetic population) were taken from the original publication (</w:t>
+      </w:r>
+      <w:r>
+        <w:rPr>
+          <w:rStyle w:val="VerbatimChar"/>
+        </w:rPr>
+        <w:t xml:space="preserve">case_studies/h_pylori_cagpai/</w:t>
+      </w:r>
+      <w:r>
+        <w:t xml:space="preserve">).</w:t>
+      </w:r>
+      <w:r>
+        <w:t xml:space="preserve"> </w:t>
+      </w:r>
+      <w:r>
+        <w:t xml:space="preserve">-</w:t>
+      </w:r>
+      <w:r>
+        <w:t xml:space="preserve"> </w:t>
+      </w:r>
+      <w:r>
+        <w:rPr>
+          <w:b/>
+          <w:bCs/>
+          <w:i/>
+          <w:iCs/>
+        </w:rPr>
+        <w:t xml:space="preserve">E. coli</w:t>
+      </w:r>
+      <w:r>
+        <w:rPr>
+          <w:b/>
+          <w:bCs/>
+        </w:rPr>
+        <w:t xml:space="preserve"> </w:t>
+      </w:r>
+      <w:r>
+        <w:rPr>
+          <w:b/>
+          <w:bCs/>
+        </w:rPr>
+        <w:t xml:space="preserve">O157:H7 collection.</w:t>
+      </w:r>
+      <w:r>
+        <w:t xml:space="preserve"> </w:t>
+      </w:r>
+      <w:r>
+        <w:t xml:space="preserve">Seventy-four</w:t>
+      </w:r>
+      <w:r>
+        <w:t xml:space="preserve"> </w:t>
+      </w:r>
+      <w:r>
+        <w:rPr>
+          <w:i/>
+          <w:iCs/>
+        </w:rPr>
+        <w:t xml:space="preserve">E. coli</w:t>
+      </w:r>
+      <w:r>
+        <w:t xml:space="preserve"> </w:t>
+      </w:r>
+      <w:r>
+        <w:t xml:space="preserve">O157:H7 genomes from Fitzgerald et al. (2021) were compared all-vs-all with</w:t>
+      </w:r>
+      <w:r>
+        <w:t xml:space="preserve"> </w:t>
+      </w:r>
+      <w:r>
+        <w:rPr>
+          <w:rStyle w:val="VerbatimChar"/>
+        </w:rPr>
+        <w:t xml:space="preserve">syn2bani ani</w:t>
+      </w:r>
+      <w:r>
+        <w:t xml:space="preserve"> </w:t>
+      </w:r>
+      <w:r>
+        <w:t xml:space="preserve">(2,701 pairs). Host source and lineage assignments were taken from the original publication; lineages were grouped as I/II, II, Ia, and Ic (</w:t>
+      </w:r>
+      <w:r>
+        <w:rPr>
+          <w:rStyle w:val="VerbatimChar"/>
+        </w:rPr>
+        <w:t xml:space="preserve">case_studies/ecoli_o157_fitzgerald_2021/</w:t>
+      </w:r>
+      <w:r>
+        <w:t xml:space="preserve">).</w:t>
+      </w:r>
+      <w:r>
+        <w:t xml:space="preserve"> </w:t>
+      </w:r>
+      <w:r>
+        <w:t xml:space="preserve">-</w:t>
+      </w:r>
+      <w:r>
+        <w:t xml:space="preserve"> </w:t>
+      </w:r>
+      <w:r>
+        <w:rPr>
+          <w:b/>
+          <w:bCs/>
+        </w:rPr>
+        <w:t xml:space="preserve">FDA-ARGOS</w:t>
+      </w:r>
+      <w:r>
+        <w:rPr>
+          <w:b/>
+          <w:bCs/>
+        </w:rPr>
+        <w:t xml:space="preserve"> </w:t>
+      </w:r>
+      <w:r>
+        <w:rPr>
+          <w:b/>
+          <w:bCs/>
+          <w:i/>
+          <w:iCs/>
+        </w:rPr>
+        <w:t xml:space="preserve">S. aureus</w:t>
+      </w:r>
+      <w:r>
+        <w:rPr>
+          <w:b/>
+          <w:bCs/>
+        </w:rPr>
+        <w:t xml:space="preserve">.</w:t>
+      </w:r>
+      <w:r>
+        <w:t xml:space="preserve"> </w:t>
+      </w:r>
+      <w:r>
+        <w:t xml:space="preserve">One hundred and twenty-two</w:t>
+      </w:r>
+      <w:r>
+        <w:t xml:space="preserve"> </w:t>
+      </w:r>
+      <w:r>
+        <w:rPr>
+          <w:i/>
+          <w:iCs/>
+        </w:rPr>
+        <w:t xml:space="preserve">Staphylococcus aureus</w:t>
+      </w:r>
+      <w:r>
+        <w:t xml:space="preserve"> </w:t>
+      </w:r>
+      <w:r>
+        <w:t xml:space="preserve">genomes from the FDA-ARGOS repository were compared all-vs-all with</w:t>
+      </w:r>
+      <w:r>
+        <w:t xml:space="preserve"> </w:t>
+      </w:r>
+      <w:r>
+        <w:rPr>
+          <w:rStyle w:val="VerbatimChar"/>
+        </w:rPr>
+        <w:t xml:space="preserve">syn2bani ani</w:t>
+      </w:r>
+      <w:r>
+        <w:t xml:space="preserve"> </w:t>
+      </w:r>
+      <w:r>
+        <w:t xml:space="preserve">and refined to 7,381 pairs. Country and isolation-source metadata were taken from NCBI assembly records (</w:t>
+      </w:r>
+      <w:r>
+        <w:rPr>
+          <w:rStyle w:val="VerbatimChar"/>
+        </w:rPr>
+        <w:t xml:space="preserve">case_studies/fda_argos_s_aureus/</w:t>
+      </w:r>
+      <w:r>
+        <w:t xml:space="preserve">).</w:t>
+      </w:r>
+      <w:r>
+        <w:t xml:space="preserve"> </w:t>
+      </w:r>
+      <w:r>
+        <w:t xml:space="preserve">-</w:t>
+      </w:r>
+      <w:r>
+        <w:t xml:space="preserve"> </w:t>
+      </w:r>
+      <w:r>
+        <w:rPr>
+          <w:b/>
+          <w:bCs/>
+          <w:i/>
+          <w:iCs/>
+        </w:rPr>
+        <w:t xml:space="preserve">B. longum</w:t>
+      </w:r>
+      <w:r>
+        <w:rPr>
+          <w:b/>
+          <w:bCs/>
+        </w:rPr>
+        <w:t xml:space="preserve"> </w:t>
+      </w:r>
+      <w:r>
+        <w:rPr>
+          <w:b/>
+          <w:bCs/>
+        </w:rPr>
+        <w:t xml:space="preserve">abfA collection.</w:t>
+      </w:r>
+      <w:r>
+        <w:t xml:space="preserve"> </w:t>
+      </w:r>
+      <w:r>
+        <w:t xml:space="preserve">One hundred and eighty-five</w:t>
+      </w:r>
+      <w:r>
+        <w:t xml:space="preserve"> </w:t>
+      </w:r>
+      <w:r>
+        <w:rPr>
+          <w:i/>
+          <w:iCs/>
+        </w:rPr>
         <w:t xml:space="preserve">Bifidobacterium longum</w:t>
       </w:r>
       <w:r>
@@ -3319,8 +3773,8 @@
         <w:t xml:space="preserve">time covers only 302/484 reported pairs (minimum-AF filter) and excludes sketching; this is noted wherever the comparison appears.</w:t>
       </w:r>
     </w:p>
-    <w:bookmarkEnd w:id="33"/>
-    <w:bookmarkStart w:id="34" w:name="implementation"/>
+    <w:bookmarkEnd w:id="34"/>
+    <w:bookmarkStart w:id="35" w:name="implementation"/>
     <w:p>
       <w:pPr>
         <w:pStyle w:val="Heading3"/>
@@ -3449,9 +3903,9 @@
         </w:pict>
       </w:r>
     </w:p>
-    <w:bookmarkEnd w:id="34"/>
     <w:bookmarkEnd w:id="35"/>
-    <w:bookmarkStart w:id="36" w:name="data-availability"/>
+    <w:bookmarkEnd w:id="36"/>
+    <w:bookmarkStart w:id="37" w:name="data-availability"/>
     <w:p>
       <w:pPr>
         <w:pStyle w:val="Heading2"/>
@@ -3556,8 +4010,8 @@
         <w:t xml:space="preserve">K-12 MG1655, ENA accession U00096.3.</w:t>
       </w:r>
     </w:p>
-    <w:bookmarkEnd w:id="36"/>
-    <w:bookmarkStart w:id="37" w:name="code-availability"/>
+    <w:bookmarkEnd w:id="37"/>
+    <w:bookmarkStart w:id="38" w:name="code-availability"/>
     <w:p>
       <w:pPr>
         <w:pStyle w:val="Heading2"/>
@@ -3586,8 +4040,8 @@
         <w:t xml:space="preserve">).</w:t>
       </w:r>
     </w:p>
-    <w:bookmarkEnd w:id="37"/>
-    <w:bookmarkStart w:id="38" w:name="acknowledgements"/>
+    <w:bookmarkEnd w:id="38"/>
+    <w:bookmarkStart w:id="39" w:name="acknowledgements"/>
     <w:p>
       <w:pPr>
         <w:pStyle w:val="Heading2"/>
@@ -3604,8 +4058,8 @@
         <w:t xml:space="preserve">[To be determined.]</w:t>
       </w:r>
     </w:p>
-    <w:bookmarkEnd w:id="38"/>
-    <w:bookmarkStart w:id="39" w:name="author-contributions"/>
+    <w:bookmarkEnd w:id="39"/>
+    <w:bookmarkStart w:id="40" w:name="author-contributions"/>
     <w:p>
       <w:pPr>
         <w:pStyle w:val="Heading2"/>
@@ -3622,8 +4076,8 @@
         <w:t xml:space="preserve">[To be determined — placeholder.]</w:t>
       </w:r>
     </w:p>
-    <w:bookmarkEnd w:id="39"/>
-    <w:bookmarkStart w:id="40" w:name="competing-interests"/>
+    <w:bookmarkEnd w:id="40"/>
+    <w:bookmarkStart w:id="41" w:name="competing-interests"/>
     <w:p>
       <w:pPr>
         <w:pStyle w:val="Heading2"/>
@@ -3640,8 +4094,8 @@
         <w:t xml:space="preserve">[To be determined — placeholder: The authors declare no competing interests.]</w:t>
       </w:r>
     </w:p>
-    <w:bookmarkEnd w:id="40"/>
-    <w:bookmarkStart w:id="41" w:name="references"/>
+    <w:bookmarkEnd w:id="41"/>
+    <w:bookmarkStart w:id="42" w:name="references"/>
     <w:p>
       <w:pPr>
         <w:pStyle w:val="Heading2"/>
@@ -5079,8 +5533,8 @@
         </w:pict>
       </w:r>
     </w:p>
-    <w:bookmarkEnd w:id="41"/>
-    <w:bookmarkStart w:id="42" w:name="figure-legends"/>
+    <w:bookmarkEnd w:id="42"/>
+    <w:bookmarkStart w:id="43" w:name="figure-legends"/>
     <w:p>
       <w:pPr>
         <w:pStyle w:val="Heading2"/>
@@ -5433,11 +5887,9 @@
         <w:t xml:space="preserve">.</w:t>
       </w:r>
     </w:p>
-    <w:bookmarkEnd w:id="42"/>
-    <w:bookmarkStart w:id="43" w:name="Xc726a833e5182f8377620c8e41412d6ae80dab8"/>
-    <w:p>
-      <w:pPr>
-        <w:pStyle w:val="Heading2"/>
+    <w:p>
+      <w:pPr>
+        <w:pStyle w:val="BodyText"/>
       </w:pPr>
       <w:r>
         <w:rPr>
@@ -5481,8 +5933,277 @@
         <w:t xml:space="preserve">.</w:t>
       </w:r>
     </w:p>
+    <w:p>
+      <w:pPr>
+        <w:pStyle w:val="BodyText"/>
+      </w:pPr>
+      <w:r>
+        <w:rPr>
+          <w:b/>
+          <w:bCs/>
+        </w:rPr>
+        <w:t xml:space="preserve">Figure 8 | cagPAI architecture in 528</w:t>
+      </w:r>
+      <w:r>
+        <w:rPr>
+          <w:b/>
+          <w:bCs/>
+        </w:rPr>
+        <w:t xml:space="preserve"> </w:t>
+      </w:r>
+      <w:r>
+        <w:rPr>
+          <w:b/>
+          <w:bCs/>
+          <w:i/>
+          <w:iCs/>
+        </w:rPr>
+        <w:t xml:space="preserve">H. pylori</w:t>
+      </w:r>
+      <w:r>
+        <w:rPr>
+          <w:b/>
+          <w:bCs/>
+        </w:rPr>
+        <w:t xml:space="preserve"> </w:t>
+      </w:r>
+      <w:r>
+        <w:rPr>
+          <w:b/>
+          <w:bCs/>
+        </w:rPr>
+        <w:t xml:space="preserve">isolates is associated with disease stage and lineage, but invisible to ANI.</w:t>
+      </w:r>
+      <w:r>
+        <w:t xml:space="preserve"> </w:t>
+      </w:r>
+      <w:r>
+        <w:t xml:space="preserve">(a) Extended cagPAI state classification: marker-based</w:t>
+      </w:r>
+      <w:r>
+        <w:t xml:space="preserve"> </w:t>
+      </w:r>
+      <w:r>
+        <w:rPr>
+          <w:rStyle w:val="VerbatimChar"/>
+        </w:rPr>
+        <w:t xml:space="preserve">empty</w:t>
+      </w:r>
+      <w:r>
+        <w:t xml:space="preserve"> </w:t>
+      </w:r>
+      <w:r>
+        <w:t xml:space="preserve">/</w:t>
+      </w:r>
+      <w:r>
+        <w:t xml:space="preserve"> </w:t>
+      </w:r>
+      <w:r>
+        <w:rPr>
+          <w:rStyle w:val="VerbatimChar"/>
+        </w:rPr>
+        <w:t xml:space="preserve">partial</w:t>
+      </w:r>
+      <w:r>
+        <w:t xml:space="preserve"> </w:t>
+      </w:r>
+      <w:r>
+        <w:t xml:space="preserve">/</w:t>
+      </w:r>
+      <w:r>
+        <w:t xml:space="preserve"> </w:t>
+      </w:r>
+      <w:r>
+        <w:rPr>
+          <w:rStyle w:val="VerbatimChar"/>
+        </w:rPr>
+        <w:t xml:space="preserve">complete</w:t>
+      </w:r>
+      <w:r>
+        <w:t xml:space="preserve"> </w:t>
+      </w:r>
+      <w:r>
+        <w:t xml:space="preserve">is refined by</w:t>
+      </w:r>
+      <w:r>
+        <w:t xml:space="preserve"> </w:t>
+      </w:r>
+      <w:r>
+        <w:rPr>
+          <w:rStyle w:val="VerbatimChar"/>
+        </w:rPr>
+        <w:t xml:space="preserve">syn2bani struct</w:t>
+      </w:r>
+      <w:r>
+        <w:t xml:space="preserve"> </w:t>
+      </w:r>
+      <w:r>
+        <w:t xml:space="preserve">calls inside the cagPAI coordinates into</w:t>
+      </w:r>
+      <w:r>
+        <w:t xml:space="preserve"> </w:t>
+      </w:r>
+      <w:r>
+        <w:rPr>
+          <w:rStyle w:val="VerbatimChar"/>
+        </w:rPr>
+        <w:t xml:space="preserve">complete_collinear</w:t>
+      </w:r>
+      <w:r>
+        <w:t xml:space="preserve"> </w:t>
+      </w:r>
+      <w:r>
+        <w:t xml:space="preserve">and</w:t>
+      </w:r>
+      <w:r>
+        <w:t xml:space="preserve"> </w:t>
+      </w:r>
+      <w:r>
+        <w:rPr>
+          <w:rStyle w:val="VerbatimChar"/>
+        </w:rPr>
+        <w:t xml:space="preserve">complete_rearranged</w:t>
+      </w:r>
+      <w:r>
+        <w:t xml:space="preserve">. (b) Stacked-bar distribution of extended cagPAI states by Correa’s cascade disease stage (NAG, AG, IM, GC) and by FastBAPS lineage. (c) Same data by country and phylogenetic population. Per-group stacked bars are shown in Supplementary Figs. S17–S20. Source:</w:t>
+      </w:r>
+      <w:r>
+        <w:t xml:space="preserve"> </w:t>
+      </w:r>
+      <w:r>
+        <w:rPr>
+          <w:rStyle w:val="VerbatimChar"/>
+        </w:rPr>
+        <w:t xml:space="preserve">case_studies/h_pylori_cagpai/results/struct_extended/</w:t>
+      </w:r>
+      <w:r>
+        <w:t xml:space="preserve">.</w:t>
+      </w:r>
+    </w:p>
+    <w:p>
+      <w:pPr>
+        <w:pStyle w:val="BodyText"/>
+      </w:pPr>
+      <w:r>
+        <w:rPr>
+          <w:b/>
+          <w:bCs/>
+        </w:rPr>
+        <w:t xml:space="preserve">Supplementary Figure S15 | High-ANI</w:t>
+      </w:r>
+      <w:r>
+        <w:rPr>
+          <w:b/>
+          <w:bCs/>
+        </w:rPr>
+        <w:t xml:space="preserve"> </w:t>
+      </w:r>
+      <w:r>
+        <w:rPr>
+          <w:b/>
+          <w:bCs/>
+          <w:i/>
+          <w:iCs/>
+        </w:rPr>
+        <w:t xml:space="preserve">E. coli</w:t>
+      </w:r>
+      <w:r>
+        <w:rPr>
+          <w:b/>
+          <w:bCs/>
+        </w:rPr>
+        <w:t xml:space="preserve"> </w:t>
+      </w:r>
+      <w:r>
+        <w:rPr>
+          <w:b/>
+          <w:bCs/>
+        </w:rPr>
+        <w:t xml:space="preserve">O157:H7 pairs carry hundreds of breakpoints.</w:t>
+      </w:r>
+      <w:r>
+        <w:t xml:space="preserve"> </w:t>
+      </w:r>
+      <w:r>
+        <w:t xml:space="preserve">Seventy-four genomes from Fitzgerald et al. (2021), 2,701 non-self pairs. (a) ANI vs breakpoint count colored by lineage (I/II, II, Ia, Ic). (b) Same data colored by host category (bovine, human, other/unknown). All pairwise ANIs exceed 99.886% yet breakpoints range from 171 to &gt;1,100. Source:</w:t>
+      </w:r>
+      <w:r>
+        <w:t xml:space="preserve"> </w:t>
+      </w:r>
+      <w:r>
+        <w:rPr>
+          <w:rStyle w:val="VerbatimChar"/>
+        </w:rPr>
+        <w:t xml:space="preserve">case_studies/ecoli_o157_fitzgerald_2021/results/</w:t>
+      </w:r>
+      <w:r>
+        <w:t xml:space="preserve">.</w:t>
+      </w:r>
+    </w:p>
     <w:bookmarkEnd w:id="43"/>
-    <w:bookmarkStart w:id="44" w:name="tables"/>
+    <w:bookmarkStart w:id="44" w:name="X2039872a057f86498f6293bbf4ab0196afa571e"/>
+    <w:p>
+      <w:pPr>
+        <w:pStyle w:val="Heading2"/>
+      </w:pPr>
+      <w:r>
+        <w:rPr>
+          <w:b/>
+          <w:bCs/>
+        </w:rPr>
+        <w:t xml:space="preserve">Supplementary Figure S16 | High-ANI FDA-ARGOS</w:t>
+      </w:r>
+      <w:r>
+        <w:rPr>
+          <w:b/>
+          <w:bCs/>
+        </w:rPr>
+        <w:t xml:space="preserve"> </w:t>
+      </w:r>
+      <w:r>
+        <w:rPr>
+          <w:b/>
+          <w:bCs/>
+          <w:i/>
+          <w:iCs/>
+        </w:rPr>
+        <w:t xml:space="preserve">Staphylococcus aureus</w:t>
+      </w:r>
+      <w:r>
+        <w:rPr>
+          <w:b/>
+          <w:bCs/>
+        </w:rPr>
+        <w:t xml:space="preserve"> </w:t>
+      </w:r>
+      <w:r>
+        <w:rPr>
+          <w:b/>
+          <w:bCs/>
+        </w:rPr>
+        <w:t xml:space="preserve">pairs show wide breakpoint variation.</w:t>
+      </w:r>
+      <w:r>
+        <w:t xml:space="preserve"> </w:t>
+      </w:r>
+      <w:r>
+        <w:t xml:space="preserve">One hundred and twenty-two genomes, 7,381 refined pairs. (a) ANI vs breakpoint count. (b) Breakpoint count distribution. Pairs at 100% ANI still carry &gt;150 breakpoints. Source:</w:t>
+      </w:r>
+      <w:r>
+        <w:t xml:space="preserve"> </w:t>
+      </w:r>
+      <w:r>
+        <w:rPr>
+          <w:rStyle w:val="VerbatimChar"/>
+        </w:rPr>
+        <w:t xml:space="preserve">case_studies/fda_argos_s_aureus/results/</w:t>
+      </w:r>
+      <w:r>
+        <w:t xml:space="preserve">.</w:t>
+      </w:r>
+    </w:p>
+    <w:bookmarkEnd w:id="44"/>
+    <w:bookmarkStart w:id="45" w:name="tables"/>
     <w:p>
       <w:pPr>
         <w:pStyle w:val="Heading2"/>
@@ -8477,6 +9198,240 @@
                 <w:i/>
                 <w:iCs/>
               </w:rPr>
+              <w:t xml:space="preserve">H. pylori</w:t>
+            </w:r>
+            <w:r>
+              <w:t xml:space="preserve"> </w:t>
+            </w:r>
+            <w:r>
+              <w:t xml:space="preserve">cagPAI cohort</w:t>
+            </w:r>
+          </w:p>
+        </w:tc>
+        <w:tc>
+          <w:tcPr/>
+          <w:p>
+            <w:pPr>
+              <w:pStyle w:val="Compact"/>
+            </w:pPr>
+            <w:r>
+              <w:t xml:space="preserve">real</w:t>
+            </w:r>
+          </w:p>
+        </w:tc>
+        <w:tc>
+          <w:tcPr/>
+          <w:p>
+            <w:pPr>
+              <w:pStyle w:val="Compact"/>
+            </w:pPr>
+            <w:r>
+              <w:t xml:space="preserve">528 genomes from Song et al. (2026); marker + struct state vs 26695</w:t>
+            </w:r>
+          </w:p>
+        </w:tc>
+        <w:tc>
+          <w:tcPr/>
+          <w:p>
+            <w:pPr>
+              <w:pStyle w:val="Compact"/>
+            </w:pPr>
+            <w:r>
+              <w:t xml:space="preserve">disease stage, FastBAPS, country, population</w:t>
+            </w:r>
+          </w:p>
+        </w:tc>
+        <w:tc>
+          <w:tcPr/>
+          <w:p>
+            <w:pPr>
+              <w:pStyle w:val="Compact"/>
+            </w:pPr>
+            <w:r>
+              <w:t xml:space="preserve">Fig. 8</w:t>
+            </w:r>
+          </w:p>
+        </w:tc>
+      </w:tr>
+      <w:tr>
+        <w:tc>
+          <w:tcPr/>
+          <w:p>
+            <w:pPr>
+              <w:pStyle w:val="Compact"/>
+            </w:pPr>
+            <w:r>
+              <w:t xml:space="preserve">21</w:t>
+            </w:r>
+          </w:p>
+        </w:tc>
+        <w:tc>
+          <w:tcPr/>
+          <w:p>
+            <w:pPr>
+              <w:pStyle w:val="Compact"/>
+            </w:pPr>
+            <w:r>
+              <w:rPr>
+                <w:i/>
+                <w:iCs/>
+              </w:rPr>
+              <w:t xml:space="preserve">E. coli</w:t>
+            </w:r>
+            <w:r>
+              <w:t xml:space="preserve"> </w:t>
+            </w:r>
+            <w:r>
+              <w:t xml:space="preserve">O157:H7 collection</w:t>
+            </w:r>
+          </w:p>
+        </w:tc>
+        <w:tc>
+          <w:tcPr/>
+          <w:p>
+            <w:pPr>
+              <w:pStyle w:val="Compact"/>
+            </w:pPr>
+            <w:r>
+              <w:t xml:space="preserve">real</w:t>
+            </w:r>
+          </w:p>
+        </w:tc>
+        <w:tc>
+          <w:tcPr/>
+          <w:p>
+            <w:pPr>
+              <w:pStyle w:val="Compact"/>
+            </w:pPr>
+            <w:r>
+              <w:t xml:space="preserve">74 genomes from Fitzgerald et al. (2021); 2,701 pairs</w:t>
+            </w:r>
+          </w:p>
+        </w:tc>
+        <w:tc>
+          <w:tcPr/>
+          <w:p>
+            <w:pPr>
+              <w:pStyle w:val="Compact"/>
+            </w:pPr>
+            <w:r>
+              <w:t xml:space="preserve">lineage, host source</w:t>
+            </w:r>
+          </w:p>
+        </w:tc>
+        <w:tc>
+          <w:tcPr/>
+          <w:p>
+            <w:pPr>
+              <w:pStyle w:val="Compact"/>
+            </w:pPr>
+            <w:r>
+              <w:t xml:space="preserve">Results; Fig. S15</w:t>
+            </w:r>
+          </w:p>
+        </w:tc>
+      </w:tr>
+      <w:tr>
+        <w:tc>
+          <w:tcPr/>
+          <w:p>
+            <w:pPr>
+              <w:pStyle w:val="Compact"/>
+            </w:pPr>
+            <w:r>
+              <w:t xml:space="preserve">22</w:t>
+            </w:r>
+          </w:p>
+        </w:tc>
+        <w:tc>
+          <w:tcPr/>
+          <w:p>
+            <w:pPr>
+              <w:pStyle w:val="Compact"/>
+            </w:pPr>
+            <w:r>
+              <w:t xml:space="preserve">FDA-ARGOS</w:t>
+            </w:r>
+            <w:r>
+              <w:t xml:space="preserve"> </w:t>
+            </w:r>
+            <w:r>
+              <w:rPr>
+                <w:i/>
+                <w:iCs/>
+              </w:rPr>
+              <w:t xml:space="preserve">S. aureus</w:t>
+            </w:r>
+          </w:p>
+        </w:tc>
+        <w:tc>
+          <w:tcPr/>
+          <w:p>
+            <w:pPr>
+              <w:pStyle w:val="Compact"/>
+            </w:pPr>
+            <w:r>
+              <w:t xml:space="preserve">real</w:t>
+            </w:r>
+          </w:p>
+        </w:tc>
+        <w:tc>
+          <w:tcPr/>
+          <w:p>
+            <w:pPr>
+              <w:pStyle w:val="Compact"/>
+            </w:pPr>
+            <w:r>
+              <w:t xml:space="preserve">122 genomes; 7,381 refined pairs</w:t>
+            </w:r>
+          </w:p>
+        </w:tc>
+        <w:tc>
+          <w:tcPr/>
+          <w:p>
+            <w:pPr>
+              <w:pStyle w:val="Compact"/>
+            </w:pPr>
+            <w:r>
+              <w:t xml:space="preserve">country, isolation source</w:t>
+            </w:r>
+          </w:p>
+        </w:tc>
+        <w:tc>
+          <w:tcPr/>
+          <w:p>
+            <w:pPr>
+              <w:pStyle w:val="Compact"/>
+            </w:pPr>
+            <w:r>
+              <w:t xml:space="preserve">Results; Fig. S16</w:t>
+            </w:r>
+          </w:p>
+        </w:tc>
+      </w:tr>
+      <w:tr>
+        <w:tc>
+          <w:tcPr/>
+          <w:p>
+            <w:pPr>
+              <w:pStyle w:val="Compact"/>
+            </w:pPr>
+            <w:r>
+              <w:t xml:space="preserve">23</w:t>
+            </w:r>
+          </w:p>
+        </w:tc>
+        <w:tc>
+          <w:tcPr/>
+          <w:p>
+            <w:pPr>
+              <w:pStyle w:val="Compact"/>
+            </w:pPr>
+            <w:r>
+              <w:rPr>
+                <w:i/>
+                <w:iCs/>
+              </w:rPr>
               <w:t xml:space="preserve">B. longum</w:t>
             </w:r>
             <w:r>
@@ -8533,8 +9488,8 @@
         </w:tc>
       </w:tr>
     </w:tbl>
-    <w:bookmarkEnd w:id="44"/>
     <w:bookmarkEnd w:id="45"/>
+    <w:bookmarkEnd w:id="46"/>
     <w:sectPr>
       <w:footnotePr>
         <w:numRestart w:val="eachSect"/>

</xml_diff>

<commit_message>
Add manuscript Word export for review
Author: HuangShiLab <huanglab07@gmail.com>
</commit_message>
<xml_diff>
--- a/paper/manuscript/manuscript_nature_methods.docx
+++ b/paper/manuscript/manuscript_nature_methods.docx
@@ -2,6 +2,32 @@
 <file path=word/document.xml><?xml version="1.0" encoding="utf-8"?>
 <w:document xmlns:w="http://schemas.openxmlformats.org/wordprocessingml/2006/main" xmlns:m="http://schemas.openxmlformats.org/officeDocument/2006/math" xmlns:r="http://schemas.openxmlformats.org/officeDocument/2006/relationships" xmlns:o="urn:schemas-microsoft-com:office:office" xmlns:v="urn:schemas-microsoft-com:vml" xmlns:w10="urn:schemas-microsoft-com:office:word" xmlns:a="http://schemas.openxmlformats.org/drawingml/2006/main" xmlns:pic="http://schemas.openxmlformats.org/drawingml/2006/picture" xmlns:wp="http://schemas.openxmlformats.org/drawingml/2006/wordprocessingDrawing">
   <w:body>
+    <w:sdt>
+      <w:sdtPr>
+        <w:docPartObj>
+          <w:docPartGallery w:val="Table of Contents"/>
+          <w:docPartUnique/>
+        </w:docPartObj>
+      </w:sdtPr>
+      <w:sdtContent>
+        <w:p>
+          <w:pPr>
+            <w:pStyle w:val="TOCHeading"/>
+          </w:pPr>
+          <w:r>
+            <w:t xml:space="preserve">Table of Contents</w:t>
+          </w:r>
+        </w:p>
+        <w:p>
+          <w:r>
+            <w:fldChar w:fldCharType="begin" w:dirty="true"/>
+            <w:instrText xml:space="preserve">TOC \o "1-2" \h \z \u</w:instrText>
+            <w:fldChar w:fldCharType="separate"/>
+            <w:fldChar w:fldCharType="end"/>
+          </w:r>
+        </w:p>
+      </w:sdtContent>
+    </w:sdt>
     <w:bookmarkStart w:id="46" w:name="Xe400126ade8f1e4d28af479649ace7c1902f082"/>
     <w:p>
       <w:pPr>
@@ -101,7 +127,7 @@
         <w:pStyle w:val="FirstParagraph"/>
       </w:pPr>
       <w:r>
-        <w:t xml:space="preserve">Average Nucleotide Identity (ANI) is the standard metric for prokaryotic species delineation, yet alignment-free tools reduce a genome comparison to a single divergence scalar and discard synteny and structural information. We introduce Syn2bANI, which uses in-silico Type IIB restriction enzyme tags as fixed positional anchors, chains shared anchors collinearly, and estimates ANI by maximum likelihood from tags inside trusted chains. A per-pair effect-size gate chooses between uniform and gamma rate models; a ridge calibration trained on alignment-based truth corrects real-genome rate heterogeneity where it matters most. In one pass the same anchors yield aligned fraction, an anchor adjacency, and structural-variant calls. On simulations with exact truth Syn2bANI attains MAE 0.073% versus 0.377% (skani) and 0.742% (FastANI), and remains robust to indels, GC variation, accessory content, and fragmentation. On 43,334 held-out GTDB-R207 pairs the calibrated estimator achieves MAE 0.619% against ANIm, compared with 0.957% for skani and 0.977% for FastANI; a hybrid rule restores skani-level accuracy in the near-clonal 97–100% regime. Syn2bANI is implemented in Rust and available at https://github.com/HuangShiLab/Syn2bANI.</w:t>
+        <w:t xml:space="preserve">Average Nucleotide Identity (ANI) is the standard metric for prokaryotic species delineation, yet alignment-free tools reduce a genome comparison to a single divergence scalar and discard synteny and structural information. We introduce Syn2bANI, which uses in-silico Type IIB restriction enzyme tags as fixed positional anchors, chains shared anchors collinearly, and estimates ANI by maximum likelihood from tags inside trusted chains. A per-pair effect-size gate chooses between uniform and gamma rate models; a ridge calibration trained on alignment-based truth corrects real-genome rate heterogeneity where it matters most. In one pass the same anchors yield aligned fraction, an anchor-adjacency conservation score, breakpoint counts, inversion/translocation calls, and indel sizes. On simulations with exact truth Syn2bANI attains MAE 0.073% versus 0.377% (skani) and 0.742% (FastANI), and remains robust to indels, GC variation, accessory content, and fragmentation. On 43,334 held-out GTDB-R207 pairs the calibrated estimator achieves MAE 0.619% against ANIm, compared with 0.957% for skani and 0.977% for FastANI; a hybrid rule restores skani-level accuracy in the near-clonal 97–100% regime. Case studies show that these structural outputs distinguish phenotype- and lineage-associated loci and rearrangements that genome-wide ANI cannot. Syn2bANI is implemented in Rust and available at https://github.com/HuangShiLab/Syn2bANI.</w:t>
       </w:r>
     </w:p>
     <w:p>
@@ -141,7 +167,7 @@
         <w:pStyle w:val="FirstParagraph"/>
       </w:pPr>
       <w:r>
-        <w:t xml:space="preserve">Average Nucleotide Identity (ANI) — the mean nucleotide identity of orthologous regions shared by two genomes — underpins prokaryotic species delineation and strain-level relatedness1,2. It is computed at scale in dereplication pipelines, outbreak investigations, and metagenomic surveys, increasingly on metagenome-assembled genomes (MAGs) that are fragmented by construction3.</w:t>
+        <w:t xml:space="preserve">Average Nucleotide Identity (ANI) — the mean nucleotide identity of orthologous regions shared by two genomes — underpins prokaryotic species delineation and strain-level relatedness1,2. It is computed at scale in dereplication pipelines16, outbreak investigations, and metagenomic surveys, increasingly on metagenome-assembled genomes (MAGs) that are fragmented by construction3.</w:t>
       </w:r>
     </w:p>
     <w:p>
@@ -729,7 +755,22 @@
         <w:pStyle w:val="FirstParagraph"/>
       </w:pPr>
       <w:r>
-        <w:t xml:space="preserve">ANI is a scalar average and therefore blind to genome architecture. Syn2bANI reports three structurally informative quantities from the same anchor chains:</w:t>
+        <w:t xml:space="preserve">ANI is a scalar average and therefore blind to genome architecture. Syn2bANI reports several structurally informative quantities from the same anchor chains.</w:t>
+      </w:r>
+      <w:r>
+        <w:t xml:space="preserve"> </w:t>
+      </w:r>
+      <w:r>
+        <w:rPr>
+          <w:rStyle w:val="VerbatimChar"/>
+        </w:rPr>
+        <w:t xml:space="preserve">raw_inverted_fraction</w:t>
+      </w:r>
+      <w:r>
+        <w:t xml:space="preserve"> </w:t>
+      </w:r>
+      <w:r>
+        <w:t xml:space="preserve">is the primary length-weighted rearrangement signal: it measures the fraction of the shared genome that maps in the reverse orientation and is invariant to assembly fragmentation.</w:t>
       </w:r>
       <w:r>
         <w:t xml:space="preserve"> </w:t>
@@ -741,7 +782,10 @@
         <w:t xml:space="preserve">breakpoint_count</w:t>
       </w:r>
       <w:r>
-        <w:t xml:space="preserve">, the number of chain-disrupting orientation flips and large indels;</w:t>
+        <w:t xml:space="preserve"> </w:t>
+      </w:r>
+      <w:r>
+        <w:t xml:space="preserve">is a count-based descriptor of chain-disrupting orientation flips, reference-order violations, and large indels; it is useful but must be interpreted with contig-count control because fragmented assemblies inflate it.</w:t>
       </w:r>
       <w:r>
         <w:t xml:space="preserve"> </w:t>
@@ -753,7 +797,10 @@
         <w:t xml:space="preserve">anchor_adjacency</w:t>
       </w:r>
       <w:r>
-        <w:t xml:space="preserve">, the fraction of chained-anchor adjacencies that remain collinear; and</w:t>
+        <w:t xml:space="preserve"> </w:t>
+      </w:r>
+      <w:r>
+        <w:t xml:space="preserve">is a local anchor-order conservation metric, not a proxy for base-pair synteny.</w:t>
       </w:r>
       <w:r>
         <w:t xml:space="preserve"> </w:t>
@@ -765,52 +812,25 @@
         <w:t xml:space="preserve">af_query</w:t>
       </w:r>
       <w:r>
-        <w:t xml:space="preserve">, the base-pair fraction of the query covered by chains.</w:t>
-      </w:r>
-      <w:r>
-        <w:t xml:space="preserve"> </w:t>
-      </w:r>
-      <w:r>
-        <w:rPr>
-          <w:rStyle w:val="VerbatimChar"/>
-        </w:rPr>
-        <w:t xml:space="preserve">breakpoint_count</w:t>
-      </w:r>
-      <w:r>
-        <w:t xml:space="preserve"> </w:t>
-      </w:r>
-      <w:r>
-        <w:t xml:space="preserve">is the primary rearrangement statistic;</w:t>
-      </w:r>
-      <w:r>
-        <w:t xml:space="preserve"> </w:t>
-      </w:r>
-      <w:r>
-        <w:rPr>
-          <w:rStyle w:val="VerbatimChar"/>
-        </w:rPr>
-        <w:t xml:space="preserve">anchor_adjacency</w:t>
-      </w:r>
-      <w:r>
-        <w:t xml:space="preserve"> </w:t>
-      </w:r>
-      <w:r>
-        <w:t xml:space="preserve">is an anchor-adjacency conservation metric;</w:t>
-      </w:r>
-      <w:r>
-        <w:t xml:space="preserve"> </w:t>
-      </w:r>
-      <w:r>
-        <w:rPr>
-          <w:rStyle w:val="VerbatimChar"/>
-        </w:rPr>
-        <w:t xml:space="preserve">af_query</w:t>
-      </w:r>
-      <w:r>
-        <w:t xml:space="preserve"> </w:t>
-      </w:r>
-      <w:r>
-        <w:t xml:space="preserve">is the coverage metric that corresponds to alignment-based aligned fraction.</w:t>
+        <w:t xml:space="preserve"> </w:t>
+      </w:r>
+      <w:r>
+        <w:t xml:space="preserve">is the base-pair fraction of the query covered by chains and corresponds to alignment-based aligned fraction.</w:t>
+      </w:r>
+      <w:r>
+        <w:t xml:space="preserve"> </w:t>
+      </w:r>
+      <w:r>
+        <w:rPr>
+          <w:rStyle w:val="VerbatimChar"/>
+        </w:rPr>
+        <w:t xml:space="preserve">synteny_blocks</w:t>
+      </w:r>
+      <w:r>
+        <w:t xml:space="preserve"> </w:t>
+      </w:r>
+      <w:r>
+        <w:t xml:space="preserve">is the raw chain count and is reported as an assembly-structure diagnostic rather than a rearrangement metric.</w:t>
       </w:r>
     </w:p>
     <w:p>
@@ -818,7 +838,7 @@
         <w:pStyle w:val="BodyText"/>
       </w:pPr>
       <w:r>
-        <w:t xml:space="preserve">We quantified this on four published isolate collections from a recent synteny-based strain-tracking study10. In a longitudinal</w:t>
+        <w:t xml:space="preserve">We quantified the ANI–structure decoupling on four published isolate collections from a recent synteny-based strain-tracking study10. In a longitudinal</w:t>
       </w:r>
       <w:r>
         <w:t xml:space="preserve"> </w:t>
@@ -834,7 +854,7 @@
         <w:t xml:space="preserve"> </w:t>
       </w:r>
       <w:r>
-        <w:t xml:space="preserve">hypermutator lineage, every cross-time pair with ANI &gt;99.9% shows an anchor adjacency of only 0.70–0.76 and 850–1,130 breakpoints. Re-analysis with</w:t>
+        <w:t xml:space="preserve">hypermutator lineage, every cross-time pair with ANI &gt;99.9% shows 850–1,130 Syn2bANI breakpoints. Re-analysis with</w:t>
       </w:r>
       <w:r>
         <w:t xml:space="preserve"> </w:t>
@@ -865,7 +885,7 @@
         <w:t xml:space="preserve"> </w:t>
       </w:r>
       <w:r>
-        <w:t xml:space="preserve">same-host pairs cluster at ANI &gt;99.9% but the lowest-anchor-adjacency cases carry 44–63 breakpoints.</w:t>
+        <w:t xml:space="preserve">same-host pairs cluster at ANI &gt;99.9% but carry 44–63 breakpoints in the lowest-synteny cases.</w:t>
       </w:r>
       <w:r>
         <w:t xml:space="preserve"> </w:t>
@@ -913,7 +933,7 @@
         <w:t xml:space="preserve"> </w:t>
       </w:r>
       <w:r>
-        <w:t xml:space="preserve">reaching 2,957 breakpoints at 99.9945% ANI (Fig. 6b; Supplementary Fig. S11).</w:t>
+        <w:t xml:space="preserve">reaching 2,957 breakpoints at 99.9945% ANI (Fig. 6c,d).</w:t>
       </w:r>
     </w:p>
     <w:p>
@@ -956,14 +976,6 @@
         <w:t xml:space="preserve">genomes, 7,381 refined pairs have mean ANI 98.72% and mean breakpoint count 24, with pairs at 100% ANI still showing &gt;150 breakpoints (Supplementary Fig. S16). These collections are not exceptional: they exemplify why an ANI-only similarity search can return genomes that are nearly identical in average sequence but differ by hundreds of rearrangements.</w:t>
       </w:r>
     </w:p>
-    <w:p>
-      <w:pPr>
-        <w:pStyle w:val="BodyText"/>
-      </w:pPr>
-      <w:r>
-        <w:t xml:space="preserve">The same pattern appears at database scale. Among 336 GTDB-R207 representative pairs with ANI ≥ 99.0% and aligned fraction ≥ 0.9 in both directions, 7.4% have an anchor adjacency &lt; 0.99 and 2.4% fall below 0.98 — i.e. pairs an ANI-only search would return as near-clonal yet which are structurally divergent.</w:t>
-      </w:r>
-    </w:p>
     <w:bookmarkEnd w:id="18"/>
     <w:bookmarkStart w:id="19" w:name="X92400c92582d6c59801983ff28fc6c6eb37ec86"/>
     <w:p>
@@ -1054,7 +1066,16 @@
         <w:t xml:space="preserve"> </w:t>
       </w:r>
       <w:r>
-        <w:t xml:space="preserve">(the raw chain count) is dominated by assembly fragmentation (62% of its variance tracks contig count) and is therefore reported as an assembly-structure diagnostic rather than a rearrangement metric.</w:t>
+        <w:t xml:space="preserve">(the raw chain count) is dominated by assembly fragmentation (62% of its variance tracks contig count) and is therefore reported as an assembly-structure diagnostic rather than a rearrangement metric. The mathematical distinction between count-based and ratio-based synteny metrics, and the fragmentation invariance of the latter, is derived in the companion Syn2b repository (</w:t>
+      </w:r>
+      <w:r>
+        <w:rPr>
+          <w:rStyle w:val="VerbatimChar"/>
+        </w:rPr>
+        <w:t xml:space="preserve">docs/MATH_REVIEW.md</w:t>
+      </w:r>
+      <w:r>
+        <w:t xml:space="preserve">; https://github.com/HuangShiLab/Syn2b).</w:t>
       </w:r>
     </w:p>
     <w:p>
@@ -1074,7 +1095,22 @@
         <w:t xml:space="preserve">inverted_fraction</w:t>
       </w:r>
       <w:r>
-        <w:t xml:space="preserve">, avoids the fragmentation confounder by construction. In fixed-reference mode it agrees one-to-one with dnadiff across the held-out set (Pearson r = 0.936) and is near-exact in the strain range (r = 0.996, slope 1.006, intercept −0.004 for ANIm ≥ 97%; Supplementary Fig. S14). A closed-form standard-error model based on the number of shared landmarks reproduces the observed spread (R² = 0.999 across divergence bins), so each reported inversion fraction can carry its own uncertainty.</w:t>
+        <w:t xml:space="preserve">, avoids the fragmentation confounder by construction. In fixed-reference mode it agrees one-to-one with dnadiff across the held-out set (Pearson r = 0.936) and is near-exact in the strain range (r = 0.996, slope 1.006, intercept −0.004 for ANIm ≥ 97%; Supplementary Fig. S14). A closed-form standard-error model based on the number of shared landmarks reproduces the observed spread (R² = 0.999 across divergence bins), so each reported inversion fraction can carry its own uncertainty. The detection-power limits underlying these resolution numbers are characterized in</w:t>
+      </w:r>
+      <w:r>
+        <w:t xml:space="preserve"> </w:t>
+      </w:r>
+      <w:r>
+        <w:rPr>
+          <w:rStyle w:val="VerbatimChar"/>
+        </w:rPr>
+        <w:t xml:space="preserve">docs/PHASE2_DETECTION_POWER.md</w:t>
+      </w:r>
+      <w:r>
+        <w:t xml:space="preserve"> </w:t>
+      </w:r>
+      <w:r>
+        <w:t xml:space="preserve">of the same repository (https://github.com/HuangShiLab/Syn2b).</w:t>
       </w:r>
     </w:p>
     <w:p>
@@ -1136,7 +1172,7 @@
       </w:r>
     </w:p>
     <w:bookmarkEnd w:id="20"/>
-    <w:bookmarkStart w:id="21" w:name="Xd88170c4b874097551b82a98016fb92a8960384"/>
+    <w:bookmarkStart w:id="21" w:name="X3b2998716b6c25b524acc27a4ab539ef1aae1e0"/>
     <w:p>
       <w:pPr>
         <w:pStyle w:val="Heading3"/>
@@ -1158,7 +1194,7 @@
         <w:t xml:space="preserve"> </w:t>
       </w:r>
       <w:r>
-        <w:t xml:space="preserve">is invisible to ANI but associated with disease stage</w:t>
+        <w:t xml:space="preserve">is invisible to ANI and tracks lineage</w:t>
       </w:r>
     </w:p>
     <w:p>
@@ -1226,7 +1262,7 @@
         <w:t xml:space="preserve">partial</w:t>
       </w:r>
       <w:r>
-        <w:t xml:space="preserve">, only 12 (2.3%) retained a collinear complete island (</w:t>
+        <w:t xml:space="preserve">, 145 (27.5%) retained a collinear complete island (</w:t>
       </w:r>
       <w:r>
         <w:rPr>
@@ -1235,7 +1271,7 @@
         <w:t xml:space="preserve">complete_collinear</w:t>
       </w:r>
       <w:r>
-        <w:t xml:space="preserve">), and 420 (79.6%) retained the markers but carried a detectable inversion or translocation inside cagPAI (</w:t>
+        <w:t xml:space="preserve">), and 287 (54.4%) retained the markers but carried a local inversion or translocation inside cagPAI (</w:t>
       </w:r>
       <w:r>
         <w:rPr>
@@ -1244,7 +1280,23 @@
         <w:t xml:space="preserve">complete_rearranged</w:t>
       </w:r>
       <w:r>
-        <w:t xml:space="preserve">; Fig. 8a). The extended state was strongly associated with FastBAPS lineage (χ² = 58.68, df = 12, p = 3.9 × 10⁻⁸) and with disease stage across Correa’s cascade (χ² = 27.91, df = 9, p = 9.9 × 10⁻⁴). Gastric-cancer cases had the lowest</w:t>
+        <w:t xml:space="preserve">; Fig. 8a). The remaining 133 complete-marker genomes that were originally classified as rearranged carried a single genome-spanning call consistent with a different arbitrary start coordinate on the circular</w:t>
+      </w:r>
+      <w:r>
+        <w:t xml:space="preserve"> </w:t>
+      </w:r>
+      <w:r>
+        <w:rPr>
+          <w:i/>
+          <w:iCs/>
+        </w:rPr>
+        <w:t xml:space="preserve">H. pylori</w:t>
+      </w:r>
+      <w:r>
+        <w:t xml:space="preserve"> </w:t>
+      </w:r>
+      <w:r>
+        <w:t xml:space="preserve">chromosome; these were reclassified as collinear after circular-origin filtering (Online Methods). The extended state remained strongly associated with FastBAPS lineage (χ² = 58.75, df = 12, p = 3.8 × 10⁻⁸), but the disease-stage association was attenuated and no longer significant after stratifying by lineage (Cochran–Mantel–Haenszel p = 0.24 for gastric-cancer vs non-atrophic-gastritis presence, p = 0.37 for rearrangement, p = 0.21 and p = 0.49 for the advanced vs early contrasts; Supplementary Table S8). Thus, the architecture–disease signal in this collection is largely driven by lineage structure, not by disease stage per se. The key biological result that survives stratification is lineage-associated cagPAI presence/absence:</w:t>
       </w:r>
       <w:r>
         <w:t xml:space="preserve"> </w:t>
@@ -1259,37 +1311,7 @@
         <w:t xml:space="preserve"> </w:t>
       </w:r>
       <w:r>
-        <w:t xml:space="preserve">rate (7.6%) and the highest</w:t>
-      </w:r>
-      <w:r>
-        <w:t xml:space="preserve"> </w:t>
-      </w:r>
-      <w:r>
-        <w:rPr>
-          <w:rStyle w:val="VerbatimChar"/>
-        </w:rPr>
-        <w:t xml:space="preserve">complete_collinear</w:t>
-      </w:r>
-      <w:r>
-        <w:t xml:space="preserve"> </w:t>
-      </w:r>
-      <w:r>
-        <w:t xml:space="preserve">rate (4.2%), whereas non-atrophic gastritis cases had the highest</w:t>
-      </w:r>
-      <w:r>
-        <w:t xml:space="preserve"> </w:t>
-      </w:r>
-      <w:r>
-        <w:rPr>
-          <w:rStyle w:val="VerbatimChar"/>
-        </w:rPr>
-        <w:t xml:space="preserve">empty</w:t>
-      </w:r>
-      <w:r>
-        <w:t xml:space="preserve"> </w:t>
-      </w:r>
-      <w:r>
-        <w:t xml:space="preserve">rate (23.4%; Fig. 8b). Because all pairwise ANIs in this collection are &gt;95%, these architecture-disease associations are inaccessible to ANI-only tools and illustrate how Syn2bANI’s structural output can reveal genotype-phenotype relationships that ANI alone cannot.</w:t>
+        <w:t xml:space="preserve">rates range from 4% in FastBAPS L2 to 33% in L6. Because all pairwise ANIs in this collection are &gt;95%, these presence/absence and architecture patterns are invisible to ANI-only tools and illustrate how Syn2bANI’s structural output can reveal genotype–population relationships that ANI alone cannot.</w:t>
       </w:r>
     </w:p>
     <w:bookmarkEnd w:id="21"/>
@@ -1376,7 +1398,25 @@
         <w:pStyle w:val="FirstParagraph"/>
       </w:pPr>
       <w:r>
-        <w:t xml:space="preserve">Syn2bANI demonstrates that fixed restriction-site anchors can support accurate, interpretable ANI estimation while additionally yielding synteny and structural information in the same computational pass. The chain-restricted likelihood cleanly separates divergence from shared content, and the calibration layer corrects the rate-heterogeneity bias that simulations alone fail to predict. Three boundaries are worth stating. First, skani remains faster for very large all-vs-all screens and is more accurate in the near-clonal 97–100% regime; the hybrid rule lets Syn2bANI recover the best raw estimate there. Second, the v5 calibration is trained on complete genomes and should not be silently applied to MAGs or mid-ANI pairs — the raw gated estimate is preferred for draft inputs, and the consistency flag marks pairs at the identifiability boundary. Third, the structural outputs are a direct consequence of using coordinate-carrying anchors: in an era of strain-resolved metagenomics, ANI alone is insufficient to decide whether two genomes are truly equivalent, and breakpoint counts, synteny blocks, and SV calls provide a second, biologically interpretable axis of comparison. Unlike dedicated structural tools such as minigraph-Cactus19, SyRI20, or Mauve21, Syn2bANI does not aim to reconstruct full genome graphs or base-level alignments; instead it reports breakpoint counts, inversion/translocation calls, and a chain-coverage score directly from the anchor chains used for ANI estimation, at no additional modeling cost.</w:t>
+        <w:t xml:space="preserve">Syn2bANI demonstrates that fixed restriction-site anchors can support accurate, interpretable ANI estimation while additionally yielding synteny and structural information in the same computational pass. The chain-restricted likelihood cleanly separates divergence from shared content, and the calibration layer corrects the rate-heterogeneity bias that simulations alone fail to predict. Three boundaries are worth stating. First, skani remains faster for very large all-vs-all screens and is more accurate in the near-clonal 97–100% regime; the hybrid rule lets Syn2bANI recover the best raw estimate there. Second, the v5 calibration is trained on complete genomes and should not be silently applied to MAGs or mid-ANI pairs — the raw gated estimate is preferred for draft inputs, and the consistency flag marks pairs at the identifiability boundary. Third, the structural outputs are a direct consequence of using coordinate-carrying anchors: in an era of strain-resolved metagenomics, ANI alone is insufficient to decide whether two genomes are truly equivalent. Syn2bANI reports both count-based descriptors (</w:t>
+      </w:r>
+      <w:r>
+        <w:rPr>
+          <w:rStyle w:val="VerbatimChar"/>
+        </w:rPr>
+        <w:t xml:space="preserve">breakpoint_count</w:t>
+      </w:r>
+      <w:r>
+        <w:t xml:space="preserve">, SV calls) and a fragmentation-invariant length-weighted orientation ratio (</w:t>
+      </w:r>
+      <w:r>
+        <w:rPr>
+          <w:rStyle w:val="VerbatimChar"/>
+        </w:rPr>
+        <w:t xml:space="preserve">raw_inverted_fraction</w:t>
+      </w:r>
+      <w:r>
+        <w:t xml:space="preserve">). These are complementary: counts localize events but are inflated by assembly fragmentation, whereas ratios are robust to fragmentation but do not report event number. For circular chromosomes, genome-spanning calls must be filtered as likely coordinate-system artifacts before biological interpretation. Unlike dedicated structural tools such as minigraph-Cactus19, SyRI20, or Mauve21, Syn2bANI does not aim to reconstruct full genome graphs or base-level alignments; instead it reports breakpoint counts, inversion/translocation calls, and a chain-coverage score directly from the anchor chains used for ANI estimation, at no additional modeling cost.</w:t>
       </w:r>
     </w:p>
     <w:p>
@@ -1434,6 +1474,29 @@
         <w:pStyle w:val="BodyText"/>
       </w:pPr>
       <w:r>
+        <w:t xml:space="preserve">The default four-enzyme panel was chosen from the 16-member 2bRAD-M catalog by a greedy search that maximized GTDB-R207 ANIm calibration accuracy while keeping tag density and runtime low. Among single-enzyme candidates, BcgI gave the best individual accuracy; adding AlfI, AloI, and FalI in turn reduced per-band MAE by improving genomic coverage and balancing recognition-site GC composition. Panels beyond four enzymes gave diminishing returns (&lt;0.05 MAE improvement) and increased runtime, so the four-enzyme set is shipped as the default. All 16 enzymes remain selectable via the</w:t>
+      </w:r>
+      <w:r>
+        <w:t xml:space="preserve"> </w:t>
+      </w:r>
+      <w:r>
+        <w:rPr>
+          <w:rStyle w:val="VerbatimChar"/>
+        </w:rPr>
+        <w:t xml:space="preserve">--enzymes</w:t>
+      </w:r>
+      <w:r>
+        <w:t xml:space="preserve"> </w:t>
+      </w:r>
+      <w:r>
+        <w:t xml:space="preserve">flag.</w:t>
+      </w:r>
+    </w:p>
+    <w:p>
+      <w:pPr>
+        <w:pStyle w:val="BodyText"/>
+      </w:pPr>
+      <w:r>
         <w:t xml:space="preserve">For the likelihood, each enzyme carries a site geometry</w:t>
       </w:r>
       <w:r>
@@ -1638,19 +1701,68 @@
         <w:pStyle w:val="FirstParagraph"/>
       </w:pPr>
       <w:r>
-        <w:t xml:space="preserve">For a query tag inside a chained region, with tag length k, recognition-site length s, mutable body b = k − s, and mismatch budget tol, the outcome probabilities under per-base identity a are: found with m body mismatches, P_m(a) = C(b, m)·(1−a)</w:t>
-      </w:r>
-      <w:r>
-        <w:rPr>
-          <w:vertAlign w:val="superscript"/>
-        </w:rPr>
-        <w:t xml:space="preserve">m·a</w:t>
-      </w:r>
-      <w:r>
-        <w:t xml:space="preserve">(k−m) for m ≤ tol; not found, P_miss(a) = 1 − Σ P_m(a). Mismatches are observable only in the body — a site mutation deletes the tag — so the site contributes a^s but never appears in the histogram; this also sets a hard retention ceiling (~0.72 at 95% ANI, ~0.50 at 90%). The log-likelihood is summed over per-enzyme strata (each with its own k and b) and maximized over the scalar a by golden-section search. Two partial estimators —</w:t>
-      </w:r>
-      <w:r>
-        <w:t xml:space="preserve"> </w:t>
+        <w:t xml:space="preserve">The estimator is a chain-restricted maximum-likelihood fit to per-enzyme tag</w:t>
+      </w:r>
+      <w:r>
+        <w:t xml:space="preserve"> </w:t>
+      </w:r>
+      <w:r>
+        <w:t xml:space="preserve">outcomes. For each stratum, tags inside chains are classified as found with 0,</w:t>
+      </w:r>
+      <w:r>
+        <w:t xml:space="preserve"> </w:t>
+      </w:r>
+      <w:r>
+        <w:t xml:space="preserve">1, or 2 body mismatches, or missing; the per-base identity</w:t>
+      </w:r>
+      <w:r>
+        <w:t xml:space="preserve"> </w:t>
+      </w:r>
+      <w:r>
+        <w:rPr>
+          <w:rStyle w:val="VerbatimChar"/>
+        </w:rPr>
+        <w:t xml:space="preserve">a</w:t>
+      </w:r>
+      <w:r>
+        <w:t xml:space="preserve"> </w:t>
+      </w:r>
+      <w:r>
+        <w:t xml:space="preserve">is found by</w:t>
+      </w:r>
+      <w:r>
+        <w:t xml:space="preserve"> </w:t>
+      </w:r>
+      <w:r>
+        <w:t xml:space="preserve">golden-section search on a likelihood that respects the recognition-site</w:t>
+      </w:r>
+      <w:r>
+        <w:t xml:space="preserve"> </w:t>
+      </w:r>
+      <w:r>
+        <w:t xml:space="preserve">geometry (a site mutation deletes the tag, so only body mismatches are</w:t>
+      </w:r>
+      <w:r>
+        <w:t xml:space="preserve"> </w:t>
+      </w:r>
+      <w:r>
+        <w:t xml:space="preserve">observable). A gamma rate-heterogeneity extension is available but is</w:t>
+      </w:r>
+      <w:r>
+        <w:t xml:space="preserve"> </w:t>
+      </w:r>
+      <w:r>
+        <w:rPr>
+          <w:b/>
+          <w:bCs/>
+        </w:rPr>
+        <w:t xml:space="preserve">gated</w:t>
+      </w:r>
+      <w:r>
+        <w:t xml:space="preserve"> </w:t>
+      </w:r>
+      <w:r>
+        <w:t xml:space="preserve">by an effect-size test on the two partial estimators (</w:t>
       </w:r>
       <w:r>
         <w:rPr>
@@ -1662,7 +1774,13 @@
         <w:t xml:space="preserve"> </w:t>
       </w:r>
       <w:r>
-        <w:t xml:space="preserve">(miss rate only) and</w:t>
+        <w:t xml:space="preserve">from the</w:t>
+      </w:r>
+      <w:r>
+        <w:t xml:space="preserve"> </w:t>
+      </w:r>
+      <w:r>
+        <w:t xml:space="preserve">miss channel and</w:t>
       </w:r>
       <w:r>
         <w:t xml:space="preserve"> </w:t>
@@ -1677,28 +1795,25 @@
         <w:t xml:space="preserve"> </w:t>
       </w:r>
       <w:r>
-        <w:t xml:space="preserve">(histogram only, renormalized by P(found)) — are independent estimates of the same quantity and power the diagnostics.</w:t>
-      </w:r>
-    </w:p>
-    <w:p>
-      <w:pPr>
-        <w:pStyle w:val="BodyText"/>
-      </w:pPr>
-      <w:r>
-        <w:t xml:space="preserve">The heterogeneous model gives each region a rate multiplier r ~ Gamma(α, α); because rate variation acts at kilobase scale while a tag is ~30 bp, all sites in a tag share one r, and integrating r out turns the mismatch count negative binomial with two parameters (mean divergence d, shape α) identifiable from the three histogram degrees of freedom plus the miss count. Guardrails: the second parameter is spent only when the likelihood-ratio statistic exceeds 3.841, and α is clamped to [0.1, 200]. Because the gamma shape and mean couple at the identifiability boundary when few tags survive (overshoots of 4–10 ANI points at mid-ANI), the shipped point estimate is</w:t>
-      </w:r>
-      <w:r>
-        <w:t xml:space="preserve"> </w:t>
-      </w:r>
-      <w:r>
-        <w:rPr>
-          <w:b/>
-          <w:bCs/>
-        </w:rPr>
-        <w:t xml:space="preserve">gated</w:t>
-      </w:r>
-      <w:r>
-        <w:t xml:space="preserve">: report the homogeneous fit when |ani_from_loss − ani_from_hist| &gt; 5 ANI points, else the gamma fit. The threshold is an effect size, not a significance level — significance-scaled variants invert their error ranking on GTDB — and was chosen at the flat optimum (4.5–6 points) of a threshold sweep on the GTDB-ANIm matrix. It fires on 5.5% of GTDB pairs (MAE 2.819 vs 2.881 always-gamma; per-pair oracle bound 2.788), on all 15 mid-ANI pairs (gamma MAE 4.48 → uniform fallback MAE 1.42), and never on uniform-rate sims, mosaic sims, or oral/gut same-species pairs, preserving gamma’s advantage exactly where it is real. The</w:t>
+        <w:t xml:space="preserve">from the mismatch histogram): when they diverge</w:t>
+      </w:r>
+      <w:r>
+        <w:t xml:space="preserve"> </w:t>
+      </w:r>
+      <w:r>
+        <w:t xml:space="preserve">by more than 5 ANI points the method reports the homogeneous fit, otherwise the</w:t>
+      </w:r>
+      <w:r>
+        <w:t xml:space="preserve"> </w:t>
+      </w:r>
+      <w:r>
+        <w:t xml:space="preserve">gamma fit. The threshold was chosen at the flat optimum of a sweep on the</w:t>
+      </w:r>
+      <w:r>
+        <w:t xml:space="preserve"> </w:t>
+      </w:r>
+      <w:r>
+        <w:t xml:space="preserve">GTDB-ANIm training matrix. The hierarchical</w:t>
       </w:r>
       <w:r>
         <w:t xml:space="preserve"> </w:t>
@@ -1728,7 +1843,7 @@
         <w:t xml:space="preserve"> </w:t>
       </w:r>
       <w:r>
-        <w:t xml:space="preserve">(expected retention &lt; 0.20; precedence),</w:t>
+        <w:t xml:space="preserve">(expected retention &lt; 0.20),</w:t>
       </w:r>
       <w:r>
         <w:t xml:space="preserve"> </w:t>
@@ -1743,7 +1858,13 @@
         <w:t xml:space="preserve"> </w:t>
       </w:r>
       <w:r>
-        <w:t xml:space="preserve">(the gate fell back, or the chains carry &gt; 0.5 rearrangement breakpoints per anchor — a structural statistic that does not share the chain-restricted likelihood denominator), else</w:t>
+        <w:t xml:space="preserve">(gate fallback or</w:t>
+      </w:r>
+      <w:r>
+        <w:t xml:space="preserve"> </w:t>
+      </w:r>
+      <w:r>
+        <w:t xml:space="preserve">&gt; 0.5 breakpoints per anchor), or</w:t>
       </w:r>
       <w:r>
         <w:t xml:space="preserve"> </w:t>
@@ -1755,7 +1876,13 @@
         <w:t xml:space="preserve">ok</w:t>
       </w:r>
       <w:r>
-        <w:t xml:space="preserve">. The recalibrated flag never inverts its error ranking on any validation set (kept vs flagged MAE: GTDB-ANIm 2.415 vs 4.153; oral/gut 0.514 vs 4.269; mid-ANI 0.343 vs 1.113), at a disclosed cost in near-clonal sensitivity.</w:t>
+        <w:t xml:space="preserve">. Full formulas, the negative-binomial</w:t>
+      </w:r>
+      <w:r>
+        <w:t xml:space="preserve"> </w:t>
+      </w:r>
+      <w:r>
+        <w:t xml:space="preserve">derivation, and the gating/flag rationale are given in Supplementary Note 4.</w:t>
       </w:r>
     </w:p>
     <w:bookmarkEnd w:id="27"/>
@@ -1911,10 +2038,13 @@
         <w:pStyle w:val="FirstParagraph"/>
       </w:pPr>
       <w:r>
-        <w:t xml:space="preserve">The calibration model is ridge regression on nine Syn2bANI-internal features —</w:t>
-      </w:r>
-      <w:r>
-        <w:t xml:space="preserve"> </w:t>
+        <w:t xml:space="preserve">The calibration model is ridge regression on nine Syn2bANI-internal features</w:t>
+      </w:r>
+      <w:r>
+        <w:t xml:space="preserve"> </w:t>
+      </w:r>
+      <w:r>
+        <w:t xml:space="preserve">(</w:t>
       </w:r>
       <w:r>
         <w:rPr>
@@ -2019,10 +2149,52 @@
         <w:t xml:space="preserve">n_tags_in_chains</w:t>
       </w:r>
       <w:r>
-        <w:t xml:space="preserve"> </w:t>
-      </w:r>
-      <w:r>
-        <w:t xml:space="preserve">— with median imputation and standardization, regularization α = 10 selected by inner cross-validation (scikit-learn29), trained on 2,520 ANIm-truth pairs (2,053 finite pairs from the stratified 2,074-pair GTDB benchmark plus 467 targeted 95.0–99.15% ANIm pairs from a skani screen of all 2.26 M same-genus GTDB-R207 pairs followed by dnadiff on 650 selected candidates; 607 species, 26 phyla, zero overlap with the existing set). Validation is</w:t>
+        <w:t xml:space="preserve">), with median imputation and</w:t>
+      </w:r>
+      <w:r>
+        <w:t xml:space="preserve"> </w:t>
+      </w:r>
+      <w:r>
+        <w:t xml:space="preserve">standardization. Regularization strength</w:t>
+      </w:r>
+      <w:r>
+        <w:t xml:space="preserve"> </w:t>
+      </w:r>
+      <w:r>
+        <w:rPr>
+          <w:rStyle w:val="VerbatimChar"/>
+        </w:rPr>
+        <w:t xml:space="preserve">α = 10</w:t>
+      </w:r>
+      <w:r>
+        <w:t xml:space="preserve"> </w:t>
+      </w:r>
+      <w:r>
+        <w:t xml:space="preserve">is selected by inner</w:t>
+      </w:r>
+      <w:r>
+        <w:t xml:space="preserve"> </w:t>
+      </w:r>
+      <w:r>
+        <w:t xml:space="preserve">cross-validation (scikit-learn29). The model is trained on 2,520 ANIm-truth pairs</w:t>
+      </w:r>
+      <w:r>
+        <w:t xml:space="preserve"> </w:t>
+      </w:r>
+      <w:r>
+        <w:t xml:space="preserve">(80–99.5% ANIm) spanning 607 species and 26 phyla, with zero genome-level overlap</w:t>
+      </w:r>
+      <w:r>
+        <w:t xml:space="preserve"> </w:t>
+      </w:r>
+      <w:r>
+        <w:t xml:space="preserve">between the 2,074-pair stratified benchmark and the 467-pair 95–99.5% expansion.</w:t>
+      </w:r>
+      <w:r>
+        <w:t xml:space="preserve"> </w:t>
+      </w:r>
+      <w:r>
+        <w:t xml:space="preserve">Validation is</w:t>
       </w:r>
       <w:r>
         <w:t xml:space="preserve"> </w:t>
@@ -2035,7 +2207,19 @@
         <w:t xml:space="preserve">band-holdout</w:t>
       </w:r>
       <w:r>
-        <w:t xml:space="preserve">: each of the four ANI bands (80–85, 85–90, 90–95, 95–99) is predicted by a model trained on the other three only. Training rows are shuffled with a fixed seed before CV (the inner KFold of the ridge CV is order-sensitive); seed spread over 5 seeds is ≤ 0.0015 MAE. An expanded 18-feature variant and a gradient-boosted model on the same features were evaluated and rejected (nonlinearity buys nothing at n ≈ 2,500, and the expanded set degrades out-of-distribution on near-clonal pairs). A learning-curve analysis (492/984/1,476/1,969 training pairs → CV MAE 0.952/0.902/0.887/0.893) shows the linear model plateaus at ~1,500 pairs. The model ships as a versioned JSON swapped into the binary; all feature matrices were re-run with the post-rescue binary before training, so there is no version skew between the shipped estimator and the deployed model. Calibrated output is a separate column (</w:t>
+        <w:t xml:space="preserve">: each ANI band (80–85, 85–90, 90–95, 95–99) is</w:t>
+      </w:r>
+      <w:r>
+        <w:t xml:space="preserve"> </w:t>
+      </w:r>
+      <w:r>
+        <w:t xml:space="preserve">predicted by a model trained on the other three only. Calibrated output is a</w:t>
+      </w:r>
+      <w:r>
+        <w:t xml:space="preserve"> </w:t>
+      </w:r>
+      <w:r>
+        <w:t xml:space="preserve">separate column (</w:t>
       </w:r>
       <w:r>
         <w:rPr>
@@ -2044,7 +2228,7 @@
         <w:t xml:space="preserve">--calibrate</w:t>
       </w:r>
       <w:r>
-        <w:t xml:space="preserve">); it returns no value on</w:t>
+        <w:t xml:space="preserve">) and is omitted on</w:t>
       </w:r>
       <w:r>
         <w:t xml:space="preserve"> </w:t>
@@ -2059,7 +2243,19 @@
         <w:t xml:space="preserve"> </w:t>
       </w:r>
       <w:r>
-        <w:t xml:space="preserve">pairs rather than extrapolating.</w:t>
+        <w:t xml:space="preserve">pairs rather</w:t>
+      </w:r>
+      <w:r>
+        <w:t xml:space="preserve"> </w:t>
+      </w:r>
+      <w:r>
+        <w:t xml:space="preserve">than extrapolated. Learning-curve, feature-expansion, and model-comparison</w:t>
+      </w:r>
+      <w:r>
+        <w:t xml:space="preserve"> </w:t>
+      </w:r>
+      <w:r>
+        <w:t xml:space="preserve">details are in Supplementary Notes 2 and 6.</w:t>
       </w:r>
     </w:p>
     <w:bookmarkEnd w:id="30"/>
@@ -2077,7 +2273,49 @@
         <w:pStyle w:val="FirstParagraph"/>
       </w:pPr>
       <w:r>
-        <w:t xml:space="preserve">The mechanistic alternative to calibration was evaluated in full (prototype in Python against 19 exact-truth mosaic simulations, then the GTDB-ANIm matrix). The bias decomposes into an in-chain distribution-family term — asymptotic in-chain MAE 2.25 for gamma, 1.25 for a capped grid NPMLE, so a nonparametric fit fixes at most ~0.1–0.2 GTDB MAE — and a coverage term: the divergence of the unchained fraction is not identifiable from tag data, since the out-of-chain anchor residual is ≈ 0 within multi-match noise whether the unchained mass is saturated-divergent or accessory, and an oracle given the exact identity of the chained sample still errs by MAE 1.36 against whole-genome truth. No candidate (AF-weighted mixtures, discrete mixtures, ascertainment-aware tilts, capped NPMLE with and without LRT gating, model averaging) beats the gated baseline while holding all simulation gates. The raw estimator is therefore at its identifiability floor at 4-enzyme tag density; this analysis is why calibration, not a new likelihood, is the deployed correction layer.</w:t>
+        <w:t xml:space="preserve">A mechanistic spatial-rate model was also evaluated as an alternative to</w:t>
+      </w:r>
+      <w:r>
+        <w:t xml:space="preserve"> </w:t>
+      </w:r>
+      <w:r>
+        <w:t xml:space="preserve">post-hoc calibration. The raw estimator is already at its identifiability floor</w:t>
+      </w:r>
+      <w:r>
+        <w:t xml:space="preserve"> </w:t>
+      </w:r>
+      <w:r>
+        <w:t xml:space="preserve">at 4-enzyme tag density: in-chain distribution-family changes can fix at most</w:t>
+      </w:r>
+      <w:r>
+        <w:t xml:space="preserve"> </w:t>
+      </w:r>
+      <w:r>
+        <w:t xml:space="preserve">~0.1–0.2 ANI points, and the divergence of the unchained fraction is not</w:t>
+      </w:r>
+      <w:r>
+        <w:t xml:space="preserve"> </w:t>
+      </w:r>
+      <w:r>
+        <w:t xml:space="preserve">identifiable from tag data. No candidate spatial model (AF-weighted mixtures,</w:t>
+      </w:r>
+      <w:r>
+        <w:t xml:space="preserve"> </w:t>
+      </w:r>
+      <w:r>
+        <w:t xml:space="preserve">discrete mixtures, ascertainment-aware tilts, capped NPMLE, model averaging)</w:t>
+      </w:r>
+      <w:r>
+        <w:t xml:space="preserve"> </w:t>
+      </w:r>
+      <w:r>
+        <w:t xml:space="preserve">beats the gated baseline while preserving exact-truth simulation gates. The full</w:t>
+      </w:r>
+      <w:r>
+        <w:t xml:space="preserve"> </w:t>
+      </w:r>
+      <w:r>
+        <w:t xml:space="preserve">negative result is reported in Supplementary Note 5.</w:t>
       </w:r>
     </w:p>
     <w:bookmarkEnd w:id="31"/>
@@ -2125,7 +2363,37 @@
         <w:t xml:space="preserve"> </w:t>
       </w:r>
       <w:r>
-        <w:t xml:space="preserve">(default 1 kb), with a guard requiring that no third chain anchors inside the spanned reference interval (without it, a small relocated block sandwiched between collinear chains is misreported as a deletion sized by the reference jump — observed as spurious 42–961 kb calls before the guard); translocations are chains violating global reference order. Resolution is limited by tag spacing and by unphaseable repeats at junctions (observed endpoint offset ≤ 5.5 kb on the 779 kb W3110 inversion); events whose flanking chains have &lt; 4 anchors are not called, and equal-length homologous replacements that keep tags phased are invisible by design. Validation against dnadiff used span-based one-to-many matching because dnadiff fragments large accessory regions into many small events while Syn2bANI calls each junction once.</w:t>
+        <w:t xml:space="preserve">(default 1 kb), with a guard requiring that no third chain anchors inside the spanned reference interval (without it, a small relocated block sandwiched between collinear chains is misreported as a deletion sized by the reference jump — observed as spurious 42–961 kb calls before the guard); translocations are chains violating global reference order. Resolution is limited by tag spacing and by unphaseable repeats at junctions (observed endpoint offset ≤ 5.5 kb on the 779 kb W3110 inversion); events whose flanking chains have &lt; 4 anchors are not called, and equal-length homologous replacements that keep tags phased are invisible by design. For circular chromosomes,</w:t>
+      </w:r>
+      <w:r>
+        <w:t xml:space="preserve"> </w:t>
+      </w:r>
+      <w:r>
+        <w:rPr>
+          <w:rStyle w:val="VerbatimChar"/>
+        </w:rPr>
+        <w:t xml:space="preserve">syn2bani struct --circular &lt;ref_name&gt;</w:t>
+      </w:r>
+      <w:r>
+        <w:t xml:space="preserve"> </w:t>
+      </w:r>
+      <w:r>
+        <w:t xml:space="preserve">marks the reference as circular; genome-spanning calls that exceed</w:t>
+      </w:r>
+      <w:r>
+        <w:t xml:space="preserve"> </w:t>
+      </w:r>
+      <w:r>
+        <w:rPr>
+          <w:rStyle w:val="VerbatimChar"/>
+        </w:rPr>
+        <w:t xml:space="preserve">--artifact-threshold</w:t>
+      </w:r>
+      <w:r>
+        <w:t xml:space="preserve"> </w:t>
+      </w:r>
+      <w:r>
+        <w:t xml:space="preserve">(default 50% of the reference length) are reported but flagged as likely circular-origin coordinate artifacts rather than biological rearrangements. Validation against dnadiff used span-based one-to-many matching because dnadiff fragments large accessory regions into many small events while Syn2bANI calls each junction once.</w:t>
       </w:r>
     </w:p>
     <w:p>
@@ -2635,7 +2903,7 @@
         <w:t xml:space="preserve">scripts/sample_gtdb_pairs.py</w:t>
       </w:r>
       <w:r>
-        <w:t xml:space="preserve">, seed-fixed). FastANI reports 672 of these pairs and they provide the large-scale comparison in Fig. 6.</w:t>
+        <w:t xml:space="preserve">, seed-fixed). FastANI reports 672 of these pairs and they are summarized in Supplementary analysis.</w:t>
       </w:r>
       <w:r>
         <w:t xml:space="preserve"> </w:t>
@@ -3418,7 +3686,7 @@
         <w:rPr>
           <w:rStyle w:val="VerbatimChar"/>
         </w:rPr>
-        <w:t xml:space="preserve">syn2bani struct --bed</w:t>
+        <w:t xml:space="preserve">syn2bani struct --bed --circular NC_000915.1</w:t>
       </w:r>
       <w:r>
         <w:t xml:space="preserve">. Marker-gene presence for 28 cagPAI CDS (HP0520–HP0547) was assessed with</w:t>
@@ -3472,7 +3740,22 @@
         <w:t xml:space="preserve">complete_collinear</w:t>
       </w:r>
       <w:r>
-        <w:t xml:space="preserve">. Isolation metadata (disease stage, country, FastBAPS lineage, phylogenetic population) were taken from the original publication (</w:t>
+        <w:t xml:space="preserve">. Complete-marker genomes whose only cagPAI-overlapping SV was a genome-spanning call (&gt;50% of the 1,667,825 bp chromosome) were reclassified as</w:t>
+      </w:r>
+      <w:r>
+        <w:t xml:space="preserve"> </w:t>
+      </w:r>
+      <w:r>
+        <w:rPr>
+          <w:rStyle w:val="VerbatimChar"/>
+        </w:rPr>
+        <w:t xml:space="preserve">complete_collinear</w:t>
+      </w:r>
+      <w:r>
+        <w:t xml:space="preserve"> </w:t>
+      </w:r>
+      <w:r>
+        <w:t xml:space="preserve">because such calls reflect the arbitrary choice of start coordinate on a circular chromosome rather than a local rearrangement. Isolation metadata (disease stage, country, FastBAPS lineage, phylogenetic population) were taken from the original publication. Disease-stage associations were tested with Pearson χ² and with Cochran–Mantel–Haenszel stratified by FastBAPS lineage (</w:t>
       </w:r>
       <w:r>
         <w:rPr>
@@ -4073,7 +4356,7 @@
         <w:pStyle w:val="FirstParagraph"/>
       </w:pPr>
       <w:r>
-        <w:t xml:space="preserve">[To be determined — placeholder.]</w:t>
+        <w:t xml:space="preserve">Y.Z. implemented the software, designed and executed the benchmarks, and generated the figures. S.H. conceived the project, supervised the research, and wrote the manuscript with input from Y.Z.</w:t>
       </w:r>
     </w:p>
     <w:bookmarkEnd w:id="40"/>
@@ -4091,7 +4374,7 @@
         <w:pStyle w:val="FirstParagraph"/>
       </w:pPr>
       <w:r>
-        <w:t xml:space="preserve">[To be determined — placeholder: The authors declare no competing interests.]</w:t>
+        <w:t xml:space="preserve">The authors declare no competing interests.</w:t>
       </w:r>
     </w:p>
     <w:bookmarkEnd w:id="41"/>
@@ -4444,7 +4727,14 @@
         <w:t xml:space="preserve"> </w:t>
       </w:r>
       <w:r>
-        <w:t xml:space="preserve">(2024).</w:t>
+        <w:rPr>
+          <w:b/>
+          <w:bCs/>
+        </w:rPr>
+        <w:t xml:space="preserve">43</w:t>
+      </w:r>
+      <w:r>
+        <w:t xml:space="preserve">, 773–783 (2025).</w:t>
       </w:r>
     </w:p>
     <w:p>
@@ -5523,7 +5813,7 @@
           <w:i/>
           <w:iCs/>
         </w:rPr>
-        <w:t xml:space="preserve">Corresponding author: Shi Huang (huangshi@njau.edu.cn)</w:t>
+        <w:t xml:space="preserve">Corresponding author: Shi Huang (shihuang@hku.hk)</w:t>
       </w:r>
     </w:p>
     <w:p>
@@ -5781,7 +6071,22 @@
         <w:t xml:space="preserve"> </w:t>
       </w:r>
       <w:r>
-        <w:t xml:space="preserve">(a)</w:t>
+        <w:t xml:space="preserve">skani ANI versus Syn2bANI</w:t>
+      </w:r>
+      <w:r>
+        <w:t xml:space="preserve"> </w:t>
+      </w:r>
+      <w:r>
+        <w:rPr>
+          <w:rStyle w:val="VerbatimChar"/>
+        </w:rPr>
+        <w:t xml:space="preserve">breakpoint_count</w:t>
+      </w:r>
+      <w:r>
+        <w:t xml:space="preserve"> </w:t>
+      </w:r>
+      <w:r>
+        <w:t xml:space="preserve">for four published near-clonal isolate collections: (a)</w:t>
       </w:r>
       <w:r>
         <w:t xml:space="preserve"> </w:t>
@@ -5797,7 +6102,7 @@
         <w:t xml:space="preserve"> </w:t>
       </w:r>
       <w:r>
-        <w:t xml:space="preserve">hypermutator and</w:t>
+        <w:t xml:space="preserve">hypermutator (253 pairs), (b)</w:t>
       </w:r>
       <w:r>
         <w:t xml:space="preserve"> </w:t>
@@ -5813,19 +6118,7 @@
         <w:t xml:space="preserve"> </w:t>
       </w:r>
       <w:r>
-        <w:t xml:space="preserve">isolates: ANI vs anchor adjacency (Syn2bANI left, skani right); highlighted pairs were re-analyzed with</w:t>
-      </w:r>
-      <w:r>
-        <w:t xml:space="preserve"> </w:t>
-      </w:r>
-      <w:r>
-        <w:rPr>
-          <w:rStyle w:val="VerbatimChar"/>
-        </w:rPr>
-        <w:t xml:space="preserve">syn2bani struct</w:t>
-      </w:r>
-      <w:r>
-        <w:t xml:space="preserve">. (b)</w:t>
+        <w:t xml:space="preserve">(2,926 pairs), (c)</w:t>
       </w:r>
       <w:r>
         <w:t xml:space="preserve"> </w:t>
@@ -5841,7 +6134,7 @@
         <w:t xml:space="preserve"> </w:t>
       </w:r>
       <w:r>
-        <w:t xml:space="preserve">and</w:t>
+        <w:t xml:space="preserve">(66 pairs), and (d)</w:t>
       </w:r>
       <w:r>
         <w:t xml:space="preserve"> </w:t>
@@ -5857,31 +6150,31 @@
         <w:t xml:space="preserve"> </w:t>
       </w:r>
       <w:r>
-        <w:t xml:space="preserve">isolates show the same ANI–anchor-adjacency decoupling. Source:</w:t>
-      </w:r>
-      <w:r>
-        <w:t xml:space="preserve"> </w:t>
-      </w:r>
-      <w:r>
-        <w:rPr>
-          <w:rStyle w:val="VerbatimChar"/>
-        </w:rPr>
-        <w:t xml:space="preserve">figures/syntracker_validation/syntracker_high_ani_low_synteny.png</w:t>
-      </w:r>
-      <w:r>
-        <w:t xml:space="preserve"> </w:t>
-      </w:r>
-      <w:r>
-        <w:t xml:space="preserve">and</w:t>
-      </w:r>
-      <w:r>
-        <w:t xml:space="preserve"> </w:t>
-      </w:r>
-      <w:r>
-        <w:rPr>
-          <w:rStyle w:val="VerbatimChar"/>
-        </w:rPr>
-        <w:t xml:space="preserve">figures/syntracker_validation/syntracker_supp_ngonorrhoeae_srimosus.png</w:t>
+        <w:t xml:space="preserve">(190 pairs). In all four collections ANI is pinned near 100% while breakpoint counts vary over orders of magnitude, illustrating that rearrangement burden is not captured by the divergence scalar. Annotated points are the top discordant cases by ANI–synteny rank difference; representative pairs were re-analyzed with</w:t>
+      </w:r>
+      <w:r>
+        <w:t xml:space="preserve"> </w:t>
+      </w:r>
+      <w:r>
+        <w:rPr>
+          <w:rStyle w:val="VerbatimChar"/>
+        </w:rPr>
+        <w:t xml:space="preserve">syn2bani struct</w:t>
+      </w:r>
+      <w:r>
+        <w:t xml:space="preserve"> </w:t>
+      </w:r>
+      <w:r>
+        <w:t xml:space="preserve">(Table 1). Source:</w:t>
+      </w:r>
+      <w:r>
+        <w:t xml:space="preserve"> </w:t>
+      </w:r>
+      <w:r>
+        <w:rPr>
+          <w:rStyle w:val="VerbatimChar"/>
+        </w:rPr>
+        <w:t xml:space="preserve">figures/syntracker_validation/syntracker_ani_vs_breakpoints.png</w:t>
       </w:r>
       <w:r>
         <w:t xml:space="preserve">.</w:t>
@@ -5972,7 +6265,7 @@
           <w:b/>
           <w:bCs/>
         </w:rPr>
-        <w:t xml:space="preserve">isolates is associated with disease stage and lineage, but invisible to ANI.</w:t>
+        <w:t xml:space="preserve">isolates is associated with lineage and invisible to ANI.</w:t>
       </w:r>
       <w:r>
         <w:t xml:space="preserve"> </w:t>
@@ -6065,16 +6358,16 @@
         <w:t xml:space="preserve">complete_rearranged</w:t>
       </w:r>
       <w:r>
-        <w:t xml:space="preserve">. (b) Stacked-bar distribution of extended cagPAI states by Correa’s cascade disease stage (NAG, AG, IM, GC) and by FastBAPS lineage. (c) Same data by country and phylogenetic population. Per-group stacked bars are shown in Supplementary Figs. S17–S20. Source:</w:t>
-      </w:r>
-      <w:r>
-        <w:t xml:space="preserve"> </w:t>
-      </w:r>
-      <w:r>
-        <w:rPr>
-          <w:rStyle w:val="VerbatimChar"/>
-        </w:rPr>
-        <w:t xml:space="preserve">case_studies/h_pylori_cagpai/results/struct_extended/</w:t>
+        <w:t xml:space="preserve">; complete-marker genomes with only a genome-spanning SV on the circular chromosome were reclassified as collinear. (b) Stacked-bar distribution of extended cagPAI states by Correa’s cascade disease stage (NAG, AG, IM, GC) and by FastBAPS lineage. (c) Same data by country and phylogenetic population. FastBAPS lineage is strongly associated with extended state (χ² = 58.75, df = 12, p = 3.8 × 10⁻⁸), but the disease-stage association is not significant after lineage stratification (CMH p ≥ 0.21 for all four contrasts). Per-group stacked bars are shown in Supplementary Figs. S17–S20. Source:</w:t>
+      </w:r>
+      <w:r>
+        <w:t xml:space="preserve"> </w:t>
+      </w:r>
+      <w:r>
+        <w:rPr>
+          <w:rStyle w:val="VerbatimChar"/>
+        </w:rPr>
+        <w:t xml:space="preserve">case_studies/h_pylori_cagpai/results/cagpai_association_filtered.tsv</w:t>
       </w:r>
       <w:r>
         <w:t xml:space="preserve">.</w:t>
@@ -8542,7 +8835,7 @@
               <w:pStyle w:val="Compact"/>
             </w:pPr>
             <w:r>
-              <w:t xml:space="preserve">Fig. S3</w:t>
+              <w:t xml:space="preserve">Supplementary analysis</w:t>
             </w:r>
           </w:p>
         </w:tc>
@@ -8588,7 +8881,7 @@
               <w:pStyle w:val="Compact"/>
             </w:pPr>
             <w:r>
-              <w:t xml:space="preserve">2,342 GTDB-R207 pairs (95–97 / 97–100), genome-level train/test</w:t>
+              <w:t xml:space="preserve">727 GTDB-R207 non-representative pairs (95–97 / 97–100), training genomes excluded</w:t>
             </w:r>
           </w:p>
         </w:tc>
@@ -8882,7 +9175,7 @@
               <w:pStyle w:val="Compact"/>
             </w:pPr>
             <w:r>
-              <w:t xml:space="preserve">Fig. 2, Fig. 5</w:t>
+              <w:t xml:space="preserve">Fig. 2</w:t>
             </w:r>
           </w:p>
         </w:tc>

</xml_diff>

<commit_message>
Reorganize figures and manuscript around GTDB-R207 core flow
- Create paper/figures/{main,supplementary,archive} structure.
- Move final figures to main/ (fig1–fig8) and supplementary/ (fig_s1–fig_s12).
- Archive old/exploratory figures and PDFs in paper/figures/archive/.
- Generate composites: fig2 (simulations), fig5 (SV validation), fig6
  (GTDB discordance), fig8 (cagPAI), fig_s9/s10/s11 (case-study merged
  supplementary), fig_s12 (circular-origin filtering).
- Update manuscript figure legends and Results narrative to match new flow:
  GTDB-R207 ANI → efficiency → SV validation → ANI+SV discordance →
  case studies.
- Renumber supplementary figures/tables and update all cross-references.
- Regenerate manuscript Word export.

Author: HuangShiLab <huanglab07@gmail.com>
</commit_message>
<xml_diff>
--- a/paper/manuscript/manuscript_nature_methods.docx
+++ b/paper/manuscript/manuscript_nature_methods.docx
@@ -28,7 +28,7 @@
         </w:p>
       </w:sdtContent>
     </w:sdt>
-    <w:bookmarkStart w:id="46" w:name="Xe400126ade8f1e4d28af479649ace7c1902f082"/>
+    <w:bookmarkStart w:id="45" w:name="Xe400126ade8f1e4d28af479649ace7c1902f082"/>
     <w:p>
       <w:pPr>
         <w:pStyle w:val="Heading1"/>
@@ -255,7 +255,7 @@
       </w:r>
     </w:p>
     <w:bookmarkEnd w:id="11"/>
-    <w:bookmarkStart w:id="23" w:name="results"/>
+    <w:bookmarkStart w:id="22" w:name="results"/>
     <w:p>
       <w:pPr>
         <w:pStyle w:val="Heading2"/>
@@ -415,7 +415,7 @@
         <w:t xml:space="preserve"> </w:t>
       </w:r>
       <w:r>
-        <w:t xml:space="preserve">for FastANI (Fig. 1b). Both comparators underestimate systematically toward low ANI. The 85% rung is flagged</w:t>
+        <w:t xml:space="preserve">for FastANI (Fig. 2a,b). Both comparators underestimate systematically toward low ANI. The 85% rung is flagged</w:t>
       </w:r>
       <w:r>
         <w:t xml:space="preserve"> </w:t>
@@ -438,7 +438,7 @@
         <w:pStyle w:val="BodyText"/>
       </w:pPr>
       <w:r>
-        <w:t xml:space="preserve">Four further exact-truth families isolate confounders (Fig. 2; Supplementary Figs. S5–S8). At fixed 95% ANI with 0–4 deletions per 100 kb, errors stay between +0.032 and +0.184 (MAE 0.081). Simulated fragmentation into 20–201 contigs yields errors of +0.018 to +0.179 (MAE 0.093). Ladders on five genomes spanning GC 27.2–72.1% give MAE 0.074–0.356, not monotone in GC. With 0–50% of the genome replaced by homology-destroying shuffled blocks, the estimate stays flat (MAE 0.114) while</w:t>
+        <w:t xml:space="preserve">Four further exact-truth families isolate confounders (Fig. 2c–e; Supplementary Fig. S5 for GC detail). At fixed 95% ANI with 0–4 deletions per 100 kb, errors stay between +0.032 and +0.184 (MAE 0.081). Simulated fragmentation into 20–201 contigs yields errors of +0.018 to +0.179 (MAE 0.093). With 0–50% of the genome replaced by homology-destroying shuffled blocks, the estimate stays flat (MAE 0.114) while</w:t>
       </w:r>
       <w:r>
         <w:t xml:space="preserve"> </w:t>
@@ -519,39 +519,17 @@
         <w:t xml:space="preserve"> </w:t>
       </w:r>
       <w:r>
-        <w:t xml:space="preserve">(bias +0.05, r = 0.963) on the 2,074-pair benchmark, ahead of skani (0.906) and FastANI (1.056) (Fig. 3a). On a strictly held-out set of</w:t>
-      </w:r>
-      <w:r>
-        <w:t xml:space="preserve"> </w:t>
-      </w:r>
-      <w:r>
-        <w:rPr>
-          <w:b/>
-          <w:bCs/>
-        </w:rPr>
-        <w:t xml:space="preserve">43,334</w:t>
-      </w:r>
-      <w:r>
-        <w:t xml:space="preserve"> </w:t>
-      </w:r>
-      <w:r>
-        <w:t xml:space="preserve">same-genus pairs with training genomes excluded in both directions, the calibrated estimator attains MAE</w:t>
-      </w:r>
-      <w:r>
-        <w:t xml:space="preserve"> </w:t>
-      </w:r>
-      <w:r>
-        <w:rPr>
-          <w:b/>
-          <w:bCs/>
-        </w:rPr>
-        <w:t xml:space="preserve">0.619</w:t>
-      </w:r>
-      <w:r>
-        <w:t xml:space="preserve"> </w:t>
-      </w:r>
-      <w:r>
-        <w:t xml:space="preserve">(bias −0.12, r = 0.962), versus skani 0.957 and FastANI 0.977 on the same pairs (Fig. 3b). The advantage is largest at 80–90% ANI, where skani and FastANI carry a ~1.9-point downward bias. The one-sided upper bound covers ANIm truth on 99.4% of all 43,334 pairs.</w:t>
+        <w:t xml:space="preserve">(bias +0.05, r = 0.963) on the 2,074-pair benchmark, ahead of skani (0.906) and FastANI (1.056). A unified 80–100% benchmark that combines the strictly held-out 43,334 same-genus pairs with 727 high-ANI test pairs shows the hybrid estimator (raw ≥ 98% / calibrated &lt; 98%) attaining the lowest overall MAE (</w:t>
+      </w:r>
+      <w:r>
+        <w:rPr>
+          <w:b/>
+          <w:bCs/>
+        </w:rPr>
+        <w:t xml:space="preserve">0.615</w:t>
+      </w:r>
+      <w:r>
+        <w:t xml:space="preserve">), recovering the strong raw gated performance in the 97–100% regime (MAE 0.23) without degrading 95–97% (Fig. 3). The advantage over skani and FastANI is largest at 80–90% ANI, where the comparators carry a ~1.9-point downward bias. The one-sided upper bound covers ANIm truth on 99.4% of all 43,334 pairs.</w:t>
       </w:r>
     </w:p>
     <w:p>
@@ -559,17 +537,37 @@
         <w:pStyle w:val="BodyText"/>
       </w:pPr>
       <w:r>
-        <w:t xml:space="preserve">A unified 80–100% benchmark combines the 43,334 held-out pairs with 727 high-ANI test pairs sampled from non-representative GTDB-R207 genomes. A simple hybrid rule — raw gated estimate at ≥98% ANI, calibrated estimate below — gives the lowest overall MAE (</w:t>
-      </w:r>
-      <w:r>
-        <w:rPr>
-          <w:b/>
-          <w:bCs/>
-        </w:rPr>
-        <w:t xml:space="preserve">0.615</w:t>
-      </w:r>
-      <w:r>
-        <w:t xml:space="preserve">), recovering the strong raw performance in the 97–100% regime (MAE 0.23) without degrading 95–97% (Fig. 4; Supplementary Fig. S3). A threshold sweep shows the boundary is not critical: 97% gives MAE 0.619, 98% gives 0.615, and 99% gives 0.614.</w:t>
+        <w:t xml:space="preserve">Computational efficiency was measured on the same GTDB-R207 dataset. On 22 genomes, Syn2bANI computes all 484 pairs in 3.73 s from FASTA (2.79 s reusing sketches), against 17.7 s for FastANI and 0.15 s for skani (the latter reports only 302/484 pairs because of its minimum-AF filter and excludes sketching). Peak memory is 58 MB with sketch reuse versus 185 MB (skani) and 912 MB (FastANI). At database scale, all-vs-all</w:t>
+      </w:r>
+      <w:r>
+        <w:t xml:space="preserve"> </w:t>
+      </w:r>
+      <w:r>
+        <w:rPr>
+          <w:rStyle w:val="VerbatimChar"/>
+        </w:rPr>
+        <w:t xml:space="preserve">triangle</w:t>
+      </w:r>
+      <w:r>
+        <w:t xml:space="preserve"> </w:t>
+      </w:r>
+      <w:r>
+        <w:t xml:space="preserve">on 5,000 GTDB-R207 representative genomes completes in ~14 min on a 32-core node;</w:t>
+      </w:r>
+      <w:r>
+        <w:t xml:space="preserve"> </w:t>
+      </w:r>
+      <w:r>
+        <w:rPr>
+          <w:rStyle w:val="VerbatimChar"/>
+        </w:rPr>
+        <w:t xml:space="preserve">search</w:t>
+      </w:r>
+      <w:r>
+        <w:t xml:space="preserve"> </w:t>
+      </w:r>
+      <w:r>
+        <w:t xml:space="preserve">against the same database takes ~4 min for 1,000 queries (Fig. 4). skani remains faster at scale, a trade-off that is stated openly.</w:t>
       </w:r>
     </w:p>
     <w:bookmarkEnd w:id="14"/>
@@ -692,7 +690,7 @@
         <w:t xml:space="preserve"> </w:t>
       </w:r>
       <w:r>
-        <w:t xml:space="preserve">against dnadiff ANIm, versus 0.092 for skani and 0.203 for FastANI (Fig. 5). By CheckM2 quality tier24,25, MAE is 0.041 on high-quality bins (n = 200; 100% within 0.5 points), 0.105 on medium-quality, and 0.291 on low-quality; |error| tracks contig N50 at Spearman ρ = −0.68. Applying the GTDB-trained v5 calibration to these MAGs degrades accuracy sharply (MAE 1.26), because the calibration learned real-genome associations absent in draft inputs; the raw gated estimate is therefore recommended for MAGs.</w:t>
+        <w:t xml:space="preserve">against dnadiff ANIm, versus 0.092 for skani and 0.203 for FastANI (Supplementary Fig. S7). By CheckM2 quality tier24,25, MAE is 0.041 on high-quality bins (n = 200; 100% within 0.5 points), 0.105 on medium-quality, and 0.291 on low-quality; |error| tracks contig N50 at Spearman ρ = −0.68. Applying the GTDB-trained v5 calibration to these MAGs degrades accuracy sharply (MAE 1.26), because the calibration learned real-genome associations absent in draft inputs; the raw gated estimate is therefore recommended for MAGs.</w:t>
       </w:r>
     </w:p>
     <w:bookmarkEnd w:id="16"/>
@@ -838,7 +836,7 @@
         <w:pStyle w:val="BodyText"/>
       </w:pPr>
       <w:r>
-        <w:t xml:space="preserve">We quantified the ANI–structure decoupling on four published isolate collections from a recent synteny-based strain-tracking study10. In a longitudinal</w:t>
+        <w:t xml:space="preserve">We quantified the ANI–structure decoupling on GTDB-R207 high-AF same-species pairs and on four published isolate collections from a recent synteny-based strain-tracking study10. In GTDB-R207, 336 high-AF pairs with Syn2bANI ANI &gt; 99% span a wide range of anchor adjacency, and the 10 most discordant pairs carry 61–989 SV calls despite near-clonal average sequence (Fig. 6). In the Syntracker isolate collections,</w:t>
       </w:r>
       <w:r>
         <w:t xml:space="preserve"> </w:t>
@@ -854,22 +852,7 @@
         <w:t xml:space="preserve"> </w:t>
       </w:r>
       <w:r>
-        <w:t xml:space="preserve">hypermutator lineage, every cross-time pair with ANI &gt;99.9% shows 850–1,130 Syn2bANI breakpoints. Re-analysis with</w:t>
-      </w:r>
-      <w:r>
-        <w:t xml:space="preserve"> </w:t>
-      </w:r>
-      <w:r>
-        <w:rPr>
-          <w:rStyle w:val="VerbatimChar"/>
-        </w:rPr>
-        <w:t xml:space="preserve">syn2bani struct</w:t>
-      </w:r>
-      <w:r>
-        <w:t xml:space="preserve"> </w:t>
-      </w:r>
-      <w:r>
-        <w:t xml:space="preserve">resolves representative pairs into dozens of chains with tens of inversions and translocations (Fig. 6a; Table 1).</w:t>
+        <w:t xml:space="preserve">hypermutator pairs with ANI &gt; 99.9% show 850–1,130 breakpoints,</w:t>
       </w:r>
       <w:r>
         <w:t xml:space="preserve"> </w:t>
@@ -879,13 +862,13 @@
           <w:i/>
           <w:iCs/>
         </w:rPr>
-        <w:t xml:space="preserve">Helicobacter pylori</w:t>
-      </w:r>
-      <w:r>
-        <w:t xml:space="preserve"> </w:t>
-      </w:r>
-      <w:r>
-        <w:t xml:space="preserve">same-host pairs cluster at ANI &gt;99.9% but carry 44–63 breakpoints in the lowest-synteny cases.</w:t>
+        <w:t xml:space="preserve">H. pylori</w:t>
+      </w:r>
+      <w:r>
+        <w:t xml:space="preserve"> </w:t>
+      </w:r>
+      <w:r>
+        <w:t xml:space="preserve">same-host pairs carry 44–63 breakpoints in the lowest-synteny cases, and</w:t>
       </w:r>
       <w:r>
         <w:t xml:space="preserve"> </w:t>
@@ -895,13 +878,13 @@
           <w:i/>
           <w:iCs/>
         </w:rPr>
-        <w:t xml:space="preserve">Neisseria gonorrhoeae</w:t>
-      </w:r>
-      <w:r>
-        <w:t xml:space="preserve"> </w:t>
-      </w:r>
-      <w:r>
-        <w:t xml:space="preserve">and</w:t>
+        <w:t xml:space="preserve">S. rimosus</w:t>
+      </w:r>
+      <w:r>
+        <w:t xml:space="preserve"> </w:t>
+      </w:r>
+      <w:r>
+        <w:t xml:space="preserve">reaches 2,957 breakpoints at 99.9945% ANI (Supplementary Fig. S8). Two additional collections reinforce the point: 74</w:t>
       </w:r>
       <w:r>
         <w:t xml:space="preserve"> </w:t>
@@ -911,13 +894,13 @@
           <w:i/>
           <w:iCs/>
         </w:rPr>
-        <w:t xml:space="preserve">Streptomyces rimosus</w:t>
-      </w:r>
-      <w:r>
-        <w:t xml:space="preserve"> </w:t>
-      </w:r>
-      <w:r>
-        <w:t xml:space="preserve">near-clonal pairs show the same decoupling, with</w:t>
+        <w:t xml:space="preserve">E. coli</w:t>
+      </w:r>
+      <w:r>
+        <w:t xml:space="preserve"> </w:t>
+      </w:r>
+      <w:r>
+        <w:t xml:space="preserve">O157:H7 genomes (2,701 pairs, all ANI ≥ 99.886%) carry 171–&gt;1,100 breakpoints (Supplementary Fig. S9), and 122 FDA-ARGOS</w:t>
       </w:r>
       <w:r>
         <w:t xml:space="preserve"> </w:t>
@@ -927,13 +910,115 @@
           <w:i/>
           <w:iCs/>
         </w:rPr>
-        <w:t xml:space="preserve">S. rimosus</w:t>
-      </w:r>
-      <w:r>
-        <w:t xml:space="preserve"> </w:t>
-      </w:r>
-      <w:r>
-        <w:t xml:space="preserve">reaching 2,957 breakpoints at 99.9945% ANI (Fig. 6c,d).</w:t>
+        <w:t xml:space="preserve">S. aureus</w:t>
+      </w:r>
+      <w:r>
+        <w:t xml:space="preserve"> </w:t>
+      </w:r>
+      <w:r>
+        <w:t xml:space="preserve">genomes (7,381 pairs, mean ANI 98.72%) show &gt;150 breakpoints even at 100% ANI (Supplementary Fig. S10). These collections exemplify why an ANI-only similarity search can return genomes that are nearly identical in average sequence but differ by hundreds of rearrangements.</w:t>
+      </w:r>
+    </w:p>
+    <w:bookmarkEnd w:id="18"/>
+    <w:bookmarkStart w:id="19" w:name="X92400c92582d6c59801983ff28fc6c6eb37ec86"/>
+    <w:p>
+      <w:pPr>
+        <w:pStyle w:val="Heading3"/>
+      </w:pPr>
+      <w:r>
+        <w:t xml:space="preserve">Structural outputs agree with independent truth</w:t>
+      </w:r>
+    </w:p>
+    <w:p>
+      <w:pPr>
+        <w:pStyle w:val="FirstParagraph"/>
+      </w:pPr>
+      <w:r>
+        <w:t xml:space="preserve">To test whether the breakpoint and coverage metrics are reliable, we compared them with alignment-based truth on the GTDB-R207 held-out benchmark (43,334 pairs). After controlling for assembly contig count and ANIm divergence, Syn2bANI</w:t>
+      </w:r>
+      <w:r>
+        <w:t xml:space="preserve"> </w:t>
+      </w:r>
+      <w:r>
+        <w:rPr>
+          <w:rStyle w:val="VerbatimChar"/>
+        </w:rPr>
+        <w:t xml:space="preserve">breakpoint_count</w:t>
+      </w:r>
+      <w:r>
+        <w:t xml:space="preserve"> </w:t>
+      </w:r>
+      <w:r>
+        <w:t xml:space="preserve">shows a partial correlation of r = 0.414 with dnadiff breakpoints and r = 0.453 with dnadiff large indels (&gt;10 kb). The signal strengthens in the strain-level range: among pairs with ANIm ≥ 95%,</w:t>
+      </w:r>
+      <w:r>
+        <w:t xml:space="preserve"> </w:t>
+      </w:r>
+      <w:r>
+        <w:rPr>
+          <w:rStyle w:val="VerbatimChar"/>
+        </w:rPr>
+        <w:t xml:space="preserve">breakpoint_count</w:t>
+      </w:r>
+      <w:r>
+        <w:t xml:space="preserve"> </w:t>
+      </w:r>
+      <w:r>
+        <w:t xml:space="preserve">correlates with dnadiff large indels at Spearman ρ = 0.674. The base-pair coverage metric</w:t>
+      </w:r>
+      <w:r>
+        <w:t xml:space="preserve"> </w:t>
+      </w:r>
+      <w:r>
+        <w:rPr>
+          <w:rStyle w:val="VerbatimChar"/>
+        </w:rPr>
+        <w:t xml:space="preserve">af_query</w:t>
+      </w:r>
+      <w:r>
+        <w:t xml:space="preserve"> </w:t>
+      </w:r>
+      <w:r>
+        <w:t xml:space="preserve">correlates with dnadiff and minimap2 coverage scores (Spearman r = 0.39 and 0.26), confirming that it is the output that aligns with alignment-based aligned fraction. By contrast, the anchor-adjacency metric</w:t>
+      </w:r>
+      <w:r>
+        <w:t xml:space="preserve"> </w:t>
+      </w:r>
+      <w:r>
+        <w:rPr>
+          <w:rStyle w:val="VerbatimChar"/>
+        </w:rPr>
+        <w:t xml:space="preserve">anchor_adjacency</w:t>
+      </w:r>
+      <w:r>
+        <w:t xml:space="preserve"> </w:t>
+      </w:r>
+      <w:r>
+        <w:t xml:space="preserve">is uncorrelated with rearrangement count and only weakly correlated with base-pair synteny/coverage scores; it should be read as a separate anchor-order statistic, not as a proxy for base-pair synteny.</w:t>
+      </w:r>
+      <w:r>
+        <w:t xml:space="preserve"> </w:t>
+      </w:r>
+      <w:r>
+        <w:rPr>
+          <w:rStyle w:val="VerbatimChar"/>
+        </w:rPr>
+        <w:t xml:space="preserve">synteny_blocks</w:t>
+      </w:r>
+      <w:r>
+        <w:t xml:space="preserve"> </w:t>
+      </w:r>
+      <w:r>
+        <w:t xml:space="preserve">(the raw chain count) is dominated by assembly fragmentation (62% of its variance tracks contig count) and is therefore reported as an assembly-structure diagnostic rather than a rearrangement metric. The mathematical distinction between count-based and ratio-based synteny metrics, and the fragmentation invariance of the latter, is derived in the companion Syn2b repository (</w:t>
+      </w:r>
+      <w:r>
+        <w:rPr>
+          <w:rStyle w:val="VerbatimChar"/>
+        </w:rPr>
+        <w:t xml:space="preserve">docs/MATH_REVIEW.md</w:t>
+      </w:r>
+      <w:r>
+        <w:t xml:space="preserve">; https://github.com/HuangShiLab/Syn2b).</w:t>
       </w:r>
     </w:p>
     <w:p>
@@ -941,7 +1026,42 @@
         <w:pStyle w:val="BodyText"/>
       </w:pPr>
       <w:r>
-        <w:t xml:space="preserve">Two additional isolate collections reinforce the point at even higher ANI. In 74</w:t>
+        <w:t xml:space="preserve">A length-weighted orientation metric,</w:t>
+      </w:r>
+      <w:r>
+        <w:t xml:space="preserve"> </w:t>
+      </w:r>
+      <w:r>
+        <w:rPr>
+          <w:rStyle w:val="VerbatimChar"/>
+        </w:rPr>
+        <w:t xml:space="preserve">raw_inverted_fraction</w:t>
+      </w:r>
+      <w:r>
+        <w:t xml:space="preserve">, avoids the fragmentation confounder by construction. In fixed-reference mode it agrees one-to-one with dnadiff across the held-out set (Pearson r = 0.936) and is near-exact in the strain range (r = 0.996, slope 1.006, intercept −0.004 for ANIm ≥ 97%; Fig. 5a,b). A closed-form standard-error model based on the number of shared landmarks reproduces the observed spread (R² = 0.999 across divergence bins), so each reported inversion fraction can carry its own uncertainty. The detection-power limits underlying these resolution numbers are characterized in</w:t>
+      </w:r>
+      <w:r>
+        <w:t xml:space="preserve"> </w:t>
+      </w:r>
+      <w:r>
+        <w:rPr>
+          <w:rStyle w:val="VerbatimChar"/>
+        </w:rPr>
+        <w:t xml:space="preserve">docs/PHASE2_DETECTION_POWER.md</w:t>
+      </w:r>
+      <w:r>
+        <w:t xml:space="preserve"> </w:t>
+      </w:r>
+      <w:r>
+        <w:t xml:space="preserve">of the companion Syn2b repository (https://github.com/HuangShiLab/Syn2b).</w:t>
+      </w:r>
+    </w:p>
+    <w:p>
+      <w:pPr>
+        <w:pStyle w:val="BodyText"/>
+      </w:pPr>
+      <w:r>
+        <w:t xml:space="preserve">On an engineered</w:t>
       </w:r>
       <w:r>
         <w:t xml:space="preserve"> </w:t>
@@ -951,13 +1071,31 @@
           <w:i/>
           <w:iCs/>
         </w:rPr>
-        <w:t xml:space="preserve">E. coli</w:t>
-      </w:r>
-      <w:r>
-        <w:t xml:space="preserve"> </w:t>
-      </w:r>
-      <w:r>
-        <w:t xml:space="preserve">O157:H7 genomes from a global source surveillance study (Fitzgerald et al., 2021), all 2,701 pairwise ANIs are ≥99.886%, yet every pair carries ≥171 breakpoints and the most structurally divergent pairs exceed 1,100 breakpoints at ANI &gt;99.9% (Supplementary Fig. S15). The human-source isolates carry fewer breakpoints on average than bovine isolates (mean 410 vs 494), suggesting that host-restricted sub-lineages differ in recombination history even when ANI cannot separate them. In 122 FDA-ARGOS</w:t>
+        <w:t xml:space="preserve">H. pylori</w:t>
+      </w:r>
+      <w:r>
+        <w:t xml:space="preserve"> </w:t>
+      </w:r>
+      <w:r>
+        <w:t xml:space="preserve">cagPAI test panel, a 36,154 bp deletion/insertion is recovered as a single insertion call of 36,154 bp (Fig. 8a).</w:t>
+      </w:r>
+    </w:p>
+    <w:bookmarkEnd w:id="19"/>
+    <w:bookmarkStart w:id="20" w:name="X22ca90b5ddbcd0e54633185a36b80aa5112cf3f"/>
+    <w:p>
+      <w:pPr>
+        <w:pStyle w:val="Heading3"/>
+      </w:pPr>
+      <w:r>
+        <w:t xml:space="preserve">A functional locus invisible to ANI is detectable by local chain coverage</w:t>
+      </w:r>
+    </w:p>
+    <w:p>
+      <w:pPr>
+        <w:pStyle w:val="FirstParagraph"/>
+      </w:pPr>
+      <w:r>
+        <w:t xml:space="preserve">The limitation of a single ANI value is not merely theoretical. In a published collection of 185</w:t>
       </w:r>
       <w:r>
         <w:t xml:space="preserve"> </w:t>
@@ -967,158 +1105,23 @@
           <w:i/>
           <w:iCs/>
         </w:rPr>
-        <w:t xml:space="preserve">Staphylococcus aureus</w:t>
-      </w:r>
-      <w:r>
-        <w:t xml:space="preserve"> </w:t>
-      </w:r>
-      <w:r>
-        <w:t xml:space="preserve">genomes, 7,381 refined pairs have mean ANI 98.72% and mean breakpoint count 24, with pairs at 100% ANI still showing &gt;150 breakpoints (Supplementary Fig. S16). These collections are not exceptional: they exemplify why an ANI-only similarity search can return genomes that are nearly identical in average sequence but differ by hundreds of rearrangements.</w:t>
-      </w:r>
-    </w:p>
-    <w:bookmarkEnd w:id="18"/>
-    <w:bookmarkStart w:id="19" w:name="X92400c92582d6c59801983ff28fc6c6eb37ec86"/>
+        <w:t xml:space="preserve">Bifidobacterium longum</w:t>
+      </w:r>
+      <w:r>
+        <w:t xml:space="preserve"> </w:t>
+      </w:r>
+      <w:r>
+        <w:t xml:space="preserve">isolates associated with constipation treatment, all pairwise ANIs are ≥98.67% and cannot separate strains that carry a complete abfA gene cluster from those with a deleted or peripheral-truncated cluster. Whole-genome aligned fraction is also uninformative (median 0.861 vs 0.867, MWU p = 0.66). However, locus-targeted Syn2bANI chain coverage over the abfA cluster periphery (17.2–37.1 kb) differs significantly between complete and deleted groups (median coverage 1.0 vs 0.16, MWU p = 1.4 × 10⁻³; Fig. 7). The signal is specific to the functional locus (the adjacent downstream region is indistinguishable, p = 0.40) and demonstrates that coordinate-carrying anchors can localize phenotype-relevant structural differences that are invisible to genome-wide ANI.</w:t>
+      </w:r>
+    </w:p>
+    <w:bookmarkEnd w:id="20"/>
+    <w:bookmarkStart w:id="21" w:name="X3b2998716b6c25b524acc27a4ab539ef1aae1e0"/>
     <w:p>
       <w:pPr>
         <w:pStyle w:val="Heading3"/>
       </w:pPr>
       <w:r>
-        <w:t xml:space="preserve">Structural outputs agree with independent truth</w:t>
-      </w:r>
-    </w:p>
-    <w:p>
-      <w:pPr>
-        <w:pStyle w:val="FirstParagraph"/>
-      </w:pPr>
-      <w:r>
-        <w:t xml:space="preserve">To test whether the breakpoint and coverage metrics are reliable, we compared them with alignment-based truth on the GTDB-R207 held-out benchmark (43,334 pairs). After controlling for assembly contig count and ANIm divergence, Syn2bANI</w:t>
-      </w:r>
-      <w:r>
-        <w:t xml:space="preserve"> </w:t>
-      </w:r>
-      <w:r>
-        <w:rPr>
-          <w:rStyle w:val="VerbatimChar"/>
-        </w:rPr>
-        <w:t xml:space="preserve">breakpoint_count</w:t>
-      </w:r>
-      <w:r>
-        <w:t xml:space="preserve"> </w:t>
-      </w:r>
-      <w:r>
-        <w:t xml:space="preserve">shows a partial correlation of r = 0.414 with dnadiff breakpoints and r = 0.453 with dnadiff large indels (&gt;10 kb). The signal strengthens in the strain-level range: among pairs with ANIm ≥ 95%,</w:t>
-      </w:r>
-      <w:r>
-        <w:t xml:space="preserve"> </w:t>
-      </w:r>
-      <w:r>
-        <w:rPr>
-          <w:rStyle w:val="VerbatimChar"/>
-        </w:rPr>
-        <w:t xml:space="preserve">breakpoint_count</w:t>
-      </w:r>
-      <w:r>
-        <w:t xml:space="preserve"> </w:t>
-      </w:r>
-      <w:r>
-        <w:t xml:space="preserve">correlates with dnadiff large indels at Spearman ρ = 0.674. The base-pair coverage metric</w:t>
-      </w:r>
-      <w:r>
-        <w:t xml:space="preserve"> </w:t>
-      </w:r>
-      <w:r>
-        <w:rPr>
-          <w:rStyle w:val="VerbatimChar"/>
-        </w:rPr>
-        <w:t xml:space="preserve">af_query</w:t>
-      </w:r>
-      <w:r>
-        <w:t xml:space="preserve"> </w:t>
-      </w:r>
-      <w:r>
-        <w:t xml:space="preserve">correlates with dnadiff and minimap2 coverage scores (Spearman r = 0.39 and 0.26), confirming that it is the output that aligns with alignment-based aligned fraction. By contrast, the anchor-adjacency metric</w:t>
-      </w:r>
-      <w:r>
-        <w:t xml:space="preserve"> </w:t>
-      </w:r>
-      <w:r>
-        <w:rPr>
-          <w:rStyle w:val="VerbatimChar"/>
-        </w:rPr>
-        <w:t xml:space="preserve">anchor_adjacency</w:t>
-      </w:r>
-      <w:r>
-        <w:t xml:space="preserve"> </w:t>
-      </w:r>
-      <w:r>
-        <w:t xml:space="preserve">is uncorrelated with rearrangement count and only weakly correlated with base-pair synteny/coverage scores; it should be read as a separate anchor-order statistic, not as a proxy for base-pair synteny.</w:t>
-      </w:r>
-      <w:r>
-        <w:t xml:space="preserve"> </w:t>
-      </w:r>
-      <w:r>
-        <w:rPr>
-          <w:rStyle w:val="VerbatimChar"/>
-        </w:rPr>
-        <w:t xml:space="preserve">synteny_blocks</w:t>
-      </w:r>
-      <w:r>
-        <w:t xml:space="preserve"> </w:t>
-      </w:r>
-      <w:r>
-        <w:t xml:space="preserve">(the raw chain count) is dominated by assembly fragmentation (62% of its variance tracks contig count) and is therefore reported as an assembly-structure diagnostic rather than a rearrangement metric. The mathematical distinction between count-based and ratio-based synteny metrics, and the fragmentation invariance of the latter, is derived in the companion Syn2b repository (</w:t>
-      </w:r>
-      <w:r>
-        <w:rPr>
-          <w:rStyle w:val="VerbatimChar"/>
-        </w:rPr>
-        <w:t xml:space="preserve">docs/MATH_REVIEW.md</w:t>
-      </w:r>
-      <w:r>
-        <w:t xml:space="preserve">; https://github.com/HuangShiLab/Syn2b).</w:t>
-      </w:r>
-    </w:p>
-    <w:p>
-      <w:pPr>
-        <w:pStyle w:val="BodyText"/>
-      </w:pPr>
-      <w:r>
-        <w:t xml:space="preserve">A length-weighted orientation metric,</w:t>
-      </w:r>
-      <w:r>
-        <w:t xml:space="preserve"> </w:t>
-      </w:r>
-      <w:r>
-        <w:rPr>
-          <w:rStyle w:val="VerbatimChar"/>
-        </w:rPr>
-        <w:t xml:space="preserve">inverted_fraction</w:t>
-      </w:r>
-      <w:r>
-        <w:t xml:space="preserve">, avoids the fragmentation confounder by construction. In fixed-reference mode it agrees one-to-one with dnadiff across the held-out set (Pearson r = 0.936) and is near-exact in the strain range (r = 0.996, slope 1.006, intercept −0.004 for ANIm ≥ 97%; Supplementary Fig. S14). A closed-form standard-error model based on the number of shared landmarks reproduces the observed spread (R² = 0.999 across divergence bins), so each reported inversion fraction can carry its own uncertainty. The detection-power limits underlying these resolution numbers are characterized in</w:t>
-      </w:r>
-      <w:r>
-        <w:t xml:space="preserve"> </w:t>
-      </w:r>
-      <w:r>
-        <w:rPr>
-          <w:rStyle w:val="VerbatimChar"/>
-        </w:rPr>
-        <w:t xml:space="preserve">docs/PHASE2_DETECTION_POWER.md</w:t>
-      </w:r>
-      <w:r>
-        <w:t xml:space="preserve"> </w:t>
-      </w:r>
-      <w:r>
-        <w:t xml:space="preserve">of the same repository (https://github.com/HuangShiLab/Syn2b).</w:t>
-      </w:r>
-    </w:p>
-    <w:p>
-      <w:pPr>
-        <w:pStyle w:val="BodyText"/>
-      </w:pPr>
-      <w:r>
-        <w:t xml:space="preserve">On an engineered</w:t>
+        <w:t xml:space="preserve">cagPAI architecture in</w:t>
       </w:r>
       <w:r>
         <w:t xml:space="preserve"> </w:t>
@@ -1134,17 +1137,7 @@
         <w:t xml:space="preserve"> </w:t>
       </w:r>
       <w:r>
-        <w:t xml:space="preserve">cagPAI test panel, a 36,154 bp deletion/insertion is recovered as a single insertion call of 36,154 bp (Supplementary Fig. S12).</w:t>
-      </w:r>
-    </w:p>
-    <w:bookmarkEnd w:id="19"/>
-    <w:bookmarkStart w:id="20" w:name="X22ca90b5ddbcd0e54633185a36b80aa5112cf3f"/>
-    <w:p>
-      <w:pPr>
-        <w:pStyle w:val="Heading3"/>
-      </w:pPr>
-      <w:r>
-        <w:t xml:space="preserve">A functional locus invisible to ANI is detectable by local chain coverage</w:t>
+        <w:t xml:space="preserve">is invisible to ANI and tracks lineage</w:t>
       </w:r>
     </w:p>
     <w:p>
@@ -1152,7 +1145,7 @@
         <w:pStyle w:val="FirstParagraph"/>
       </w:pPr>
       <w:r>
-        <w:t xml:space="preserve">The limitation of a single ANI value is not merely theoretical. In a published collection of 185</w:t>
+        <w:t xml:space="preserve">The</w:t>
       </w:r>
       <w:r>
         <w:t xml:space="preserve"> </w:t>
@@ -1162,23 +1155,75 @@
           <w:i/>
           <w:iCs/>
         </w:rPr>
-        <w:t xml:space="preserve">Bifidobacterium longum</w:t>
-      </w:r>
-      <w:r>
-        <w:t xml:space="preserve"> </w:t>
-      </w:r>
-      <w:r>
-        <w:t xml:space="preserve">isolates associated with constipation treatment, all pairwise ANIs are ≥98.67% and cannot separate strains that carry a complete abfA gene cluster from those with a deleted or peripheral-truncated cluster. Whole-genome aligned fraction is also uninformative (median 0.861 vs 0.867, MWU p = 0.66). However, locus-targeted Syn2bANI chain coverage over the abfA cluster periphery (17.2–37.1 kb) differs significantly between complete and deleted groups (median coverage 1.0 vs 0.16, MWU p = 1.4 × 10⁻³; Fig. 7). The signal is specific to the functional locus (the adjacent downstream region is indistinguishable, p = 0.40) and demonstrates that coordinate-carrying anchors can localize phenotype-relevant structural differences that are invisible to genome-wide ANI.</w:t>
-      </w:r>
-    </w:p>
-    <w:bookmarkEnd w:id="20"/>
-    <w:bookmarkStart w:id="21" w:name="X3b2998716b6c25b524acc27a4ab539ef1aae1e0"/>
-    <w:p>
-      <w:pPr>
-        <w:pStyle w:val="Heading3"/>
-      </w:pPr>
-      <w:r>
-        <w:t xml:space="preserve">cagPAI architecture in</w:t>
+        <w:t xml:space="preserve">Helicobacter pylori</w:t>
+      </w:r>
+      <w:r>
+        <w:t xml:space="preserve"> </w:t>
+      </w:r>
+      <w:r>
+        <w:t xml:space="preserve">cagPAI pathogenicity island is a classic example of a functionally important locus whose presence and architecture are lost in a genome-wide ANI average. We combined marker-gene presence/absence with</w:t>
+      </w:r>
+      <w:r>
+        <w:t xml:space="preserve"> </w:t>
+      </w:r>
+      <w:r>
+        <w:rPr>
+          <w:rStyle w:val="VerbatimChar"/>
+        </w:rPr>
+        <w:t xml:space="preserve">syn2bani struct</w:t>
+      </w:r>
+      <w:r>
+        <w:t xml:space="preserve"> </w:t>
+      </w:r>
+      <w:r>
+        <w:t xml:space="preserve">calls inside the cagPAI coordinates (NC_000915.1: 547,327–583,481) for 528 genomes from a recent gastric-cancer risk study. The extended state was validated on an engineered nine-strain panel (wild-type, ΔcagPAI, inversion, translocation, and mutated backgrounds) and classified all controls correctly.</w:t>
+      </w:r>
+    </w:p>
+    <w:p>
+      <w:pPr>
+        <w:pStyle w:val="BodyText"/>
+      </w:pPr>
+      <w:r>
+        <w:t xml:space="preserve">Among the 528 isolates, 85 (16.1%) lacked the island (</w:t>
+      </w:r>
+      <w:r>
+        <w:rPr>
+          <w:rStyle w:val="VerbatimChar"/>
+        </w:rPr>
+        <w:t xml:space="preserve">empty</w:t>
+      </w:r>
+      <w:r>
+        <w:t xml:space="preserve">), 11 (2.1%) were</w:t>
+      </w:r>
+      <w:r>
+        <w:t xml:space="preserve"> </w:t>
+      </w:r>
+      <w:r>
+        <w:rPr>
+          <w:rStyle w:val="VerbatimChar"/>
+        </w:rPr>
+        <w:t xml:space="preserve">partial</w:t>
+      </w:r>
+      <w:r>
+        <w:t xml:space="preserve">, 145 (27.5%) retained a collinear complete island (</w:t>
+      </w:r>
+      <w:r>
+        <w:rPr>
+          <w:rStyle w:val="VerbatimChar"/>
+        </w:rPr>
+        <w:t xml:space="preserve">complete_collinear</w:t>
+      </w:r>
+      <w:r>
+        <w:t xml:space="preserve">), and 287 (54.4%) retained the markers but carried a local inversion or translocation inside cagPAI (</w:t>
+      </w:r>
+      <w:r>
+        <w:rPr>
+          <w:rStyle w:val="VerbatimChar"/>
+        </w:rPr>
+        <w:t xml:space="preserve">complete_rearranged</w:t>
+      </w:r>
+      <w:r>
+        <w:t xml:space="preserve">; Fig. 8a). The remaining 133 complete-marker genomes that were originally classified as rearranged carried a single genome-spanning call consistent with a different arbitrary start coordinate on the circular</w:t>
       </w:r>
       <w:r>
         <w:t xml:space="preserve"> </w:t>
@@ -1194,54 +1239,10 @@
         <w:t xml:space="preserve"> </w:t>
       </w:r>
       <w:r>
-        <w:t xml:space="preserve">is invisible to ANI and tracks lineage</w:t>
-      </w:r>
-    </w:p>
-    <w:p>
-      <w:pPr>
-        <w:pStyle w:val="FirstParagraph"/>
-      </w:pPr>
-      <w:r>
-        <w:t xml:space="preserve">The</w:t>
-      </w:r>
-      <w:r>
-        <w:t xml:space="preserve"> </w:t>
-      </w:r>
-      <w:r>
-        <w:rPr>
-          <w:i/>
-          <w:iCs/>
-        </w:rPr>
-        <w:t xml:space="preserve">Helicobacter pylori</w:t>
-      </w:r>
-      <w:r>
-        <w:t xml:space="preserve"> </w:t>
-      </w:r>
-      <w:r>
-        <w:t xml:space="preserve">cagPAI pathogenicity island is a classic example of a functionally important locus whose presence and architecture are lost in a genome-wide ANI average. We combined marker-gene presence/absence with</w:t>
-      </w:r>
-      <w:r>
-        <w:t xml:space="preserve"> </w:t>
-      </w:r>
-      <w:r>
-        <w:rPr>
-          <w:rStyle w:val="VerbatimChar"/>
-        </w:rPr>
-        <w:t xml:space="preserve">syn2bani struct</w:t>
-      </w:r>
-      <w:r>
-        <w:t xml:space="preserve"> </w:t>
-      </w:r>
-      <w:r>
-        <w:t xml:space="preserve">calls inside the cagPAI coordinates (NC_000915.1: 547,327–583,481) for 528 genomes from a recent gastric-cancer risk study. The extended state was validated on an engineered nine-strain panel (wild-type, ΔcagPAI, inversion, translocation, and mutated backgrounds) and classified all controls correctly.</w:t>
-      </w:r>
-    </w:p>
-    <w:p>
-      <w:pPr>
-        <w:pStyle w:val="BodyText"/>
-      </w:pPr>
-      <w:r>
-        <w:t xml:space="preserve">Among the 528 isolates, 85 (16.1%) lacked the island (</w:t>
+        <w:t xml:space="preserve">chromosome; these were reclassified as collinear after circular-origin filtering (Online Methods). The extended state remained strongly associated with FastBAPS lineage (χ² = 58.75, df = 12, p = 3.8 × 10⁻⁸), but the disease-stage association was attenuated and no longer significant after stratifying by lineage (Cochran–Mantel–Haenszel p = 0.24 for gastric-cancer vs non-atrophic-gastritis presence, p = 0.37 for rearrangement, p = 0.21 and p = 0.49 for the advanced vs early contrasts; Supplementary Table S4). Thus, the architecture–disease signal in this collection is largely driven by lineage structure, not by disease stage per se. The key biological result that survives stratification is lineage-associated cagPAI presence/absence:</w:t>
+      </w:r>
+      <w:r>
+        <w:t xml:space="preserve"> </w:t>
       </w:r>
       <w:r>
         <w:rPr>
@@ -1250,129 +1251,10 @@
         <w:t xml:space="preserve">empty</w:t>
       </w:r>
       <w:r>
-        <w:t xml:space="preserve">), 11 (2.1%) were</w:t>
-      </w:r>
-      <w:r>
-        <w:t xml:space="preserve"> </w:t>
-      </w:r>
-      <w:r>
-        <w:rPr>
-          <w:rStyle w:val="VerbatimChar"/>
-        </w:rPr>
-        <w:t xml:space="preserve">partial</w:t>
-      </w:r>
-      <w:r>
-        <w:t xml:space="preserve">, 145 (27.5%) retained a collinear complete island (</w:t>
-      </w:r>
-      <w:r>
-        <w:rPr>
-          <w:rStyle w:val="VerbatimChar"/>
-        </w:rPr>
-        <w:t xml:space="preserve">complete_collinear</w:t>
-      </w:r>
-      <w:r>
-        <w:t xml:space="preserve">), and 287 (54.4%) retained the markers but carried a local inversion or translocation inside cagPAI (</w:t>
-      </w:r>
-      <w:r>
-        <w:rPr>
-          <w:rStyle w:val="VerbatimChar"/>
-        </w:rPr>
-        <w:t xml:space="preserve">complete_rearranged</w:t>
-      </w:r>
-      <w:r>
-        <w:t xml:space="preserve">; Fig. 8a). The remaining 133 complete-marker genomes that were originally classified as rearranged carried a single genome-spanning call consistent with a different arbitrary start coordinate on the circular</w:t>
-      </w:r>
-      <w:r>
-        <w:t xml:space="preserve"> </w:t>
-      </w:r>
-      <w:r>
-        <w:rPr>
-          <w:i/>
-          <w:iCs/>
-        </w:rPr>
-        <w:t xml:space="preserve">H. pylori</w:t>
-      </w:r>
-      <w:r>
-        <w:t xml:space="preserve"> </w:t>
-      </w:r>
-      <w:r>
-        <w:t xml:space="preserve">chromosome; these were reclassified as collinear after circular-origin filtering (Online Methods). The extended state remained strongly associated with FastBAPS lineage (χ² = 58.75, df = 12, p = 3.8 × 10⁻⁸), but the disease-stage association was attenuated and no longer significant after stratifying by lineage (Cochran–Mantel–Haenszel p = 0.24 for gastric-cancer vs non-atrophic-gastritis presence, p = 0.37 for rearrangement, p = 0.21 and p = 0.49 for the advanced vs early contrasts; Supplementary Table S8). Thus, the architecture–disease signal in this collection is largely driven by lineage structure, not by disease stage per se. The key biological result that survives stratification is lineage-associated cagPAI presence/absence:</w:t>
-      </w:r>
-      <w:r>
-        <w:t xml:space="preserve"> </w:t>
-      </w:r>
-      <w:r>
-        <w:rPr>
-          <w:rStyle w:val="VerbatimChar"/>
-        </w:rPr>
-        <w:t xml:space="preserve">empty</w:t>
-      </w:r>
-      <w:r>
         <w:t xml:space="preserve"> </w:t>
       </w:r>
       <w:r>
         <w:t xml:space="preserve">rates range from 4% in FastBAPS L2 to 33% in L6. Because all pairwise ANIs in this collection are &gt;95%, these presence/absence and architecture patterns are invisible to ANI-only tools and illustrate how Syn2bANI’s structural output can reveal genotype–population relationships that ANI alone cannot.</w:t>
-      </w:r>
-    </w:p>
-    <w:bookmarkEnd w:id="21"/>
-    <w:bookmarkStart w:id="22" w:name="computational-efficiency"/>
-    <w:p>
-      <w:pPr>
-        <w:pStyle w:val="Heading3"/>
-      </w:pPr>
-      <w:r>
-        <w:t xml:space="preserve">Computational efficiency</w:t>
-      </w:r>
-    </w:p>
-    <w:p>
-      <w:pPr>
-        <w:pStyle w:val="FirstParagraph"/>
-      </w:pPr>
-      <w:r>
-        <w:t xml:space="preserve">On all-vs-all comparison of 22 genomes (14 complete Enterobacteriaceae plus 8 real draft</w:t>
-      </w:r>
-      <w:r>
-        <w:t xml:space="preserve"> </w:t>
-      </w:r>
-      <w:r>
-        <w:rPr>
-          <w:i/>
-          <w:iCs/>
-        </w:rPr>
-        <w:t xml:space="preserve">E. coli</w:t>
-      </w:r>
-      <w:r>
-        <w:t xml:space="preserve">), Syn2bANI computes all 484 pairs in 3.73 s from FASTA or 2.79 s reusing sketches, against 17.7 s for FastANI and 0.15 s for skani (the latter reports only 302/484 pairs because of its minimum-AF filter and excludes sketching). Peak memory is 58 MB with sketch reuse versus 185 MB (skani) and 912 MB (FastANI); the sketch store is ~5× smaller than skani’s (Supplementary Fig. S6). At database scale, all-vs-all</w:t>
-      </w:r>
-      <w:r>
-        <w:t xml:space="preserve"> </w:t>
-      </w:r>
-      <w:r>
-        <w:rPr>
-          <w:rStyle w:val="VerbatimChar"/>
-        </w:rPr>
-        <w:t xml:space="preserve">triangle</w:t>
-      </w:r>
-      <w:r>
-        <w:t xml:space="preserve"> </w:t>
-      </w:r>
-      <w:r>
-        <w:t xml:space="preserve">on 5,000 GTDB-R207 representative genomes completes in ~14 min on a 32-core node;</w:t>
-      </w:r>
-      <w:r>
-        <w:t xml:space="preserve"> </w:t>
-      </w:r>
-      <w:r>
-        <w:rPr>
-          <w:rStyle w:val="VerbatimChar"/>
-        </w:rPr>
-        <w:t xml:space="preserve">search</w:t>
-      </w:r>
-      <w:r>
-        <w:t xml:space="preserve"> </w:t>
-      </w:r>
-      <w:r>
-        <w:t xml:space="preserve">against the same database takes ~4 min for 1,000 queries. skani remains faster at scale, a trade-off that is stated openly.</w:t>
       </w:r>
     </w:p>
     <w:p>
@@ -1382,9 +1264,9 @@
         </w:pict>
       </w:r>
     </w:p>
+    <w:bookmarkEnd w:id="21"/>
     <w:bookmarkEnd w:id="22"/>
-    <w:bookmarkEnd w:id="23"/>
-    <w:bookmarkStart w:id="24" w:name="discussion"/>
+    <w:bookmarkStart w:id="23" w:name="discussion"/>
     <w:p>
       <w:pPr>
         <w:pStyle w:val="Heading2"/>
@@ -1426,8 +1308,8 @@
         </w:pict>
       </w:r>
     </w:p>
-    <w:bookmarkEnd w:id="24"/>
-    <w:bookmarkStart w:id="36" w:name="online-methods"/>
+    <w:bookmarkEnd w:id="23"/>
+    <w:bookmarkStart w:id="35" w:name="online-methods"/>
     <w:p>
       <w:pPr>
         <w:pStyle w:val="Heading2"/>
@@ -1436,7 +1318,7 @@
         <w:t xml:space="preserve">Online Methods</w:t>
       </w:r>
     </w:p>
-    <w:bookmarkStart w:id="25" w:name="X585a6a8b67378bd6645996598d95979c15b1236"/>
+    <w:bookmarkStart w:id="24" w:name="X585a6a8b67378bd6645996598d95979c15b1236"/>
     <w:p>
       <w:pPr>
         <w:pStyle w:val="Heading3"/>
@@ -1560,8 +1442,8 @@
         <w:t xml:space="preserve">three-of-four positions. The homogeneous likelihood uses the exact convolution over degenerate classes; the heterogeneous likelihood uses a negative binomial with effective body b + d2/3 + 2·d3/3 plus a closed-form survival factor. With the fully specific default panel (d2 = d3 = 0) both paths are bit-identical to the pre-fix code. Tags are stored strand-canonically (the lexicographically smaller of a tag and its reverse complement), so contig orientation is immaterial; reverse-complement self-controls on real drafts return 99.9999.</w:t>
       </w:r>
     </w:p>
-    <w:bookmarkEnd w:id="25"/>
-    <w:bookmarkStart w:id="26" w:name="Xd100f60785764278c40c45b7debf06888935c47"/>
+    <w:bookmarkEnd w:id="24"/>
+    <w:bookmarkStart w:id="25" w:name="Xd100f60785764278c40c45b7debf06888935c47"/>
     <w:p>
       <w:pPr>
         <w:pStyle w:val="Heading3"/>
@@ -1686,14 +1568,213 @@
         <w:t xml:space="preserve">bp of the predicted position — seed-and-extend, which cannot invent matches between positionally unrelated tags. Chains are processed largest-first and each query tag is counted at most once.</w:t>
       </w:r>
     </w:p>
+    <w:bookmarkEnd w:id="25"/>
+    <w:bookmarkStart w:id="26" w:name="Xc84f212d8323a8f017575d3d7a92fc22fb23227"/>
+    <w:p>
+      <w:pPr>
+        <w:pStyle w:val="Heading3"/>
+      </w:pPr>
+      <w:r>
+        <w:t xml:space="preserve">Chain-restricted stratified MLE, gating, and flags</w:t>
+      </w:r>
+    </w:p>
+    <w:p>
+      <w:pPr>
+        <w:pStyle w:val="FirstParagraph"/>
+      </w:pPr>
+      <w:r>
+        <w:t xml:space="preserve">The estimator is a chain-restricted maximum-likelihood fit to per-enzyme tag</w:t>
+      </w:r>
+      <w:r>
+        <w:t xml:space="preserve"> </w:t>
+      </w:r>
+      <w:r>
+        <w:t xml:space="preserve">outcomes. For each stratum, tags inside chains are classified as found with 0,</w:t>
+      </w:r>
+      <w:r>
+        <w:t xml:space="preserve"> </w:t>
+      </w:r>
+      <w:r>
+        <w:t xml:space="preserve">1, or 2 body mismatches, or missing; the per-base identity</w:t>
+      </w:r>
+      <w:r>
+        <w:t xml:space="preserve"> </w:t>
+      </w:r>
+      <w:r>
+        <w:rPr>
+          <w:rStyle w:val="VerbatimChar"/>
+        </w:rPr>
+        <w:t xml:space="preserve">a</w:t>
+      </w:r>
+      <w:r>
+        <w:t xml:space="preserve"> </w:t>
+      </w:r>
+      <w:r>
+        <w:t xml:space="preserve">is found by</w:t>
+      </w:r>
+      <w:r>
+        <w:t xml:space="preserve"> </w:t>
+      </w:r>
+      <w:r>
+        <w:t xml:space="preserve">golden-section search on a likelihood that respects the recognition-site</w:t>
+      </w:r>
+      <w:r>
+        <w:t xml:space="preserve"> </w:t>
+      </w:r>
+      <w:r>
+        <w:t xml:space="preserve">geometry (a site mutation deletes the tag, so only body mismatches are</w:t>
+      </w:r>
+      <w:r>
+        <w:t xml:space="preserve"> </w:t>
+      </w:r>
+      <w:r>
+        <w:t xml:space="preserve">observable). A gamma rate-heterogeneity extension is available but is</w:t>
+      </w:r>
+      <w:r>
+        <w:t xml:space="preserve"> </w:t>
+      </w:r>
+      <w:r>
+        <w:rPr>
+          <w:b/>
+          <w:bCs/>
+        </w:rPr>
+        <w:t xml:space="preserve">gated</w:t>
+      </w:r>
+      <w:r>
+        <w:t xml:space="preserve"> </w:t>
+      </w:r>
+      <w:r>
+        <w:t xml:space="preserve">by an effect-size test on the two partial estimators (</w:t>
+      </w:r>
+      <w:r>
+        <w:rPr>
+          <w:rStyle w:val="VerbatimChar"/>
+        </w:rPr>
+        <w:t xml:space="preserve">ani_from_loss</w:t>
+      </w:r>
+      <w:r>
+        <w:t xml:space="preserve"> </w:t>
+      </w:r>
+      <w:r>
+        <w:t xml:space="preserve">from the</w:t>
+      </w:r>
+      <w:r>
+        <w:t xml:space="preserve"> </w:t>
+      </w:r>
+      <w:r>
+        <w:t xml:space="preserve">miss channel and</w:t>
+      </w:r>
+      <w:r>
+        <w:t xml:space="preserve"> </w:t>
+      </w:r>
+      <w:r>
+        <w:rPr>
+          <w:rStyle w:val="VerbatimChar"/>
+        </w:rPr>
+        <w:t xml:space="preserve">ani_from_hist</w:t>
+      </w:r>
+      <w:r>
+        <w:t xml:space="preserve"> </w:t>
+      </w:r>
+      <w:r>
+        <w:t xml:space="preserve">from the mismatch histogram): when they diverge</w:t>
+      </w:r>
+      <w:r>
+        <w:t xml:space="preserve"> </w:t>
+      </w:r>
+      <w:r>
+        <w:t xml:space="preserve">by more than 5 ANI points the method reports the homogeneous fit, otherwise the</w:t>
+      </w:r>
+      <w:r>
+        <w:t xml:space="preserve"> </w:t>
+      </w:r>
+      <w:r>
+        <w:t xml:space="preserve">gamma fit. The threshold was chosen at the flat optimum of a sweep on the</w:t>
+      </w:r>
+      <w:r>
+        <w:t xml:space="preserve"> </w:t>
+      </w:r>
+      <w:r>
+        <w:t xml:space="preserve">GTDB-ANIm training matrix. The hierarchical</w:t>
+      </w:r>
+      <w:r>
+        <w:t xml:space="preserve"> </w:t>
+      </w:r>
+      <w:r>
+        <w:rPr>
+          <w:rStyle w:val="VerbatimChar"/>
+        </w:rPr>
+        <w:t xml:space="preserve">flag</w:t>
+      </w:r>
+      <w:r>
+        <w:t xml:space="preserve"> </w:t>
+      </w:r>
+      <w:r>
+        <w:t xml:space="preserve">column reports</w:t>
+      </w:r>
+      <w:r>
+        <w:t xml:space="preserve"> </w:t>
+      </w:r>
+      <w:r>
+        <w:rPr>
+          <w:rStyle w:val="VerbatimChar"/>
+        </w:rPr>
+        <w:t xml:space="preserve">BELOW_DETECTION</w:t>
+      </w:r>
+      <w:r>
+        <w:t xml:space="preserve"> </w:t>
+      </w:r>
+      <w:r>
+        <w:t xml:space="preserve">(expected retention &lt; 0.20),</w:t>
+      </w:r>
+      <w:r>
+        <w:t xml:space="preserve"> </w:t>
+      </w:r>
+      <w:r>
+        <w:rPr>
+          <w:rStyle w:val="VerbatimChar"/>
+        </w:rPr>
+        <w:t xml:space="preserve">INCONSISTENT</w:t>
+      </w:r>
+      <w:r>
+        <w:t xml:space="preserve"> </w:t>
+      </w:r>
+      <w:r>
+        <w:t xml:space="preserve">(gate fallback or</w:t>
+      </w:r>
+      <w:r>
+        <w:t xml:space="preserve"> </w:t>
+      </w:r>
+      <w:r>
+        <w:t xml:space="preserve">&gt; 0.5 breakpoints per anchor), or</w:t>
+      </w:r>
+      <w:r>
+        <w:t xml:space="preserve"> </w:t>
+      </w:r>
+      <w:r>
+        <w:rPr>
+          <w:rStyle w:val="VerbatimChar"/>
+        </w:rPr>
+        <w:t xml:space="preserve">ok</w:t>
+      </w:r>
+      <w:r>
+        <w:t xml:space="preserve">. Full formulas, the negative-binomial</w:t>
+      </w:r>
+      <w:r>
+        <w:t xml:space="preserve"> </w:t>
+      </w:r>
+      <w:r>
+        <w:t xml:space="preserve">derivation, and the gating/flag rationale are given in Supplementary Note 4.</w:t>
+      </w:r>
+    </w:p>
     <w:bookmarkEnd w:id="26"/>
-    <w:bookmarkStart w:id="27" w:name="Xc84f212d8323a8f017575d3d7a92fc22fb23227"/>
+    <w:bookmarkStart w:id="27" w:name="short-contig-rescue-pass"/>
     <w:p>
       <w:pPr>
         <w:pStyle w:val="Heading3"/>
       </w:pPr>
       <w:r>
-        <w:t xml:space="preserve">Chain-restricted stratified MLE, gating, and flags</w:t>
+        <w:t xml:space="preserve">Short-contig rescue pass</w:t>
       </w:r>
     </w:p>
     <w:p>
@@ -1701,134 +1782,335 @@
         <w:pStyle w:val="FirstParagraph"/>
       </w:pPr>
       <w:r>
-        <w:t xml:space="preserve">The estimator is a chain-restricted maximum-likelihood fit to per-enzyme tag</w:t>
-      </w:r>
-      <w:r>
-        <w:t xml:space="preserve"> </w:t>
-      </w:r>
-      <w:r>
-        <w:t xml:space="preserve">outcomes. For each stratum, tags inside chains are classified as found with 0,</w:t>
-      </w:r>
-      <w:r>
-        <w:t xml:space="preserve"> </w:t>
-      </w:r>
-      <w:r>
-        <w:t xml:space="preserve">1, or 2 body mismatches, or missing; the per-base identity</w:t>
-      </w:r>
-      <w:r>
-        <w:t xml:space="preserve"> </w:t>
-      </w:r>
-      <w:r>
-        <w:rPr>
-          <w:rStyle w:val="VerbatimChar"/>
-        </w:rPr>
-        <w:t xml:space="preserve">a</w:t>
-      </w:r>
-      <w:r>
-        <w:t xml:space="preserve"> </w:t>
-      </w:r>
-      <w:r>
-        <w:t xml:space="preserve">is found by</w:t>
-      </w:r>
-      <w:r>
-        <w:t xml:space="preserve"> </w:t>
-      </w:r>
-      <w:r>
-        <w:t xml:space="preserve">golden-section search on a likelihood that respects the recognition-site</w:t>
-      </w:r>
-      <w:r>
-        <w:t xml:space="preserve"> </w:t>
-      </w:r>
-      <w:r>
-        <w:t xml:space="preserve">geometry (a site mutation deletes the tag, so only body mismatches are</w:t>
-      </w:r>
-      <w:r>
-        <w:t xml:space="preserve"> </w:t>
-      </w:r>
-      <w:r>
-        <w:t xml:space="preserve">observable). A gamma rate-heterogeneity extension is available but is</w:t>
-      </w:r>
-      <w:r>
-        <w:t xml:space="preserve"> </w:t>
-      </w:r>
-      <w:r>
-        <w:rPr>
-          <w:b/>
-          <w:bCs/>
-        </w:rPr>
-        <w:t xml:space="preserve">gated</w:t>
-      </w:r>
-      <w:r>
-        <w:t xml:space="preserve"> </w:t>
-      </w:r>
-      <w:r>
-        <w:t xml:space="preserve">by an effect-size test on the two partial estimators (</w:t>
-      </w:r>
-      <w:r>
-        <w:rPr>
-          <w:rStyle w:val="VerbatimChar"/>
-        </w:rPr>
-        <w:t xml:space="preserve">ani_from_loss</w:t>
-      </w:r>
-      <w:r>
-        <w:t xml:space="preserve"> </w:t>
-      </w:r>
-      <w:r>
-        <w:t xml:space="preserve">from the</w:t>
-      </w:r>
-      <w:r>
-        <w:t xml:space="preserve"> </w:t>
-      </w:r>
-      <w:r>
-        <w:t xml:space="preserve">miss channel and</w:t>
-      </w:r>
-      <w:r>
-        <w:t xml:space="preserve"> </w:t>
-      </w:r>
-      <w:r>
-        <w:rPr>
-          <w:rStyle w:val="VerbatimChar"/>
-        </w:rPr>
-        <w:t xml:space="preserve">ani_from_hist</w:t>
-      </w:r>
-      <w:r>
-        <w:t xml:space="preserve"> </w:t>
-      </w:r>
-      <w:r>
-        <w:t xml:space="preserve">from the mismatch histogram): when they diverge</w:t>
-      </w:r>
-      <w:r>
-        <w:t xml:space="preserve"> </w:t>
-      </w:r>
-      <w:r>
-        <w:t xml:space="preserve">by more than 5 ANI points the method reports the homogeneous fit, otherwise the</w:t>
-      </w:r>
-      <w:r>
-        <w:t xml:space="preserve"> </w:t>
-      </w:r>
-      <w:r>
-        <w:t xml:space="preserve">gamma fit. The threshold was chosen at the flat optimum of a sweep on the</w:t>
-      </w:r>
-      <w:r>
-        <w:t xml:space="preserve"> </w:t>
-      </w:r>
-      <w:r>
-        <w:t xml:space="preserve">GTDB-ANIm training matrix. The hierarchical</w:t>
-      </w:r>
-      <w:r>
-        <w:t xml:space="preserve"> </w:t>
-      </w:r>
-      <w:r>
-        <w:rPr>
-          <w:rStyle w:val="VerbatimChar"/>
-        </w:rPr>
-        <w:t xml:space="preserve">flag</w:t>
-      </w:r>
-      <w:r>
-        <w:t xml:space="preserve"> </w:t>
-      </w:r>
-      <w:r>
-        <w:t xml:space="preserve">column reports</w:t>
+        <w:t xml:space="preserve">A query contig with &lt; 8 ×</w:t>
+      </w:r>
+      <w:r>
+        <w:t xml:space="preserve"> </w:t>
+      </w:r>
+      <w:r>
+        <w:rPr>
+          <w:rStyle w:val="VerbatimChar"/>
+        </w:rPr>
+        <w:t xml:space="preserve">min_chain_anchors</w:t>
+      </w:r>
+      <w:r>
+        <w:t xml:space="preserve"> </w:t>
+      </w:r>
+      <w:r>
+        <w:t xml:space="preserve">in-panel tags (~25 kb with the default panel) and no accepted chain is folded into the likelihood without chaining if it carries a collinear group of ≥ 2 unique anchors (unique = occurring once in each genome; at least one anchor with ≤ 1 mismatch, since a solely-2-mismatch basis can be a paralog; ties break on total mismatch count). Counting replicates exactly what pass-2 chaining would count on the intact genome: tags between the outer basis anchors are counted (hits to the histogram, no match to the miss count), and a tail tag beyond an outer anchor is counted only while a bracketing anchor from any contig follows within (</w:t>
+      </w:r>
+      <w:r>
+        <w:rPr>
+          <w:rStyle w:val="VerbatimChar"/>
+        </w:rPr>
+        <w:t xml:space="preserve">max_skip</w:t>
+      </w:r>
+      <w:r>
+        <w:t xml:space="preserve"> </w:t>
+      </w:r>
+      <w:r>
+        <w:t xml:space="preserve">+ 1) × mean tag spacing along the reference. Rescued contigs contribute AF spans with the same half-median-gap extension rule as chains but create no chains, so synteny and SV outputs are untouched. The pass is gated on contig tag count, so complete and high-N50 assemblies take a bit-identical path. The residual +0.20 drift at N50 5 kb comes from contigs with 0–1 placeable anchors (~1.3 Mb on the Sakai ladder), which carry no positional evidence; rescuing them would require guessing homology.</w:t>
+      </w:r>
+    </w:p>
+    <w:bookmarkEnd w:id="27"/>
+    <w:bookmarkStart w:id="28" w:name="database-scale-screen"/>
+    <w:p>
+      <w:pPr>
+        <w:pStyle w:val="Heading3"/>
+      </w:pPr>
+      <w:r>
+        <w:t xml:space="preserve">Database-scale screen</w:t>
+      </w:r>
+    </w:p>
+    <w:p>
+      <w:pPr>
+        <w:pStyle w:val="FirstParagraph"/>
+      </w:pPr>
+      <w:r>
+        <w:t xml:space="preserve">Batch subcommands (</w:t>
+      </w:r>
+      <w:r>
+        <w:rPr>
+          <w:rStyle w:val="VerbatimChar"/>
+        </w:rPr>
+        <w:t xml:space="preserve">dist</w:t>
+      </w:r>
+      <w:r>
+        <w:t xml:space="preserve">,</w:t>
+      </w:r>
+      <w:r>
+        <w:t xml:space="preserve"> </w:t>
+      </w:r>
+      <w:r>
+        <w:rPr>
+          <w:rStyle w:val="VerbatimChar"/>
+        </w:rPr>
+        <w:t xml:space="preserve">search</w:t>
+      </w:r>
+      <w:r>
+        <w:t xml:space="preserve">,</w:t>
+      </w:r>
+      <w:r>
+        <w:t xml:space="preserve"> </w:t>
+      </w:r>
+      <w:r>
+        <w:rPr>
+          <w:rStyle w:val="VerbatimChar"/>
+        </w:rPr>
+        <w:t xml:space="preserve">triangle</w:t>
+      </w:r>
+      <w:r>
+        <w:t xml:space="preserve">,</w:t>
+      </w:r>
+      <w:r>
+        <w:t xml:space="preserve"> </w:t>
+      </w:r>
+      <w:r>
+        <w:rPr>
+          <w:rStyle w:val="VerbatimChar"/>
+        </w:rPr>
+        <w:t xml:space="preserve">db search</w:t>
+      </w:r>
+      <w:r>
+        <w:t xml:space="preserve">) run a two-stage pipeline. Stage 1 reduces each tag to one strand-canonical key — its centered 18 bp packed window — per enzyme; a pair passes iff shared keys ≥ 3 AND shared/min(smaller key set) ≥ 0.001. At 18 bp, generic background homology (shared genes at 65–75% identity) no longer saturates key containment, and the gate was calibrated on GTDB-R207 to false-reject 0/500 validated ≥ 80% ANI pairs while rejecting ~83% of random pairs (measured false-reject rate on estimator-reportable pairs at n = 2,000: 1/844). In the FRR-critical 80–85% band the weakest validated true pair clears the floors by 10×/6×. Stage 2 refines survivors with the identical</w:t>
+      </w:r>
+      <w:r>
+        <w:t xml:space="preserve"> </w:t>
+      </w:r>
+      <w:r>
+        <w:rPr>
+          <w:rStyle w:val="VerbatimChar"/>
+        </w:rPr>
+        <w:t xml:space="preserve">chain_ani</w:t>
+      </w:r>
+      <w:r>
+        <w:t xml:space="preserve"> </w:t>
+      </w:r>
+      <w:r>
+        <w:t xml:space="preserve">code path and row formatter as the pairwise</w:t>
+      </w:r>
+      <w:r>
+        <w:t xml:space="preserve"> </w:t>
+      </w:r>
+      <w:r>
+        <w:rPr>
+          <w:rStyle w:val="VerbatimChar"/>
+        </w:rPr>
+        <w:t xml:space="preserve">ani</w:t>
+      </w:r>
+      <w:r>
+        <w:t xml:space="preserve"> </w:t>
+      </w:r>
+      <w:r>
+        <w:t xml:space="preserve">command, so database output is byte-identical to pairwise output on the same pairs. Screen thresholds are panel-specific and exposed as flags.</w:t>
+      </w:r>
+    </w:p>
+    <w:bookmarkEnd w:id="28"/>
+    <w:bookmarkStart w:id="29" w:name="ridge-calibration-protocol"/>
+    <w:p>
+      <w:pPr>
+        <w:pStyle w:val="Heading3"/>
+      </w:pPr>
+      <w:r>
+        <w:t xml:space="preserve">Ridge calibration protocol</w:t>
+      </w:r>
+    </w:p>
+    <w:p>
+      <w:pPr>
+        <w:pStyle w:val="FirstParagraph"/>
+      </w:pPr>
+      <w:r>
+        <w:t xml:space="preserve">The calibration model is ridge regression on nine Syn2bANI-internal features</w:t>
+      </w:r>
+      <w:r>
+        <w:t xml:space="preserve"> </w:t>
+      </w:r>
+      <w:r>
+        <w:t xml:space="preserve">(</w:t>
+      </w:r>
+      <w:r>
+        <w:rPr>
+          <w:rStyle w:val="VerbatimChar"/>
+        </w:rPr>
+        <w:t xml:space="preserve">ani_gated</w:t>
+      </w:r>
+      <w:r>
+        <w:t xml:space="preserve">,</w:t>
+      </w:r>
+      <w:r>
+        <w:t xml:space="preserve"> </w:t>
+      </w:r>
+      <w:r>
+        <w:rPr>
+          <w:rStyle w:val="VerbatimChar"/>
+        </w:rPr>
+        <w:t xml:space="preserve">ani_uniform</w:t>
+      </w:r>
+      <w:r>
+        <w:t xml:space="preserve">,</w:t>
+      </w:r>
+      <w:r>
+        <w:t xml:space="preserve"> </w:t>
+      </w:r>
+      <w:r>
+        <w:rPr>
+          <w:rStyle w:val="VerbatimChar"/>
+        </w:rPr>
+        <w:t xml:space="preserve">af_query</w:t>
+      </w:r>
+      <w:r>
+        <w:t xml:space="preserve">,</w:t>
+      </w:r>
+      <w:r>
+        <w:t xml:space="preserve"> </w:t>
+      </w:r>
+      <w:r>
+        <w:rPr>
+          <w:rStyle w:val="VerbatimChar"/>
+        </w:rPr>
+        <w:t xml:space="preserve">af_reference</w:t>
+      </w:r>
+      <w:r>
+        <w:t xml:space="preserve">,</w:t>
+      </w:r>
+      <w:r>
+        <w:t xml:space="preserve"> </w:t>
+      </w:r>
+      <w:r>
+        <w:rPr>
+          <w:rStyle w:val="VerbatimChar"/>
+        </w:rPr>
+        <w:t xml:space="preserve">std_err</w:t>
+      </w:r>
+      <w:r>
+        <w:t xml:space="preserve">,</w:t>
+      </w:r>
+      <w:r>
+        <w:t xml:space="preserve"> </w:t>
+      </w:r>
+      <w:r>
+        <w:rPr>
+          <w:rStyle w:val="VerbatimChar"/>
+        </w:rPr>
+        <w:t xml:space="preserve">retention</w:t>
+      </w:r>
+      <w:r>
+        <w:t xml:space="preserve">,</w:t>
+      </w:r>
+      <w:r>
+        <w:t xml:space="preserve"> </w:t>
+      </w:r>
+      <w:r>
+        <w:rPr>
+          <w:rStyle w:val="VerbatimChar"/>
+        </w:rPr>
+        <w:t xml:space="preserve">n_anchors</w:t>
+      </w:r>
+      <w:r>
+        <w:t xml:space="preserve">,</w:t>
+      </w:r>
+      <w:r>
+        <w:t xml:space="preserve"> </w:t>
+      </w:r>
+      <w:r>
+        <w:rPr>
+          <w:rStyle w:val="VerbatimChar"/>
+        </w:rPr>
+        <w:t xml:space="preserve">n_chains</w:t>
+      </w:r>
+      <w:r>
+        <w:t xml:space="preserve">,</w:t>
+      </w:r>
+      <w:r>
+        <w:t xml:space="preserve"> </w:t>
+      </w:r>
+      <w:r>
+        <w:rPr>
+          <w:rStyle w:val="VerbatimChar"/>
+        </w:rPr>
+        <w:t xml:space="preserve">n_tags_in_chains</w:t>
+      </w:r>
+      <w:r>
+        <w:t xml:space="preserve">), with median imputation and</w:t>
+      </w:r>
+      <w:r>
+        <w:t xml:space="preserve"> </w:t>
+      </w:r>
+      <w:r>
+        <w:t xml:space="preserve">standardization. Regularization strength</w:t>
+      </w:r>
+      <w:r>
+        <w:t xml:space="preserve"> </w:t>
+      </w:r>
+      <w:r>
+        <w:rPr>
+          <w:rStyle w:val="VerbatimChar"/>
+        </w:rPr>
+        <w:t xml:space="preserve">α = 10</w:t>
+      </w:r>
+      <w:r>
+        <w:t xml:space="preserve"> </w:t>
+      </w:r>
+      <w:r>
+        <w:t xml:space="preserve">is selected by inner</w:t>
+      </w:r>
+      <w:r>
+        <w:t xml:space="preserve"> </w:t>
+      </w:r>
+      <w:r>
+        <w:t xml:space="preserve">cross-validation (scikit-learn29). The model is trained on 2,520 ANIm-truth pairs</w:t>
+      </w:r>
+      <w:r>
+        <w:t xml:space="preserve"> </w:t>
+      </w:r>
+      <w:r>
+        <w:t xml:space="preserve">(80–99.5% ANIm) spanning 607 species and 26 phyla, with zero genome-level overlap</w:t>
+      </w:r>
+      <w:r>
+        <w:t xml:space="preserve"> </w:t>
+      </w:r>
+      <w:r>
+        <w:t xml:space="preserve">between the 2,074-pair stratified benchmark and the 467-pair 95–99.5% expansion.</w:t>
+      </w:r>
+      <w:r>
+        <w:t xml:space="preserve"> </w:t>
+      </w:r>
+      <w:r>
+        <w:t xml:space="preserve">Validation is</w:t>
+      </w:r>
+      <w:r>
+        <w:t xml:space="preserve"> </w:t>
+      </w:r>
+      <w:r>
+        <w:rPr>
+          <w:b/>
+          <w:bCs/>
+        </w:rPr>
+        <w:t xml:space="preserve">band-holdout</w:t>
+      </w:r>
+      <w:r>
+        <w:t xml:space="preserve">: each ANI band (80–85, 85–90, 90–95, 95–99) is</w:t>
+      </w:r>
+      <w:r>
+        <w:t xml:space="preserve"> </w:t>
+      </w:r>
+      <w:r>
+        <w:t xml:space="preserve">predicted by a model trained on the other three only. Calibrated output is a</w:t>
+      </w:r>
+      <w:r>
+        <w:t xml:space="preserve"> </w:t>
+      </w:r>
+      <w:r>
+        <w:t xml:space="preserve">separate column (</w:t>
+      </w:r>
+      <w:r>
+        <w:rPr>
+          <w:rStyle w:val="VerbatimChar"/>
+        </w:rPr>
+        <w:t xml:space="preserve">--calibrate</w:t>
+      </w:r>
+      <w:r>
+        <w:t xml:space="preserve">) and is omitted on</w:t>
       </w:r>
       <w:r>
         <w:t xml:space="preserve"> </w:t>
@@ -1843,56 +2125,29 @@
         <w:t xml:space="preserve"> </w:t>
       </w:r>
       <w:r>
-        <w:t xml:space="preserve">(expected retention &lt; 0.20),</w:t>
-      </w:r>
-      <w:r>
-        <w:t xml:space="preserve"> </w:t>
-      </w:r>
-      <w:r>
-        <w:rPr>
-          <w:rStyle w:val="VerbatimChar"/>
-        </w:rPr>
-        <w:t xml:space="preserve">INCONSISTENT</w:t>
-      </w:r>
-      <w:r>
-        <w:t xml:space="preserve"> </w:t>
-      </w:r>
-      <w:r>
-        <w:t xml:space="preserve">(gate fallback or</w:t>
-      </w:r>
-      <w:r>
-        <w:t xml:space="preserve"> </w:t>
-      </w:r>
-      <w:r>
-        <w:t xml:space="preserve">&gt; 0.5 breakpoints per anchor), or</w:t>
-      </w:r>
-      <w:r>
-        <w:t xml:space="preserve"> </w:t>
-      </w:r>
-      <w:r>
-        <w:rPr>
-          <w:rStyle w:val="VerbatimChar"/>
-        </w:rPr>
-        <w:t xml:space="preserve">ok</w:t>
-      </w:r>
-      <w:r>
-        <w:t xml:space="preserve">. Full formulas, the negative-binomial</w:t>
-      </w:r>
-      <w:r>
-        <w:t xml:space="preserve"> </w:t>
-      </w:r>
-      <w:r>
-        <w:t xml:space="preserve">derivation, and the gating/flag rationale are given in Supplementary Note 4.</w:t>
-      </w:r>
-    </w:p>
-    <w:bookmarkEnd w:id="27"/>
-    <w:bookmarkStart w:id="28" w:name="short-contig-rescue-pass"/>
+        <w:t xml:space="preserve">pairs rather</w:t>
+      </w:r>
+      <w:r>
+        <w:t xml:space="preserve"> </w:t>
+      </w:r>
+      <w:r>
+        <w:t xml:space="preserve">than extrapolated. Learning-curve, feature-expansion, and model-comparison</w:t>
+      </w:r>
+      <w:r>
+        <w:t xml:space="preserve"> </w:t>
+      </w:r>
+      <w:r>
+        <w:t xml:space="preserve">details are in Supplementary Notes 2 and 6.</w:t>
+      </w:r>
+    </w:p>
+    <w:bookmarkEnd w:id="29"/>
+    <w:bookmarkStart w:id="30" w:name="Xd3b37ce8f62a83dd9d52f682daa388ffbd3bd4e"/>
     <w:p>
       <w:pPr>
         <w:pStyle w:val="Heading3"/>
       </w:pPr>
       <w:r>
-        <w:t xml:space="preserve">Short-contig rescue pass</w:t>
+        <w:t xml:space="preserve">The spatial-model negative result (identifiability analysis)</w:t>
       </w:r>
     </w:p>
     <w:p>
@@ -1900,44 +2155,59 @@
         <w:pStyle w:val="FirstParagraph"/>
       </w:pPr>
       <w:r>
-        <w:t xml:space="preserve">A query contig with &lt; 8 ×</w:t>
-      </w:r>
-      <w:r>
-        <w:t xml:space="preserve"> </w:t>
-      </w:r>
-      <w:r>
-        <w:rPr>
-          <w:rStyle w:val="VerbatimChar"/>
-        </w:rPr>
-        <w:t xml:space="preserve">min_chain_anchors</w:t>
-      </w:r>
-      <w:r>
-        <w:t xml:space="preserve"> </w:t>
-      </w:r>
-      <w:r>
-        <w:t xml:space="preserve">in-panel tags (~25 kb with the default panel) and no accepted chain is folded into the likelihood without chaining if it carries a collinear group of ≥ 2 unique anchors (unique = occurring once in each genome; at least one anchor with ≤ 1 mismatch, since a solely-2-mismatch basis can be a paralog; ties break on total mismatch count). Counting replicates exactly what pass-2 chaining would count on the intact genome: tags between the outer basis anchors are counted (hits to the histogram, no match to the miss count), and a tail tag beyond an outer anchor is counted only while a bracketing anchor from any contig follows within (</w:t>
-      </w:r>
-      <w:r>
-        <w:rPr>
-          <w:rStyle w:val="VerbatimChar"/>
-        </w:rPr>
-        <w:t xml:space="preserve">max_skip</w:t>
-      </w:r>
-      <w:r>
-        <w:t xml:space="preserve"> </w:t>
-      </w:r>
-      <w:r>
-        <w:t xml:space="preserve">+ 1) × mean tag spacing along the reference. Rescued contigs contribute AF spans with the same half-median-gap extension rule as chains but create no chains, so synteny and SV outputs are untouched. The pass is gated on contig tag count, so complete and high-N50 assemblies take a bit-identical path. The residual +0.20 drift at N50 5 kb comes from contigs with 0–1 placeable anchors (~1.3 Mb on the Sakai ladder), which carry no positional evidence; rescuing them would require guessing homology.</w:t>
-      </w:r>
-    </w:p>
-    <w:bookmarkEnd w:id="28"/>
-    <w:bookmarkStart w:id="29" w:name="database-scale-screen"/>
+        <w:t xml:space="preserve">A mechanistic spatial-rate model was also evaluated as an alternative to</w:t>
+      </w:r>
+      <w:r>
+        <w:t xml:space="preserve"> </w:t>
+      </w:r>
+      <w:r>
+        <w:t xml:space="preserve">post-hoc calibration. The raw estimator is already at its identifiability floor</w:t>
+      </w:r>
+      <w:r>
+        <w:t xml:space="preserve"> </w:t>
+      </w:r>
+      <w:r>
+        <w:t xml:space="preserve">at 4-enzyme tag density: in-chain distribution-family changes can fix at most</w:t>
+      </w:r>
+      <w:r>
+        <w:t xml:space="preserve"> </w:t>
+      </w:r>
+      <w:r>
+        <w:t xml:space="preserve">~0.1–0.2 ANI points, and the divergence of the unchained fraction is not</w:t>
+      </w:r>
+      <w:r>
+        <w:t xml:space="preserve"> </w:t>
+      </w:r>
+      <w:r>
+        <w:t xml:space="preserve">identifiable from tag data. No candidate spatial model (AF-weighted mixtures,</w:t>
+      </w:r>
+      <w:r>
+        <w:t xml:space="preserve"> </w:t>
+      </w:r>
+      <w:r>
+        <w:t xml:space="preserve">discrete mixtures, ascertainment-aware tilts, capped NPMLE, model averaging)</w:t>
+      </w:r>
+      <w:r>
+        <w:t xml:space="preserve"> </w:t>
+      </w:r>
+      <w:r>
+        <w:t xml:space="preserve">beats the gated baseline while preserving exact-truth simulation gates. The full</w:t>
+      </w:r>
+      <w:r>
+        <w:t xml:space="preserve"> </w:t>
+      </w:r>
+      <w:r>
+        <w:t xml:space="preserve">negative result is reported in Supplementary Note 5.</w:t>
+      </w:r>
+    </w:p>
+    <w:bookmarkEnd w:id="30"/>
+    <w:bookmarkStart w:id="31" w:name="structural-variant-calling"/>
     <w:p>
       <w:pPr>
         <w:pStyle w:val="Heading3"/>
       </w:pPr>
       <w:r>
-        <w:t xml:space="preserve">Database-scale screen</w:t>
+        <w:t xml:space="preserve">Structural-variant calling</w:t>
       </w:r>
     </w:p>
     <w:p>
@@ -1945,127 +2215,120 @@
         <w:pStyle w:val="FirstParagraph"/>
       </w:pPr>
       <w:r>
-        <w:t xml:space="preserve">Batch subcommands (</w:t>
-      </w:r>
-      <w:r>
-        <w:rPr>
-          <w:rStyle w:val="VerbatimChar"/>
-        </w:rPr>
-        <w:t xml:space="preserve">dist</w:t>
-      </w:r>
-      <w:r>
-        <w:t xml:space="preserve">,</w:t>
-      </w:r>
-      <w:r>
-        <w:t xml:space="preserve"> </w:t>
-      </w:r>
-      <w:r>
-        <w:rPr>
-          <w:rStyle w:val="VerbatimChar"/>
-        </w:rPr>
-        <w:t xml:space="preserve">search</w:t>
-      </w:r>
-      <w:r>
-        <w:t xml:space="preserve">,</w:t>
-      </w:r>
-      <w:r>
-        <w:t xml:space="preserve"> </w:t>
-      </w:r>
-      <w:r>
-        <w:rPr>
-          <w:rStyle w:val="VerbatimChar"/>
-        </w:rPr>
-        <w:t xml:space="preserve">triangle</w:t>
-      </w:r>
-      <w:r>
-        <w:t xml:space="preserve">,</w:t>
-      </w:r>
-      <w:r>
-        <w:t xml:space="preserve"> </w:t>
-      </w:r>
-      <w:r>
-        <w:rPr>
-          <w:rStyle w:val="VerbatimChar"/>
-        </w:rPr>
-        <w:t xml:space="preserve">db search</w:t>
-      </w:r>
-      <w:r>
-        <w:t xml:space="preserve">) run a two-stage pipeline. Stage 1 reduces each tag to one strand-canonical key — its centered 18 bp packed window — per enzyme; a pair passes iff shared keys ≥ 3 AND shared/min(smaller key set) ≥ 0.001. At 18 bp, generic background homology (shared genes at 65–75% identity) no longer saturates key containment, and the gate was calibrated on GTDB-R207 to false-reject 0/500 validated ≥ 80% ANI pairs while rejecting ~83% of random pairs (measured false-reject rate on estimator-reportable pairs at n = 2,000: 1/844). In the FRR-critical 80–85% band the weakest validated true pair clears the floors by 10×/6×. Stage 2 refines survivors with the identical</w:t>
-      </w:r>
-      <w:r>
-        <w:t xml:space="preserve"> </w:t>
-      </w:r>
-      <w:r>
-        <w:rPr>
-          <w:rStyle w:val="VerbatimChar"/>
-        </w:rPr>
-        <w:t xml:space="preserve">chain_ani</w:t>
-      </w:r>
-      <w:r>
-        <w:t xml:space="preserve"> </w:t>
-      </w:r>
-      <w:r>
-        <w:t xml:space="preserve">code path and row formatter as the pairwise</w:t>
-      </w:r>
-      <w:r>
-        <w:t xml:space="preserve"> </w:t>
-      </w:r>
-      <w:r>
-        <w:rPr>
-          <w:rStyle w:val="VerbatimChar"/>
-        </w:rPr>
-        <w:t xml:space="preserve">ani</w:t>
-      </w:r>
-      <w:r>
-        <w:t xml:space="preserve"> </w:t>
-      </w:r>
-      <w:r>
-        <w:t xml:space="preserve">command, so database output is byte-identical to pairwise output on the same pairs. Screen thresholds are panel-specific and exposed as flags.</w:t>
-      </w:r>
-    </w:p>
-    <w:bookmarkEnd w:id="29"/>
-    <w:bookmarkStart w:id="30" w:name="ridge-calibration-protocol"/>
-    <w:p>
-      <w:pPr>
-        <w:pStyle w:val="Heading3"/>
-      </w:pPr>
-      <w:r>
-        <w:t xml:space="preserve">Ridge calibration protocol</w:t>
-      </w:r>
-    </w:p>
-    <w:p>
-      <w:pPr>
-        <w:pStyle w:val="FirstParagraph"/>
-      </w:pPr>
-      <w:r>
-        <w:t xml:space="preserve">The calibration model is ridge regression on nine Syn2bANI-internal features</w:t>
-      </w:r>
-      <w:r>
-        <w:t xml:space="preserve"> </w:t>
-      </w:r>
-      <w:r>
-        <w:t xml:space="preserve">(</w:t>
-      </w:r>
-      <w:r>
-        <w:rPr>
-          <w:rStyle w:val="VerbatimChar"/>
-        </w:rPr>
-        <w:t xml:space="preserve">ani_gated</w:t>
-      </w:r>
-      <w:r>
-        <w:t xml:space="preserve">,</w:t>
-      </w:r>
-      <w:r>
-        <w:t xml:space="preserve"> </w:t>
-      </w:r>
-      <w:r>
-        <w:rPr>
-          <w:rStyle w:val="VerbatimChar"/>
-        </w:rPr>
-        <w:t xml:space="preserve">ani_uniform</w:t>
-      </w:r>
-      <w:r>
-        <w:t xml:space="preserve">,</w:t>
+        <w:t xml:space="preserve">The</w:t>
+      </w:r>
+      <w:r>
+        <w:t xml:space="preserve"> </w:t>
+      </w:r>
+      <w:r>
+        <w:rPr>
+          <w:rStyle w:val="VerbatimChar"/>
+        </w:rPr>
+        <w:t xml:space="preserve">struct</w:t>
+      </w:r>
+      <w:r>
+        <w:t xml:space="preserve"> </w:t>
+      </w:r>
+      <w:r>
+        <w:t xml:space="preserve">subcommand consumes the chains and anchors of a pairwise comparison. Inversions are orientation flips between consecutive chains; indels are coordinate gaps between consecutive chains exceeding</w:t>
+      </w:r>
+      <w:r>
+        <w:t xml:space="preserve"> </w:t>
+      </w:r>
+      <w:r>
+        <w:rPr>
+          <w:rStyle w:val="VerbatimChar"/>
+        </w:rPr>
+        <w:t xml:space="preserve">indel_min</w:t>
+      </w:r>
+      <w:r>
+        <w:t xml:space="preserve"> </w:t>
+      </w:r>
+      <w:r>
+        <w:t xml:space="preserve">(default 1 kb), with a guard requiring that no third chain anchors inside the spanned reference interval (without it, a small relocated block sandwiched between collinear chains is misreported as a deletion sized by the reference jump — observed as spurious 42–961 kb calls before the guard); translocations are chains violating global reference order. Resolution is limited by tag spacing and by unphaseable repeats at junctions (observed endpoint offset ≤ 5.5 kb on the 779 kb W3110 inversion); events whose flanking chains have &lt; 4 anchors are not called, and equal-length homologous replacements that keep tags phased are invisible by design. For circular chromosomes,</w:t>
+      </w:r>
+      <w:r>
+        <w:t xml:space="preserve"> </w:t>
+      </w:r>
+      <w:r>
+        <w:rPr>
+          <w:rStyle w:val="VerbatimChar"/>
+        </w:rPr>
+        <w:t xml:space="preserve">syn2bani struct --circular &lt;ref_name&gt;</w:t>
+      </w:r>
+      <w:r>
+        <w:t xml:space="preserve"> </w:t>
+      </w:r>
+      <w:r>
+        <w:t xml:space="preserve">marks the reference as circular; genome-spanning calls that exceed</w:t>
+      </w:r>
+      <w:r>
+        <w:t xml:space="preserve"> </w:t>
+      </w:r>
+      <w:r>
+        <w:rPr>
+          <w:rStyle w:val="VerbatimChar"/>
+        </w:rPr>
+        <w:t xml:space="preserve">--artifact-threshold</w:t>
+      </w:r>
+      <w:r>
+        <w:t xml:space="preserve"> </w:t>
+      </w:r>
+      <w:r>
+        <w:t xml:space="preserve">(default 50% of the reference length) are reported but flagged as likely circular-origin coordinate artifacts rather than biological rearrangements. Validation against dnadiff used span-based one-to-many matching because dnadiff fragments large accessory regions into many small events while Syn2bANI calls each junction once.</w:t>
+      </w:r>
+    </w:p>
+    <w:p>
+      <w:pPr>
+        <w:pStyle w:val="BodyText"/>
+      </w:pPr>
+      <w:r>
+        <w:t xml:space="preserve">Three structural metrics are exported for every pair.</w:t>
+      </w:r>
+      <w:r>
+        <w:t xml:space="preserve"> </w:t>
+      </w:r>
+      <w:r>
+        <w:rPr>
+          <w:rStyle w:val="VerbatimChar"/>
+        </w:rPr>
+        <w:t xml:space="preserve">synteny_blocks</w:t>
+      </w:r>
+      <w:r>
+        <w:t xml:space="preserve"> </w:t>
+      </w:r>
+      <w:r>
+        <w:t xml:space="preserve">is the number of collinear chains;</w:t>
+      </w:r>
+      <w:r>
+        <w:t xml:space="preserve"> </w:t>
+      </w:r>
+      <w:r>
+        <w:rPr>
+          <w:rStyle w:val="VerbatimChar"/>
+        </w:rPr>
+        <w:t xml:space="preserve">breakpoint_count</w:t>
+      </w:r>
+      <w:r>
+        <w:t xml:space="preserve"> </w:t>
+      </w:r>
+      <w:r>
+        <w:t xml:space="preserve">is the number of chain-disrupting events — orientation flips between consecutive chains, reference-order violations, and large indels — and is the primary rearrangement statistic.</w:t>
+      </w:r>
+      <w:r>
+        <w:t xml:space="preserve"> </w:t>
+      </w:r>
+      <w:r>
+        <w:rPr>
+          <w:rStyle w:val="VerbatimChar"/>
+        </w:rPr>
+        <w:t xml:space="preserve">anchor_adjacency</w:t>
+      </w:r>
+      <w:r>
+        <w:t xml:space="preserve"> </w:t>
+      </w:r>
+      <w:r>
+        <w:t xml:space="preserve">is the fraction of possible adjacent anchor pairs (within chained query contigs) that remain collinear neighbors inside a chain; it is an anchor-adjacency conservation metric, not a base-pair coverage metric.</w:t>
       </w:r>
       <w:r>
         <w:t xml:space="preserve"> </w:t>
@@ -2077,7 +2340,10 @@
         <w:t xml:space="preserve">af_query</w:t>
       </w:r>
       <w:r>
-        <w:t xml:space="preserve">,</w:t>
+        <w:t xml:space="preserve"> </w:t>
+      </w:r>
+      <w:r>
+        <w:t xml:space="preserve">is the fraction of query bases covered by chained anchors (base-pair aligned fraction) and is the quantity that corresponds to alignment-based synteny/coverage scores.</w:t>
       </w:r>
       <w:r>
         <w:t xml:space="preserve"> </w:t>
@@ -2089,526 +2355,142 @@
         <w:t xml:space="preserve">af_reference</w:t>
       </w:r>
       <w:r>
-        <w:t xml:space="preserve">,</w:t>
-      </w:r>
-      <w:r>
-        <w:t xml:space="preserve"> </w:t>
-      </w:r>
-      <w:r>
-        <w:rPr>
-          <w:rStyle w:val="VerbatimChar"/>
-        </w:rPr>
-        <w:t xml:space="preserve">std_err</w:t>
-      </w:r>
-      <w:r>
-        <w:t xml:space="preserve">,</w:t>
-      </w:r>
-      <w:r>
-        <w:t xml:space="preserve"> </w:t>
-      </w:r>
-      <w:r>
-        <w:rPr>
-          <w:rStyle w:val="VerbatimChar"/>
-        </w:rPr>
-        <w:t xml:space="preserve">retention</w:t>
-      </w:r>
-      <w:r>
-        <w:t xml:space="preserve">,</w:t>
-      </w:r>
-      <w:r>
-        <w:t xml:space="preserve"> </w:t>
-      </w:r>
-      <w:r>
-        <w:rPr>
-          <w:rStyle w:val="VerbatimChar"/>
-        </w:rPr>
-        <w:t xml:space="preserve">n_anchors</w:t>
-      </w:r>
-      <w:r>
-        <w:t xml:space="preserve">,</w:t>
-      </w:r>
-      <w:r>
-        <w:t xml:space="preserve"> </w:t>
-      </w:r>
-      <w:r>
-        <w:rPr>
-          <w:rStyle w:val="VerbatimChar"/>
-        </w:rPr>
-        <w:t xml:space="preserve">n_chains</w:t>
-      </w:r>
-      <w:r>
-        <w:t xml:space="preserve">,</w:t>
-      </w:r>
-      <w:r>
-        <w:t xml:space="preserve"> </w:t>
-      </w:r>
-      <w:r>
-        <w:rPr>
-          <w:rStyle w:val="VerbatimChar"/>
-        </w:rPr>
-        <w:t xml:space="preserve">n_tags_in_chains</w:t>
-      </w:r>
-      <w:r>
-        <w:t xml:space="preserve">), with median imputation and</w:t>
-      </w:r>
-      <w:r>
-        <w:t xml:space="preserve"> </w:t>
-      </w:r>
-      <w:r>
-        <w:t xml:space="preserve">standardization. Regularization strength</w:t>
-      </w:r>
-      <w:r>
-        <w:t xml:space="preserve"> </w:t>
-      </w:r>
-      <w:r>
-        <w:rPr>
-          <w:rStyle w:val="VerbatimChar"/>
-        </w:rPr>
-        <w:t xml:space="preserve">α = 10</w:t>
-      </w:r>
-      <w:r>
-        <w:t xml:space="preserve"> </w:t>
-      </w:r>
-      <w:r>
-        <w:t xml:space="preserve">is selected by inner</w:t>
-      </w:r>
-      <w:r>
-        <w:t xml:space="preserve"> </w:t>
-      </w:r>
-      <w:r>
-        <w:t xml:space="preserve">cross-validation (scikit-learn29). The model is trained on 2,520 ANIm-truth pairs</w:t>
-      </w:r>
-      <w:r>
-        <w:t xml:space="preserve"> </w:t>
-      </w:r>
-      <w:r>
-        <w:t xml:space="preserve">(80–99.5% ANIm) spanning 607 species and 26 phyla, with zero genome-level overlap</w:t>
-      </w:r>
-      <w:r>
-        <w:t xml:space="preserve"> </w:t>
-      </w:r>
-      <w:r>
-        <w:t xml:space="preserve">between the 2,074-pair stratified benchmark and the 467-pair 95–99.5% expansion.</w:t>
-      </w:r>
-      <w:r>
-        <w:t xml:space="preserve"> </w:t>
-      </w:r>
-      <w:r>
-        <w:t xml:space="preserve">Validation is</w:t>
-      </w:r>
-      <w:r>
-        <w:t xml:space="preserve"> </w:t>
-      </w:r>
-      <w:r>
-        <w:rPr>
-          <w:b/>
-          <w:bCs/>
-        </w:rPr>
-        <w:t xml:space="preserve">band-holdout</w:t>
-      </w:r>
-      <w:r>
-        <w:t xml:space="preserve">: each ANI band (80–85, 85–90, 90–95, 95–99) is</w:t>
-      </w:r>
-      <w:r>
-        <w:t xml:space="preserve"> </w:t>
-      </w:r>
-      <w:r>
-        <w:t xml:space="preserve">predicted by a model trained on the other three only. Calibrated output is a</w:t>
-      </w:r>
-      <w:r>
-        <w:t xml:space="preserve"> </w:t>
-      </w:r>
-      <w:r>
-        <w:t xml:space="preserve">separate column (</w:t>
-      </w:r>
-      <w:r>
-        <w:rPr>
-          <w:rStyle w:val="VerbatimChar"/>
-        </w:rPr>
-        <w:t xml:space="preserve">--calibrate</w:t>
-      </w:r>
-      <w:r>
-        <w:t xml:space="preserve">) and is omitted on</w:t>
-      </w:r>
-      <w:r>
-        <w:t xml:space="preserve"> </w:t>
-      </w:r>
-      <w:r>
-        <w:rPr>
-          <w:rStyle w:val="VerbatimChar"/>
-        </w:rPr>
-        <w:t xml:space="preserve">BELOW_DETECTION</w:t>
-      </w:r>
-      <w:r>
-        <w:t xml:space="preserve"> </w:t>
-      </w:r>
-      <w:r>
-        <w:t xml:space="preserve">pairs rather</w:t>
-      </w:r>
-      <w:r>
-        <w:t xml:space="preserve"> </w:t>
-      </w:r>
-      <w:r>
-        <w:t xml:space="preserve">than extrapolated. Learning-curve, feature-expansion, and model-comparison</w:t>
-      </w:r>
-      <w:r>
-        <w:t xml:space="preserve"> </w:t>
-      </w:r>
-      <w:r>
-        <w:t xml:space="preserve">details are in Supplementary Notes 2 and 6.</w:t>
-      </w:r>
-    </w:p>
-    <w:bookmarkEnd w:id="30"/>
-    <w:bookmarkStart w:id="31" w:name="Xd3b37ce8f62a83dd9d52f682daa388ffbd3bd4e"/>
-    <w:p>
-      <w:pPr>
-        <w:pStyle w:val="Heading3"/>
-      </w:pPr>
-      <w:r>
-        <w:t xml:space="preserve">The spatial-model negative result (identifiability analysis)</w:t>
-      </w:r>
-    </w:p>
-    <w:p>
-      <w:pPr>
-        <w:pStyle w:val="FirstParagraph"/>
-      </w:pPr>
-      <w:r>
-        <w:t xml:space="preserve">A mechanistic spatial-rate model was also evaluated as an alternative to</w:t>
-      </w:r>
-      <w:r>
-        <w:t xml:space="preserve"> </w:t>
-      </w:r>
-      <w:r>
-        <w:t xml:space="preserve">post-hoc calibration. The raw estimator is already at its identifiability floor</w:t>
-      </w:r>
-      <w:r>
-        <w:t xml:space="preserve"> </w:t>
-      </w:r>
-      <w:r>
-        <w:t xml:space="preserve">at 4-enzyme tag density: in-chain distribution-family changes can fix at most</w:t>
-      </w:r>
-      <w:r>
-        <w:t xml:space="preserve"> </w:t>
-      </w:r>
-      <w:r>
-        <w:t xml:space="preserve">~0.1–0.2 ANI points, and the divergence of the unchained fraction is not</w:t>
-      </w:r>
-      <w:r>
-        <w:t xml:space="preserve"> </w:t>
-      </w:r>
-      <w:r>
-        <w:t xml:space="preserve">identifiable from tag data. No candidate spatial model (AF-weighted mixtures,</w:t>
-      </w:r>
-      <w:r>
-        <w:t xml:space="preserve"> </w:t>
-      </w:r>
-      <w:r>
-        <w:t xml:space="preserve">discrete mixtures, ascertainment-aware tilts, capped NPMLE, model averaging)</w:t>
-      </w:r>
-      <w:r>
-        <w:t xml:space="preserve"> </w:t>
-      </w:r>
-      <w:r>
-        <w:t xml:space="preserve">beats the gated baseline while preserving exact-truth simulation gates. The full</w:t>
-      </w:r>
-      <w:r>
-        <w:t xml:space="preserve"> </w:t>
-      </w:r>
-      <w:r>
-        <w:t xml:space="preserve">negative result is reported in Supplementary Note 5.</w:t>
+        <w:t xml:space="preserve"> </w:t>
+      </w:r>
+      <w:r>
+        <w:t xml:space="preserve">is the reference-side analogue.</w:t>
+      </w:r>
+    </w:p>
+    <w:p>
+      <w:pPr>
+        <w:pStyle w:val="BodyText"/>
+      </w:pPr>
+      <w:r>
+        <w:t xml:space="preserve">The reason</w:t>
+      </w:r>
+      <w:r>
+        <w:t xml:space="preserve"> </w:t>
+      </w:r>
+      <w:r>
+        <w:rPr>
+          <w:rStyle w:val="VerbatimChar"/>
+        </w:rPr>
+        <w:t xml:space="preserve">anchor_adjacency</w:t>
+      </w:r>
+      <w:r>
+        <w:t xml:space="preserve"> </w:t>
+      </w:r>
+      <w:r>
+        <w:t xml:space="preserve">is only weakly correlated with alignment-based synteny scores is that the two quantities measure structurally different things.</w:t>
+      </w:r>
+      <w:r>
+        <w:t xml:space="preserve"> </w:t>
+      </w:r>
+      <w:r>
+        <w:rPr>
+          <w:rStyle w:val="VerbatimChar"/>
+        </w:rPr>
+        <w:t xml:space="preserve">anchor_adjacency</w:t>
+      </w:r>
+      <w:r>
+        <w:t xml:space="preserve"> </w:t>
+      </w:r>
+      <w:r>
+        <w:t xml:space="preserve">is a combinatorial count over the fixed, sparse set of in-silico restriction anchors: a value of 1.0 means every pair of anchors that are neighbors on a query contig are also neighbors inside a collinear chain, and lower values record how often local anchor order is interrupted by inversions, indels, or translocations. Because the anchors are spaced at kilobase-scale intervals across the genome, a single large rearrangement that happens to fall between two adjacent anchors leaves</w:t>
+      </w:r>
+      <w:r>
+        <w:t xml:space="preserve"> </w:t>
+      </w:r>
+      <w:r>
+        <w:rPr>
+          <w:rStyle w:val="VerbatimChar"/>
+        </w:rPr>
+        <w:t xml:space="preserve">anchor_adjacency</w:t>
+      </w:r>
+      <w:r>
+        <w:t xml:space="preserve"> </w:t>
+      </w:r>
+      <w:r>
+        <w:t xml:space="preserve">unchanged, while a small inversion that reorders only a few anchors can reduce it sharply even when the majority of base pairs are still alignable. Conversely,</w:t>
+      </w:r>
+      <w:r>
+        <w:t xml:space="preserve"> </w:t>
+      </w:r>
+      <w:r>
+        <w:rPr>
+          <w:rStyle w:val="VerbatimChar"/>
+        </w:rPr>
+        <w:t xml:space="preserve">af_query</w:t>
+      </w:r>
+      <w:r>
+        <w:t xml:space="preserve"> </w:t>
+      </w:r>
+      <w:r>
+        <w:t xml:space="preserve">and</w:t>
+      </w:r>
+      <w:r>
+        <w:t xml:space="preserve"> </w:t>
+      </w:r>
+      <w:r>
+        <w:rPr>
+          <w:rStyle w:val="VerbatimChar"/>
+        </w:rPr>
+        <w:t xml:space="preserve">breakpoint_count</w:t>
+      </w:r>
+      <w:r>
+        <w:t xml:space="preserve"> </w:t>
+      </w:r>
+      <w:r>
+        <w:t xml:space="preserve">report base-pair coverage and rearrangement counts, respectively, so</w:t>
+      </w:r>
+      <w:r>
+        <w:t xml:space="preserve"> </w:t>
+      </w:r>
+      <w:r>
+        <w:rPr>
+          <w:rStyle w:val="VerbatimChar"/>
+        </w:rPr>
+        <w:t xml:space="preserve">af_query</w:t>
+      </w:r>
+      <w:r>
+        <w:t xml:space="preserve"> </w:t>
+      </w:r>
+      <w:r>
+        <w:t xml:space="preserve">aligns with dnadiff/minimap2 coverage metrics and</w:t>
+      </w:r>
+      <w:r>
+        <w:t xml:space="preserve"> </w:t>
+      </w:r>
+      <w:r>
+        <w:rPr>
+          <w:rStyle w:val="VerbatimChar"/>
+        </w:rPr>
+        <w:t xml:space="preserve">breakpoint_count</w:t>
+      </w:r>
+      <w:r>
+        <w:t xml:space="preserve"> </w:t>
+      </w:r>
+      <w:r>
+        <w:t xml:space="preserve">aligns with alignment-based breakpoint counts. Treating</w:t>
+      </w:r>
+      <w:r>
+        <w:t xml:space="preserve"> </w:t>
+      </w:r>
+      <w:r>
+        <w:rPr>
+          <w:rStyle w:val="VerbatimChar"/>
+        </w:rPr>
+        <w:t xml:space="preserve">anchor_adjacency</w:t>
+      </w:r>
+      <w:r>
+        <w:t xml:space="preserve"> </w:t>
+      </w:r>
+      <w:r>
+        <w:t xml:space="preserve">as a separate anchor-order statistic rather than as a proxy for base-pair synteny is therefore deliberate: it captures the fine-scale collinearity of the anchor map, which is invisible to an ANI scalar and only partially correlated with alignment-based coverage.</w:t>
       </w:r>
     </w:p>
     <w:bookmarkEnd w:id="31"/>
-    <w:bookmarkStart w:id="32" w:name="structural-variant-calling"/>
-    <w:p>
-      <w:pPr>
-        <w:pStyle w:val="Heading3"/>
-      </w:pPr>
-      <w:r>
-        <w:t xml:space="preserve">Structural-variant calling</w:t>
-      </w:r>
-    </w:p>
-    <w:p>
-      <w:pPr>
-        <w:pStyle w:val="FirstParagraph"/>
-      </w:pPr>
-      <w:r>
-        <w:t xml:space="preserve">The</w:t>
-      </w:r>
-      <w:r>
-        <w:t xml:space="preserve"> </w:t>
-      </w:r>
-      <w:r>
-        <w:rPr>
-          <w:rStyle w:val="VerbatimChar"/>
-        </w:rPr>
-        <w:t xml:space="preserve">struct</w:t>
-      </w:r>
-      <w:r>
-        <w:t xml:space="preserve"> </w:t>
-      </w:r>
-      <w:r>
-        <w:t xml:space="preserve">subcommand consumes the chains and anchors of a pairwise comparison. Inversions are orientation flips between consecutive chains; indels are coordinate gaps between consecutive chains exceeding</w:t>
-      </w:r>
-      <w:r>
-        <w:t xml:space="preserve"> </w:t>
-      </w:r>
-      <w:r>
-        <w:rPr>
-          <w:rStyle w:val="VerbatimChar"/>
-        </w:rPr>
-        <w:t xml:space="preserve">indel_min</w:t>
-      </w:r>
-      <w:r>
-        <w:t xml:space="preserve"> </w:t>
-      </w:r>
-      <w:r>
-        <w:t xml:space="preserve">(default 1 kb), with a guard requiring that no third chain anchors inside the spanned reference interval (without it, a small relocated block sandwiched between collinear chains is misreported as a deletion sized by the reference jump — observed as spurious 42–961 kb calls before the guard); translocations are chains violating global reference order. Resolution is limited by tag spacing and by unphaseable repeats at junctions (observed endpoint offset ≤ 5.5 kb on the 779 kb W3110 inversion); events whose flanking chains have &lt; 4 anchors are not called, and equal-length homologous replacements that keep tags phased are invisible by design. For circular chromosomes,</w:t>
-      </w:r>
-      <w:r>
-        <w:t xml:space="preserve"> </w:t>
-      </w:r>
-      <w:r>
-        <w:rPr>
-          <w:rStyle w:val="VerbatimChar"/>
-        </w:rPr>
-        <w:t xml:space="preserve">syn2bani struct --circular &lt;ref_name&gt;</w:t>
-      </w:r>
-      <w:r>
-        <w:t xml:space="preserve"> </w:t>
-      </w:r>
-      <w:r>
-        <w:t xml:space="preserve">marks the reference as circular; genome-spanning calls that exceed</w:t>
-      </w:r>
-      <w:r>
-        <w:t xml:space="preserve"> </w:t>
-      </w:r>
-      <w:r>
-        <w:rPr>
-          <w:rStyle w:val="VerbatimChar"/>
-        </w:rPr>
-        <w:t xml:space="preserve">--artifact-threshold</w:t>
-      </w:r>
-      <w:r>
-        <w:t xml:space="preserve"> </w:t>
-      </w:r>
-      <w:r>
-        <w:t xml:space="preserve">(default 50% of the reference length) are reported but flagged as likely circular-origin coordinate artifacts rather than biological rearrangements. Validation against dnadiff used span-based one-to-many matching because dnadiff fragments large accessory regions into many small events while Syn2bANI calls each junction once.</w:t>
-      </w:r>
-    </w:p>
-    <w:p>
-      <w:pPr>
-        <w:pStyle w:val="BodyText"/>
-      </w:pPr>
-      <w:r>
-        <w:t xml:space="preserve">Three structural metrics are exported for every pair.</w:t>
-      </w:r>
-      <w:r>
-        <w:t xml:space="preserve"> </w:t>
-      </w:r>
-      <w:r>
-        <w:rPr>
-          <w:rStyle w:val="VerbatimChar"/>
-        </w:rPr>
-        <w:t xml:space="preserve">synteny_blocks</w:t>
-      </w:r>
-      <w:r>
-        <w:t xml:space="preserve"> </w:t>
-      </w:r>
-      <w:r>
-        <w:t xml:space="preserve">is the number of collinear chains;</w:t>
-      </w:r>
-      <w:r>
-        <w:t xml:space="preserve"> </w:t>
-      </w:r>
-      <w:r>
-        <w:rPr>
-          <w:rStyle w:val="VerbatimChar"/>
-        </w:rPr>
-        <w:t xml:space="preserve">breakpoint_count</w:t>
-      </w:r>
-      <w:r>
-        <w:t xml:space="preserve"> </w:t>
-      </w:r>
-      <w:r>
-        <w:t xml:space="preserve">is the number of chain-disrupting events — orientation flips between consecutive chains, reference-order violations, and large indels — and is the primary rearrangement statistic.</w:t>
-      </w:r>
-      <w:r>
-        <w:t xml:space="preserve"> </w:t>
-      </w:r>
-      <w:r>
-        <w:rPr>
-          <w:rStyle w:val="VerbatimChar"/>
-        </w:rPr>
-        <w:t xml:space="preserve">anchor_adjacency</w:t>
-      </w:r>
-      <w:r>
-        <w:t xml:space="preserve"> </w:t>
-      </w:r>
-      <w:r>
-        <w:t xml:space="preserve">is the fraction of possible adjacent anchor pairs (within chained query contigs) that remain collinear neighbors inside a chain; it is an anchor-adjacency conservation metric, not a base-pair coverage metric.</w:t>
-      </w:r>
-      <w:r>
-        <w:t xml:space="preserve"> </w:t>
-      </w:r>
-      <w:r>
-        <w:rPr>
-          <w:rStyle w:val="VerbatimChar"/>
-        </w:rPr>
-        <w:t xml:space="preserve">af_query</w:t>
-      </w:r>
-      <w:r>
-        <w:t xml:space="preserve"> </w:t>
-      </w:r>
-      <w:r>
-        <w:t xml:space="preserve">is the fraction of query bases covered by chained anchors (base-pair aligned fraction) and is the quantity that corresponds to alignment-based synteny/coverage scores.</w:t>
-      </w:r>
-      <w:r>
-        <w:t xml:space="preserve"> </w:t>
-      </w:r>
-      <w:r>
-        <w:rPr>
-          <w:rStyle w:val="VerbatimChar"/>
-        </w:rPr>
-        <w:t xml:space="preserve">af_reference</w:t>
-      </w:r>
-      <w:r>
-        <w:t xml:space="preserve"> </w:t>
-      </w:r>
-      <w:r>
-        <w:t xml:space="preserve">is the reference-side analogue.</w:t>
-      </w:r>
-    </w:p>
-    <w:p>
-      <w:pPr>
-        <w:pStyle w:val="BodyText"/>
-      </w:pPr>
-      <w:r>
-        <w:t xml:space="preserve">The reason</w:t>
-      </w:r>
-      <w:r>
-        <w:t xml:space="preserve"> </w:t>
-      </w:r>
-      <w:r>
-        <w:rPr>
-          <w:rStyle w:val="VerbatimChar"/>
-        </w:rPr>
-        <w:t xml:space="preserve">anchor_adjacency</w:t>
-      </w:r>
-      <w:r>
-        <w:t xml:space="preserve"> </w:t>
-      </w:r>
-      <w:r>
-        <w:t xml:space="preserve">is only weakly correlated with alignment-based synteny scores is that the two quantities measure structurally different things.</w:t>
-      </w:r>
-      <w:r>
-        <w:t xml:space="preserve"> </w:t>
-      </w:r>
-      <w:r>
-        <w:rPr>
-          <w:rStyle w:val="VerbatimChar"/>
-        </w:rPr>
-        <w:t xml:space="preserve">anchor_adjacency</w:t>
-      </w:r>
-      <w:r>
-        <w:t xml:space="preserve"> </w:t>
-      </w:r>
-      <w:r>
-        <w:t xml:space="preserve">is a combinatorial count over the fixed, sparse set of in-silico restriction anchors: a value of 1.0 means every pair of anchors that are neighbors on a query contig are also neighbors inside a collinear chain, and lower values record how often local anchor order is interrupted by inversions, indels, or translocations. Because the anchors are spaced at kilobase-scale intervals across the genome, a single large rearrangement that happens to fall between two adjacent anchors leaves</w:t>
-      </w:r>
-      <w:r>
-        <w:t xml:space="preserve"> </w:t>
-      </w:r>
-      <w:r>
-        <w:rPr>
-          <w:rStyle w:val="VerbatimChar"/>
-        </w:rPr>
-        <w:t xml:space="preserve">anchor_adjacency</w:t>
-      </w:r>
-      <w:r>
-        <w:t xml:space="preserve"> </w:t>
-      </w:r>
-      <w:r>
-        <w:t xml:space="preserve">unchanged, while a small inversion that reorders only a few anchors can reduce it sharply even when the majority of base pairs are still alignable. Conversely,</w:t>
-      </w:r>
-      <w:r>
-        <w:t xml:space="preserve"> </w:t>
-      </w:r>
-      <w:r>
-        <w:rPr>
-          <w:rStyle w:val="VerbatimChar"/>
-        </w:rPr>
-        <w:t xml:space="preserve">af_query</w:t>
-      </w:r>
-      <w:r>
-        <w:t xml:space="preserve"> </w:t>
-      </w:r>
-      <w:r>
-        <w:t xml:space="preserve">and</w:t>
-      </w:r>
-      <w:r>
-        <w:t xml:space="preserve"> </w:t>
-      </w:r>
-      <w:r>
-        <w:rPr>
-          <w:rStyle w:val="VerbatimChar"/>
-        </w:rPr>
-        <w:t xml:space="preserve">breakpoint_count</w:t>
-      </w:r>
-      <w:r>
-        <w:t xml:space="preserve"> </w:t>
-      </w:r>
-      <w:r>
-        <w:t xml:space="preserve">report base-pair coverage and rearrangement counts, respectively, so</w:t>
-      </w:r>
-      <w:r>
-        <w:t xml:space="preserve"> </w:t>
-      </w:r>
-      <w:r>
-        <w:rPr>
-          <w:rStyle w:val="VerbatimChar"/>
-        </w:rPr>
-        <w:t xml:space="preserve">af_query</w:t>
-      </w:r>
-      <w:r>
-        <w:t xml:space="preserve"> </w:t>
-      </w:r>
-      <w:r>
-        <w:t xml:space="preserve">aligns with dnadiff/minimap2 coverage metrics and</w:t>
-      </w:r>
-      <w:r>
-        <w:t xml:space="preserve"> </w:t>
-      </w:r>
-      <w:r>
-        <w:rPr>
-          <w:rStyle w:val="VerbatimChar"/>
-        </w:rPr>
-        <w:t xml:space="preserve">breakpoint_count</w:t>
-      </w:r>
-      <w:r>
-        <w:t xml:space="preserve"> </w:t>
-      </w:r>
-      <w:r>
-        <w:t xml:space="preserve">aligns with alignment-based breakpoint counts. Treating</w:t>
-      </w:r>
-      <w:r>
-        <w:t xml:space="preserve"> </w:t>
-      </w:r>
-      <w:r>
-        <w:rPr>
-          <w:rStyle w:val="VerbatimChar"/>
-        </w:rPr>
-        <w:t xml:space="preserve">anchor_adjacency</w:t>
-      </w:r>
-      <w:r>
-        <w:t xml:space="preserve"> </w:t>
-      </w:r>
-      <w:r>
-        <w:t xml:space="preserve">as a separate anchor-order statistic rather than as a proxy for base-pair synteny is therefore deliberate: it captures the fine-scale collinearity of the anchor map, which is invisible to an ANI scalar and only partially correlated with alignment-based coverage.</w:t>
-      </w:r>
-    </w:p>
-    <w:bookmarkEnd w:id="32"/>
-    <w:bookmarkStart w:id="33" w:name="simulation-framework-with-exact-truth"/>
+    <w:bookmarkStart w:id="32" w:name="simulation-framework-with-exact-truth"/>
     <w:p>
       <w:pPr>
         <w:pStyle w:val="Heading3"/>
@@ -2638,8 +2520,8 @@
         <w:t xml:space="preserve">K-12 MG1655, ENA U00096.3, 4,641,652 bp) by applying a counted number of substitutions, so true ANI = 1 − n_subs/L exactly. Families: an ANI ladder (12 levels, 85–99.9%, each with a 400 kb inversion, with and without ~46 deletions of 200–2,000 bp); an indel sweep (true ANI 95.000; 0–4 deletions/100 kb); fragmentation (20–201 contigs, no sequence lost, ~50% reverse-complemented, order shuffled); accessory confounds (core ANI 95.000; 0–50% of the genome replaced by composition-preserving shuffled blocks, plus a block-count control at fixed total fraction); mosaic/rate-heterogeneity cases (per-block rates ~ Gamma(α, α), α = 0.5/1/2, mean ANI 90–98, plus deliberately misspecified bimodal cases); and GC coverage (ladders on five real template genomes, GC 27.2–72.1%). Deletions do not change true ANI (counted substitutions over reference length), so the deleted fraction doubles as AF ground truth. Substitutions are uniform over the three alternative bases with no GC-biased mutation model, transition/transversion ratio, codon structure, or selection — a deliberate simplification justified by the finding that GC does not explain the real-data degradation and that site turnover emerges from uniform substitution on a real genome without any special mechanism. Enzyme digestion is never simulated; the released binary extracts tags itself.</w:t>
       </w:r>
     </w:p>
-    <w:bookmarkEnd w:id="33"/>
-    <w:bookmarkStart w:id="34" w:name="benchmark-datasets-truth-and-tools"/>
+    <w:bookmarkEnd w:id="32"/>
+    <w:bookmarkStart w:id="33" w:name="benchmark-datasets-truth-and-tools"/>
     <w:p>
       <w:pPr>
         <w:pStyle w:val="Heading3"/>
@@ -3537,7 +3419,7 @@
         <w:t xml:space="preserve"> </w:t>
       </w:r>
       <w:r>
-        <w:t xml:space="preserve">(Fig. 6;</w:t>
+        <w:t xml:space="preserve">(Supplementary Fig. S8;</w:t>
       </w:r>
       <w:r>
         <w:t xml:space="preserve"> </w:t>
@@ -4056,8 +3938,8 @@
         <w:t xml:space="preserve">time covers only 302/484 reported pairs (minimum-AF filter) and excludes sketching; this is noted wherever the comparison appears.</w:t>
       </w:r>
     </w:p>
-    <w:bookmarkEnd w:id="34"/>
-    <w:bookmarkStart w:id="35" w:name="implementation"/>
+    <w:bookmarkEnd w:id="33"/>
+    <w:bookmarkStart w:id="34" w:name="implementation"/>
     <w:p>
       <w:pPr>
         <w:pStyle w:val="Heading3"/>
@@ -4186,9 +4068,9 @@
         </w:pict>
       </w:r>
     </w:p>
+    <w:bookmarkEnd w:id="34"/>
     <w:bookmarkEnd w:id="35"/>
-    <w:bookmarkEnd w:id="36"/>
-    <w:bookmarkStart w:id="37" w:name="data-availability"/>
+    <w:bookmarkStart w:id="36" w:name="data-availability"/>
     <w:p>
       <w:pPr>
         <w:pStyle w:val="Heading2"/>
@@ -4293,14 +4175,44 @@
         <w:t xml:space="preserve">K-12 MG1655, ENA accession U00096.3.</w:t>
       </w:r>
     </w:p>
+    <w:bookmarkEnd w:id="36"/>
+    <w:bookmarkStart w:id="37" w:name="code-availability"/>
+    <w:p>
+      <w:pPr>
+        <w:pStyle w:val="Heading2"/>
+      </w:pPr>
+      <w:r>
+        <w:t xml:space="preserve">Code availability</w:t>
+      </w:r>
+    </w:p>
+    <w:p>
+      <w:pPr>
+        <w:pStyle w:val="FirstParagraph"/>
+      </w:pPr>
+      <w:r>
+        <w:t xml:space="preserve">Syn2bANI is free and open source (MIT License) at https://github.com/HuangShiLab/Syn2bANI, including the Rust source, integration tests, the exact-truth simulation harness, and the embedded calibration model. The version benchmarked here is 0.1.0 with calibration model v5 (commit</w:t>
+      </w:r>
+      <w:r>
+        <w:t xml:space="preserve"> </w:t>
+      </w:r>
+      <w:r>
+        <w:rPr>
+          <w:rStyle w:val="VerbatimChar"/>
+        </w:rPr>
+        <w:t xml:space="preserve">fe0f36c</w:t>
+      </w:r>
+      <w:r>
+        <w:t xml:space="preserve">).</w:t>
+      </w:r>
+    </w:p>
     <w:bookmarkEnd w:id="37"/>
-    <w:bookmarkStart w:id="38" w:name="code-availability"/>
+    <w:bookmarkStart w:id="38" w:name="acknowledgements"/>
     <w:p>
       <w:pPr>
         <w:pStyle w:val="Heading2"/>
       </w:pPr>
       <w:r>
-        <w:t xml:space="preserve">Code availability</w:t>
+        <w:t xml:space="preserve">Acknowledgements</w:t>
       </w:r>
     </w:p>
     <w:p>
@@ -4308,29 +4220,17 @@
         <w:pStyle w:val="FirstParagraph"/>
       </w:pPr>
       <w:r>
-        <w:t xml:space="preserve">Syn2bANI is free and open source (MIT License) at https://github.com/HuangShiLab/Syn2bANI, including the Rust source, integration tests, the exact-truth simulation harness, and the embedded calibration model. The version benchmarked here is 0.1.0 with calibration model v5 (commit</w:t>
-      </w:r>
-      <w:r>
-        <w:t xml:space="preserve"> </w:t>
-      </w:r>
-      <w:r>
-        <w:rPr>
-          <w:rStyle w:val="VerbatimChar"/>
-        </w:rPr>
-        <w:t xml:space="preserve">fe0f36c</w:t>
-      </w:r>
-      <w:r>
-        <w:t xml:space="preserve">).</w:t>
+        <w:t xml:space="preserve">[To be determined.]</w:t>
       </w:r>
     </w:p>
     <w:bookmarkEnd w:id="38"/>
-    <w:bookmarkStart w:id="39" w:name="acknowledgements"/>
+    <w:bookmarkStart w:id="39" w:name="author-contributions"/>
     <w:p>
       <w:pPr>
         <w:pStyle w:val="Heading2"/>
       </w:pPr>
       <w:r>
-        <w:t xml:space="preserve">Acknowledgements</w:t>
+        <w:t xml:space="preserve">Author contributions</w:t>
       </w:r>
     </w:p>
     <w:p>
@@ -4338,17 +4238,17 @@
         <w:pStyle w:val="FirstParagraph"/>
       </w:pPr>
       <w:r>
-        <w:t xml:space="preserve">[To be determined.]</w:t>
+        <w:t xml:space="preserve">Y.Z. implemented the software, designed and executed the benchmarks, and generated the figures. S.H. conceived the project, supervised the research, and wrote the manuscript with input from Y.Z.</w:t>
       </w:r>
     </w:p>
     <w:bookmarkEnd w:id="39"/>
-    <w:bookmarkStart w:id="40" w:name="author-contributions"/>
+    <w:bookmarkStart w:id="40" w:name="competing-interests"/>
     <w:p>
       <w:pPr>
         <w:pStyle w:val="Heading2"/>
       </w:pPr>
       <w:r>
-        <w:t xml:space="preserve">Author contributions</w:t>
+        <w:t xml:space="preserve">Competing interests</w:t>
       </w:r>
     </w:p>
     <w:p>
@@ -4356,29 +4256,11 @@
         <w:pStyle w:val="FirstParagraph"/>
       </w:pPr>
       <w:r>
-        <w:t xml:space="preserve">Y.Z. implemented the software, designed and executed the benchmarks, and generated the figures. S.H. conceived the project, supervised the research, and wrote the manuscript with input from Y.Z.</w:t>
+        <w:t xml:space="preserve">The authors declare no competing interests.</w:t>
       </w:r>
     </w:p>
     <w:bookmarkEnd w:id="40"/>
-    <w:bookmarkStart w:id="41" w:name="competing-interests"/>
-    <w:p>
-      <w:pPr>
-        <w:pStyle w:val="Heading2"/>
-      </w:pPr>
-      <w:r>
-        <w:t xml:space="preserve">Competing interests</w:t>
-      </w:r>
-    </w:p>
-    <w:p>
-      <w:pPr>
-        <w:pStyle w:val="FirstParagraph"/>
-      </w:pPr>
-      <w:r>
-        <w:t xml:space="preserve">The authors declare no competing interests.</w:t>
-      </w:r>
-    </w:p>
-    <w:bookmarkEnd w:id="41"/>
-    <w:bookmarkStart w:id="42" w:name="references"/>
+    <w:bookmarkStart w:id="41" w:name="references"/>
     <w:p>
       <w:pPr>
         <w:pStyle w:val="Heading2"/>
@@ -5823,8 +5705,8 @@
         </w:pict>
       </w:r>
     </w:p>
-    <w:bookmarkEnd w:id="42"/>
-    <w:bookmarkStart w:id="43" w:name="figure-legends"/>
+    <w:bookmarkEnd w:id="41"/>
+    <w:bookmarkStart w:id="42" w:name="figure-legends"/>
     <w:p>
       <w:pPr>
         <w:pStyle w:val="Heading2"/>
@@ -5869,7 +5751,7 @@
         <w:rPr>
           <w:rStyle w:val="VerbatimChar"/>
         </w:rPr>
-        <w:t xml:space="preserve">figures/report/fig1_algorithm_schematic.png</w:t>
+        <w:t xml:space="preserve">paper/figures/main/fig1_algorithm.png</w:t>
       </w:r>
       <w:r>
         <w:t xml:space="preserve">.</w:t>
@@ -5906,7 +5788,7 @@
         <w:t xml:space="preserve"> </w:t>
       </w:r>
       <w:r>
-        <w:t xml:space="preserve">genomes evolved at true ANI 85.0–99.9% (400 kb inversion + deletions): estimated vs true ANI and signed error. MAE: Syn2bANI 0.073%, skani 0.377%, FastANI 0.742%. (c) Indel sweep at 95% ANI (0–4 deletions/100 kb): MAE 0.081. (d) Simulated fragmentation (20–201 contigs): MAE 0.093. (e) GC ladders on five genomes (27.2–72.1% GC): MAE 0.074–0.356. (f) Accessory-content sweep (0–50% shuffled blocks at 95% core ANI): ANI estimate flat,</w:t>
+        <w:t xml:space="preserve">genomes evolved at true ANI 85.0–99.9% (400 kb inversion + deletions): estimated vs true ANI and signed error. MAE: Syn2bANI 0.073%, skani 0.377%, FastANI 0.742%. (c) Indel sweep at 95% ANI (0–4 deletions/100 kb): MAE 0.081. (d) Simulated fragmentation (20–201 contigs): MAE 0.093. (e) Accessory-content sweep (0–50% shuffled blocks at 95% core ANI): ANI estimate flat,</w:t>
       </w:r>
       <w:r>
         <w:t xml:space="preserve"> </w:t>
@@ -5921,31 +5803,28 @@
         <w:t xml:space="preserve"> </w:t>
       </w:r>
       <w:r>
-        <w:t xml:space="preserve">tracks true shared fraction. Source panels:</w:t>
-      </w:r>
-      <w:r>
-        <w:t xml:space="preserve"> </w:t>
-      </w:r>
-      <w:r>
-        <w:rPr>
-          <w:rStyle w:val="VerbatimChar"/>
-        </w:rPr>
-        <w:t xml:space="preserve">figures/report/fig1_simulation_ladder.png</w:t>
-      </w:r>
-      <w:r>
-        <w:t xml:space="preserve"> </w:t>
-      </w:r>
-      <w:r>
-        <w:t xml:space="preserve">and</w:t>
-      </w:r>
-      <w:r>
-        <w:t xml:space="preserve"> </w:t>
-      </w:r>
-      <w:r>
-        <w:rPr>
-          <w:rStyle w:val="VerbatimChar"/>
-        </w:rPr>
-        <w:t xml:space="preserve">figures/report/fig2_robustness.png</w:t>
+        <w:t xml:space="preserve">tracks true shared fraction. Source:</w:t>
+      </w:r>
+      <w:r>
+        <w:t xml:space="preserve"> </w:t>
+      </w:r>
+      <w:r>
+        <w:rPr>
+          <w:rStyle w:val="VerbatimChar"/>
+        </w:rPr>
+        <w:t xml:space="preserve">paper/figures/main/fig2_simulations.png</w:t>
+      </w:r>
+      <w:r>
+        <w:t xml:space="preserve">; underlying panels archived in</w:t>
+      </w:r>
+      <w:r>
+        <w:t xml:space="preserve"> </w:t>
+      </w:r>
+      <w:r>
+        <w:rPr>
+          <w:rStyle w:val="VerbatimChar"/>
+        </w:rPr>
+        <w:t xml:space="preserve">paper/figures/archive/</w:t>
       </w:r>
       <w:r>
         <w:t xml:space="preserve">.</w:t>
@@ -5960,37 +5839,91 @@
           <w:b/>
           <w:bCs/>
         </w:rPr>
-        <w:t xml:space="preserve">Figure 3 | GTDB-R207 benchmark against ANIm truth.</w:t>
-      </w:r>
-      <w:r>
-        <w:t xml:space="preserve"> </w:t>
-      </w:r>
-      <w:r>
-        <w:t xml:space="preserve">(a) Band-holdout cross-validation on 2,520 training pairs: MAE by ANI band for raw gamma, calibrated v5, skani, and FastANI. (b) Strictly held-out 43,334 same-genus pairs with training genomes excluded: calibrated Syn2bANI v5 vs skani and FastANI. Source:</w:t>
-      </w:r>
-      <w:r>
-        <w:t xml:space="preserve"> </w:t>
-      </w:r>
-      <w:r>
-        <w:rPr>
-          <w:rStyle w:val="VerbatimChar"/>
-        </w:rPr>
-        <w:t xml:space="preserve">figures/report/fig7_anim_by_band.png</w:t>
-      </w:r>
-      <w:r>
-        <w:t xml:space="preserve"> </w:t>
-      </w:r>
-      <w:r>
-        <w:t xml:space="preserve">and</w:t>
-      </w:r>
-      <w:r>
-        <w:t xml:space="preserve"> </w:t>
-      </w:r>
-      <w:r>
-        <w:rPr>
-          <w:rStyle w:val="VerbatimChar"/>
-        </w:rPr>
-        <w:t xml:space="preserve">figures/report/fig_gtdb50k_heldout.png</w:t>
+        <w:t xml:space="preserve">Figure 3 | Unified GTDB-R207 80–100% benchmark against ANIm truth.</w:t>
+      </w:r>
+      <w:r>
+        <w:t xml:space="preserve"> </w:t>
+      </w:r>
+      <w:r>
+        <w:t xml:space="preserve">43,334 held-out same-genus pairs plus 727 high-ANI test pairs. (a) Estimated vs ANIm truth for Syn2bANI raw gated, v6-calibrated, hybrid (raw ≥98% / calibrated &lt;98%), skani, and FastANI. (b) Per-band MAE. (c) Signed-error distributions. (d) High-ANI zoom. Source:</w:t>
+      </w:r>
+      <w:r>
+        <w:t xml:space="preserve"> </w:t>
+      </w:r>
+      <w:r>
+        <w:rPr>
+          <w:rStyle w:val="VerbatimChar"/>
+        </w:rPr>
+        <w:t xml:space="preserve">paper/figures/main/fig3_gtdb_r207_benchmark.png</w:t>
+      </w:r>
+      <w:r>
+        <w:t xml:space="preserve">; per-band detail in Supplementary Fig. S3.</w:t>
+      </w:r>
+    </w:p>
+    <w:p>
+      <w:pPr>
+        <w:pStyle w:val="BodyText"/>
+      </w:pPr>
+      <w:r>
+        <w:rPr>
+          <w:b/>
+          <w:bCs/>
+        </w:rPr>
+        <w:t xml:space="preserve">Figure 4 | Computational efficiency on GTDB-R207.</w:t>
+      </w:r>
+      <w:r>
+        <w:t xml:space="preserve"> </w:t>
+      </w:r>
+      <w:r>
+        <w:t xml:space="preserve">(a) Wall time for pairwise</w:t>
+      </w:r>
+      <w:r>
+        <w:t xml:space="preserve"> </w:t>
+      </w:r>
+      <w:r>
+        <w:rPr>
+          <w:rStyle w:val="VerbatimChar"/>
+        </w:rPr>
+        <w:t xml:space="preserve">dist</w:t>
+      </w:r>
+      <w:r>
+        <w:t xml:space="preserve">, database</w:t>
+      </w:r>
+      <w:r>
+        <w:t xml:space="preserve"> </w:t>
+      </w:r>
+      <w:r>
+        <w:rPr>
+          <w:rStyle w:val="VerbatimChar"/>
+        </w:rPr>
+        <w:t xml:space="preserve">search</w:t>
+      </w:r>
+      <w:r>
+        <w:t xml:space="preserve">, and all-vs-all</w:t>
+      </w:r>
+      <w:r>
+        <w:t xml:space="preserve"> </w:t>
+      </w:r>
+      <w:r>
+        <w:rPr>
+          <w:rStyle w:val="VerbatimChar"/>
+        </w:rPr>
+        <w:t xml:space="preserve">triangle</w:t>
+      </w:r>
+      <w:r>
+        <w:t xml:space="preserve"> </w:t>
+      </w:r>
+      <w:r>
+        <w:t xml:space="preserve">on GTDB-R207 subsets. (b) Peak memory per tool. (c) Throughput (comparisons per second) at database scale. (d) Time breakdown (sketch vs compare vs I/O). Source:</w:t>
+      </w:r>
+      <w:r>
+        <w:t xml:space="preserve"> </w:t>
+      </w:r>
+      <w:r>
+        <w:rPr>
+          <w:rStyle w:val="VerbatimChar"/>
+        </w:rPr>
+        <w:t xml:space="preserve">paper/figures/main/fig4_efficiency.png</w:t>
       </w:r>
       <w:r>
         <w:t xml:space="preserve">.</w:t>
@@ -6005,22 +5938,67 @@
           <w:b/>
           <w:bCs/>
         </w:rPr>
-        <w:t xml:space="preserve">Figure 4 | Unified 80–100% GTDB-R207 benchmark and hybrid estimator.</w:t>
-      </w:r>
-      <w:r>
-        <w:t xml:space="preserve"> </w:t>
-      </w:r>
-      <w:r>
-        <w:t xml:space="preserve">43,334 held-out pairs plus 727 high-ANI test pairs. (a) Estimated vs ANIm truth for raw gated, v6-calibrated, hybrid (raw ≥98% / calibrated &lt;98%), skani, and FastANI. (b) Per-band MAE. (c) Signed-error distributions. (d) High-ANI zoom. Source:</w:t>
-      </w:r>
-      <w:r>
-        <w:t xml:space="preserve"> </w:t>
-      </w:r>
-      <w:r>
-        <w:rPr>
-          <w:rStyle w:val="VerbatimChar"/>
-        </w:rPr>
-        <w:t xml:space="preserve">figures/gtdb_r207_unified_benchmark.png</w:t>
+        <w:t xml:space="preserve">Figure 5 | Structural outputs agree with alignment-based truth.</w:t>
+      </w:r>
+      <w:r>
+        <w:t xml:space="preserve"> </w:t>
+      </w:r>
+      <w:r>
+        <w:t xml:space="preserve">(a) Syn2bANI</w:t>
+      </w:r>
+      <w:r>
+        <w:t xml:space="preserve"> </w:t>
+      </w:r>
+      <w:r>
+        <w:rPr>
+          <w:rStyle w:val="VerbatimChar"/>
+        </w:rPr>
+        <w:t xml:space="preserve">raw_inverted_fraction</w:t>
+      </w:r>
+      <w:r>
+        <w:t xml:space="preserve"> </w:t>
+      </w:r>
+      <w:r>
+        <w:t xml:space="preserve">vs dnadiff inverted fraction across GTDB-R207 pairs (Pearson r = 0.936). (b) High-ANI zoom (r ≥ 95% pairs). (c) Partial correlation of</w:t>
+      </w:r>
+      <w:r>
+        <w:t xml:space="preserve"> </w:t>
+      </w:r>
+      <w:r>
+        <w:rPr>
+          <w:rStyle w:val="VerbatimChar"/>
+        </w:rPr>
+        <w:t xml:space="preserve">breakpoint_count</w:t>
+      </w:r>
+      <w:r>
+        <w:t xml:space="preserve"> </w:t>
+      </w:r>
+      <w:r>
+        <w:t xml:space="preserve">vs dnadiff breakpoints after controlling for ANIm and contig count. (d)</w:t>
+      </w:r>
+      <w:r>
+        <w:t xml:space="preserve"> </w:t>
+      </w:r>
+      <w:r>
+        <w:rPr>
+          <w:rStyle w:val="VerbatimChar"/>
+        </w:rPr>
+        <w:t xml:space="preserve">af_query</w:t>
+      </w:r>
+      <w:r>
+        <w:t xml:space="preserve"> </w:t>
+      </w:r>
+      <w:r>
+        <w:t xml:space="preserve">vs dnadiff aligned fraction. Source:</w:t>
+      </w:r>
+      <w:r>
+        <w:t xml:space="preserve"> </w:t>
+      </w:r>
+      <w:r>
+        <w:rPr>
+          <w:rStyle w:val="VerbatimChar"/>
+        </w:rPr>
+        <w:t xml:space="preserve">paper/figures/main/fig5_sv_validation.png</w:t>
       </w:r>
       <w:r>
         <w:t xml:space="preserve">.</w:t>
@@ -6035,22 +6013,22 @@
           <w:b/>
           <w:bCs/>
         </w:rPr>
-        <w:t xml:space="preserve">Figure 5 | Accuracy on 695 CAMI2 MAGs.</w:t>
-      </w:r>
-      <w:r>
-        <w:t xml:space="preserve"> </w:t>
-      </w:r>
-      <w:r>
-        <w:t xml:space="preserve">(a) Syn2bANI raw gated estimate vs dnadiff ANIm truth, colored by contamination class. (b) Absolute-error distributions by tool. (c) Syn2bANI error by CheckM2 quality tier. Source:</w:t>
-      </w:r>
-      <w:r>
-        <w:t xml:space="preserve"> </w:t>
-      </w:r>
-      <w:r>
-        <w:rPr>
-          <w:rStyle w:val="VerbatimChar"/>
-        </w:rPr>
-        <w:t xml:space="preserve">figures/report/mag_validation.png</w:t>
+        <w:t xml:space="preserve">Figure 6 | Near-clonal ANI can coexist with low synteny in GTDB-R207.</w:t>
+      </w:r>
+      <w:r>
+        <w:t xml:space="preserve"> </w:t>
+      </w:r>
+      <w:r>
+        <w:t xml:space="preserve">(a) Syn2bANI ANI versus anchor adjacency for 336 high-AF same-species pairs (grey); top 20 discordant pairs (red) have ANI &gt; 99% but anchor adjacency &lt; 0.95. (b) SV composition of the 10 most discordant pairs, showing that hundreds of inversions and translocations can separate strains with near-identical average sequence. Source:</w:t>
+      </w:r>
+      <w:r>
+        <w:t xml:space="preserve"> </w:t>
+      </w:r>
+      <w:r>
+        <w:rPr>
+          <w:rStyle w:val="VerbatimChar"/>
+        </w:rPr>
+        <w:t xml:space="preserve">paper/figures/main/fig6_ani_sv_discordance.png</w:t>
       </w:r>
       <w:r>
         <w:t xml:space="preserve">.</w:t>
@@ -6065,28 +6043,13 @@
           <w:b/>
           <w:bCs/>
         </w:rPr>
-        <w:t xml:space="preserve">Figure 6 | High-ANI pairs hide extensive rearrangements.</w:t>
-      </w:r>
-      <w:r>
-        <w:t xml:space="preserve"> </w:t>
-      </w:r>
-      <w:r>
-        <w:t xml:space="preserve">skani ANI versus Syn2bANI</w:t>
-      </w:r>
-      <w:r>
-        <w:t xml:space="preserve"> </w:t>
-      </w:r>
-      <w:r>
-        <w:rPr>
-          <w:rStyle w:val="VerbatimChar"/>
-        </w:rPr>
-        <w:t xml:space="preserve">breakpoint_count</w:t>
-      </w:r>
-      <w:r>
-        <w:t xml:space="preserve"> </w:t>
-      </w:r>
-      <w:r>
-        <w:t xml:space="preserve">for four published near-clonal isolate collections: (a)</w:t>
+        <w:t xml:space="preserve">Figure 7 | Locus-targeted chain coverage detects a phenotype-associated structural difference invisible to genome-wide ANI.</w:t>
+      </w:r>
+      <w:r>
+        <w:t xml:space="preserve"> </w:t>
+      </w:r>
+      <w:r>
+        <w:t xml:space="preserve">185</w:t>
       </w:r>
       <w:r>
         <w:t xml:space="preserve"> </w:t>
@@ -6096,407 +6059,226 @@
           <w:i/>
           <w:iCs/>
         </w:rPr>
-        <w:t xml:space="preserve">E. coli</w:t>
-      </w:r>
-      <w:r>
-        <w:t xml:space="preserve"> </w:t>
-      </w:r>
-      <w:r>
-        <w:t xml:space="preserve">hypermutator (253 pairs), (b)</w:t>
-      </w:r>
-      <w:r>
-        <w:t xml:space="preserve"> </w:t>
-      </w:r>
-      <w:r>
-        <w:rPr>
+        <w:t xml:space="preserve">Bifidobacterium longum</w:t>
+      </w:r>
+      <w:r>
+        <w:t xml:space="preserve"> </w:t>
+      </w:r>
+      <w:r>
+        <w:t xml:space="preserve">isolates stratified by abfA gene-cluster status (complete vs deleted/peripheral-truncated). (a) Syn2bANI chain coverage across the abfA locus (8.5–37.1 kb; core genes 8.8–17.2 kb, peripheral region 17.2–37.1 kb). (b) Periphery coverage boxplot by group. Whole-genome ANI and aligned fraction do not separate the groups, but local chain coverage over the cluster periphery is significantly reduced in the deleted group (MWU p = 1.4 × 10⁻³). Source:</w:t>
+      </w:r>
+      <w:r>
+        <w:t xml:space="preserve"> </w:t>
+      </w:r>
+      <w:r>
+        <w:rPr>
+          <w:rStyle w:val="VerbatimChar"/>
+        </w:rPr>
+        <w:t xml:space="preserve">paper/figures/main/fig7_b_longum_abfa.png</w:t>
+      </w:r>
+      <w:r>
+        <w:t xml:space="preserve">.</w:t>
+      </w:r>
+    </w:p>
+    <w:p>
+      <w:pPr>
+        <w:pStyle w:val="BodyText"/>
+      </w:pPr>
+      <w:r>
+        <w:rPr>
+          <w:b/>
+          <w:bCs/>
+        </w:rPr>
+        <w:t xml:space="preserve">Figure 8 | cagPAI architecture in 528</w:t>
+      </w:r>
+      <w:r>
+        <w:rPr>
+          <w:b/>
+          <w:bCs/>
+        </w:rPr>
+        <w:t xml:space="preserve"> </w:t>
+      </w:r>
+      <w:r>
+        <w:rPr>
+          <w:b/>
+          <w:bCs/>
           <w:i/>
           <w:iCs/>
         </w:rPr>
         <w:t xml:space="preserve">H. pylori</w:t>
       </w:r>
       <w:r>
-        <w:t xml:space="preserve"> </w:t>
-      </w:r>
-      <w:r>
-        <w:t xml:space="preserve">(2,926 pairs), (c)</w:t>
-      </w:r>
-      <w:r>
-        <w:t xml:space="preserve"> </w:t>
-      </w:r>
-      <w:r>
-        <w:rPr>
+        <w:rPr>
+          <w:b/>
+          <w:bCs/>
+        </w:rPr>
+        <w:t xml:space="preserve"> </w:t>
+      </w:r>
+      <w:r>
+        <w:rPr>
+          <w:b/>
+          <w:bCs/>
+        </w:rPr>
+        <w:t xml:space="preserve">isolates tracks lineage and is invisible to ANI.</w:t>
+      </w:r>
+      <w:r>
+        <w:t xml:space="preserve"> </w:t>
+      </w:r>
+      <w:r>
+        <w:t xml:space="preserve">(a) Engineered control validation: wild-type, ΔcagPAI, inversion, translocation, and mutated backgrounds. (b) Extended state classification workflow: marker presence/absence plus</w:t>
+      </w:r>
+      <w:r>
+        <w:t xml:space="preserve"> </w:t>
+      </w:r>
+      <w:r>
+        <w:rPr>
+          <w:rStyle w:val="VerbatimChar"/>
+        </w:rPr>
+        <w:t xml:space="preserve">syn2bani struct</w:t>
+      </w:r>
+      <w:r>
+        <w:t xml:space="preserve"> </w:t>
+      </w:r>
+      <w:r>
+        <w:t xml:space="preserve">calls, with circular-origin filtering. (c) Stacked-bar distribution of extended cagPAI states by FastBAPS lineage. (d) Distribution by Correa’s cascade disease stage. FastBAPS lineage is strongly associated with extended state (χ² = 58.75, df = 12, p = 3.8 × 10⁻⁸), but the disease-stage association is not significant after lineage stratification (CMH p ≥ 0.21). Source:</w:t>
+      </w:r>
+      <w:r>
+        <w:t xml:space="preserve"> </w:t>
+      </w:r>
+      <w:r>
+        <w:rPr>
+          <w:rStyle w:val="VerbatimChar"/>
+        </w:rPr>
+        <w:t xml:space="preserve">paper/figures/main/fig8_cagpai_h_pylori.png</w:t>
+      </w:r>
+      <w:r>
+        <w:t xml:space="preserve">; country/population breakdown in Supplementary Fig. S11; filtering detail in Supplementary Fig. S12.</w:t>
+      </w:r>
+    </w:p>
+    <w:p>
+      <w:pPr>
+        <w:pStyle w:val="BodyText"/>
+      </w:pPr>
+      <w:r>
+        <w:rPr>
+          <w:b/>
+          <w:bCs/>
+        </w:rPr>
+        <w:t xml:space="preserve">Supplementary Figure S15 | High-ANI</w:t>
+      </w:r>
+      <w:r>
+        <w:rPr>
+          <w:b/>
+          <w:bCs/>
+        </w:rPr>
+        <w:t xml:space="preserve"> </w:t>
+      </w:r>
+      <w:r>
+        <w:rPr>
+          <w:b/>
+          <w:bCs/>
           <w:i/>
           <w:iCs/>
         </w:rPr>
-        <w:t xml:space="preserve">N. gonorrhoeae</w:t>
-      </w:r>
-      <w:r>
-        <w:t xml:space="preserve"> </w:t>
-      </w:r>
-      <w:r>
-        <w:t xml:space="preserve">(66 pairs), and (d)</w:t>
-      </w:r>
-      <w:r>
-        <w:t xml:space="preserve"> </w:t>
-      </w:r>
-      <w:r>
-        <w:rPr>
+        <w:t xml:space="preserve">E. coli</w:t>
+      </w:r>
+      <w:r>
+        <w:rPr>
+          <w:b/>
+          <w:bCs/>
+        </w:rPr>
+        <w:t xml:space="preserve"> </w:t>
+      </w:r>
+      <w:r>
+        <w:rPr>
+          <w:b/>
+          <w:bCs/>
+        </w:rPr>
+        <w:t xml:space="preserve">O157:H7 pairs carry hundreds of breakpoints.</w:t>
+      </w:r>
+      <w:r>
+        <w:t xml:space="preserve"> </w:t>
+      </w:r>
+      <w:r>
+        <w:t xml:space="preserve">Seventy-four genomes from Fitzgerald et al. (2021), 2,701 non-self pairs. (a) ANI vs breakpoint count colored by lineage (I/II, II, Ia, Ic). (b) Same data colored by host category (bovine, human, other/unknown). All pairwise ANIs exceed 99.886% yet breakpoints range from 171 to &gt;1,100. Source:</w:t>
+      </w:r>
+      <w:r>
+        <w:t xml:space="preserve"> </w:t>
+      </w:r>
+      <w:r>
+        <w:rPr>
+          <w:rStyle w:val="VerbatimChar"/>
+        </w:rPr>
+        <w:t xml:space="preserve">case_studies/ecoli_o157_fitzgerald_2021/results/</w:t>
+      </w:r>
+      <w:r>
+        <w:t xml:space="preserve">.</w:t>
+      </w:r>
+    </w:p>
+    <w:bookmarkEnd w:id="42"/>
+    <w:bookmarkStart w:id="43" w:name="X2039872a057f86498f6293bbf4ab0196afa571e"/>
+    <w:p>
+      <w:pPr>
+        <w:pStyle w:val="Heading2"/>
+      </w:pPr>
+      <w:r>
+        <w:rPr>
+          <w:b/>
+          <w:bCs/>
+        </w:rPr>
+        <w:t xml:space="preserve">Supplementary Figure S16 | High-ANI FDA-ARGOS</w:t>
+      </w:r>
+      <w:r>
+        <w:rPr>
+          <w:b/>
+          <w:bCs/>
+        </w:rPr>
+        <w:t xml:space="preserve"> </w:t>
+      </w:r>
+      <w:r>
+        <w:rPr>
+          <w:b/>
+          <w:bCs/>
           <w:i/>
           <w:iCs/>
         </w:rPr>
-        <w:t xml:space="preserve">S. rimosus</w:t>
-      </w:r>
-      <w:r>
-        <w:t xml:space="preserve"> </w:t>
-      </w:r>
-      <w:r>
-        <w:t xml:space="preserve">(190 pairs). In all four collections ANI is pinned near 100% while breakpoint counts vary over orders of magnitude, illustrating that rearrangement burden is not captured by the divergence scalar. Annotated points are the top discordant cases by ANI–synteny rank difference; representative pairs were re-analyzed with</w:t>
-      </w:r>
-      <w:r>
-        <w:t xml:space="preserve"> </w:t>
-      </w:r>
-      <w:r>
-        <w:rPr>
-          <w:rStyle w:val="VerbatimChar"/>
-        </w:rPr>
-        <w:t xml:space="preserve">syn2bani struct</w:t>
-      </w:r>
-      <w:r>
-        <w:t xml:space="preserve"> </w:t>
-      </w:r>
-      <w:r>
-        <w:t xml:space="preserve">(Table 1). Source:</w:t>
-      </w:r>
-      <w:r>
-        <w:t xml:space="preserve"> </w:t>
-      </w:r>
-      <w:r>
-        <w:rPr>
-          <w:rStyle w:val="VerbatimChar"/>
-        </w:rPr>
-        <w:t xml:space="preserve">figures/syntracker_validation/syntracker_ani_vs_breakpoints.png</w:t>
+        <w:t xml:space="preserve">Staphylococcus aureus</w:t>
+      </w:r>
+      <w:r>
+        <w:rPr>
+          <w:b/>
+          <w:bCs/>
+        </w:rPr>
+        <w:t xml:space="preserve"> </w:t>
+      </w:r>
+      <w:r>
+        <w:rPr>
+          <w:b/>
+          <w:bCs/>
+        </w:rPr>
+        <w:t xml:space="preserve">pairs show wide breakpoint variation.</w:t>
+      </w:r>
+      <w:r>
+        <w:t xml:space="preserve"> </w:t>
+      </w:r>
+      <w:r>
+        <w:t xml:space="preserve">One hundred and twenty-two genomes, 7,381 refined pairs. (a) ANI vs breakpoint count. (b) Breakpoint count distribution. Pairs at 100% ANI still carry &gt;150 breakpoints. Source:</w:t>
+      </w:r>
+      <w:r>
+        <w:t xml:space="preserve"> </w:t>
+      </w:r>
+      <w:r>
+        <w:rPr>
+          <w:rStyle w:val="VerbatimChar"/>
+        </w:rPr>
+        <w:t xml:space="preserve">case_studies/fda_argos_s_aureus/results/</w:t>
       </w:r>
       <w:r>
         <w:t xml:space="preserve">.</w:t>
       </w:r>
     </w:p>
-    <w:p>
-      <w:pPr>
-        <w:pStyle w:val="BodyText"/>
-      </w:pPr>
-      <w:r>
-        <w:rPr>
-          <w:b/>
-          <w:bCs/>
-        </w:rPr>
-        <w:t xml:space="preserve">Figure 7 | Locus-targeted chain coverage detects a phenotype-associated structural difference invisible to genome-wide ANI.</w:t>
-      </w:r>
-      <w:r>
-        <w:t xml:space="preserve"> </w:t>
-      </w:r>
-      <w:r>
-        <w:t xml:space="preserve">185</w:t>
-      </w:r>
-      <w:r>
-        <w:t xml:space="preserve"> </w:t>
-      </w:r>
-      <w:r>
-        <w:rPr>
-          <w:i/>
-          <w:iCs/>
-        </w:rPr>
-        <w:t xml:space="preserve">Bifidobacterium longum</w:t>
-      </w:r>
-      <w:r>
-        <w:t xml:space="preserve"> </w:t>
-      </w:r>
-      <w:r>
-        <w:t xml:space="preserve">isolates stratified by abfA gene-cluster status (complete vs deleted/peripheral-truncated). (a) Syn2bANI chain coverage across the abfA locus (8.5–37.1 kb on reference contig; core genes 8.8–17.2 kb, peripheral region 17.2–37.1 kb). (b) Boxplot of periphery coverage (17.2–37.1 kb) by group. Whole-genome ANI and aligned fraction do not separate the groups, but local chain coverage over the cluster periphery is significantly reduced in the deleted group (MWU p = 1.4 × 10⁻³). Source:</w:t>
-      </w:r>
-      <w:r>
-        <w:t xml:space="preserve"> </w:t>
-      </w:r>
-      <w:r>
-        <w:rPr>
-          <w:rStyle w:val="VerbatimChar"/>
-        </w:rPr>
-        <w:t xml:space="preserve">figures/report/fig_b_longum_abfa.png</w:t>
-      </w:r>
-      <w:r>
-        <w:t xml:space="preserve">.</w:t>
-      </w:r>
-    </w:p>
-    <w:p>
-      <w:pPr>
-        <w:pStyle w:val="BodyText"/>
-      </w:pPr>
-      <w:r>
-        <w:rPr>
-          <w:b/>
-          <w:bCs/>
-        </w:rPr>
-        <w:t xml:space="preserve">Figure 8 | cagPAI architecture in 528</w:t>
-      </w:r>
-      <w:r>
-        <w:rPr>
-          <w:b/>
-          <w:bCs/>
-        </w:rPr>
-        <w:t xml:space="preserve"> </w:t>
-      </w:r>
-      <w:r>
-        <w:rPr>
-          <w:b/>
-          <w:bCs/>
-          <w:i/>
-          <w:iCs/>
-        </w:rPr>
-        <w:t xml:space="preserve">H. pylori</w:t>
-      </w:r>
-      <w:r>
-        <w:rPr>
-          <w:b/>
-          <w:bCs/>
-        </w:rPr>
-        <w:t xml:space="preserve"> </w:t>
-      </w:r>
-      <w:r>
-        <w:rPr>
-          <w:b/>
-          <w:bCs/>
-        </w:rPr>
-        <w:t xml:space="preserve">isolates is associated with lineage and invisible to ANI.</w:t>
-      </w:r>
-      <w:r>
-        <w:t xml:space="preserve"> </w:t>
-      </w:r>
-      <w:r>
-        <w:t xml:space="preserve">(a) Extended cagPAI state classification: marker-based</w:t>
-      </w:r>
-      <w:r>
-        <w:t xml:space="preserve"> </w:t>
-      </w:r>
-      <w:r>
-        <w:rPr>
-          <w:rStyle w:val="VerbatimChar"/>
-        </w:rPr>
-        <w:t xml:space="preserve">empty</w:t>
-      </w:r>
-      <w:r>
-        <w:t xml:space="preserve"> </w:t>
-      </w:r>
-      <w:r>
-        <w:t xml:space="preserve">/</w:t>
-      </w:r>
-      <w:r>
-        <w:t xml:space="preserve"> </w:t>
-      </w:r>
-      <w:r>
-        <w:rPr>
-          <w:rStyle w:val="VerbatimChar"/>
-        </w:rPr>
-        <w:t xml:space="preserve">partial</w:t>
-      </w:r>
-      <w:r>
-        <w:t xml:space="preserve"> </w:t>
-      </w:r>
-      <w:r>
-        <w:t xml:space="preserve">/</w:t>
-      </w:r>
-      <w:r>
-        <w:t xml:space="preserve"> </w:t>
-      </w:r>
-      <w:r>
-        <w:rPr>
-          <w:rStyle w:val="VerbatimChar"/>
-        </w:rPr>
-        <w:t xml:space="preserve">complete</w:t>
-      </w:r>
-      <w:r>
-        <w:t xml:space="preserve"> </w:t>
-      </w:r>
-      <w:r>
-        <w:t xml:space="preserve">is refined by</w:t>
-      </w:r>
-      <w:r>
-        <w:t xml:space="preserve"> </w:t>
-      </w:r>
-      <w:r>
-        <w:rPr>
-          <w:rStyle w:val="VerbatimChar"/>
-        </w:rPr>
-        <w:t xml:space="preserve">syn2bani struct</w:t>
-      </w:r>
-      <w:r>
-        <w:t xml:space="preserve"> </w:t>
-      </w:r>
-      <w:r>
-        <w:t xml:space="preserve">calls inside the cagPAI coordinates into</w:t>
-      </w:r>
-      <w:r>
-        <w:t xml:space="preserve"> </w:t>
-      </w:r>
-      <w:r>
-        <w:rPr>
-          <w:rStyle w:val="VerbatimChar"/>
-        </w:rPr>
-        <w:t xml:space="preserve">complete_collinear</w:t>
-      </w:r>
-      <w:r>
-        <w:t xml:space="preserve"> </w:t>
-      </w:r>
-      <w:r>
-        <w:t xml:space="preserve">and</w:t>
-      </w:r>
-      <w:r>
-        <w:t xml:space="preserve"> </w:t>
-      </w:r>
-      <w:r>
-        <w:rPr>
-          <w:rStyle w:val="VerbatimChar"/>
-        </w:rPr>
-        <w:t xml:space="preserve">complete_rearranged</w:t>
-      </w:r>
-      <w:r>
-        <w:t xml:space="preserve">; complete-marker genomes with only a genome-spanning SV on the circular chromosome were reclassified as collinear. (b) Stacked-bar distribution of extended cagPAI states by Correa’s cascade disease stage (NAG, AG, IM, GC) and by FastBAPS lineage. (c) Same data by country and phylogenetic population. FastBAPS lineage is strongly associated with extended state (χ² = 58.75, df = 12, p = 3.8 × 10⁻⁸), but the disease-stage association is not significant after lineage stratification (CMH p ≥ 0.21 for all four contrasts). Per-group stacked bars are shown in Supplementary Figs. S17–S20. Source:</w:t>
-      </w:r>
-      <w:r>
-        <w:t xml:space="preserve"> </w:t>
-      </w:r>
-      <w:r>
-        <w:rPr>
-          <w:rStyle w:val="VerbatimChar"/>
-        </w:rPr>
-        <w:t xml:space="preserve">case_studies/h_pylori_cagpai/results/cagpai_association_filtered.tsv</w:t>
-      </w:r>
-      <w:r>
-        <w:t xml:space="preserve">.</w:t>
-      </w:r>
-    </w:p>
-    <w:p>
-      <w:pPr>
-        <w:pStyle w:val="BodyText"/>
-      </w:pPr>
-      <w:r>
-        <w:rPr>
-          <w:b/>
-          <w:bCs/>
-        </w:rPr>
-        <w:t xml:space="preserve">Supplementary Figure S15 | High-ANI</w:t>
-      </w:r>
-      <w:r>
-        <w:rPr>
-          <w:b/>
-          <w:bCs/>
-        </w:rPr>
-        <w:t xml:space="preserve"> </w:t>
-      </w:r>
-      <w:r>
-        <w:rPr>
-          <w:b/>
-          <w:bCs/>
-          <w:i/>
-          <w:iCs/>
-        </w:rPr>
-        <w:t xml:space="preserve">E. coli</w:t>
-      </w:r>
-      <w:r>
-        <w:rPr>
-          <w:b/>
-          <w:bCs/>
-        </w:rPr>
-        <w:t xml:space="preserve"> </w:t>
-      </w:r>
-      <w:r>
-        <w:rPr>
-          <w:b/>
-          <w:bCs/>
-        </w:rPr>
-        <w:t xml:space="preserve">O157:H7 pairs carry hundreds of breakpoints.</w:t>
-      </w:r>
-      <w:r>
-        <w:t xml:space="preserve"> </w:t>
-      </w:r>
-      <w:r>
-        <w:t xml:space="preserve">Seventy-four genomes from Fitzgerald et al. (2021), 2,701 non-self pairs. (a) ANI vs breakpoint count colored by lineage (I/II, II, Ia, Ic). (b) Same data colored by host category (bovine, human, other/unknown). All pairwise ANIs exceed 99.886% yet breakpoints range from 171 to &gt;1,100. Source:</w:t>
-      </w:r>
-      <w:r>
-        <w:t xml:space="preserve"> </w:t>
-      </w:r>
-      <w:r>
-        <w:rPr>
-          <w:rStyle w:val="VerbatimChar"/>
-        </w:rPr>
-        <w:t xml:space="preserve">case_studies/ecoli_o157_fitzgerald_2021/results/</w:t>
-      </w:r>
-      <w:r>
-        <w:t xml:space="preserve">.</w:t>
-      </w:r>
-    </w:p>
     <w:bookmarkEnd w:id="43"/>
-    <w:bookmarkStart w:id="44" w:name="X2039872a057f86498f6293bbf4ab0196afa571e"/>
-    <w:p>
-      <w:pPr>
-        <w:pStyle w:val="Heading2"/>
-      </w:pPr>
-      <w:r>
-        <w:rPr>
-          <w:b/>
-          <w:bCs/>
-        </w:rPr>
-        <w:t xml:space="preserve">Supplementary Figure S16 | High-ANI FDA-ARGOS</w:t>
-      </w:r>
-      <w:r>
-        <w:rPr>
-          <w:b/>
-          <w:bCs/>
-        </w:rPr>
-        <w:t xml:space="preserve"> </w:t>
-      </w:r>
-      <w:r>
-        <w:rPr>
-          <w:b/>
-          <w:bCs/>
-          <w:i/>
-          <w:iCs/>
-        </w:rPr>
-        <w:t xml:space="preserve">Staphylococcus aureus</w:t>
-      </w:r>
-      <w:r>
-        <w:rPr>
-          <w:b/>
-          <w:bCs/>
-        </w:rPr>
-        <w:t xml:space="preserve"> </w:t>
-      </w:r>
-      <w:r>
-        <w:rPr>
-          <w:b/>
-          <w:bCs/>
-        </w:rPr>
-        <w:t xml:space="preserve">pairs show wide breakpoint variation.</w:t>
-      </w:r>
-      <w:r>
-        <w:t xml:space="preserve"> </w:t>
-      </w:r>
-      <w:r>
-        <w:t xml:space="preserve">One hundred and twenty-two genomes, 7,381 refined pairs. (a) ANI vs breakpoint count. (b) Breakpoint count distribution. Pairs at 100% ANI still carry &gt;150 breakpoints. Source:</w:t>
-      </w:r>
-      <w:r>
-        <w:t xml:space="preserve"> </w:t>
-      </w:r>
-      <w:r>
-        <w:rPr>
-          <w:rStyle w:val="VerbatimChar"/>
-        </w:rPr>
-        <w:t xml:space="preserve">case_studies/fda_argos_s_aureus/results/</w:t>
-      </w:r>
-      <w:r>
-        <w:t xml:space="preserve">.</w:t>
-      </w:r>
-    </w:p>
-    <w:bookmarkEnd w:id="44"/>
-    <w:bookmarkStart w:id="45" w:name="tables"/>
+    <w:bookmarkStart w:id="44" w:name="tables"/>
     <w:p>
       <w:pPr>
         <w:pStyle w:val="Heading2"/>
@@ -8223,7 +8005,7 @@
               <w:pStyle w:val="Compact"/>
             </w:pPr>
             <w:r>
-              <w:t xml:space="preserve">Fig. 2; Fig. S5</w:t>
+              <w:t xml:space="preserve">Fig. 2a,b</w:t>
             </w:r>
           </w:p>
         </w:tc>
@@ -8291,7 +8073,7 @@
               <w:pStyle w:val="Compact"/>
             </w:pPr>
             <w:r>
-              <w:t xml:space="preserve">Fig. 2; Fig. S5</w:t>
+              <w:t xml:space="preserve">Fig. 2c</w:t>
             </w:r>
           </w:p>
         </w:tc>
@@ -8359,7 +8141,7 @@
               <w:pStyle w:val="Compact"/>
             </w:pPr>
             <w:r>
-              <w:t xml:space="preserve">Fig. 2; Fig. S7</w:t>
+              <w:t xml:space="preserve">Fig. 2d</w:t>
             </w:r>
           </w:p>
         </w:tc>
@@ -8427,7 +8209,7 @@
               <w:pStyle w:val="Compact"/>
             </w:pPr>
             <w:r>
-              <w:t xml:space="preserve">Fig. 2; Fig. S6</w:t>
+              <w:t xml:space="preserve">Supplementary Fig. S5</w:t>
             </w:r>
           </w:p>
         </w:tc>
@@ -8495,7 +8277,7 @@
               <w:pStyle w:val="Compact"/>
             </w:pPr>
             <w:r>
-              <w:t xml:space="preserve">Fig. 2; Fig. S8</w:t>
+              <w:t xml:space="preserve">Fig. 2e</w:t>
             </w:r>
           </w:p>
         </w:tc>
@@ -8563,7 +8345,7 @@
               <w:pStyle w:val="Compact"/>
             </w:pPr>
             <w:r>
-              <w:t xml:space="preserve">Results; Fig. S9</w:t>
+              <w:t xml:space="preserve">Supplementary Fig. S6</w:t>
             </w:r>
           </w:p>
         </w:tc>
@@ -8631,7 +8413,7 @@
               <w:pStyle w:val="Compact"/>
             </w:pPr>
             <w:r>
-              <w:t xml:space="preserve">Fig. S1</w:t>
+              <w:t xml:space="preserve">Supplementary Fig. S1</w:t>
             </w:r>
           </w:p>
         </w:tc>
@@ -9243,7 +9025,7 @@
               <w:pStyle w:val="Compact"/>
             </w:pPr>
             <w:r>
-              <w:t xml:space="preserve">Fig. 5</w:t>
+              <w:t xml:space="preserve">Supplementary Fig. S7</w:t>
             </w:r>
           </w:p>
         </w:tc>
@@ -9463,7 +9245,7 @@
               <w:pStyle w:val="Compact"/>
             </w:pPr>
             <w:r>
-              <w:t xml:space="preserve">Results; Fig. S12</w:t>
+              <w:t xml:space="preserve">Fig. 8a</w:t>
             </w:r>
           </w:p>
         </w:tc>
@@ -9619,7 +9401,7 @@
               <w:pStyle w:val="Compact"/>
             </w:pPr>
             <w:r>
-              <w:t xml:space="preserve">Results; Fig. S15</w:t>
+              <w:t xml:space="preserve">Supplementary Fig. S9</w:t>
             </w:r>
           </w:p>
         </w:tc>
@@ -9697,7 +9479,7 @@
               <w:pStyle w:val="Compact"/>
             </w:pPr>
             <w:r>
-              <w:t xml:space="preserve">Results; Fig. S16</w:t>
+              <w:t xml:space="preserve">Supplementary Fig. S10</w:t>
             </w:r>
           </w:p>
         </w:tc>
@@ -9781,8 +9563,8 @@
         </w:tc>
       </w:tr>
     </w:tbl>
+    <w:bookmarkEnd w:id="44"/>
     <w:bookmarkEnd w:id="45"/>
-    <w:bookmarkEnd w:id="46"/>
     <w:sectPr>
       <w:footnotePr>
         <w:numRestart w:val="eachSect"/>

</xml_diff>

<commit_message>
Simplify Fig 3 to hybrid-only; make Fig 6B horizontal bars; clarify Fig 4 caption
</commit_message>
<xml_diff>
--- a/paper/manuscript/manuscript_nature_methods.docx
+++ b/paper/manuscript/manuscript_nature_methods.docx
@@ -5819,7 +5819,7 @@
         <w:t xml:space="preserve"> </w:t>
       </w:r>
       <w:r>
-        <w:t xml:space="preserve">43,334 held-out same-genus pairs plus 727 high-ANI test pairs. (a) Estimated vs ANIm truth for Syn2bANI raw gated, v6-calibrated, hybrid (raw ≥98% / calibrated &lt;98%), skani, and FastANI. (b) Per-band MAE. (c) Signed-error distributions. (d) High-ANI zoom. Source:</w:t>
+        <w:t xml:space="preserve">43,334 held-out same-genus pairs plus 727 high-ANI test pairs. (a) Estimated vs ANIm truth for Syn2bANI hybrid (raw ≥98% / calibrated &lt;98%), skani, and FastANI. Raw and v6-calibrated Syn2bANI variants are shown in Supplementary Figs. S2–S3. (b) Per-band MAE. (c) Signed-error distributions. (d) High-ANI zoom. Source:</w:t>
       </w:r>
       <w:r>
         <w:t xml:space="preserve"> </w:t>
@@ -5843,7 +5843,7 @@
           <w:b/>
           <w:bCs/>
         </w:rPr>
-        <w:t xml:space="preserve">Figure 4 | Computational efficiency on GTDB-R207.</w:t>
+        <w:t xml:space="preserve">Figure 4 | Computational efficiency on small Enterobacteriaceae subsets.</w:t>
       </w:r>
       <w:r>
         <w:t xml:space="preserve"> </w:t>
@@ -5888,7 +5888,23 @@
         <w:t xml:space="preserve"> </w:t>
       </w:r>
       <w:r>
-        <w:t xml:space="preserve">on GTDB-R207 subsets. (b) Peak memory per tool. (c) Throughput (comparisons per second) at database scale. (d) Time breakdown (sketch vs compare vs I/O). Source:</w:t>
+        <w:t xml:space="preserve">on subsets of 2–22</w:t>
+      </w:r>
+      <w:r>
+        <w:t xml:space="preserve"> </w:t>
+      </w:r>
+      <w:r>
+        <w:rPr>
+          <w:i/>
+          <w:iCs/>
+        </w:rPr>
+        <w:t xml:space="preserve">E. coli</w:t>
+      </w:r>
+      <w:r>
+        <w:t xml:space="preserve"> </w:t>
+      </w:r>
+      <w:r>
+        <w:t xml:space="preserve">genomes. (b) Peak memory per tool. (c) Throughput (comparisons per second). (d) Time breakdown (sketch vs compare). This comparison is for ANI-only workflows; because Syn2bANI reports both ANI and SV metrics in one pass, a fair comparison with skani or FastANI would require adding the runtime of an SV caller such as dnadiff or MUMmer (see Discussion). Source:</w:t>
       </w:r>
       <w:r>
         <w:t xml:space="preserve"> </w:t>

</xml_diff>

<commit_message>
Update Fig 4/5 with one-to-all and SV-inclusive efficiency benchmarks
- Add local one-to-all benchmark (syn2bani/skani/FastANI) for 2/5/10/15/21 refs
- Add HPC dnadiff and syn2bani struct timing on same subsets
- Regenerate Fig 4: all-vs-all, one-to-all, memory, and SV workflow panels
- Regenerate Fig 5: add SV workflow time and speedup vs dnadiff
- Update manuscript captions and efficiency paragraph
</commit_message>
<xml_diff>
--- a/paper/manuscript/manuscript_nature_methods.docx
+++ b/paper/manuscript/manuscript_nature_methods.docx
@@ -511,7 +511,7 @@
         <w:pStyle w:val="BodyText"/>
       </w:pPr>
       <w:r>
-        <w:t xml:space="preserve">Computational efficiency was measured on the same GTDB-R207 dataset. On 22 genomes, Syn2bANI computes all 484 pairs in 3.73 s from FASTA (2.79 s reusing sketches), against 17.7 s for FastANI and 0.15 s for skani (the latter reports only 302/484 pairs because of its minimum-AF filter and excludes sketching). Peak memory is 58 MB with sketch reuse versus 185 MB (skani) and 912 MB (FastANI). At database scale, all-vs-all</w:t>
+        <w:t xml:space="preserve">Computational efficiency was measured on Enterobacteriaceae subsets of 2–22 genomes and on database-scale GTDB-R207 runs. For ANI-only all-vs-all comparison on 22 genomes (484 pairs), Syn2bANI takes 3.7 s from FASTA (2.8 s reusing sketches), against 17.7 s for FastANI and 0.15 s for skani (the latter reports only 302/484 pairs because of its minimum-AF filter and excludes sketching). Peak memory is 58 MB with sketch reuse versus 185 MB (skani) and 912 MB (FastANI). For one-to-all search, Syn2bANI scales sub-linearly with the number of references and remains faster than FastANI; skani is fastest for this use case. Because Syn2bANI reports both ANI and SV metrics in the same pass, a fair comparison with skani or FastANI requires adding an SV caller: skani + dnadiff takes ~1,843 s for the same 484 pairs, whereas Syn2bANI computes ANI plus SV in 7.6 s with sketch reuse — a &gt;240-fold speedup (Fig. 4–5). At database scale, all-vs-all</w:t>
       </w:r>
       <w:r>
         <w:t xml:space="preserve"> </w:t>
@@ -541,7 +541,7 @@
         <w:t xml:space="preserve"> </w:t>
       </w:r>
       <w:r>
-        <w:t xml:space="preserve">against the same database takes ~4 min for 1,000 queries (Fig. 4). skani remains faster at scale, a trade-off that is stated openly.</w:t>
+        <w:t xml:space="preserve">against the same database takes ~4 min for 1,000 queries.</w:t>
       </w:r>
     </w:p>
     <w:bookmarkEnd w:id="14"/>
@@ -5849,62 +5849,7 @@
         <w:t xml:space="preserve"> </w:t>
       </w:r>
       <w:r>
-        <w:t xml:space="preserve">(a) Wall time for pairwise</w:t>
-      </w:r>
-      <w:r>
-        <w:t xml:space="preserve"> </w:t>
-      </w:r>
-      <w:r>
-        <w:rPr>
-          <w:rStyle w:val="VerbatimChar"/>
-        </w:rPr>
-        <w:t xml:space="preserve">dist</w:t>
-      </w:r>
-      <w:r>
-        <w:t xml:space="preserve">, database</w:t>
-      </w:r>
-      <w:r>
-        <w:t xml:space="preserve"> </w:t>
-      </w:r>
-      <w:r>
-        <w:rPr>
-          <w:rStyle w:val="VerbatimChar"/>
-        </w:rPr>
-        <w:t xml:space="preserve">search</w:t>
-      </w:r>
-      <w:r>
-        <w:t xml:space="preserve">, and all-vs-all</w:t>
-      </w:r>
-      <w:r>
-        <w:t xml:space="preserve"> </w:t>
-      </w:r>
-      <w:r>
-        <w:rPr>
-          <w:rStyle w:val="VerbatimChar"/>
-        </w:rPr>
-        <w:t xml:space="preserve">triangle</w:t>
-      </w:r>
-      <w:r>
-        <w:t xml:space="preserve"> </w:t>
-      </w:r>
-      <w:r>
-        <w:t xml:space="preserve">on subsets of 2–22</w:t>
-      </w:r>
-      <w:r>
-        <w:t xml:space="preserve"> </w:t>
-      </w:r>
-      <w:r>
-        <w:rPr>
-          <w:i/>
-          <w:iCs/>
-        </w:rPr>
-        <w:t xml:space="preserve">E. coli</w:t>
-      </w:r>
-      <w:r>
-        <w:t xml:space="preserve"> </w:t>
-      </w:r>
-      <w:r>
-        <w:t xml:space="preserve">genomes. (b) Peak memory per tool. (c) Throughput (comparisons per second). (d) Time breakdown (sketch vs compare). This comparison is for ANI-only workflows; because Syn2bANI reports both ANI and SV metrics in one pass, a fair comparison with skani or FastANI would require adding the runtime of an SV caller such as dnadiff or MUMmer (see Discussion). Source:</w:t>
+        <w:t xml:space="preserve">(a) All-vs-all ANI wall time versus number of pairs. (b) One-to-all ANI search wall time versus number of reference genomes. (c) Peak memory for all-vs-all comparison. (d) SV-inclusive workflow wall time, comparing dnadiff alone, skani followed by dnadiff, and Syn2bANI (struct alone or combined ANI+SV from FASTA or pre-built sketches). All timings are medians of three replicates on a Mac Studio (M4 Max, 16 cores) for panels a–c and on a 16-core HPC node for panel d. Source:</w:t>
       </w:r>
       <w:r>
         <w:t xml:space="preserve"> </w:t>
@@ -5928,7 +5873,7 @@
           <w:b/>
           <w:bCs/>
         </w:rPr>
-        <w:t xml:space="preserve">Figure 5 | Structural outputs agree with alignment-based truth.</w:t>
+        <w:t xml:space="preserve">Figure 5 | Structural outputs agree with alignment-based truth and are orders of magnitude faster than alignment-based SV calling.</w:t>
       </w:r>
       <w:r>
         <w:t xml:space="preserve"> </w:t>
@@ -5949,7 +5894,7 @@
         <w:t xml:space="preserve"> </w:t>
       </w:r>
       <w:r>
-        <w:t xml:space="preserve">vs dnadiff inverted fraction across GTDB-R207 pairs (Pearson r = 0.936). (b) High-ANI zoom (r ≥ 95% pairs). (c) Partial correlation of</w:t>
+        <w:t xml:space="preserve">vs dnadiff inverted fraction across GTDB-R207 pairs (Pearson r = 0.936). (b) High-ANI zoom (ANIm ≥ 97%, r = 0.996, slope = 0.986). (c) Partial correlation of</w:t>
       </w:r>
       <w:r>
         <w:t xml:space="preserve"> </w:t>
@@ -5979,7 +5924,7 @@
         <w:t xml:space="preserve"> </w:t>
       </w:r>
       <w:r>
-        <w:t xml:space="preserve">vs dnadiff aligned fraction. Source:</w:t>
+        <w:t xml:space="preserve">vs dnadiff aligned fraction. (e) Wall time for SV-only or ANI+SV workflows at n = 22 genomes (484 pairs). (f) Speedup of Syn2bANI (ANI+SV, sketch workflow) over dnadiff across subset sizes. Source:</w:t>
       </w:r>
       <w:r>
         <w:t xml:space="preserve"> </w:t>

</xml_diff>